<commit_message>
Optimizar arranque y actualizar documentación
</commit_message>
<xml_diff>
--- a/TFG.docx
+++ b/TFG.docx
@@ -1,6 +1,6 @@
 
 <file path=word/document.xml><?xml version="1.0" encoding="utf-8"?>
-<w:document xmlns:wpc="http://schemas.microsoft.com/office/word/2010/wordprocessingCanvas" xmlns:cx="http://schemas.microsoft.com/office/drawing/2014/chartex" xmlns:cx1="http://schemas.microsoft.com/office/drawing/2015/9/8/chartex" xmlns:cx2="http://schemas.microsoft.com/office/drawing/2015/10/21/chartex" xmlns:cx3="http://schemas.microsoft.com/office/drawing/2016/5/9/chartex" xmlns:cx4="http://schemas.microsoft.com/office/drawing/2016/5/10/chartex" xmlns:cx5="http://schemas.microsoft.com/office/drawing/2016/5/11/chartex" xmlns:cx6="http://schemas.microsoft.com/office/drawing/2016/5/12/chartex" xmlns:cx7="http://schemas.microsoft.com/office/drawing/2016/5/13/chartex" xmlns:cx8="http://schemas.microsoft.com/office/drawing/2016/5/14/chartex" xmlns:mc="http://schemas.openxmlformats.org/markup-compatibility/2006" xmlns:aink="http://schemas.microsoft.com/office/drawing/2016/ink" xmlns:am3d="http://schemas.microsoft.com/office/drawing/2017/model3d" xmlns:o="urn:schemas-microsoft-com:office:office" xmlns:oel="http://schemas.microsoft.com/office/2019/extlst" xmlns:r="http://schemas.openxmlformats.org/officeDocument/2006/relationships" xmlns:m="http://schemas.openxmlformats.org/officeDocument/2006/math" xmlns:v="urn:schemas-microsoft-com:vml" xmlns:wp14="http://schemas.microsoft.com/office/word/2010/wordprocessingDrawing" xmlns:wp="http://schemas.openxmlformats.org/drawingml/2006/wordprocessingDrawing" xmlns:w10="urn:schemas-microsoft-com:office:word" xmlns:w="http://schemas.openxmlformats.org/wordprocessingml/2006/main" xmlns:w14="http://schemas.microsoft.com/office/word/2010/wordml" xmlns:w15="http://schemas.microsoft.com/office/word/2012/wordml" xmlns:w16cei="http://schemas.microsoft.com/office/word/2026/wordml/cei" xmlns:w16cex="http://schemas.microsoft.com/office/word/2018/wordml/cex" xmlns:w16cid="http://schemas.microsoft.com/office/word/2016/wordml/cid" xmlns:w16="http://schemas.microsoft.com/office/word/2018/wordml" xmlns:w16du="http://schemas.microsoft.com/office/word/2023/wordml/word16du" xmlns:w16sdtdh="http://schemas.microsoft.com/office/word/2020/wordml/sdtdatahash" xmlns:w16sdtfl="http://schemas.microsoft.com/office/word/2024/wordml/sdtformatlock" xmlns:w16se="http://schemas.microsoft.com/office/word/2015/wordml/symex" xmlns:wpg="http://schemas.microsoft.com/office/word/2010/wordprocessingGroup" xmlns:wpi="http://schemas.microsoft.com/office/word/2010/wordprocessingInk" xmlns:wne="http://schemas.microsoft.com/office/word/2006/wordml" xmlns:wps="http://schemas.microsoft.com/office/word/2010/wordprocessingShape" mc:Ignorable="w14 w15 w16se w16cid w16 w16cex w16sdtdh w16sdtfl w16du wp14">
+<w:document xmlns:wpc="http://schemas.microsoft.com/office/word/2010/wordprocessingCanvas" xmlns:cx="http://schemas.microsoft.com/office/drawing/2014/chartex" xmlns:cx1="http://schemas.microsoft.com/office/drawing/2015/9/8/chartex" xmlns:cx2="http://schemas.microsoft.com/office/drawing/2015/10/21/chartex" xmlns:cx3="http://schemas.microsoft.com/office/drawing/2016/5/9/chartex" xmlns:cx4="http://schemas.microsoft.com/office/drawing/2016/5/10/chartex" xmlns:cx5="http://schemas.microsoft.com/office/drawing/2016/5/11/chartex" xmlns:cx6="http://schemas.microsoft.com/office/drawing/2016/5/12/chartex" xmlns:cx7="http://schemas.microsoft.com/office/drawing/2016/5/13/chartex" xmlns:cx8="http://schemas.microsoft.com/office/drawing/2016/5/14/chartex" xmlns:mc="http://schemas.openxmlformats.org/markup-compatibility/2006" xmlns:aink="http://schemas.microsoft.com/office/drawing/2016/ink" xmlns:am3d="http://schemas.microsoft.com/office/drawing/2017/model3d" xmlns:o="urn:schemas-microsoft-com:office:office" xmlns:oel="http://schemas.microsoft.com/office/2019/extlst" xmlns:r="http://schemas.openxmlformats.org/officeDocument/2006/relationships" xmlns:m="http://schemas.openxmlformats.org/officeDocument/2006/math" xmlns:v="urn:schemas-microsoft-com:vml" xmlns:wp14="http://schemas.microsoft.com/office/word/2010/wordprocessingDrawing" xmlns:wp="http://schemas.openxmlformats.org/drawingml/2006/wordprocessingDrawing" xmlns:w10="urn:schemas-microsoft-com:office:word" xmlns:w="http://schemas.openxmlformats.org/wordprocessingml/2006/main" xmlns:w14="http://schemas.microsoft.com/office/word/2010/wordml" xmlns:w15="http://schemas.microsoft.com/office/word/2012/wordml" xmlns:w16cex="http://schemas.microsoft.com/office/word/2018/wordml/cex" xmlns:w16cid="http://schemas.microsoft.com/office/word/2016/wordml/cid" xmlns:w16="http://schemas.microsoft.com/office/word/2018/wordml" xmlns:w16du="http://schemas.microsoft.com/office/word/2023/wordml/word16du" xmlns:w16sdtdh="http://schemas.microsoft.com/office/word/2020/wordml/sdtdatahash" xmlns:w16sdtfl="http://schemas.microsoft.com/office/word/2024/wordml/sdtformatlock" xmlns:w16se="http://schemas.microsoft.com/office/word/2015/wordml/symex" xmlns:wpg="http://schemas.microsoft.com/office/word/2010/wordprocessingGroup" xmlns:wpi="http://schemas.microsoft.com/office/word/2010/wordprocessingInk" xmlns:wne="http://schemas.microsoft.com/office/word/2006/wordml" xmlns:wps="http://schemas.microsoft.com/office/word/2010/wordprocessingShape" mc:Ignorable="w14 w15 w16se w16cid w16 w16cex w16sdtdh w16sdtfl w16du wp14">
   <w:body>
     <w:p/>
     <w:p/>
@@ -118,7 +118,7 @@
       <w:pPr>
         <w:pStyle w:val="Ttulo1"/>
       </w:pPr>
-      <w:bookmarkStart w:id="0" w:name="_Toc238105997"/>
+      <w:bookmarkStart w:id="0" w:name="_Toc238490931"/>
       <w:r>
         <w:lastRenderedPageBreak/>
         <w:t>Resumen</w:t>
@@ -140,7 +140,7 @@
       <w:pPr>
         <w:pStyle w:val="Ttulo1"/>
       </w:pPr>
-      <w:bookmarkStart w:id="1" w:name="_Toc238105998"/>
+      <w:bookmarkStart w:id="1" w:name="_Toc238490932"/>
       <w:r>
         <w:lastRenderedPageBreak/>
         <w:t>Abstract</w:t>
@@ -167,7 +167,7 @@
       <w:pPr>
         <w:pStyle w:val="Ttulo1"/>
       </w:pPr>
-      <w:bookmarkStart w:id="2" w:name="_Toc238105999"/>
+      <w:bookmarkStart w:id="2" w:name="_Toc238490933"/>
       <w:r>
         <w:lastRenderedPageBreak/>
         <w:t>Agradecimientos</w:t>
@@ -183,7 +183,7 @@
       <w:pPr>
         <w:pStyle w:val="Ttulo1"/>
       </w:pPr>
-      <w:bookmarkStart w:id="3" w:name="_Toc238106000"/>
+      <w:bookmarkStart w:id="3" w:name="_Toc238490934"/>
       <w:r>
         <w:lastRenderedPageBreak/>
         <w:t>Índice de figuras y tablas</w:t>
@@ -261,7 +261,7 @@
       <w:pPr>
         <w:pStyle w:val="Ttulo1"/>
       </w:pPr>
-      <w:bookmarkStart w:id="4" w:name="_Toc238106001"/>
+      <w:bookmarkStart w:id="4" w:name="_Toc238490935"/>
       <w:r>
         <w:lastRenderedPageBreak/>
         <w:t>Abreviaturas</w:t>
@@ -530,7 +530,7 @@
           <w:r>
             <w:fldChar w:fldCharType="separate"/>
           </w:r>
-          <w:hyperlink w:anchor="_Toc238105997" w:history="1">
+          <w:hyperlink w:anchor="_Toc238490931" w:history="1">
             <w:r>
               <w:rPr>
                 <w:rStyle w:val="Hipervnculo"/>
@@ -557,7 +557,7 @@
                 <w:noProof/>
                 <w:webHidden/>
               </w:rPr>
-              <w:instrText xml:space="preserve"> PAGEREF _Toc238105997 \h </w:instrText>
+              <w:instrText xml:space="preserve"> PAGEREF _Toc238490931 \h </w:instrText>
             </w:r>
             <w:r>
               <w:rPr>
@@ -605,7 +605,7 @@
               <w14:ligatures w14:val="standardContextual"/>
             </w:rPr>
           </w:pPr>
-          <w:hyperlink w:anchor="_Toc238105998" w:history="1">
+          <w:hyperlink w:anchor="_Toc238490932" w:history="1">
             <w:r>
               <w:rPr>
                 <w:rStyle w:val="Hipervnculo"/>
@@ -632,7 +632,7 @@
                 <w:noProof/>
                 <w:webHidden/>
               </w:rPr>
-              <w:instrText xml:space="preserve"> PAGEREF _Toc238105998 \h </w:instrText>
+              <w:instrText xml:space="preserve"> PAGEREF _Toc238490932 \h </w:instrText>
             </w:r>
             <w:r>
               <w:rPr>
@@ -680,7 +680,7 @@
               <w14:ligatures w14:val="standardContextual"/>
             </w:rPr>
           </w:pPr>
-          <w:hyperlink w:anchor="_Toc238105999" w:history="1">
+          <w:hyperlink w:anchor="_Toc238490933" w:history="1">
             <w:r>
               <w:rPr>
                 <w:rStyle w:val="Hipervnculo"/>
@@ -707,7 +707,7 @@
                 <w:noProof/>
                 <w:webHidden/>
               </w:rPr>
-              <w:instrText xml:space="preserve"> PAGEREF _Toc238105999 \h </w:instrText>
+              <w:instrText xml:space="preserve"> PAGEREF _Toc238490933 \h </w:instrText>
             </w:r>
             <w:r>
               <w:rPr>
@@ -755,7 +755,7 @@
               <w14:ligatures w14:val="standardContextual"/>
             </w:rPr>
           </w:pPr>
-          <w:hyperlink w:anchor="_Toc238106000" w:history="1">
+          <w:hyperlink w:anchor="_Toc238490934" w:history="1">
             <w:r>
               <w:rPr>
                 <w:rStyle w:val="Hipervnculo"/>
@@ -782,7 +782,7 @@
                 <w:noProof/>
                 <w:webHidden/>
               </w:rPr>
-              <w:instrText xml:space="preserve"> PAGEREF _Toc238106000 \h </w:instrText>
+              <w:instrText xml:space="preserve"> PAGEREF _Toc238490934 \h </w:instrText>
             </w:r>
             <w:r>
               <w:rPr>
@@ -830,7 +830,7 @@
               <w14:ligatures w14:val="standardContextual"/>
             </w:rPr>
           </w:pPr>
-          <w:hyperlink w:anchor="_Toc238106001" w:history="1">
+          <w:hyperlink w:anchor="_Toc238490935" w:history="1">
             <w:r>
               <w:rPr>
                 <w:rStyle w:val="Hipervnculo"/>
@@ -857,7 +857,7 @@
                 <w:noProof/>
                 <w:webHidden/>
               </w:rPr>
-              <w:instrText xml:space="preserve"> PAGEREF _Toc238106001 \h </w:instrText>
+              <w:instrText xml:space="preserve"> PAGEREF _Toc238490935 \h </w:instrText>
             </w:r>
             <w:r>
               <w:rPr>
@@ -905,7 +905,7 @@
               <w14:ligatures w14:val="standardContextual"/>
             </w:rPr>
           </w:pPr>
-          <w:hyperlink w:anchor="_Toc238106002" w:history="1">
+          <w:hyperlink w:anchor="_Toc238490936" w:history="1">
             <w:r>
               <w:rPr>
                 <w:rStyle w:val="Hipervnculo"/>
@@ -932,7 +932,7 @@
                 <w:noProof/>
                 <w:webHidden/>
               </w:rPr>
-              <w:instrText xml:space="preserve"> PAGEREF _Toc238106002 \h </w:instrText>
+              <w:instrText xml:space="preserve"> PAGEREF _Toc238490936 \h </w:instrText>
             </w:r>
             <w:r>
               <w:rPr>
@@ -980,7 +980,7 @@
               <w14:ligatures w14:val="standardContextual"/>
             </w:rPr>
           </w:pPr>
-          <w:hyperlink w:anchor="_Toc238106003" w:history="1">
+          <w:hyperlink w:anchor="_Toc238490937" w:history="1">
             <w:r>
               <w:rPr>
                 <w:rStyle w:val="Hipervnculo"/>
@@ -1007,7 +1007,7 @@
                 <w:noProof/>
                 <w:webHidden/>
               </w:rPr>
-              <w:instrText xml:space="preserve"> PAGEREF _Toc238106003 \h </w:instrText>
+              <w:instrText xml:space="preserve"> PAGEREF _Toc238490937 \h </w:instrText>
             </w:r>
             <w:r>
               <w:rPr>
@@ -1055,7 +1055,7 @@
               <w14:ligatures w14:val="standardContextual"/>
             </w:rPr>
           </w:pPr>
-          <w:hyperlink w:anchor="_Toc238106004" w:history="1">
+          <w:hyperlink w:anchor="_Toc238490938" w:history="1">
             <w:r>
               <w:rPr>
                 <w:rStyle w:val="Hipervnculo"/>
@@ -1082,7 +1082,7 @@
                 <w:noProof/>
                 <w:webHidden/>
               </w:rPr>
-              <w:instrText xml:space="preserve"> PAGEREF _Toc238106004 \h </w:instrText>
+              <w:instrText xml:space="preserve"> PAGEREF _Toc238490938 \h </w:instrText>
             </w:r>
             <w:r>
               <w:rPr>
@@ -1130,7 +1130,7 @@
               <w14:ligatures w14:val="standardContextual"/>
             </w:rPr>
           </w:pPr>
-          <w:hyperlink w:anchor="_Toc238106005" w:history="1">
+          <w:hyperlink w:anchor="_Toc238490939" w:history="1">
             <w:r>
               <w:rPr>
                 <w:rStyle w:val="Hipervnculo"/>
@@ -1157,7 +1157,7 @@
                 <w:noProof/>
                 <w:webHidden/>
               </w:rPr>
-              <w:instrText xml:space="preserve"> PAGEREF _Toc238106005 \h </w:instrText>
+              <w:instrText xml:space="preserve"> PAGEREF _Toc238490939 \h </w:instrText>
             </w:r>
             <w:r>
               <w:rPr>
@@ -1205,7 +1205,7 @@
               <w14:ligatures w14:val="standardContextual"/>
             </w:rPr>
           </w:pPr>
-          <w:hyperlink w:anchor="_Toc238106006" w:history="1">
+          <w:hyperlink w:anchor="_Toc238490940" w:history="1">
             <w:r>
               <w:rPr>
                 <w:rStyle w:val="Hipervnculo"/>
@@ -1232,7 +1232,7 @@
                 <w:noProof/>
                 <w:webHidden/>
               </w:rPr>
-              <w:instrText xml:space="preserve"> PAGEREF _Toc238106006 \h </w:instrText>
+              <w:instrText xml:space="preserve"> PAGEREF _Toc238490940 \h </w:instrText>
             </w:r>
             <w:r>
               <w:rPr>
@@ -1280,7 +1280,7 @@
               <w14:ligatures w14:val="standardContextual"/>
             </w:rPr>
           </w:pPr>
-          <w:hyperlink w:anchor="_Toc238106007" w:history="1">
+          <w:hyperlink w:anchor="_Toc238490941" w:history="1">
             <w:r>
               <w:rPr>
                 <w:rStyle w:val="Hipervnculo"/>
@@ -1307,7 +1307,7 @@
                 <w:noProof/>
                 <w:webHidden/>
               </w:rPr>
-              <w:instrText xml:space="preserve"> PAGEREF _Toc238106007 \h </w:instrText>
+              <w:instrText xml:space="preserve"> PAGEREF _Toc238490941 \h </w:instrText>
             </w:r>
             <w:r>
               <w:rPr>
@@ -1355,7 +1355,7 @@
               <w14:ligatures w14:val="standardContextual"/>
             </w:rPr>
           </w:pPr>
-          <w:hyperlink w:anchor="_Toc238106008" w:history="1">
+          <w:hyperlink w:anchor="_Toc238490942" w:history="1">
             <w:r>
               <w:rPr>
                 <w:rStyle w:val="Hipervnculo"/>
@@ -1382,7 +1382,7 @@
                 <w:noProof/>
                 <w:webHidden/>
               </w:rPr>
-              <w:instrText xml:space="preserve"> PAGEREF _Toc238106008 \h </w:instrText>
+              <w:instrText xml:space="preserve"> PAGEREF _Toc238490942 \h </w:instrText>
             </w:r>
             <w:r>
               <w:rPr>
@@ -1430,7 +1430,7 @@
               <w14:ligatures w14:val="standardContextual"/>
             </w:rPr>
           </w:pPr>
-          <w:hyperlink w:anchor="_Toc238106009" w:history="1">
+          <w:hyperlink w:anchor="_Toc238490943" w:history="1">
             <w:r>
               <w:rPr>
                 <w:rStyle w:val="Hipervnculo"/>
@@ -1457,7 +1457,7 @@
                 <w:noProof/>
                 <w:webHidden/>
               </w:rPr>
-              <w:instrText xml:space="preserve"> PAGEREF _Toc238106009 \h </w:instrText>
+              <w:instrText xml:space="preserve"> PAGEREF _Toc238490943 \h </w:instrText>
             </w:r>
             <w:r>
               <w:rPr>
@@ -1505,7 +1505,7 @@
               <w14:ligatures w14:val="standardContextual"/>
             </w:rPr>
           </w:pPr>
-          <w:hyperlink w:anchor="_Toc238106010" w:history="1">
+          <w:hyperlink w:anchor="_Toc238490944" w:history="1">
             <w:r>
               <w:rPr>
                 <w:rStyle w:val="Hipervnculo"/>
@@ -1532,7 +1532,7 @@
                 <w:noProof/>
                 <w:webHidden/>
               </w:rPr>
-              <w:instrText xml:space="preserve"> PAGEREF _Toc238106010 \h </w:instrText>
+              <w:instrText xml:space="preserve"> PAGEREF _Toc238490944 \h </w:instrText>
             </w:r>
             <w:r>
               <w:rPr>
@@ -1580,7 +1580,7 @@
               <w14:ligatures w14:val="standardContextual"/>
             </w:rPr>
           </w:pPr>
-          <w:hyperlink w:anchor="_Toc238106011" w:history="1">
+          <w:hyperlink w:anchor="_Toc238490945" w:history="1">
             <w:r>
               <w:rPr>
                 <w:rStyle w:val="Hipervnculo"/>
@@ -1607,7 +1607,7 @@
                 <w:noProof/>
                 <w:webHidden/>
               </w:rPr>
-              <w:instrText xml:space="preserve"> PAGEREF _Toc238106011 \h </w:instrText>
+              <w:instrText xml:space="preserve"> PAGEREF _Toc238490945 \h </w:instrText>
             </w:r>
             <w:r>
               <w:rPr>
@@ -1655,7 +1655,7 @@
               <w14:ligatures w14:val="standardContextual"/>
             </w:rPr>
           </w:pPr>
-          <w:hyperlink w:anchor="_Toc238106012" w:history="1">
+          <w:hyperlink w:anchor="_Toc238490946" w:history="1">
             <w:r>
               <w:rPr>
                 <w:rStyle w:val="Hipervnculo"/>
@@ -1682,7 +1682,7 @@
                 <w:noProof/>
                 <w:webHidden/>
               </w:rPr>
-              <w:instrText xml:space="preserve"> PAGEREF _Toc238106012 \h </w:instrText>
+              <w:instrText xml:space="preserve"> PAGEREF _Toc238490946 \h </w:instrText>
             </w:r>
             <w:r>
               <w:rPr>
@@ -1730,7 +1730,7 @@
               <w14:ligatures w14:val="standardContextual"/>
             </w:rPr>
           </w:pPr>
-          <w:hyperlink w:anchor="_Toc238106013" w:history="1">
+          <w:hyperlink w:anchor="_Toc238490947" w:history="1">
             <w:r>
               <w:rPr>
                 <w:rStyle w:val="Hipervnculo"/>
@@ -1757,7 +1757,7 @@
                 <w:noProof/>
                 <w:webHidden/>
               </w:rPr>
-              <w:instrText xml:space="preserve"> PAGEREF _Toc238106013 \h </w:instrText>
+              <w:instrText xml:space="preserve"> PAGEREF _Toc238490947 \h </w:instrText>
             </w:r>
             <w:r>
               <w:rPr>
@@ -1805,7 +1805,7 @@
               <w14:ligatures w14:val="standardContextual"/>
             </w:rPr>
           </w:pPr>
-          <w:hyperlink w:anchor="_Toc238106014" w:history="1">
+          <w:hyperlink w:anchor="_Toc238490948" w:history="1">
             <w:r>
               <w:rPr>
                 <w:rStyle w:val="Hipervnculo"/>
@@ -1832,7 +1832,7 @@
                 <w:noProof/>
                 <w:webHidden/>
               </w:rPr>
-              <w:instrText xml:space="preserve"> PAGEREF _Toc238106014 \h </w:instrText>
+              <w:instrText xml:space="preserve"> PAGEREF _Toc238490948 \h </w:instrText>
             </w:r>
             <w:r>
               <w:rPr>
@@ -1880,7 +1880,7 @@
               <w14:ligatures w14:val="standardContextual"/>
             </w:rPr>
           </w:pPr>
-          <w:hyperlink w:anchor="_Toc238106015" w:history="1">
+          <w:hyperlink w:anchor="_Toc238490949" w:history="1">
             <w:r>
               <w:rPr>
                 <w:rStyle w:val="Hipervnculo"/>
@@ -1907,7 +1907,7 @@
                 <w:noProof/>
                 <w:webHidden/>
               </w:rPr>
-              <w:instrText xml:space="preserve"> PAGEREF _Toc238106015 \h </w:instrText>
+              <w:instrText xml:space="preserve"> PAGEREF _Toc238490949 \h </w:instrText>
             </w:r>
             <w:r>
               <w:rPr>
@@ -1955,7 +1955,7 @@
               <w14:ligatures w14:val="standardContextual"/>
             </w:rPr>
           </w:pPr>
-          <w:hyperlink w:anchor="_Toc238106016" w:history="1">
+          <w:hyperlink w:anchor="_Toc238490950" w:history="1">
             <w:r>
               <w:rPr>
                 <w:rStyle w:val="Hipervnculo"/>
@@ -1982,7 +1982,7 @@
                 <w:noProof/>
                 <w:webHidden/>
               </w:rPr>
-              <w:instrText xml:space="preserve"> PAGEREF _Toc238106016 \h </w:instrText>
+              <w:instrText xml:space="preserve"> PAGEREF _Toc238490950 \h </w:instrText>
             </w:r>
             <w:r>
               <w:rPr>
@@ -2030,7 +2030,7 @@
               <w14:ligatures w14:val="standardContextual"/>
             </w:rPr>
           </w:pPr>
-          <w:hyperlink w:anchor="_Toc238106017" w:history="1">
+          <w:hyperlink w:anchor="_Toc238490951" w:history="1">
             <w:r>
               <w:rPr>
                 <w:rStyle w:val="Hipervnculo"/>
@@ -2057,7 +2057,7 @@
                 <w:noProof/>
                 <w:webHidden/>
               </w:rPr>
-              <w:instrText xml:space="preserve"> PAGEREF _Toc238106017 \h </w:instrText>
+              <w:instrText xml:space="preserve"> PAGEREF _Toc238490951 \h </w:instrText>
             </w:r>
             <w:r>
               <w:rPr>
@@ -2105,7 +2105,7 @@
               <w14:ligatures w14:val="standardContextual"/>
             </w:rPr>
           </w:pPr>
-          <w:hyperlink w:anchor="_Toc238106018" w:history="1">
+          <w:hyperlink w:anchor="_Toc238490952" w:history="1">
             <w:r>
               <w:rPr>
                 <w:rStyle w:val="Hipervnculo"/>
@@ -2132,7 +2132,7 @@
                 <w:noProof/>
                 <w:webHidden/>
               </w:rPr>
-              <w:instrText xml:space="preserve"> PAGEREF _Toc238106018 \h </w:instrText>
+              <w:instrText xml:space="preserve"> PAGEREF _Toc238490952 \h </w:instrText>
             </w:r>
             <w:r>
               <w:rPr>
@@ -2180,7 +2180,7 @@
               <w14:ligatures w14:val="standardContextual"/>
             </w:rPr>
           </w:pPr>
-          <w:hyperlink w:anchor="_Toc238106019" w:history="1">
+          <w:hyperlink w:anchor="_Toc238490953" w:history="1">
             <w:r>
               <w:rPr>
                 <w:rStyle w:val="Hipervnculo"/>
@@ -2207,7 +2207,7 @@
                 <w:noProof/>
                 <w:webHidden/>
               </w:rPr>
-              <w:instrText xml:space="preserve"> PAGEREF _Toc238106019 \h </w:instrText>
+              <w:instrText xml:space="preserve"> PAGEREF _Toc238490953 \h </w:instrText>
             </w:r>
             <w:r>
               <w:rPr>
@@ -2255,7 +2255,7 @@
               <w14:ligatures w14:val="standardContextual"/>
             </w:rPr>
           </w:pPr>
-          <w:hyperlink w:anchor="_Toc238106020" w:history="1">
+          <w:hyperlink w:anchor="_Toc238490954" w:history="1">
             <w:r>
               <w:rPr>
                 <w:rStyle w:val="Hipervnculo"/>
@@ -2282,7 +2282,7 @@
                 <w:noProof/>
                 <w:webHidden/>
               </w:rPr>
-              <w:instrText xml:space="preserve"> PAGEREF _Toc238106020 \h </w:instrText>
+              <w:instrText xml:space="preserve"> PAGEREF _Toc238490954 \h </w:instrText>
             </w:r>
             <w:r>
               <w:rPr>
@@ -2330,7 +2330,7 @@
               <w14:ligatures w14:val="standardContextual"/>
             </w:rPr>
           </w:pPr>
-          <w:hyperlink w:anchor="_Toc238106021" w:history="1">
+          <w:hyperlink w:anchor="_Toc238490955" w:history="1">
             <w:r>
               <w:rPr>
                 <w:rStyle w:val="Hipervnculo"/>
@@ -2357,7 +2357,7 @@
                 <w:noProof/>
                 <w:webHidden/>
               </w:rPr>
-              <w:instrText xml:space="preserve"> PAGEREF _Toc238106021 \h </w:instrText>
+              <w:instrText xml:space="preserve"> PAGEREF _Toc238490955 \h </w:instrText>
             </w:r>
             <w:r>
               <w:rPr>
@@ -2405,7 +2405,7 @@
               <w14:ligatures w14:val="standardContextual"/>
             </w:rPr>
           </w:pPr>
-          <w:hyperlink w:anchor="_Toc238106022" w:history="1">
+          <w:hyperlink w:anchor="_Toc238490956" w:history="1">
             <w:r>
               <w:rPr>
                 <w:rStyle w:val="Hipervnculo"/>
@@ -2432,7 +2432,7 @@
                 <w:noProof/>
                 <w:webHidden/>
               </w:rPr>
-              <w:instrText xml:space="preserve"> PAGEREF _Toc238106022 \h </w:instrText>
+              <w:instrText xml:space="preserve"> PAGEREF _Toc238490956 \h </w:instrText>
             </w:r>
             <w:r>
               <w:rPr>
@@ -2480,7 +2480,7 @@
               <w14:ligatures w14:val="standardContextual"/>
             </w:rPr>
           </w:pPr>
-          <w:hyperlink w:anchor="_Toc238106023" w:history="1">
+          <w:hyperlink w:anchor="_Toc238490957" w:history="1">
             <w:r>
               <w:rPr>
                 <w:rStyle w:val="Hipervnculo"/>
@@ -2507,7 +2507,7 @@
                 <w:noProof/>
                 <w:webHidden/>
               </w:rPr>
-              <w:instrText xml:space="preserve"> PAGEREF _Toc238106023 \h </w:instrText>
+              <w:instrText xml:space="preserve"> PAGEREF _Toc238490957 \h </w:instrText>
             </w:r>
             <w:r>
               <w:rPr>
@@ -2555,7 +2555,7 @@
               <w14:ligatures w14:val="standardContextual"/>
             </w:rPr>
           </w:pPr>
-          <w:hyperlink w:anchor="_Toc238106024" w:history="1">
+          <w:hyperlink w:anchor="_Toc238490958" w:history="1">
             <w:r>
               <w:rPr>
                 <w:rStyle w:val="Hipervnculo"/>
@@ -2582,7 +2582,7 @@
                 <w:noProof/>
                 <w:webHidden/>
               </w:rPr>
-              <w:instrText xml:space="preserve"> PAGEREF _Toc238106024 \h </w:instrText>
+              <w:instrText xml:space="preserve"> PAGEREF _Toc238490958 \h </w:instrText>
             </w:r>
             <w:r>
               <w:rPr>
@@ -2630,7 +2630,7 @@
               <w14:ligatures w14:val="standardContextual"/>
             </w:rPr>
           </w:pPr>
-          <w:hyperlink w:anchor="_Toc238106025" w:history="1">
+          <w:hyperlink w:anchor="_Toc238490959" w:history="1">
             <w:r>
               <w:rPr>
                 <w:rStyle w:val="Hipervnculo"/>
@@ -2657,7 +2657,7 @@
                 <w:noProof/>
                 <w:webHidden/>
               </w:rPr>
-              <w:instrText xml:space="preserve"> PAGEREF _Toc238106025 \h </w:instrText>
+              <w:instrText xml:space="preserve"> PAGEREF _Toc238490959 \h </w:instrText>
             </w:r>
             <w:r>
               <w:rPr>
@@ -2705,7 +2705,7 @@
               <w14:ligatures w14:val="standardContextual"/>
             </w:rPr>
           </w:pPr>
-          <w:hyperlink w:anchor="_Toc238106026" w:history="1">
+          <w:hyperlink w:anchor="_Toc238490960" w:history="1">
             <w:r>
               <w:rPr>
                 <w:rStyle w:val="Hipervnculo"/>
@@ -2732,7 +2732,7 @@
                 <w:noProof/>
                 <w:webHidden/>
               </w:rPr>
-              <w:instrText xml:space="preserve"> PAGEREF _Toc238106026 \h </w:instrText>
+              <w:instrText xml:space="preserve"> PAGEREF _Toc238490960 \h </w:instrText>
             </w:r>
             <w:r>
               <w:rPr>
@@ -2780,7 +2780,7 @@
               <w14:ligatures w14:val="standardContextual"/>
             </w:rPr>
           </w:pPr>
-          <w:hyperlink w:anchor="_Toc238106027" w:history="1">
+          <w:hyperlink w:anchor="_Toc238490961" w:history="1">
             <w:r>
               <w:rPr>
                 <w:rStyle w:val="Hipervnculo"/>
@@ -2807,7 +2807,7 @@
                 <w:noProof/>
                 <w:webHidden/>
               </w:rPr>
-              <w:instrText xml:space="preserve"> PAGEREF _Toc238106027 \h </w:instrText>
+              <w:instrText xml:space="preserve"> PAGEREF _Toc238490961 \h </w:instrText>
             </w:r>
             <w:r>
               <w:rPr>
@@ -2855,7 +2855,7 @@
               <w14:ligatures w14:val="standardContextual"/>
             </w:rPr>
           </w:pPr>
-          <w:hyperlink w:anchor="_Toc238106028" w:history="1">
+          <w:hyperlink w:anchor="_Toc238490962" w:history="1">
             <w:r>
               <w:rPr>
                 <w:rStyle w:val="Hipervnculo"/>
@@ -2882,7 +2882,7 @@
                 <w:noProof/>
                 <w:webHidden/>
               </w:rPr>
-              <w:instrText xml:space="preserve"> PAGEREF _Toc238106028 \h </w:instrText>
+              <w:instrText xml:space="preserve"> PAGEREF _Toc238490962 \h </w:instrText>
             </w:r>
             <w:r>
               <w:rPr>
@@ -2930,7 +2930,7 @@
               <w14:ligatures w14:val="standardContextual"/>
             </w:rPr>
           </w:pPr>
-          <w:hyperlink w:anchor="_Toc238106029" w:history="1">
+          <w:hyperlink w:anchor="_Toc238490963" w:history="1">
             <w:r>
               <w:rPr>
                 <w:rStyle w:val="Hipervnculo"/>
@@ -2957,7 +2957,7 @@
                 <w:noProof/>
                 <w:webHidden/>
               </w:rPr>
-              <w:instrText xml:space="preserve"> PAGEREF _Toc238106029 \h </w:instrText>
+              <w:instrText xml:space="preserve"> PAGEREF _Toc238490963 \h </w:instrText>
             </w:r>
             <w:r>
               <w:rPr>
@@ -3005,7 +3005,7 @@
               <w14:ligatures w14:val="standardContextual"/>
             </w:rPr>
           </w:pPr>
-          <w:hyperlink w:anchor="_Toc238106030" w:history="1">
+          <w:hyperlink w:anchor="_Toc238490964" w:history="1">
             <w:r>
               <w:rPr>
                 <w:rStyle w:val="Hipervnculo"/>
@@ -3032,7 +3032,7 @@
                 <w:noProof/>
                 <w:webHidden/>
               </w:rPr>
-              <w:instrText xml:space="preserve"> PAGEREF _Toc238106030 \h </w:instrText>
+              <w:instrText xml:space="preserve"> PAGEREF _Toc238490964 \h </w:instrText>
             </w:r>
             <w:r>
               <w:rPr>
@@ -3080,7 +3080,7 @@
               <w14:ligatures w14:val="standardContextual"/>
             </w:rPr>
           </w:pPr>
-          <w:hyperlink w:anchor="_Toc238106031" w:history="1">
+          <w:hyperlink w:anchor="_Toc238490965" w:history="1">
             <w:r>
               <w:rPr>
                 <w:rStyle w:val="Hipervnculo"/>
@@ -3107,7 +3107,7 @@
                 <w:noProof/>
                 <w:webHidden/>
               </w:rPr>
-              <w:instrText xml:space="preserve"> PAGEREF _Toc238106031 \h </w:instrText>
+              <w:instrText xml:space="preserve"> PAGEREF _Toc238490965 \h </w:instrText>
             </w:r>
             <w:r>
               <w:rPr>
@@ -3155,7 +3155,7 @@
               <w14:ligatures w14:val="standardContextual"/>
             </w:rPr>
           </w:pPr>
-          <w:hyperlink w:anchor="_Toc238106032" w:history="1">
+          <w:hyperlink w:anchor="_Toc238490966" w:history="1">
             <w:r>
               <w:rPr>
                 <w:rStyle w:val="Hipervnculo"/>
@@ -3183,7 +3183,7 @@
                 <w:noProof/>
                 <w:webHidden/>
               </w:rPr>
-              <w:instrText xml:space="preserve"> PAGEREF _Toc238106032 \h </w:instrText>
+              <w:instrText xml:space="preserve"> PAGEREF _Toc238490966 \h </w:instrText>
             </w:r>
             <w:r>
               <w:rPr>
@@ -3231,7 +3231,7 @@
               <w14:ligatures w14:val="standardContextual"/>
             </w:rPr>
           </w:pPr>
-          <w:hyperlink w:anchor="_Toc238106033" w:history="1">
+          <w:hyperlink w:anchor="_Toc238490967" w:history="1">
             <w:r>
               <w:rPr>
                 <w:rStyle w:val="Hipervnculo"/>
@@ -3259,7 +3259,7 @@
                 <w:noProof/>
                 <w:webHidden/>
               </w:rPr>
-              <w:instrText xml:space="preserve"> PAGEREF _Toc238106033 \h </w:instrText>
+              <w:instrText xml:space="preserve"> PAGEREF _Toc238490967 \h </w:instrText>
             </w:r>
             <w:r>
               <w:rPr>
@@ -3307,7 +3307,7 @@
               <w14:ligatures w14:val="standardContextual"/>
             </w:rPr>
           </w:pPr>
-          <w:hyperlink w:anchor="_Toc238106034" w:history="1">
+          <w:hyperlink w:anchor="_Toc238490968" w:history="1">
             <w:r>
               <w:rPr>
                 <w:rStyle w:val="Hipervnculo"/>
@@ -3335,7 +3335,7 @@
                 <w:noProof/>
                 <w:webHidden/>
               </w:rPr>
-              <w:instrText xml:space="preserve"> PAGEREF _Toc238106034 \h </w:instrText>
+              <w:instrText xml:space="preserve"> PAGEREF _Toc238490968 \h </w:instrText>
             </w:r>
             <w:r>
               <w:rPr>
@@ -3383,7 +3383,7 @@
               <w14:ligatures w14:val="standardContextual"/>
             </w:rPr>
           </w:pPr>
-          <w:hyperlink w:anchor="_Toc238106035" w:history="1">
+          <w:hyperlink w:anchor="_Toc238490969" w:history="1">
             <w:r>
               <w:rPr>
                 <w:rStyle w:val="Hipervnculo"/>
@@ -3411,7 +3411,7 @@
                 <w:noProof/>
                 <w:webHidden/>
               </w:rPr>
-              <w:instrText xml:space="preserve"> PAGEREF _Toc238106035 \h </w:instrText>
+              <w:instrText xml:space="preserve"> PAGEREF _Toc238490969 \h </w:instrText>
             </w:r>
             <w:r>
               <w:rPr>
@@ -3459,7 +3459,7 @@
               <w14:ligatures w14:val="standardContextual"/>
             </w:rPr>
           </w:pPr>
-          <w:hyperlink w:anchor="_Toc238106036" w:history="1">
+          <w:hyperlink w:anchor="_Toc238490970" w:history="1">
             <w:r>
               <w:rPr>
                 <w:rStyle w:val="Hipervnculo"/>
@@ -3487,7 +3487,7 @@
                 <w:noProof/>
                 <w:webHidden/>
               </w:rPr>
-              <w:instrText xml:space="preserve"> PAGEREF _Toc238106036 \h </w:instrText>
+              <w:instrText xml:space="preserve"> PAGEREF _Toc238490970 \h </w:instrText>
             </w:r>
             <w:r>
               <w:rPr>
@@ -3535,7 +3535,7 @@
               <w14:ligatures w14:val="standardContextual"/>
             </w:rPr>
           </w:pPr>
-          <w:hyperlink w:anchor="_Toc238106037" w:history="1">
+          <w:hyperlink w:anchor="_Toc238490971" w:history="1">
             <w:r>
               <w:rPr>
                 <w:rStyle w:val="Hipervnculo"/>
@@ -3562,7 +3562,7 @@
                 <w:noProof/>
                 <w:webHidden/>
               </w:rPr>
-              <w:instrText xml:space="preserve"> PAGEREF _Toc238106037 \h </w:instrText>
+              <w:instrText xml:space="preserve"> PAGEREF _Toc238490971 \h </w:instrText>
             </w:r>
             <w:r>
               <w:rPr>
@@ -3610,7 +3610,7 @@
               <w14:ligatures w14:val="standardContextual"/>
             </w:rPr>
           </w:pPr>
-          <w:hyperlink w:anchor="_Toc238106038" w:history="1">
+          <w:hyperlink w:anchor="_Toc238490972" w:history="1">
             <w:r>
               <w:rPr>
                 <w:rStyle w:val="Hipervnculo"/>
@@ -3637,7 +3637,7 @@
                 <w:noProof/>
                 <w:webHidden/>
               </w:rPr>
-              <w:instrText xml:space="preserve"> PAGEREF _Toc238106038 \h </w:instrText>
+              <w:instrText xml:space="preserve"> PAGEREF _Toc238490972 \h </w:instrText>
             </w:r>
             <w:r>
               <w:rPr>
@@ -3685,7 +3685,7 @@
               <w14:ligatures w14:val="standardContextual"/>
             </w:rPr>
           </w:pPr>
-          <w:hyperlink w:anchor="_Toc238106039" w:history="1">
+          <w:hyperlink w:anchor="_Toc238490973" w:history="1">
             <w:r>
               <w:rPr>
                 <w:rStyle w:val="Hipervnculo"/>
@@ -3712,7 +3712,7 @@
                 <w:noProof/>
                 <w:webHidden/>
               </w:rPr>
-              <w:instrText xml:space="preserve"> PAGEREF _Toc238106039 \h </w:instrText>
+              <w:instrText xml:space="preserve"> PAGEREF _Toc238490973 \h </w:instrText>
             </w:r>
             <w:r>
               <w:rPr>
@@ -3760,7 +3760,7 @@
               <w14:ligatures w14:val="standardContextual"/>
             </w:rPr>
           </w:pPr>
-          <w:hyperlink w:anchor="_Toc238106040" w:history="1">
+          <w:hyperlink w:anchor="_Toc238490974" w:history="1">
             <w:r>
               <w:rPr>
                 <w:rStyle w:val="Hipervnculo"/>
@@ -3787,7 +3787,7 @@
                 <w:noProof/>
                 <w:webHidden/>
               </w:rPr>
-              <w:instrText xml:space="preserve"> PAGEREF _Toc238106040 \h </w:instrText>
+              <w:instrText xml:space="preserve"> PAGEREF _Toc238490974 \h </w:instrText>
             </w:r>
             <w:r>
               <w:rPr>
@@ -3835,7 +3835,7 @@
               <w14:ligatures w14:val="standardContextual"/>
             </w:rPr>
           </w:pPr>
-          <w:hyperlink w:anchor="_Toc238106041" w:history="1">
+          <w:hyperlink w:anchor="_Toc238490975" w:history="1">
             <w:r>
               <w:rPr>
                 <w:rStyle w:val="Hipervnculo"/>
@@ -3862,7 +3862,7 @@
                 <w:noProof/>
                 <w:webHidden/>
               </w:rPr>
-              <w:instrText xml:space="preserve"> PAGEREF _Toc238106041 \h </w:instrText>
+              <w:instrText xml:space="preserve"> PAGEREF _Toc238490975 \h </w:instrText>
             </w:r>
             <w:r>
               <w:rPr>
@@ -3910,7 +3910,7 @@
               <w14:ligatures w14:val="standardContextual"/>
             </w:rPr>
           </w:pPr>
-          <w:hyperlink w:anchor="_Toc238106042" w:history="1">
+          <w:hyperlink w:anchor="_Toc238490976" w:history="1">
             <w:r>
               <w:rPr>
                 <w:rStyle w:val="Hipervnculo"/>
@@ -3937,7 +3937,7 @@
                 <w:noProof/>
                 <w:webHidden/>
               </w:rPr>
-              <w:instrText xml:space="preserve"> PAGEREF _Toc238106042 \h </w:instrText>
+              <w:instrText xml:space="preserve"> PAGEREF _Toc238490976 \h </w:instrText>
             </w:r>
             <w:r>
               <w:rPr>
@@ -3985,7 +3985,7 @@
               <w14:ligatures w14:val="standardContextual"/>
             </w:rPr>
           </w:pPr>
-          <w:hyperlink w:anchor="_Toc238106043" w:history="1">
+          <w:hyperlink w:anchor="_Toc238490977" w:history="1">
             <w:r>
               <w:rPr>
                 <w:rStyle w:val="Hipervnculo"/>
@@ -4012,7 +4012,7 @@
                 <w:noProof/>
                 <w:webHidden/>
               </w:rPr>
-              <w:instrText xml:space="preserve"> PAGEREF _Toc238106043 \h </w:instrText>
+              <w:instrText xml:space="preserve"> PAGEREF _Toc238490977 \h </w:instrText>
             </w:r>
             <w:r>
               <w:rPr>
@@ -4060,7 +4060,7 @@
               <w14:ligatures w14:val="standardContextual"/>
             </w:rPr>
           </w:pPr>
-          <w:hyperlink w:anchor="_Toc238106044" w:history="1">
+          <w:hyperlink w:anchor="_Toc238490978" w:history="1">
             <w:r>
               <w:rPr>
                 <w:rStyle w:val="Hipervnculo"/>
@@ -4087,7 +4087,7 @@
                 <w:noProof/>
                 <w:webHidden/>
               </w:rPr>
-              <w:instrText xml:space="preserve"> PAGEREF _Toc238106044 \h </w:instrText>
+              <w:instrText xml:space="preserve"> PAGEREF _Toc238490978 \h </w:instrText>
             </w:r>
             <w:r>
               <w:rPr>
@@ -4135,7 +4135,7 @@
               <w14:ligatures w14:val="standardContextual"/>
             </w:rPr>
           </w:pPr>
-          <w:hyperlink w:anchor="_Toc238106045" w:history="1">
+          <w:hyperlink w:anchor="_Toc238490979" w:history="1">
             <w:r>
               <w:rPr>
                 <w:rStyle w:val="Hipervnculo"/>
@@ -4162,7 +4162,7 @@
                 <w:noProof/>
                 <w:webHidden/>
               </w:rPr>
-              <w:instrText xml:space="preserve"> PAGEREF _Toc238106045 \h </w:instrText>
+              <w:instrText xml:space="preserve"> PAGEREF _Toc238490979 \h </w:instrText>
             </w:r>
             <w:r>
               <w:rPr>
@@ -4210,7 +4210,7 @@
               <w14:ligatures w14:val="standardContextual"/>
             </w:rPr>
           </w:pPr>
-          <w:hyperlink w:anchor="_Toc238106046" w:history="1">
+          <w:hyperlink w:anchor="_Toc238490980" w:history="1">
             <w:r>
               <w:rPr>
                 <w:rStyle w:val="Hipervnculo"/>
@@ -4237,7 +4237,7 @@
                 <w:noProof/>
                 <w:webHidden/>
               </w:rPr>
-              <w:instrText xml:space="preserve"> PAGEREF _Toc238106046 \h </w:instrText>
+              <w:instrText xml:space="preserve"> PAGEREF _Toc238490980 \h </w:instrText>
             </w:r>
             <w:r>
               <w:rPr>
@@ -4285,7 +4285,7 @@
               <w14:ligatures w14:val="standardContextual"/>
             </w:rPr>
           </w:pPr>
-          <w:hyperlink w:anchor="_Toc238106047" w:history="1">
+          <w:hyperlink w:anchor="_Toc238490981" w:history="1">
             <w:r>
               <w:rPr>
                 <w:rStyle w:val="Hipervnculo"/>
@@ -4312,7 +4312,7 @@
                 <w:noProof/>
                 <w:webHidden/>
               </w:rPr>
-              <w:instrText xml:space="preserve"> PAGEREF _Toc238106047 \h </w:instrText>
+              <w:instrText xml:space="preserve"> PAGEREF _Toc238490981 \h </w:instrText>
             </w:r>
             <w:r>
               <w:rPr>
@@ -4360,7 +4360,7 @@
               <w14:ligatures w14:val="standardContextual"/>
             </w:rPr>
           </w:pPr>
-          <w:hyperlink w:anchor="_Toc238106048" w:history="1">
+          <w:hyperlink w:anchor="_Toc238490982" w:history="1">
             <w:r>
               <w:rPr>
                 <w:rStyle w:val="Hipervnculo"/>
@@ -4387,7 +4387,7 @@
                 <w:noProof/>
                 <w:webHidden/>
               </w:rPr>
-              <w:instrText xml:space="preserve"> PAGEREF _Toc238106048 \h </w:instrText>
+              <w:instrText xml:space="preserve"> PAGEREF _Toc238490982 \h </w:instrText>
             </w:r>
             <w:r>
               <w:rPr>
@@ -4435,13 +4435,13 @@
               <w14:ligatures w14:val="standardContextual"/>
             </w:rPr>
           </w:pPr>
-          <w:hyperlink w:anchor="_Toc238106049" w:history="1">
+          <w:hyperlink w:anchor="_Toc238490983" w:history="1">
             <w:r>
               <w:rPr>
                 <w:rStyle w:val="Hipervnculo"/>
                 <w:noProof/>
               </w:rPr>
-              <w:t>Dataset de ejemplo</w:t>
+              <w:t>Rendimiento y eficiencia de arranque</w:t>
             </w:r>
             <w:r>
               <w:rPr>
@@ -4462,7 +4462,7 @@
                 <w:noProof/>
                 <w:webHidden/>
               </w:rPr>
-              <w:instrText xml:space="preserve"> PAGEREF _Toc238106049 \h </w:instrText>
+              <w:instrText xml:space="preserve"> PAGEREF _Toc238490983 \h </w:instrText>
             </w:r>
             <w:r>
               <w:rPr>
@@ -4510,13 +4510,13 @@
               <w14:ligatures w14:val="standardContextual"/>
             </w:rPr>
           </w:pPr>
-          <w:hyperlink w:anchor="_Toc238106050" w:history="1">
+          <w:hyperlink w:anchor="_Toc238490984" w:history="1">
             <w:r>
               <w:rPr>
                 <w:rStyle w:val="Hipervnculo"/>
                 <w:noProof/>
               </w:rPr>
-              <w:t>Resultados del clasificador neuronal</w:t>
+              <w:t>Dataset de ejemplo</w:t>
             </w:r>
             <w:r>
               <w:rPr>
@@ -4537,7 +4537,7 @@
                 <w:noProof/>
                 <w:webHidden/>
               </w:rPr>
-              <w:instrText xml:space="preserve"> PAGEREF _Toc238106050 \h </w:instrText>
+              <w:instrText xml:space="preserve"> PAGEREF _Toc238490984 \h </w:instrText>
             </w:r>
             <w:r>
               <w:rPr>
@@ -4585,13 +4585,13 @@
               <w14:ligatures w14:val="standardContextual"/>
             </w:rPr>
           </w:pPr>
-          <w:hyperlink w:anchor="_Toc238106051" w:history="1">
+          <w:hyperlink w:anchor="_Toc238490985" w:history="1">
             <w:r>
               <w:rPr>
                 <w:rStyle w:val="Hipervnculo"/>
                 <w:noProof/>
               </w:rPr>
-              <w:t>Comportamiento del sistema heurístico</w:t>
+              <w:t>Resultados del clasificador neuronal</w:t>
             </w:r>
             <w:r>
               <w:rPr>
@@ -4612,7 +4612,7 @@
                 <w:noProof/>
                 <w:webHidden/>
               </w:rPr>
-              <w:instrText xml:space="preserve"> PAGEREF _Toc238106051 \h </w:instrText>
+              <w:instrText xml:space="preserve"> PAGEREF _Toc238490985 \h </w:instrText>
             </w:r>
             <w:r>
               <w:rPr>
@@ -4660,13 +4660,13 @@
               <w14:ligatures w14:val="standardContextual"/>
             </w:rPr>
           </w:pPr>
-          <w:hyperlink w:anchor="_Toc238106052" w:history="1">
+          <w:hyperlink w:anchor="_Toc238490986" w:history="1">
             <w:r>
               <w:rPr>
                 <w:rStyle w:val="Hipervnculo"/>
                 <w:noProof/>
               </w:rPr>
-              <w:t>Prueba funcional de la aplicación web</w:t>
+              <w:t>Comportamiento del sistema heurístico</w:t>
             </w:r>
             <w:r>
               <w:rPr>
@@ -4687,7 +4687,7 @@
                 <w:noProof/>
                 <w:webHidden/>
               </w:rPr>
-              <w:instrText xml:space="preserve"> PAGEREF _Toc238106052 \h </w:instrText>
+              <w:instrText xml:space="preserve"> PAGEREF _Toc238490986 \h </w:instrText>
             </w:r>
             <w:r>
               <w:rPr>
@@ -4735,12 +4735,87 @@
               <w14:ligatures w14:val="standardContextual"/>
             </w:rPr>
           </w:pPr>
-          <w:hyperlink w:anchor="_Toc238106053" w:history="1">
+          <w:hyperlink w:anchor="_Toc238490987" w:history="1">
             <w:r>
               <w:rPr>
                 <w:rStyle w:val="Hipervnculo"/>
                 <w:noProof/>
               </w:rPr>
+              <w:t>Prueba funcional de la aplicación web</w:t>
+            </w:r>
+            <w:r>
+              <w:rPr>
+                <w:noProof/>
+                <w:webHidden/>
+              </w:rPr>
+              <w:tab/>
+            </w:r>
+            <w:r>
+              <w:rPr>
+                <w:noProof/>
+                <w:webHidden/>
+              </w:rPr>
+              <w:fldChar w:fldCharType="begin"/>
+            </w:r>
+            <w:r>
+              <w:rPr>
+                <w:noProof/>
+                <w:webHidden/>
+              </w:rPr>
+              <w:instrText xml:space="preserve"> PAGEREF _Toc238490987 \h </w:instrText>
+            </w:r>
+            <w:r>
+              <w:rPr>
+                <w:noProof/>
+                <w:webHidden/>
+              </w:rPr>
+            </w:r>
+            <w:r>
+              <w:rPr>
+                <w:noProof/>
+                <w:webHidden/>
+              </w:rPr>
+              <w:fldChar w:fldCharType="separate"/>
+            </w:r>
+            <w:r>
+              <w:rPr>
+                <w:noProof/>
+                <w:webHidden/>
+              </w:rPr>
+              <w:t>33</w:t>
+            </w:r>
+            <w:r>
+              <w:rPr>
+                <w:noProof/>
+                <w:webHidden/>
+              </w:rPr>
+              <w:fldChar w:fldCharType="end"/>
+            </w:r>
+          </w:hyperlink>
+        </w:p>
+        <w:p>
+          <w:pPr>
+            <w:pStyle w:val="TDC2"/>
+            <w:tabs>
+              <w:tab w:val="right" w:leader="dot" w:pos="8494"/>
+            </w:tabs>
+            <w:rPr>
+              <w:rFonts w:asciiTheme="minorHAnsi" w:hAnsiTheme="minorHAnsi"/>
+              <w:noProof/>
+              <w:color w:val="auto"/>
+              <w:kern w:val="2"/>
+              <w:sz w:val="24"/>
+              <w:szCs w:val="24"/>
+              <w:lang w:eastAsia="es-ES"/>
+              <w14:ligatures w14:val="standardContextual"/>
+            </w:rPr>
+          </w:pPr>
+          <w:hyperlink w:anchor="_Toc238490988" w:history="1">
+            <w:r>
+              <w:rPr>
+                <w:rStyle w:val="Hipervnculo"/>
+                <w:noProof/>
+              </w:rPr>
               <w:t>Discusión</w:t>
             </w:r>
             <w:r>
@@ -4762,7 +4837,7 @@
                 <w:noProof/>
                 <w:webHidden/>
               </w:rPr>
-              <w:instrText xml:space="preserve"> PAGEREF _Toc238106053 \h </w:instrText>
+              <w:instrText xml:space="preserve"> PAGEREF _Toc238490988 \h </w:instrText>
             </w:r>
             <w:r>
               <w:rPr>
@@ -4810,7 +4885,7 @@
               <w14:ligatures w14:val="standardContextual"/>
             </w:rPr>
           </w:pPr>
-          <w:hyperlink w:anchor="_Toc238106054" w:history="1">
+          <w:hyperlink w:anchor="_Toc238490989" w:history="1">
             <w:r>
               <w:rPr>
                 <w:rStyle w:val="Hipervnculo"/>
@@ -4837,7 +4912,7 @@
                 <w:noProof/>
                 <w:webHidden/>
               </w:rPr>
-              <w:instrText xml:space="preserve"> PAGEREF _Toc238106054 \h </w:instrText>
+              <w:instrText xml:space="preserve"> PAGEREF _Toc238490989 \h </w:instrText>
             </w:r>
             <w:r>
               <w:rPr>
@@ -4885,7 +4960,7 @@
               <w14:ligatures w14:val="standardContextual"/>
             </w:rPr>
           </w:pPr>
-          <w:hyperlink w:anchor="_Toc238106055" w:history="1">
+          <w:hyperlink w:anchor="_Toc238490990" w:history="1">
             <w:r>
               <w:rPr>
                 <w:rStyle w:val="Hipervnculo"/>
@@ -4912,7 +4987,7 @@
                 <w:noProof/>
                 <w:webHidden/>
               </w:rPr>
-              <w:instrText xml:space="preserve"> PAGEREF _Toc238106055 \h </w:instrText>
+              <w:instrText xml:space="preserve"> PAGEREF _Toc238490990 \h </w:instrText>
             </w:r>
             <w:r>
               <w:rPr>
@@ -4960,7 +5035,7 @@
               <w14:ligatures w14:val="standardContextual"/>
             </w:rPr>
           </w:pPr>
-          <w:hyperlink w:anchor="_Toc238106056" w:history="1">
+          <w:hyperlink w:anchor="_Toc238490991" w:history="1">
             <w:r>
               <w:rPr>
                 <w:rStyle w:val="Hipervnculo"/>
@@ -4987,7 +5062,7 @@
                 <w:noProof/>
                 <w:webHidden/>
               </w:rPr>
-              <w:instrText xml:space="preserve"> PAGEREF _Toc238106056 \h </w:instrText>
+              <w:instrText xml:space="preserve"> PAGEREF _Toc238490991 \h </w:instrText>
             </w:r>
             <w:r>
               <w:rPr>
@@ -5035,7 +5110,7 @@
               <w14:ligatures w14:val="standardContextual"/>
             </w:rPr>
           </w:pPr>
-          <w:hyperlink w:anchor="_Toc238106057" w:history="1">
+          <w:hyperlink w:anchor="_Toc238490992" w:history="1">
             <w:r>
               <w:rPr>
                 <w:rStyle w:val="Hipervnculo"/>
@@ -5062,7 +5137,7 @@
                 <w:noProof/>
                 <w:webHidden/>
               </w:rPr>
-              <w:instrText xml:space="preserve"> PAGEREF _Toc238106057 \h </w:instrText>
+              <w:instrText xml:space="preserve"> PAGEREF _Toc238490992 \h </w:instrText>
             </w:r>
             <w:r>
               <w:rPr>
@@ -5110,7 +5185,7 @@
               <w14:ligatures w14:val="standardContextual"/>
             </w:rPr>
           </w:pPr>
-          <w:hyperlink w:anchor="_Toc238106058" w:history="1">
+          <w:hyperlink w:anchor="_Toc238490993" w:history="1">
             <w:r>
               <w:rPr>
                 <w:rStyle w:val="Hipervnculo"/>
@@ -5138,7 +5213,7 @@
                 <w:noProof/>
                 <w:webHidden/>
               </w:rPr>
-              <w:instrText xml:space="preserve"> PAGEREF _Toc238106058 \h </w:instrText>
+              <w:instrText xml:space="preserve"> PAGEREF _Toc238490993 \h </w:instrText>
             </w:r>
             <w:r>
               <w:rPr>
@@ -5186,7 +5261,7 @@
               <w14:ligatures w14:val="standardContextual"/>
             </w:rPr>
           </w:pPr>
-          <w:hyperlink w:anchor="_Toc238106059" w:history="1">
+          <w:hyperlink w:anchor="_Toc238490994" w:history="1">
             <w:r>
               <w:rPr>
                 <w:rStyle w:val="Hipervnculo"/>
@@ -5214,7 +5289,7 @@
                 <w:noProof/>
                 <w:webHidden/>
               </w:rPr>
-              <w:instrText xml:space="preserve"> PAGEREF _Toc238106059 \h </w:instrText>
+              <w:instrText xml:space="preserve"> PAGEREF _Toc238490994 \h </w:instrText>
             </w:r>
             <w:r>
               <w:rPr>
@@ -5262,7 +5337,7 @@
               <w14:ligatures w14:val="standardContextual"/>
             </w:rPr>
           </w:pPr>
-          <w:hyperlink w:anchor="_Toc238106060" w:history="1">
+          <w:hyperlink w:anchor="_Toc238490995" w:history="1">
             <w:r>
               <w:rPr>
                 <w:rStyle w:val="Hipervnculo"/>
@@ -5290,7 +5365,7 @@
                 <w:noProof/>
                 <w:webHidden/>
               </w:rPr>
-              <w:instrText xml:space="preserve"> PAGEREF _Toc238106060 \h </w:instrText>
+              <w:instrText xml:space="preserve"> PAGEREF _Toc238490995 \h </w:instrText>
             </w:r>
             <w:r>
               <w:rPr>
@@ -5338,7 +5413,7 @@
               <w14:ligatures w14:val="standardContextual"/>
             </w:rPr>
           </w:pPr>
-          <w:hyperlink w:anchor="_Toc238106061" w:history="1">
+          <w:hyperlink w:anchor="_Toc238490996" w:history="1">
             <w:r>
               <w:rPr>
                 <w:rStyle w:val="Hipervnculo"/>
@@ -5366,7 +5441,7 @@
                 <w:noProof/>
                 <w:webHidden/>
               </w:rPr>
-              <w:instrText xml:space="preserve"> PAGEREF _Toc238106061 \h </w:instrText>
+              <w:instrText xml:space="preserve"> PAGEREF _Toc238490996 \h </w:instrText>
             </w:r>
             <w:r>
               <w:rPr>
@@ -5414,7 +5489,7 @@
               <w14:ligatures w14:val="standardContextual"/>
             </w:rPr>
           </w:pPr>
-          <w:hyperlink w:anchor="_Toc238106062" w:history="1">
+          <w:hyperlink w:anchor="_Toc238490997" w:history="1">
             <w:r>
               <w:rPr>
                 <w:rStyle w:val="Hipervnculo"/>
@@ -5442,7 +5517,7 @@
                 <w:noProof/>
                 <w:webHidden/>
               </w:rPr>
-              <w:instrText xml:space="preserve"> PAGEREF _Toc238106062 \h </w:instrText>
+              <w:instrText xml:space="preserve"> PAGEREF _Toc238490997 \h </w:instrText>
             </w:r>
             <w:r>
               <w:rPr>
@@ -5490,7 +5565,7 @@
               <w14:ligatures w14:val="standardContextual"/>
             </w:rPr>
           </w:pPr>
-          <w:hyperlink w:anchor="_Toc238106063" w:history="1">
+          <w:hyperlink w:anchor="_Toc238490998" w:history="1">
             <w:r>
               <w:rPr>
                 <w:rStyle w:val="Hipervnculo"/>
@@ -5518,7 +5593,7 @@
                 <w:noProof/>
                 <w:webHidden/>
               </w:rPr>
-              <w:instrText xml:space="preserve"> PAGEREF _Toc238106063 \h </w:instrText>
+              <w:instrText xml:space="preserve"> PAGEREF _Toc238490998 \h </w:instrText>
             </w:r>
             <w:r>
               <w:rPr>
@@ -5566,7 +5641,7 @@
               <w14:ligatures w14:val="standardContextual"/>
             </w:rPr>
           </w:pPr>
-          <w:hyperlink w:anchor="_Toc238106064" w:history="1">
+          <w:hyperlink w:anchor="_Toc238490999" w:history="1">
             <w:r>
               <w:rPr>
                 <w:rStyle w:val="Hipervnculo"/>
@@ -5594,7 +5669,7 @@
                 <w:noProof/>
                 <w:webHidden/>
               </w:rPr>
-              <w:instrText xml:space="preserve"> PAGEREF _Toc238106064 \h </w:instrText>
+              <w:instrText xml:space="preserve"> PAGEREF _Toc238490999 \h </w:instrText>
             </w:r>
             <w:r>
               <w:rPr>
@@ -5642,7 +5717,7 @@
               <w14:ligatures w14:val="standardContextual"/>
             </w:rPr>
           </w:pPr>
-          <w:hyperlink w:anchor="_Toc238106065" w:history="1">
+          <w:hyperlink w:anchor="_Toc238491000" w:history="1">
             <w:r>
               <w:rPr>
                 <w:rStyle w:val="Hipervnculo"/>
@@ -5669,7 +5744,7 @@
                 <w:noProof/>
                 <w:webHidden/>
               </w:rPr>
-              <w:instrText xml:space="preserve"> PAGEREF _Toc238106065 \h </w:instrText>
+              <w:instrText xml:space="preserve"> PAGEREF _Toc238491000 \h </w:instrText>
             </w:r>
             <w:r>
               <w:rPr>
@@ -5717,7 +5792,7 @@
               <w14:ligatures w14:val="standardContextual"/>
             </w:rPr>
           </w:pPr>
-          <w:hyperlink w:anchor="_Toc238106066" w:history="1">
+          <w:hyperlink w:anchor="_Toc238491001" w:history="1">
             <w:r>
               <w:rPr>
                 <w:rStyle w:val="Hipervnculo"/>
@@ -5745,7 +5820,7 @@
                 <w:noProof/>
                 <w:webHidden/>
               </w:rPr>
-              <w:instrText xml:space="preserve"> PAGEREF _Toc238106066 \h </w:instrText>
+              <w:instrText xml:space="preserve"> PAGEREF _Toc238491001 \h </w:instrText>
             </w:r>
             <w:r>
               <w:rPr>
@@ -5791,7 +5866,7 @@
       <w:pPr>
         <w:pStyle w:val="Ttulo1"/>
       </w:pPr>
-      <w:bookmarkStart w:id="5" w:name="_Toc238106002"/>
+      <w:bookmarkStart w:id="5" w:name="_Toc238490936"/>
       <w:r>
         <w:lastRenderedPageBreak/>
         <w:t>Introducción</w:t>
@@ -5899,7 +5974,7 @@
       <w:pPr>
         <w:pStyle w:val="Ttulo1"/>
       </w:pPr>
-      <w:bookmarkStart w:id="6" w:name="_Toc238106003"/>
+      <w:bookmarkStart w:id="6" w:name="_Toc238490937"/>
       <w:r>
         <w:lastRenderedPageBreak/>
         <w:t>Marco teórico del phishing</w:t>
@@ -5910,7 +5985,7 @@
       <w:pPr>
         <w:pStyle w:val="Ttulo2"/>
       </w:pPr>
-      <w:bookmarkStart w:id="7" w:name="_Toc238106004"/>
+      <w:bookmarkStart w:id="7" w:name="_Toc238490938"/>
       <w:r>
         <w:t>Concepto y contexto actual</w:t>
       </w:r>
@@ -5952,7 +6027,7 @@
       <w:pPr>
         <w:pStyle w:val="Ttulo2"/>
       </w:pPr>
-      <w:bookmarkStart w:id="8" w:name="_Toc238106005"/>
+      <w:bookmarkStart w:id="8" w:name="_Toc238490939"/>
       <w:r>
         <w:t>Fases de un ataque de phishing</w:t>
       </w:r>
@@ -6185,7 +6260,7 @@
       <w:pPr>
         <w:pStyle w:val="Ttulo3"/>
       </w:pPr>
-      <w:bookmarkStart w:id="9" w:name="_Toc238106006"/>
+      <w:bookmarkStart w:id="9" w:name="_Toc238490940"/>
       <w:r>
         <w:t>Preparación y Recopilación de Información (Reconocimiento)</w:t>
       </w:r>
@@ -6251,7 +6326,7 @@
       <w:pPr>
         <w:pStyle w:val="Ttulo3"/>
       </w:pPr>
-      <w:bookmarkStart w:id="10" w:name="_Toc238106007"/>
+      <w:bookmarkStart w:id="10" w:name="_Toc238490941"/>
       <w:r>
         <w:t>Creación y Lanzamiento del Cebo (Setup y Ataque)</w:t>
       </w:r>
@@ -6335,7 +6410,7 @@
           <w:noProof/>
         </w:rPr>
         <w:drawing>
-          <wp:inline distT="0" distB="0" distL="0" distR="0" wp14:anchorId="5F2B1234" wp14:editId="0E66E6A4">
+          <wp:inline distT="0" distB="0" distL="0" distR="0" wp14:anchorId="5F2B1234" wp14:editId="2F79471A">
             <wp:extent cx="5398135" cy="3598545"/>
             <wp:effectExtent l="0" t="0" r="0" b="1905"/>
             <wp:docPr id="2138688316" name="Imagen 4" descr="Figura o captura del sistema de detección, imagen 2." title="Figura del TFG 2"/>
@@ -6388,7 +6463,7 @@
       <w:pPr>
         <w:pStyle w:val="Ttulo3"/>
       </w:pPr>
-      <w:bookmarkStart w:id="11" w:name="_Toc238106008"/>
+      <w:bookmarkStart w:id="11" w:name="_Toc238490942"/>
       <w:r>
         <w:t>Interacción y Explotación (Colección Inicial)</w:t>
       </w:r>
@@ -6453,7 +6528,7 @@
       <w:pPr>
         <w:pStyle w:val="Ttulo3"/>
       </w:pPr>
-      <w:bookmarkStart w:id="12" w:name="_Toc238106009"/>
+      <w:bookmarkStart w:id="12" w:name="_Toc238490943"/>
       <w:r>
         <w:t>Adquisición y Monetización de los Datos</w:t>
       </w:r>
@@ -7101,7 +7176,7 @@
       <w:pPr>
         <w:pStyle w:val="Ttulo3"/>
       </w:pPr>
-      <w:bookmarkStart w:id="13" w:name="_Toc238106010"/>
+      <w:bookmarkStart w:id="13" w:name="_Toc238490944"/>
       <w:r>
         <w:t>Comparación crítica de modelos de fases</w:t>
       </w:r>
@@ -7742,7 +7817,7 @@
         <w:pStyle w:val="Ttulo3"/>
         <w:spacing w:line="278" w:lineRule="auto"/>
       </w:pPr>
-      <w:bookmarkStart w:id="14" w:name="_Toc238106011"/>
+      <w:bookmarkStart w:id="14" w:name="_Toc238490945"/>
       <w:r>
         <w:lastRenderedPageBreak/>
         <w:t>Puntos de intervención y controles</w:t>
@@ -8348,7 +8423,7 @@
       <w:pPr>
         <w:pStyle w:val="Ttulo2"/>
       </w:pPr>
-      <w:bookmarkStart w:id="15" w:name="_Toc238106012"/>
+      <w:bookmarkStart w:id="15" w:name="_Toc238490946"/>
       <w:r>
         <w:t>Tipos, clasificación y evolución de los ataques de phishing</w:t>
       </w:r>
@@ -8358,7 +8433,7 @@
       <w:pPr>
         <w:pStyle w:val="Ttulo3"/>
       </w:pPr>
-      <w:bookmarkStart w:id="16" w:name="_Toc238106013"/>
+      <w:bookmarkStart w:id="16" w:name="_Toc238490947"/>
       <w:r>
         <w:t>Introducción a la clasificación</w:t>
       </w:r>
@@ -8376,7 +8451,7 @@
       <w:pPr>
         <w:pStyle w:val="Ttulo3"/>
       </w:pPr>
-      <w:bookmarkStart w:id="17" w:name="_Toc238106014"/>
+      <w:bookmarkStart w:id="17" w:name="_Toc238490948"/>
       <w:r>
         <w:t>Clasificación según el vector de entrega</w:t>
       </w:r>
@@ -8450,7 +8525,7 @@
       <w:pPr>
         <w:pStyle w:val="Ttulo3"/>
       </w:pPr>
-      <w:bookmarkStart w:id="18" w:name="_Toc238106015"/>
+      <w:bookmarkStart w:id="18" w:name="_Toc238490949"/>
       <w:r>
         <w:t>Clasificación según el grado de personalización y objetivo</w:t>
       </w:r>
@@ -8528,7 +8603,7 @@
       <w:pPr>
         <w:pStyle w:val="Ttulo3"/>
       </w:pPr>
-      <w:bookmarkStart w:id="19" w:name="_Toc238106016"/>
+      <w:bookmarkStart w:id="19" w:name="_Toc238490950"/>
       <w:r>
         <w:t>Clasificación según la técnica de explotación</w:t>
       </w:r>
@@ -8598,7 +8673,7 @@
       <w:pPr>
         <w:pStyle w:val="Ttulo3"/>
       </w:pPr>
-      <w:bookmarkStart w:id="20" w:name="_Toc238106017"/>
+      <w:bookmarkStart w:id="20" w:name="_Toc238490951"/>
       <w:r>
         <w:t>Evolución histórica resumida</w:t>
       </w:r>
@@ -8696,7 +8771,7 @@
       <w:pPr>
         <w:pStyle w:val="Ttulo3"/>
       </w:pPr>
-      <w:bookmarkStart w:id="21" w:name="_Toc238106018"/>
+      <w:bookmarkStart w:id="21" w:name="_Toc238490952"/>
       <w:r>
         <w:t>Impacto actual (2025)</w:t>
       </w:r>
@@ -8722,7 +8797,7 @@
       <w:pPr>
         <w:pStyle w:val="Ttulo2"/>
       </w:pPr>
-      <w:bookmarkStart w:id="22" w:name="_Toc238106019"/>
+      <w:bookmarkStart w:id="22" w:name="_Toc238490953"/>
       <w:r>
         <w:t>La ingeniería social como fundamento psicológico y sociotécnico del phishing</w:t>
       </w:r>
@@ -8740,7 +8815,7 @@
       <w:pPr>
         <w:pStyle w:val="Ttulo3"/>
       </w:pPr>
-      <w:bookmarkStart w:id="23" w:name="_Toc238106020"/>
+      <w:bookmarkStart w:id="23" w:name="_Toc238490954"/>
       <w:r>
         <w:lastRenderedPageBreak/>
         <w:t>Principios psicológicos fundamentales explotados</w:t>
@@ -9393,7 +9468,7 @@
       <w:pPr>
         <w:pStyle w:val="Ttulo3"/>
       </w:pPr>
-      <w:bookmarkStart w:id="24" w:name="_Toc238106021"/>
+      <w:bookmarkStart w:id="24" w:name="_Toc238490955"/>
       <w:r>
         <w:t>Sesgos cognitivos específicos explotados</w:t>
       </w:r>
@@ -9467,7 +9542,7 @@
       <w:pPr>
         <w:pStyle w:val="Ttulo3"/>
       </w:pPr>
-      <w:bookmarkStart w:id="25" w:name="_Toc238106022"/>
+      <w:bookmarkStart w:id="25" w:name="_Toc238490956"/>
       <w:r>
         <w:t>El impacto de la inteligencia artificial generativa en la ingeniería social (2023-2025)</w:t>
       </w:r>
@@ -9528,7 +9603,7 @@
       <w:pPr>
         <w:pStyle w:val="Ttulo3"/>
       </w:pPr>
-      <w:bookmarkStart w:id="26" w:name="_Toc238106023"/>
+      <w:bookmarkStart w:id="26" w:name="_Toc238490957"/>
       <w:r>
         <w:t>Consecuencias organizativas y humanas</w:t>
       </w:r>
@@ -9554,7 +9629,7 @@
       <w:pPr>
         <w:pStyle w:val="Ttulo3"/>
       </w:pPr>
-      <w:bookmarkStart w:id="27" w:name="_Toc238106024"/>
+      <w:bookmarkStart w:id="27" w:name="_Toc238490958"/>
       <w:r>
         <w:t>Implicaciones para la detección</w:t>
       </w:r>
@@ -9633,7 +9708,7 @@
       <w:pPr>
         <w:pStyle w:val="Ttulo1"/>
       </w:pPr>
-      <w:bookmarkStart w:id="28" w:name="_Toc238106025"/>
+      <w:bookmarkStart w:id="28" w:name="_Toc238490959"/>
       <w:r>
         <w:lastRenderedPageBreak/>
         <w:t>Estado del arte en técnicas de detección y prevención de phishing basadas en Machine Learning y Deep Learning (2018-2025)</w:t>
@@ -9674,7 +9749,7 @@
       <w:pPr>
         <w:pStyle w:val="Ttulo2"/>
       </w:pPr>
-      <w:bookmarkStart w:id="29" w:name="_Toc238106026"/>
+      <w:bookmarkStart w:id="29" w:name="_Toc238490960"/>
       <w:r>
         <w:t>Evolución de los enfoques de detección</w:t>
       </w:r>
@@ -9746,7 +9821,7 @@
       <w:pPr>
         <w:pStyle w:val="Ttulo2"/>
       </w:pPr>
-      <w:bookmarkStart w:id="30" w:name="_Toc238106027"/>
+      <w:bookmarkStart w:id="30" w:name="_Toc238490961"/>
       <w:r>
         <w:t>Técnicas clásicas de Machine Learning (representativas 2019-2022)</w:t>
       </w:r>
@@ -10662,7 +10737,7 @@
       <w:pPr>
         <w:pStyle w:val="Ttulo2"/>
       </w:pPr>
-      <w:bookmarkStart w:id="31" w:name="_Toc238106028"/>
+      <w:bookmarkStart w:id="31" w:name="_Toc238490962"/>
       <w:r>
         <w:t>Técnicas de Deep Learning y Transformers (2023-2025)</w:t>
       </w:r>
@@ -12256,7 +12331,7 @@
       <w:pPr>
         <w:pStyle w:val="Ttulo2"/>
       </w:pPr>
-      <w:bookmarkStart w:id="32" w:name="_Toc238106029"/>
+      <w:bookmarkStart w:id="32" w:name="_Toc238490963"/>
       <w:r>
         <w:t>Enfoques híbridos y basados en comportamiento (UEBA)</w:t>
       </w:r>
@@ -12343,7 +12418,7 @@
       <w:pPr>
         <w:pStyle w:val="Ttulo2"/>
       </w:pPr>
-      <w:bookmarkStart w:id="33" w:name="_Toc238106030"/>
+      <w:bookmarkStart w:id="33" w:name="_Toc238490964"/>
       <w:r>
         <w:t>Limitaciones actuales de los enfoques</w:t>
       </w:r>
@@ -12443,7 +12518,7 @@
       <w:pPr>
         <w:pStyle w:val="Ttulo2"/>
       </w:pPr>
-      <w:bookmarkStart w:id="34" w:name="_Toc238106031"/>
+      <w:bookmarkStart w:id="34" w:name="_Toc238490965"/>
       <w:r>
         <w:t>Conclusiones del estado del arte y hueco de investigación</w:t>
       </w:r>
@@ -12532,7 +12607,7 @@
           <w:bCs/>
         </w:rPr>
       </w:pPr>
-      <w:bookmarkStart w:id="35" w:name="_Toc238106032"/>
+      <w:bookmarkStart w:id="35" w:name="_Toc238490966"/>
       <w:r>
         <w:rPr>
           <w:bCs/>
@@ -12553,7 +12628,7 @@
           <w:bCs/>
         </w:rPr>
       </w:pPr>
-      <w:bookmarkStart w:id="36" w:name="_Toc238106033"/>
+      <w:bookmarkStart w:id="36" w:name="_Toc238490967"/>
       <w:r>
         <w:rPr>
           <w:bCs/>
@@ -12590,7 +12665,7 @@
           <w:bCs/>
         </w:rPr>
       </w:pPr>
-      <w:bookmarkStart w:id="37" w:name="_Toc238106034"/>
+      <w:bookmarkStart w:id="37" w:name="_Toc238490968"/>
       <w:r>
         <w:rPr>
           <w:bCs/>
@@ -13489,7 +13564,7 @@
           <w:bCs/>
         </w:rPr>
       </w:pPr>
-      <w:bookmarkStart w:id="38" w:name="_Toc238106035"/>
+      <w:bookmarkStart w:id="38" w:name="_Toc238490969"/>
       <w:r>
         <w:rPr>
           <w:bCs/>
@@ -14196,7 +14271,7 @@
           <w:bCs/>
         </w:rPr>
       </w:pPr>
-      <w:bookmarkStart w:id="39" w:name="_Toc238106036"/>
+      <w:bookmarkStart w:id="39" w:name="_Toc238490970"/>
       <w:r>
         <w:rPr>
           <w:bCs/>
@@ -14223,7 +14298,7 @@
       <w:pPr>
         <w:pStyle w:val="Ttulo2"/>
       </w:pPr>
-      <w:bookmarkStart w:id="40" w:name="_Toc238106037"/>
+      <w:bookmarkStart w:id="40" w:name="_Toc238490971"/>
       <w:r>
         <w:t>Aspectos éticos y de protección de datos</w:t>
       </w:r>
@@ -14243,7 +14318,7 @@
       <w:pPr>
         <w:pStyle w:val="Ttulo1"/>
       </w:pPr>
-      <w:bookmarkStart w:id="41" w:name="_Toc238106038"/>
+      <w:bookmarkStart w:id="41" w:name="_Toc238490972"/>
       <w:r>
         <w:lastRenderedPageBreak/>
         <w:t>Diseño e implementación de la aplicación web</w:t>
@@ -14280,7 +14355,7 @@
           <w:rFonts w:eastAsiaTheme="minorEastAsia"/>
         </w:rPr>
       </w:pPr>
-      <w:bookmarkStart w:id="42" w:name="_Toc238106039"/>
+      <w:bookmarkStart w:id="42" w:name="_Toc238490973"/>
       <w:r>
         <w:rPr>
           <w:rFonts w:eastAsiaTheme="minorEastAsia"/>
@@ -14319,7 +14394,7 @@
           <w:rFonts w:eastAsiaTheme="minorEastAsia"/>
         </w:rPr>
       </w:pPr>
-      <w:bookmarkStart w:id="43" w:name="_Toc238106040"/>
+      <w:bookmarkStart w:id="43" w:name="_Toc238490974"/>
       <w:r>
         <w:rPr>
           <w:rFonts w:eastAsiaTheme="minorEastAsia"/>
@@ -14365,7 +14440,7 @@
           <w:rFonts w:eastAsiaTheme="minorEastAsia"/>
         </w:rPr>
       </w:pPr>
-      <w:bookmarkStart w:id="44" w:name="_Toc238106041"/>
+      <w:bookmarkStart w:id="44" w:name="_Toc238490975"/>
       <w:r>
         <w:rPr>
           <w:rFonts w:eastAsiaTheme="minorEastAsia"/>
@@ -14428,7 +14503,7 @@
           <w:rFonts w:eastAsiaTheme="minorEastAsia"/>
         </w:rPr>
       </w:pPr>
-      <w:bookmarkStart w:id="45" w:name="_Toc238106042"/>
+      <w:bookmarkStart w:id="45" w:name="_Toc238490976"/>
       <w:r>
         <w:rPr>
           <w:rFonts w:eastAsiaTheme="minorEastAsia"/>
@@ -14509,7 +14584,7 @@
           <w:rFonts w:eastAsiaTheme="minorEastAsia"/>
         </w:rPr>
       </w:pPr>
-      <w:bookmarkStart w:id="46" w:name="_Toc238106043"/>
+      <w:bookmarkStart w:id="46" w:name="_Toc238490977"/>
       <w:r>
         <w:rPr>
           <w:rFonts w:eastAsiaTheme="minorEastAsia"/>
@@ -14565,7 +14640,7 @@
           <w:rFonts w:eastAsiaTheme="minorEastAsia"/>
         </w:rPr>
       </w:pPr>
-      <w:bookmarkStart w:id="47" w:name="_Toc238106044"/>
+      <w:bookmarkStart w:id="47" w:name="_Toc238490978"/>
       <w:r>
         <w:rPr>
           <w:rFonts w:eastAsiaTheme="minorEastAsia"/>
@@ -14611,7 +14686,7 @@
       <w:pPr>
         <w:pStyle w:val="Ttulo2"/>
       </w:pPr>
-      <w:bookmarkStart w:id="48" w:name="_Toc238106045"/>
+      <w:bookmarkStart w:id="48" w:name="_Toc238490979"/>
       <w:r>
         <w:t>Diseño modular</w:t>
       </w:r>
@@ -14655,7 +14730,7 @@
       <w:pPr>
         <w:pStyle w:val="Ttulo2"/>
       </w:pPr>
-      <w:bookmarkStart w:id="49" w:name="_Toc238106046"/>
+      <w:bookmarkStart w:id="49" w:name="_Toc238490980"/>
       <w:r>
         <w:rPr>
           <w:rFonts w:eastAsiaTheme="minorEastAsia"/>
@@ -14695,7 +14770,7 @@
       <w:pPr>
         <w:pStyle w:val="Ttulo1"/>
       </w:pPr>
-      <w:bookmarkStart w:id="50" w:name="_Toc238106047"/>
+      <w:bookmarkStart w:id="50" w:name="_Toc238490981"/>
       <w:r>
         <w:lastRenderedPageBreak/>
         <w:t>Pruebas, resultados y discusión</w:t>
@@ -14706,7 +14781,7 @@
       <w:pPr>
         <w:pStyle w:val="Ttulo2"/>
       </w:pPr>
-      <w:bookmarkStart w:id="51" w:name="_Toc238106048"/>
+      <w:bookmarkStart w:id="51" w:name="_Toc238490982"/>
       <w:r>
         <w:t>Pruebas unitarias y de integración</w:t>
       </w:r>
@@ -14726,11 +14801,36 @@
       <w:pPr>
         <w:pStyle w:val="Ttulo2"/>
       </w:pPr>
-      <w:bookmarkStart w:id="52" w:name="_Toc238106049"/>
+      <w:bookmarkStart w:id="52" w:name="_Toc238490983"/>
+      <w:r>
+        <w:t>Rendimiento y eficiencia de arranque</w:t>
+      </w:r>
+      <w:bookmarkEnd w:id="52"/>
+    </w:p>
+    <w:p>
+      <w:r>
+        <w:t>Para cuantificar el coste operativo se añadió un benchmark reproducible que mide el arranque, el análisis heurístico, la detección de idioma, la carga de modelos y la inferencia. Cada microbenchmark se ejecutó con cinco repeticiones y se tomó la mediana por operación; las importaciones se midieron en procesos nuevos para evitar que la caché de módulos ocultase el coste de inicio.</w:t>
+      </w:r>
+    </w:p>
+    <w:p>
+      <w:r>
+        <w:t>El perfilado localizó el principal cuello de botella en las importaciones anticipadas. Importar únicamente las heurísticas requería 1098,5090 ms y, tras diferir la carga de scikit-learn y del subsistema neuronal, pasó a 37,0194 ms: una reducción del 96,6 % y una aceleración de 29,7 veces. El arranque frío de la aplicación Streamlit bajó de 1326,5726 ms a 315,1490 ms, una mejora del 76,2 % y 4,2 veces.</w:t>
+      </w:r>
+    </w:p>
+    <w:p>
+      <w:r>
+        <w:t>Las rutas de inferencia permanecieron estables: el análisis heurístico pasó de 0,1097 ms a 0,1084 ms, la detección de idioma de 2,8185 ms a 2,8230 ms, la predicción neuronal de 0,3101 ms a 0,3190 ms y el análisis combinado en caliente de 3,4187 ms a 3,3611 ms. Las variaciones de hasta el 3 % se consideran ruido de medición, ya que no se modificaron reglas, pesos ni modelos.</w:t>
+      </w:r>
+    </w:p>
+    <w:p>
+      <w:pPr>
+        <w:pStyle w:val="Ttulo2"/>
+      </w:pPr>
+      <w:bookmarkStart w:id="53" w:name="_Toc238490984"/>
       <w:r>
         <w:t>Dataset de ejemplo</w:t>
       </w:r>
-      <w:bookmarkEnd w:id="52"/>
+      <w:bookmarkEnd w:id="53"/>
     </w:p>
     <w:p>
       <w:r>
@@ -14741,11 +14841,11 @@
       <w:pPr>
         <w:pStyle w:val="Ttulo2"/>
       </w:pPr>
-      <w:bookmarkStart w:id="53" w:name="_Toc238106050"/>
+      <w:bookmarkStart w:id="54" w:name="_Toc238490985"/>
       <w:r>
         <w:t>Resultados del clasificador neuronal</w:t>
       </w:r>
-      <w:bookmarkEnd w:id="53"/>
+      <w:bookmarkEnd w:id="54"/>
     </w:p>
     <w:p>
       <w:r>
@@ -14756,11 +14856,11 @@
       <w:pPr>
         <w:pStyle w:val="Ttulo2"/>
       </w:pPr>
-      <w:bookmarkStart w:id="54" w:name="_Toc238106051"/>
+      <w:bookmarkStart w:id="55" w:name="_Toc238490986"/>
       <w:r>
         <w:t>Comportamiento del sistema heurístico</w:t>
       </w:r>
-      <w:bookmarkEnd w:id="54"/>
+      <w:bookmarkEnd w:id="55"/>
     </w:p>
     <w:p>
       <w:pPr>
@@ -14772,37 +14872,23 @@
         <w:rPr>
           <w:rFonts w:asciiTheme="minorHAnsi" w:hAnsiTheme="minorHAnsi"/>
         </w:rPr>
-        <w:t>El sistema heurístico es deliberadamente conservador: solo clasifica como phishing probable los mensajes que superan el umbral (por defecto 45 sobre 100) acumulando varias señales. Sobre el dataset de ejemplo, construido con mensajes sintéticos sin cabeceras reales (sin Received ni resultados SPF/DKIM/DMARC), la heurística por sí sola detecta las señales de contenido (lenguaje urgente, saludo genérico, solicitud de credenciales o enlaces sospechosos) pero rara vez alcanza el umbral. Este comportamiento es el esperado y evidencia que sus mejores resultados se obtienen con correos reales que incluyen cabeceras de autenticación y enlaces a dominios conocidos: la heurística aporta explicabilidad, mientras que la generalización la aporta el modelo neuronal, de ahí el interés del modo combinado.</w:t>
-      </w:r>
-    </w:p>
-    <w:p>
-      <w:pPr>
-        <w:pStyle w:val="Ttulo2"/>
-      </w:pPr>
-      <w:bookmarkStart w:id="55" w:name="_Toc238106052"/>
-      <w:r>
-        <w:t>Prueba funcional de la aplicación web</w:t>
-      </w:r>
-      <w:bookmarkEnd w:id="55"/>
-    </w:p>
-    <w:p>
-      <w:pPr>
+        <w:t xml:space="preserve">El sistema heurístico es deliberadamente conservador: solo clasifica como phishing probable los mensajes que superan el umbral (por defecto 45 sobre 100) acumulando varias señales. </w:t>
+      </w:r>
+      <w:r>
         <w:rPr>
           <w:rFonts w:asciiTheme="minorHAnsi" w:hAnsiTheme="minorHAnsi"/>
         </w:rPr>
-      </w:pPr>
-      <w:r>
-        <w:t>Se realizaron comprobaciones funcionales sobre mensajes sintéticos en español e inglés y sobre un correo legítimo de control. Las comprobaciones verificaron que el servicio devuelve los tres resultados, aplica el umbral común, selecciona el detector del idioma correspondiente y conserva las señales y explicaciones heurísticas. La suite de 47 pruebas añade casos específicos para la API, el límite de archivos EML, la caché por idioma y el manejo de entradas malformadas; no se presentan estas comprobaciones como una evaluación estadística de producción.</w:t>
+        <w:lastRenderedPageBreak/>
+        <w:t>Sobre el dataset de ejemplo, construido con mensajes sintéticos sin cabeceras reales (sin Received ni resultados SPF/DKIM/DMARC), la heurística por sí sola detecta las señales de contenido (lenguaje urgente, saludo genérico, solicitud de credenciales o enlaces sospechosos) pero rara vez alcanza el umbral. Este comportamiento es el esperado y evidencia que sus mejores resultados se obtienen con correos reales que incluyen cabeceras de autenticación y enlaces a dominios conocidos: la heurística aporta explicabilidad, mientras que la generalización la aporta el modelo neuronal, de ahí el interés del modo combinado.</w:t>
       </w:r>
     </w:p>
     <w:p>
       <w:pPr>
         <w:pStyle w:val="Ttulo2"/>
       </w:pPr>
-      <w:bookmarkStart w:id="56" w:name="_Toc238106053"/>
-      <w:r>
-        <w:lastRenderedPageBreak/>
-        <w:t>Discusión</w:t>
+      <w:bookmarkStart w:id="56" w:name="_Toc238490987"/>
+      <w:r>
+        <w:t>Prueba funcional de la aplicación web</w:t>
       </w:r>
       <w:bookmarkEnd w:id="56"/>
     </w:p>
@@ -14813,6 +14899,26 @@
         </w:rPr>
       </w:pPr>
       <w:r>
+        <w:t>Se realizaron comprobaciones funcionales sobre mensajes sintéticos en español e inglés y sobre un correo legítimo de control. Las comprobaciones verificaron que el servicio devuelve los tres resultados, aplica el umbral común, selecciona el detector del idioma correspondiente y conserva las señales y explicaciones heurísticas. La suite de 47 pruebas añade casos específicos para la API, el límite de archivos EML, la caché por idioma y el manejo de entradas malformadas; no se presentan estas comprobaciones como una evaluación estadística de producción.</w:t>
+      </w:r>
+    </w:p>
+    <w:p>
+      <w:pPr>
+        <w:pStyle w:val="Ttulo2"/>
+      </w:pPr>
+      <w:bookmarkStart w:id="57" w:name="_Toc238490988"/>
+      <w:r>
+        <w:t>Discusión</w:t>
+      </w:r>
+      <w:bookmarkEnd w:id="57"/>
+    </w:p>
+    <w:p>
+      <w:pPr>
+        <w:rPr>
+          <w:rFonts w:asciiTheme="minorHAnsi" w:hAnsiTheme="minorHAnsi"/>
+        </w:rPr>
+      </w:pPr>
+      <w:r>
         <w:t>Los resultados confirman el diseño como una base funcional: la heurística aporta señales comprensibles sobre contenido y cabeceras, el clasificador neuronal reconoce patrones aprendidos y el modo combinado equilibra ambas perspectivas. La principal limitación es el tamaño del conjunto sintético de demostración y la ausencia de un corpus de producción representativo, que pueden provocar sobreajuste y métricas poco generalizables. Para una evaluación rigurosa será necesario entrenar con datasets públicos amplios y recientes y comparar con métodos del estado del arte. Aun así, el prototipo demuestra la viabilidad de integrar reglas explicables y aprendizaje supervisado en una aplicación local con varias interfaces.</w:t>
       </w:r>
     </w:p>
@@ -14821,11 +14927,11 @@
         <w:pStyle w:val="Ttulo1"/>
         <w:pageBreakBefore w:val="0"/>
       </w:pPr>
-      <w:bookmarkStart w:id="57" w:name="_Toc238106054"/>
+      <w:bookmarkStart w:id="58" w:name="_Toc238490989"/>
       <w:r>
         <w:t>Conclusiones</w:t>
       </w:r>
-      <w:bookmarkEnd w:id="57"/>
+      <w:bookmarkEnd w:id="58"/>
     </w:p>
     <w:p>
       <w:pPr>
@@ -14877,6 +14983,7 @@
         </w:rPr>
       </w:pPr>
       <w:r>
+        <w:lastRenderedPageBreak/>
         <w:t>El tercer objetivo, revisar el estado del arte en técnicas de detección, se desarrolla en la sección dedicada a machine learning clásico, deep learning, transformers y enfoques híbridos, y concluye con el hueco de investigación que justifica el prototipo.</w:t>
       </w:r>
     </w:p>
@@ -14917,19 +15024,18 @@
         </w:rPr>
       </w:pPr>
       <w:r>
-        <w:t>Entre los logros principales destacan la modularidad del código, la selección del modelo por idioma, la API local compartida, la extensión de Gmail, la integración de Gmail y Telegram y la incorporación de métricas de exactitud, precisión, recall, F1 y accuracy balanceada en la vista de entrenamiento. El prototipo demuestra la viabilidad de un detector de phishing explicable y extensible dentro del alcance de un Trabajo Fin de Grado.</w:t>
+        <w:t>Entre los logros principales destacan la modularidad del código, la selección del modelo por idioma, la API local compartida, la extensión de Gmail, la integración de Gmail y Telegram, la incorporación de métricas de exactitud, precisión, recall, F1 y accuracy balanceada en la vista de entrenamiento y un benchmark reproducible de rendimiento. La carga diferida reduce el arranque de las heurísticas un 96,6 % y el de la aplicación un 76,2 % sin alterar la inferencia. El prototipo demuestra la viabilidad de un detector de phishing explicable, eficiente y extensible dentro del alcance de un Trabajo Fin de Grado.</w:t>
       </w:r>
     </w:p>
     <w:p>
       <w:pPr>
         <w:pStyle w:val="Ttulo2"/>
       </w:pPr>
-      <w:bookmarkStart w:id="58" w:name="_Toc238106055"/>
-      <w:r>
-        <w:lastRenderedPageBreak/>
+      <w:bookmarkStart w:id="59" w:name="_Toc238490990"/>
+      <w:r>
         <w:t>Trabajo futuro</w:t>
       </w:r>
-      <w:bookmarkEnd w:id="58"/>
+      <w:bookmarkEnd w:id="59"/>
     </w:p>
     <w:p>
       <w:pPr>
@@ -14945,12 +15051,12 @@
       <w:pPr>
         <w:pStyle w:val="Ttulo1"/>
       </w:pPr>
-      <w:bookmarkStart w:id="59" w:name="_Toc238106056"/>
+      <w:bookmarkStart w:id="60" w:name="_Toc238490991"/>
       <w:r>
         <w:lastRenderedPageBreak/>
         <w:t>Glosario</w:t>
       </w:r>
-      <w:bookmarkEnd w:id="59"/>
+      <w:bookmarkEnd w:id="60"/>
     </w:p>
     <w:p>
       <w:pPr>
@@ -15311,12 +15417,12 @@
       <w:pPr>
         <w:pStyle w:val="Ttulo1"/>
       </w:pPr>
-      <w:bookmarkStart w:id="60" w:name="_Toc238106057"/>
+      <w:bookmarkStart w:id="61" w:name="_Toc238490992"/>
       <w:r>
         <w:lastRenderedPageBreak/>
         <w:t>Referencias</w:t>
       </w:r>
-      <w:bookmarkEnd w:id="60"/>
+      <w:bookmarkEnd w:id="61"/>
     </w:p>
     <w:p>
       <w:pPr>
@@ -15647,14 +15753,14 @@
           <w:bCs/>
         </w:rPr>
       </w:pPr>
-      <w:bookmarkStart w:id="61" w:name="_Toc238106058"/>
+      <w:bookmarkStart w:id="62" w:name="_Toc238490993"/>
       <w:r>
         <w:rPr>
           <w:bCs/>
         </w:rPr>
         <w:t>Anexos</w:t>
       </w:r>
-      <w:bookmarkEnd w:id="61"/>
+      <w:bookmarkEnd w:id="62"/>
     </w:p>
     <w:p>
       <w:r>
@@ -15668,14 +15774,14 @@
           <w:bCs/>
         </w:rPr>
       </w:pPr>
-      <w:bookmarkStart w:id="62" w:name="_Toc238106059"/>
+      <w:bookmarkStart w:id="63" w:name="_Toc238490994"/>
       <w:r>
         <w:rPr>
           <w:bCs/>
         </w:rPr>
         <w:t>Anexo A: Estructura del repositorio</w:t>
       </w:r>
-      <w:bookmarkEnd w:id="62"/>
+      <w:bookmarkEnd w:id="63"/>
     </w:p>
     <w:p>
       <w:r>
@@ -16036,14 +16142,14 @@
           <w:bCs/>
         </w:rPr>
       </w:pPr>
-      <w:bookmarkStart w:id="63" w:name="_Toc238106060"/>
+      <w:bookmarkStart w:id="64" w:name="_Toc238490995"/>
       <w:r>
         <w:rPr>
           <w:bCs/>
         </w:rPr>
         <w:t>Anexo B: Fragmentos de código fuente</w:t>
       </w:r>
-      <w:bookmarkEnd w:id="63"/>
+      <w:bookmarkEnd w:id="64"/>
     </w:p>
     <w:p>
       <w:r>
@@ -16057,14 +16163,14 @@
           <w:bCs/>
         </w:rPr>
       </w:pPr>
-      <w:bookmarkStart w:id="64" w:name="_Toc238106061"/>
+      <w:bookmarkStart w:id="65" w:name="_Toc238490996"/>
       <w:r>
         <w:rPr>
           <w:bCs/>
         </w:rPr>
         <w:t>B.1. Fachada del análisis heurístico (heuristicas.py)</w:t>
       </w:r>
-      <w:bookmarkEnd w:id="64"/>
+      <w:bookmarkEnd w:id="65"/>
     </w:p>
     <w:p>
       <w:pPr>
@@ -16153,14 +16259,14 @@
           <w:bCs/>
         </w:rPr>
       </w:pPr>
-      <w:bookmarkStart w:id="65" w:name="_Toc238106062"/>
+      <w:bookmarkStart w:id="66" w:name="_Toc238490997"/>
       <w:r>
         <w:rPr>
           <w:bCs/>
         </w:rPr>
         <w:t>B.2. Servicio común de análisis (analysis_service.py)</w:t>
       </w:r>
-      <w:bookmarkEnd w:id="65"/>
+      <w:bookmarkEnd w:id="66"/>
     </w:p>
     <w:p>
       <w:pPr>
@@ -16610,14 +16716,14 @@
           <w:bCs/>
         </w:rPr>
       </w:pPr>
-      <w:bookmarkStart w:id="66" w:name="_Toc238106063"/>
+      <w:bookmarkStart w:id="67" w:name="_Toc238490998"/>
       <w:r>
         <w:rPr>
           <w:bCs/>
         </w:rPr>
         <w:t>B.3. Núcleo del clasificador neuronal (modelo_neural.py)</w:t>
       </w:r>
-      <w:bookmarkEnd w:id="66"/>
+      <w:bookmarkEnd w:id="67"/>
     </w:p>
     <w:p>
       <w:pPr>
@@ -16898,7 +17004,7 @@
           <w:bCs/>
         </w:rPr>
       </w:pPr>
-      <w:bookmarkStart w:id="67" w:name="_Toc238106064"/>
+      <w:bookmarkStart w:id="68" w:name="_Toc238490999"/>
       <w:r>
         <w:rPr>
           <w:bCs/>
@@ -16906,7 +17012,7 @@
         <w:lastRenderedPageBreak/>
         <w:t>Anexo C: Guía resumida de instalación y uso</w:t>
       </w:r>
-      <w:bookmarkEnd w:id="67"/>
+      <w:bookmarkEnd w:id="68"/>
     </w:p>
     <w:p>
       <w:r>
@@ -17046,11 +17152,11 @@
       <w:pPr>
         <w:pStyle w:val="Ttulo2"/>
       </w:pPr>
-      <w:bookmarkStart w:id="68" w:name="_Toc238106065"/>
+      <w:bookmarkStart w:id="69" w:name="_Toc238491000"/>
       <w:r>
         <w:t>C.1. Uso del prototipo</w:t>
       </w:r>
-      <w:bookmarkEnd w:id="68"/>
+      <w:bookmarkEnd w:id="69"/>
     </w:p>
     <w:p>
       <w:r>
@@ -17084,14 +17190,14 @@
           <w:bCs/>
         </w:rPr>
       </w:pPr>
-      <w:bookmarkStart w:id="69" w:name="_Toc238106066"/>
+      <w:bookmarkStart w:id="70" w:name="_Toc238491001"/>
       <w:r>
         <w:rPr>
           <w:bCs/>
         </w:rPr>
         <w:t>Anexo D: Lista de verificación de la validación</w:t>
       </w:r>
-      <w:bookmarkEnd w:id="69"/>
+      <w:bookmarkEnd w:id="70"/>
     </w:p>
     <w:p>
       <w:r>
@@ -17107,6 +17213,12 @@
       </w:r>
     </w:p>
     <w:p>
+      <w:r>
+        <w:lastRenderedPageBreak/>
+        <w:t>Verificado: Benchmark reproducible de arranque e inferencia con comparación antes/después.</w:t>
+      </w:r>
+    </w:p>
+    <w:p>
       <w:pPr>
         <w:pStyle w:val="ListadecomprobacinTFG"/>
       </w:pPr>
@@ -17119,7 +17231,6 @@
         <w:pStyle w:val="ListadecomprobacinTFG"/>
       </w:pPr>
       <w:r>
-        <w:lastRenderedPageBreak/>
         <w:t>Verificado: Entrenamiento del modelo TF-IDF + MLP en español e inglés.</w:t>
       </w:r>
     </w:p>
@@ -17193,7 +17304,7 @@
 </file>
 
 <file path=word/endnotes.xml><?xml version="1.0" encoding="utf-8"?>
-<w:endnotes xmlns:wpc="http://schemas.microsoft.com/office/word/2010/wordprocessingCanvas" xmlns:cx="http://schemas.microsoft.com/office/drawing/2014/chartex" xmlns:cx1="http://schemas.microsoft.com/office/drawing/2015/9/8/chartex" xmlns:cx2="http://schemas.microsoft.com/office/drawing/2015/10/21/chartex" xmlns:cx3="http://schemas.microsoft.com/office/drawing/2016/5/9/chartex" xmlns:cx4="http://schemas.microsoft.com/office/drawing/2016/5/10/chartex" xmlns:cx5="http://schemas.microsoft.com/office/drawing/2016/5/11/chartex" xmlns:cx6="http://schemas.microsoft.com/office/drawing/2016/5/12/chartex" xmlns:cx7="http://schemas.microsoft.com/office/drawing/2016/5/13/chartex" xmlns:cx8="http://schemas.microsoft.com/office/drawing/2016/5/14/chartex" xmlns:mc="http://schemas.openxmlformats.org/markup-compatibility/2006" xmlns:aink="http://schemas.microsoft.com/office/drawing/2016/ink" xmlns:am3d="http://schemas.microsoft.com/office/drawing/2017/model3d" xmlns:o="urn:schemas-microsoft-com:office:office" xmlns:oel="http://schemas.microsoft.com/office/2019/extlst" xmlns:r="http://schemas.openxmlformats.org/officeDocument/2006/relationships" xmlns:m="http://schemas.openxmlformats.org/officeDocument/2006/math" xmlns:v="urn:schemas-microsoft-com:vml" xmlns:wp14="http://schemas.microsoft.com/office/word/2010/wordprocessingDrawing" xmlns:wp="http://schemas.openxmlformats.org/drawingml/2006/wordprocessingDrawing" xmlns:w10="urn:schemas-microsoft-com:office:word" xmlns:w="http://schemas.openxmlformats.org/wordprocessingml/2006/main" xmlns:w14="http://schemas.microsoft.com/office/word/2010/wordml" xmlns:w15="http://schemas.microsoft.com/office/word/2012/wordml" xmlns:w16cei="http://schemas.microsoft.com/office/word/2026/wordml/cei" xmlns:w16cex="http://schemas.microsoft.com/office/word/2018/wordml/cex" xmlns:w16cid="http://schemas.microsoft.com/office/word/2016/wordml/cid" xmlns:w16="http://schemas.microsoft.com/office/word/2018/wordml" xmlns:w16du="http://schemas.microsoft.com/office/word/2023/wordml/word16du" xmlns:w16sdtdh="http://schemas.microsoft.com/office/word/2020/wordml/sdtdatahash" xmlns:w16sdtfl="http://schemas.microsoft.com/office/word/2024/wordml/sdtformatlock" xmlns:w16se="http://schemas.microsoft.com/office/word/2015/wordml/symex" xmlns:wpg="http://schemas.microsoft.com/office/word/2010/wordprocessingGroup" xmlns:wpi="http://schemas.microsoft.com/office/word/2010/wordprocessingInk" xmlns:wne="http://schemas.microsoft.com/office/word/2006/wordml" xmlns:wps="http://schemas.microsoft.com/office/word/2010/wordprocessingShape" mc:Ignorable="w14 w15 w16se w16cid w16 w16cex w16sdtdh w16sdtfl w16du wp14">
+<w:endnotes xmlns:wpc="http://schemas.microsoft.com/office/word/2010/wordprocessingCanvas" xmlns:cx="http://schemas.microsoft.com/office/drawing/2014/chartex" xmlns:cx1="http://schemas.microsoft.com/office/drawing/2015/9/8/chartex" xmlns:cx2="http://schemas.microsoft.com/office/drawing/2015/10/21/chartex" xmlns:cx3="http://schemas.microsoft.com/office/drawing/2016/5/9/chartex" xmlns:cx4="http://schemas.microsoft.com/office/drawing/2016/5/10/chartex" xmlns:cx5="http://schemas.microsoft.com/office/drawing/2016/5/11/chartex" xmlns:cx6="http://schemas.microsoft.com/office/drawing/2016/5/12/chartex" xmlns:cx7="http://schemas.microsoft.com/office/drawing/2016/5/13/chartex" xmlns:cx8="http://schemas.microsoft.com/office/drawing/2016/5/14/chartex" xmlns:mc="http://schemas.openxmlformats.org/markup-compatibility/2006" xmlns:aink="http://schemas.microsoft.com/office/drawing/2016/ink" xmlns:am3d="http://schemas.microsoft.com/office/drawing/2017/model3d" xmlns:o="urn:schemas-microsoft-com:office:office" xmlns:oel="http://schemas.microsoft.com/office/2019/extlst" xmlns:r="http://schemas.openxmlformats.org/officeDocument/2006/relationships" xmlns:m="http://schemas.openxmlformats.org/officeDocument/2006/math" xmlns:v="urn:schemas-microsoft-com:vml" xmlns:wp14="http://schemas.microsoft.com/office/word/2010/wordprocessingDrawing" xmlns:wp="http://schemas.openxmlformats.org/drawingml/2006/wordprocessingDrawing" xmlns:w10="urn:schemas-microsoft-com:office:word" xmlns:w="http://schemas.openxmlformats.org/wordprocessingml/2006/main" xmlns:w14="http://schemas.microsoft.com/office/word/2010/wordml" xmlns:w15="http://schemas.microsoft.com/office/word/2012/wordml" xmlns:w16cex="http://schemas.microsoft.com/office/word/2018/wordml/cex" xmlns:w16cid="http://schemas.microsoft.com/office/word/2016/wordml/cid" xmlns:w16="http://schemas.microsoft.com/office/word/2018/wordml" xmlns:w16du="http://schemas.microsoft.com/office/word/2023/wordml/word16du" xmlns:w16sdtdh="http://schemas.microsoft.com/office/word/2020/wordml/sdtdatahash" xmlns:w16sdtfl="http://schemas.microsoft.com/office/word/2024/wordml/sdtformatlock" xmlns:w16se="http://schemas.microsoft.com/office/word/2015/wordml/symex" xmlns:wpg="http://schemas.microsoft.com/office/word/2010/wordprocessingGroup" xmlns:wpi="http://schemas.microsoft.com/office/word/2010/wordprocessingInk" xmlns:wne="http://schemas.microsoft.com/office/word/2006/wordml" xmlns:wps="http://schemas.microsoft.com/office/word/2010/wordprocessingShape" mc:Ignorable="w14 w15 w16se w16cid w16 w16cex w16sdtdh w16sdtfl w16du wp14">
   <w:endnote w:type="separator" w:id="-1">
     <w:p>
       <w:pPr>
@@ -17218,7 +17329,7 @@
 </file>
 
 <file path=word/footer1.xml><?xml version="1.0" encoding="utf-8"?>
-<w:ftr xmlns:wpc="http://schemas.microsoft.com/office/word/2010/wordprocessingCanvas" xmlns:cx="http://schemas.microsoft.com/office/drawing/2014/chartex" xmlns:cx1="http://schemas.microsoft.com/office/drawing/2015/9/8/chartex" xmlns:cx2="http://schemas.microsoft.com/office/drawing/2015/10/21/chartex" xmlns:cx3="http://schemas.microsoft.com/office/drawing/2016/5/9/chartex" xmlns:cx4="http://schemas.microsoft.com/office/drawing/2016/5/10/chartex" xmlns:cx5="http://schemas.microsoft.com/office/drawing/2016/5/11/chartex" xmlns:cx6="http://schemas.microsoft.com/office/drawing/2016/5/12/chartex" xmlns:cx7="http://schemas.microsoft.com/office/drawing/2016/5/13/chartex" xmlns:cx8="http://schemas.microsoft.com/office/drawing/2016/5/14/chartex" xmlns:mc="http://schemas.openxmlformats.org/markup-compatibility/2006" xmlns:aink="http://schemas.microsoft.com/office/drawing/2016/ink" xmlns:am3d="http://schemas.microsoft.com/office/drawing/2017/model3d" xmlns:o="urn:schemas-microsoft-com:office:office" xmlns:oel="http://schemas.microsoft.com/office/2019/extlst" xmlns:r="http://schemas.openxmlformats.org/officeDocument/2006/relationships" xmlns:m="http://schemas.openxmlformats.org/officeDocument/2006/math" xmlns:v="urn:schemas-microsoft-com:vml" xmlns:wp14="http://schemas.microsoft.com/office/word/2010/wordprocessingDrawing" xmlns:wp="http://schemas.openxmlformats.org/drawingml/2006/wordprocessingDrawing" xmlns:w10="urn:schemas-microsoft-com:office:word" xmlns:w="http://schemas.openxmlformats.org/wordprocessingml/2006/main" xmlns:w14="http://schemas.microsoft.com/office/word/2010/wordml" xmlns:w15="http://schemas.microsoft.com/office/word/2012/wordml" xmlns:w16cei="http://schemas.microsoft.com/office/word/2026/wordml/cei" xmlns:w16cex="http://schemas.microsoft.com/office/word/2018/wordml/cex" xmlns:w16cid="http://schemas.microsoft.com/office/word/2016/wordml/cid" xmlns:w16="http://schemas.microsoft.com/office/word/2018/wordml" xmlns:w16du="http://schemas.microsoft.com/office/word/2023/wordml/word16du" xmlns:w16sdtdh="http://schemas.microsoft.com/office/word/2020/wordml/sdtdatahash" xmlns:w16sdtfl="http://schemas.microsoft.com/office/word/2024/wordml/sdtformatlock" xmlns:w16se="http://schemas.microsoft.com/office/word/2015/wordml/symex" xmlns:wpg="http://schemas.microsoft.com/office/word/2010/wordprocessingGroup" xmlns:wpi="http://schemas.microsoft.com/office/word/2010/wordprocessingInk" xmlns:wne="http://schemas.microsoft.com/office/word/2006/wordml" xmlns:wps="http://schemas.microsoft.com/office/word/2010/wordprocessingShape" mc:Ignorable="w14 w15 w16se w16cid w16 w16cex w16sdtdh w16sdtfl w16du wp14">
+<w:ftr xmlns:wpc="http://schemas.microsoft.com/office/word/2010/wordprocessingCanvas" xmlns:cx="http://schemas.microsoft.com/office/drawing/2014/chartex" xmlns:cx1="http://schemas.microsoft.com/office/drawing/2015/9/8/chartex" xmlns:cx2="http://schemas.microsoft.com/office/drawing/2015/10/21/chartex" xmlns:cx3="http://schemas.microsoft.com/office/drawing/2016/5/9/chartex" xmlns:cx4="http://schemas.microsoft.com/office/drawing/2016/5/10/chartex" xmlns:cx5="http://schemas.microsoft.com/office/drawing/2016/5/11/chartex" xmlns:cx6="http://schemas.microsoft.com/office/drawing/2016/5/12/chartex" xmlns:cx7="http://schemas.microsoft.com/office/drawing/2016/5/13/chartex" xmlns:cx8="http://schemas.microsoft.com/office/drawing/2016/5/14/chartex" xmlns:mc="http://schemas.openxmlformats.org/markup-compatibility/2006" xmlns:aink="http://schemas.microsoft.com/office/drawing/2016/ink" xmlns:am3d="http://schemas.microsoft.com/office/drawing/2017/model3d" xmlns:o="urn:schemas-microsoft-com:office:office" xmlns:oel="http://schemas.microsoft.com/office/2019/extlst" xmlns:r="http://schemas.openxmlformats.org/officeDocument/2006/relationships" xmlns:m="http://schemas.openxmlformats.org/officeDocument/2006/math" xmlns:v="urn:schemas-microsoft-com:vml" xmlns:wp14="http://schemas.microsoft.com/office/word/2010/wordprocessingDrawing" xmlns:wp="http://schemas.openxmlformats.org/drawingml/2006/wordprocessingDrawing" xmlns:w10="urn:schemas-microsoft-com:office:word" xmlns:w="http://schemas.openxmlformats.org/wordprocessingml/2006/main" xmlns:w14="http://schemas.microsoft.com/office/word/2010/wordml" xmlns:w15="http://schemas.microsoft.com/office/word/2012/wordml" xmlns:w16cex="http://schemas.microsoft.com/office/word/2018/wordml/cex" xmlns:w16cid="http://schemas.microsoft.com/office/word/2016/wordml/cid" xmlns:w16="http://schemas.microsoft.com/office/word/2018/wordml" xmlns:w16du="http://schemas.microsoft.com/office/word/2023/wordml/word16du" xmlns:w16sdtdh="http://schemas.microsoft.com/office/word/2020/wordml/sdtdatahash" xmlns:w16sdtfl="http://schemas.microsoft.com/office/word/2024/wordml/sdtformatlock" xmlns:w16se="http://schemas.microsoft.com/office/word/2015/wordml/symex" xmlns:wpg="http://schemas.microsoft.com/office/word/2010/wordprocessingGroup" xmlns:wpi="http://schemas.microsoft.com/office/word/2010/wordprocessingInk" xmlns:wne="http://schemas.microsoft.com/office/word/2006/wordml" xmlns:wps="http://schemas.microsoft.com/office/word/2010/wordprocessingShape" mc:Ignorable="w14 w15 w16se w16cid w16 w16cex w16sdtdh w16sdtfl w16du wp14">
   <w:sdt>
     <w:sdtPr>
       <w:id w:val="1724796077"/>
@@ -17261,7 +17372,7 @@
 </file>
 
 <file path=word/footnotes.xml><?xml version="1.0" encoding="utf-8"?>
-<w:footnotes xmlns:wpc="http://schemas.microsoft.com/office/word/2010/wordprocessingCanvas" xmlns:cx="http://schemas.microsoft.com/office/drawing/2014/chartex" xmlns:cx1="http://schemas.microsoft.com/office/drawing/2015/9/8/chartex" xmlns:cx2="http://schemas.microsoft.com/office/drawing/2015/10/21/chartex" xmlns:cx3="http://schemas.microsoft.com/office/drawing/2016/5/9/chartex" xmlns:cx4="http://schemas.microsoft.com/office/drawing/2016/5/10/chartex" xmlns:cx5="http://schemas.microsoft.com/office/drawing/2016/5/11/chartex" xmlns:cx6="http://schemas.microsoft.com/office/drawing/2016/5/12/chartex" xmlns:cx7="http://schemas.microsoft.com/office/drawing/2016/5/13/chartex" xmlns:cx8="http://schemas.microsoft.com/office/drawing/2016/5/14/chartex" xmlns:mc="http://schemas.openxmlformats.org/markup-compatibility/2006" xmlns:aink="http://schemas.microsoft.com/office/drawing/2016/ink" xmlns:am3d="http://schemas.microsoft.com/office/drawing/2017/model3d" xmlns:o="urn:schemas-microsoft-com:office:office" xmlns:oel="http://schemas.microsoft.com/office/2019/extlst" xmlns:r="http://schemas.openxmlformats.org/officeDocument/2006/relationships" xmlns:m="http://schemas.openxmlformats.org/officeDocument/2006/math" xmlns:v="urn:schemas-microsoft-com:vml" xmlns:wp14="http://schemas.microsoft.com/office/word/2010/wordprocessingDrawing" xmlns:wp="http://schemas.openxmlformats.org/drawingml/2006/wordprocessingDrawing" xmlns:w10="urn:schemas-microsoft-com:office:word" xmlns:w="http://schemas.openxmlformats.org/wordprocessingml/2006/main" xmlns:w14="http://schemas.microsoft.com/office/word/2010/wordml" xmlns:w15="http://schemas.microsoft.com/office/word/2012/wordml" xmlns:w16cei="http://schemas.microsoft.com/office/word/2026/wordml/cei" xmlns:w16cex="http://schemas.microsoft.com/office/word/2018/wordml/cex" xmlns:w16cid="http://schemas.microsoft.com/office/word/2016/wordml/cid" xmlns:w16="http://schemas.microsoft.com/office/word/2018/wordml" xmlns:w16du="http://schemas.microsoft.com/office/word/2023/wordml/word16du" xmlns:w16sdtdh="http://schemas.microsoft.com/office/word/2020/wordml/sdtdatahash" xmlns:w16sdtfl="http://schemas.microsoft.com/office/word/2024/wordml/sdtformatlock" xmlns:w16se="http://schemas.microsoft.com/office/word/2015/wordml/symex" xmlns:wpg="http://schemas.microsoft.com/office/word/2010/wordprocessingGroup" xmlns:wpi="http://schemas.microsoft.com/office/word/2010/wordprocessingInk" xmlns:wne="http://schemas.microsoft.com/office/word/2006/wordml" xmlns:wps="http://schemas.microsoft.com/office/word/2010/wordprocessingShape" mc:Ignorable="w14 w15 w16se w16cid w16 w16cex w16sdtdh w16sdtfl w16du wp14">
+<w:footnotes xmlns:wpc="http://schemas.microsoft.com/office/word/2010/wordprocessingCanvas" xmlns:cx="http://schemas.microsoft.com/office/drawing/2014/chartex" xmlns:cx1="http://schemas.microsoft.com/office/drawing/2015/9/8/chartex" xmlns:cx2="http://schemas.microsoft.com/office/drawing/2015/10/21/chartex" xmlns:cx3="http://schemas.microsoft.com/office/drawing/2016/5/9/chartex" xmlns:cx4="http://schemas.microsoft.com/office/drawing/2016/5/10/chartex" xmlns:cx5="http://schemas.microsoft.com/office/drawing/2016/5/11/chartex" xmlns:cx6="http://schemas.microsoft.com/office/drawing/2016/5/12/chartex" xmlns:cx7="http://schemas.microsoft.com/office/drawing/2016/5/13/chartex" xmlns:cx8="http://schemas.microsoft.com/office/drawing/2016/5/14/chartex" xmlns:mc="http://schemas.openxmlformats.org/markup-compatibility/2006" xmlns:aink="http://schemas.microsoft.com/office/drawing/2016/ink" xmlns:am3d="http://schemas.microsoft.com/office/drawing/2017/model3d" xmlns:o="urn:schemas-microsoft-com:office:office" xmlns:oel="http://schemas.microsoft.com/office/2019/extlst" xmlns:r="http://schemas.openxmlformats.org/officeDocument/2006/relationships" xmlns:m="http://schemas.openxmlformats.org/officeDocument/2006/math" xmlns:v="urn:schemas-microsoft-com:vml" xmlns:wp14="http://schemas.microsoft.com/office/word/2010/wordprocessingDrawing" xmlns:wp="http://schemas.openxmlformats.org/drawingml/2006/wordprocessingDrawing" xmlns:w10="urn:schemas-microsoft-com:office:word" xmlns:w="http://schemas.openxmlformats.org/wordprocessingml/2006/main" xmlns:w14="http://schemas.microsoft.com/office/word/2010/wordml" xmlns:w15="http://schemas.microsoft.com/office/word/2012/wordml" xmlns:w16cex="http://schemas.microsoft.com/office/word/2018/wordml/cex" xmlns:w16cid="http://schemas.microsoft.com/office/word/2016/wordml/cid" xmlns:w16="http://schemas.microsoft.com/office/word/2018/wordml" xmlns:w16du="http://schemas.microsoft.com/office/word/2023/wordml/word16du" xmlns:w16sdtdh="http://schemas.microsoft.com/office/word/2020/wordml/sdtdatahash" xmlns:w16sdtfl="http://schemas.microsoft.com/office/word/2024/wordml/sdtformatlock" xmlns:w16se="http://schemas.microsoft.com/office/word/2015/wordml/symex" xmlns:wpg="http://schemas.microsoft.com/office/word/2010/wordprocessingGroup" xmlns:wpi="http://schemas.microsoft.com/office/word/2010/wordprocessingInk" xmlns:wne="http://schemas.microsoft.com/office/word/2006/wordml" xmlns:wps="http://schemas.microsoft.com/office/word/2010/wordprocessingShape" mc:Ignorable="w14 w15 w16se w16cid w16 w16cex w16sdtdh w16sdtfl w16du wp14">
   <w:footnote w:type="separator" w:id="-1">
     <w:p>
       <w:pPr>
@@ -17286,7 +17397,7 @@
 </file>
 
 <file path=word/header1.xml><?xml version="1.0" encoding="utf-8"?>
-<w:hdr xmlns:wpc="http://schemas.microsoft.com/office/word/2010/wordprocessingCanvas" xmlns:cx="http://schemas.microsoft.com/office/drawing/2014/chartex" xmlns:cx1="http://schemas.microsoft.com/office/drawing/2015/9/8/chartex" xmlns:cx2="http://schemas.microsoft.com/office/drawing/2015/10/21/chartex" xmlns:cx3="http://schemas.microsoft.com/office/drawing/2016/5/9/chartex" xmlns:cx4="http://schemas.microsoft.com/office/drawing/2016/5/10/chartex" xmlns:cx5="http://schemas.microsoft.com/office/drawing/2016/5/11/chartex" xmlns:cx6="http://schemas.microsoft.com/office/drawing/2016/5/12/chartex" xmlns:cx7="http://schemas.microsoft.com/office/drawing/2016/5/13/chartex" xmlns:cx8="http://schemas.microsoft.com/office/drawing/2016/5/14/chartex" xmlns:mc="http://schemas.openxmlformats.org/markup-compatibility/2006" xmlns:aink="http://schemas.microsoft.com/office/drawing/2016/ink" xmlns:am3d="http://schemas.microsoft.com/office/drawing/2017/model3d" xmlns:o="urn:schemas-microsoft-com:office:office" xmlns:oel="http://schemas.microsoft.com/office/2019/extlst" xmlns:r="http://schemas.openxmlformats.org/officeDocument/2006/relationships" xmlns:m="http://schemas.openxmlformats.org/officeDocument/2006/math" xmlns:v="urn:schemas-microsoft-com:vml" xmlns:wp14="http://schemas.microsoft.com/office/word/2010/wordprocessingDrawing" xmlns:wp="http://schemas.openxmlformats.org/drawingml/2006/wordprocessingDrawing" xmlns:w10="urn:schemas-microsoft-com:office:word" xmlns:w="http://schemas.openxmlformats.org/wordprocessingml/2006/main" xmlns:w14="http://schemas.microsoft.com/office/word/2010/wordml" xmlns:w15="http://schemas.microsoft.com/office/word/2012/wordml" xmlns:w16cei="http://schemas.microsoft.com/office/word/2026/wordml/cei" xmlns:w16cex="http://schemas.microsoft.com/office/word/2018/wordml/cex" xmlns:w16cid="http://schemas.microsoft.com/office/word/2016/wordml/cid" xmlns:w16="http://schemas.microsoft.com/office/word/2018/wordml" xmlns:w16du="http://schemas.microsoft.com/office/word/2023/wordml/word16du" xmlns:w16sdtdh="http://schemas.microsoft.com/office/word/2020/wordml/sdtdatahash" xmlns:w16sdtfl="http://schemas.microsoft.com/office/word/2024/wordml/sdtformatlock" xmlns:w16se="http://schemas.microsoft.com/office/word/2015/wordml/symex" xmlns:wpg="http://schemas.microsoft.com/office/word/2010/wordprocessingGroup" xmlns:wpi="http://schemas.microsoft.com/office/word/2010/wordprocessingInk" xmlns:wne="http://schemas.microsoft.com/office/word/2006/wordml" xmlns:wps="http://schemas.microsoft.com/office/word/2010/wordprocessingShape" mc:Ignorable="w14 w15 w16se w16cid w16 w16cex w16sdtdh w16sdtfl w16du wp14">
+<w:hdr xmlns:wpc="http://schemas.microsoft.com/office/word/2010/wordprocessingCanvas" xmlns:cx="http://schemas.microsoft.com/office/drawing/2014/chartex" xmlns:cx1="http://schemas.microsoft.com/office/drawing/2015/9/8/chartex" xmlns:cx2="http://schemas.microsoft.com/office/drawing/2015/10/21/chartex" xmlns:cx3="http://schemas.microsoft.com/office/drawing/2016/5/9/chartex" xmlns:cx4="http://schemas.microsoft.com/office/drawing/2016/5/10/chartex" xmlns:cx5="http://schemas.microsoft.com/office/drawing/2016/5/11/chartex" xmlns:cx6="http://schemas.microsoft.com/office/drawing/2016/5/12/chartex" xmlns:cx7="http://schemas.microsoft.com/office/drawing/2016/5/13/chartex" xmlns:cx8="http://schemas.microsoft.com/office/drawing/2016/5/14/chartex" xmlns:mc="http://schemas.openxmlformats.org/markup-compatibility/2006" xmlns:aink="http://schemas.microsoft.com/office/drawing/2016/ink" xmlns:am3d="http://schemas.microsoft.com/office/drawing/2017/model3d" xmlns:o="urn:schemas-microsoft-com:office:office" xmlns:oel="http://schemas.microsoft.com/office/2019/extlst" xmlns:r="http://schemas.openxmlformats.org/officeDocument/2006/relationships" xmlns:m="http://schemas.openxmlformats.org/officeDocument/2006/math" xmlns:v="urn:schemas-microsoft-com:vml" xmlns:wp14="http://schemas.microsoft.com/office/word/2010/wordprocessingDrawing" xmlns:wp="http://schemas.openxmlformats.org/drawingml/2006/wordprocessingDrawing" xmlns:w10="urn:schemas-microsoft-com:office:word" xmlns:w="http://schemas.openxmlformats.org/wordprocessingml/2006/main" xmlns:w14="http://schemas.microsoft.com/office/word/2010/wordml" xmlns:w15="http://schemas.microsoft.com/office/word/2012/wordml" xmlns:w16cex="http://schemas.microsoft.com/office/word/2018/wordml/cex" xmlns:w16cid="http://schemas.microsoft.com/office/word/2016/wordml/cid" xmlns:w16="http://schemas.microsoft.com/office/word/2018/wordml" xmlns:w16du="http://schemas.microsoft.com/office/word/2023/wordml/word16du" xmlns:w16sdtdh="http://schemas.microsoft.com/office/word/2020/wordml/sdtdatahash" xmlns:w16sdtfl="http://schemas.microsoft.com/office/word/2024/wordml/sdtformatlock" xmlns:w16se="http://schemas.microsoft.com/office/word/2015/wordml/symex" xmlns:wpg="http://schemas.microsoft.com/office/word/2010/wordprocessingGroup" xmlns:wpi="http://schemas.microsoft.com/office/word/2010/wordprocessingInk" xmlns:wne="http://schemas.microsoft.com/office/word/2006/wordml" xmlns:wps="http://schemas.microsoft.com/office/word/2010/wordprocessingShape" mc:Ignorable="w14 w15 w16se w16cid w16 w16cex w16sdtdh w16sdtfl w16du wp14">
   <w:p>
     <w:pPr>
       <w:pStyle w:val="Encabezado"/>
@@ -17302,7 +17413,7 @@
 </file>
 
 <file path=word/numbering.xml><?xml version="1.0" encoding="utf-8"?>
-<w:numbering xmlns:wpc="http://schemas.microsoft.com/office/word/2010/wordprocessingCanvas" xmlns:cx="http://schemas.microsoft.com/office/drawing/2014/chartex" xmlns:cx1="http://schemas.microsoft.com/office/drawing/2015/9/8/chartex" xmlns:cx2="http://schemas.microsoft.com/office/drawing/2015/10/21/chartex" xmlns:cx3="http://schemas.microsoft.com/office/drawing/2016/5/9/chartex" xmlns:cx4="http://schemas.microsoft.com/office/drawing/2016/5/10/chartex" xmlns:cx5="http://schemas.microsoft.com/office/drawing/2016/5/11/chartex" xmlns:cx6="http://schemas.microsoft.com/office/drawing/2016/5/12/chartex" xmlns:cx7="http://schemas.microsoft.com/office/drawing/2016/5/13/chartex" xmlns:cx8="http://schemas.microsoft.com/office/drawing/2016/5/14/chartex" xmlns:mc="http://schemas.openxmlformats.org/markup-compatibility/2006" xmlns:aink="http://schemas.microsoft.com/office/drawing/2016/ink" xmlns:am3d="http://schemas.microsoft.com/office/drawing/2017/model3d" xmlns:o="urn:schemas-microsoft-com:office:office" xmlns:oel="http://schemas.microsoft.com/office/2019/extlst" xmlns:r="http://schemas.openxmlformats.org/officeDocument/2006/relationships" xmlns:m="http://schemas.openxmlformats.org/officeDocument/2006/math" xmlns:v="urn:schemas-microsoft-com:vml" xmlns:wp14="http://schemas.microsoft.com/office/word/2010/wordprocessingDrawing" xmlns:wp="http://schemas.openxmlformats.org/drawingml/2006/wordprocessingDrawing" xmlns:w10="urn:schemas-microsoft-com:office:word" xmlns:w="http://schemas.openxmlformats.org/wordprocessingml/2006/main" xmlns:w14="http://schemas.microsoft.com/office/word/2010/wordml" xmlns:w15="http://schemas.microsoft.com/office/word/2012/wordml" xmlns:w16cei="http://schemas.microsoft.com/office/word/2026/wordml/cei" xmlns:w16cex="http://schemas.microsoft.com/office/word/2018/wordml/cex" xmlns:w16cid="http://schemas.microsoft.com/office/word/2016/wordml/cid" xmlns:w16="http://schemas.microsoft.com/office/word/2018/wordml" xmlns:w16du="http://schemas.microsoft.com/office/word/2023/wordml/word16du" xmlns:w16sdtdh="http://schemas.microsoft.com/office/word/2020/wordml/sdtdatahash" xmlns:w16sdtfl="http://schemas.microsoft.com/office/word/2024/wordml/sdtformatlock" xmlns:w16se="http://schemas.microsoft.com/office/word/2015/wordml/symex" xmlns:wpg="http://schemas.microsoft.com/office/word/2010/wordprocessingGroup" xmlns:wpi="http://schemas.microsoft.com/office/word/2010/wordprocessingInk" xmlns:wne="http://schemas.microsoft.com/office/word/2006/wordml" xmlns:wps="http://schemas.microsoft.com/office/word/2010/wordprocessingShape" mc:Ignorable="w14 w15 w16se w16cid w16 w16cex w16sdtdh w16sdtfl w16du wp14">
+<w:numbering xmlns:wpc="http://schemas.microsoft.com/office/word/2010/wordprocessingCanvas" xmlns:cx="http://schemas.microsoft.com/office/drawing/2014/chartex" xmlns:cx1="http://schemas.microsoft.com/office/drawing/2015/9/8/chartex" xmlns:cx2="http://schemas.microsoft.com/office/drawing/2015/10/21/chartex" xmlns:cx3="http://schemas.microsoft.com/office/drawing/2016/5/9/chartex" xmlns:cx4="http://schemas.microsoft.com/office/drawing/2016/5/10/chartex" xmlns:cx5="http://schemas.microsoft.com/office/drawing/2016/5/11/chartex" xmlns:cx6="http://schemas.microsoft.com/office/drawing/2016/5/12/chartex" xmlns:cx7="http://schemas.microsoft.com/office/drawing/2016/5/13/chartex" xmlns:cx8="http://schemas.microsoft.com/office/drawing/2016/5/14/chartex" xmlns:mc="http://schemas.openxmlformats.org/markup-compatibility/2006" xmlns:aink="http://schemas.microsoft.com/office/drawing/2016/ink" xmlns:am3d="http://schemas.microsoft.com/office/drawing/2017/model3d" xmlns:o="urn:schemas-microsoft-com:office:office" xmlns:oel="http://schemas.microsoft.com/office/2019/extlst" xmlns:r="http://schemas.openxmlformats.org/officeDocument/2006/relationships" xmlns:m="http://schemas.openxmlformats.org/officeDocument/2006/math" xmlns:v="urn:schemas-microsoft-com:vml" xmlns:wp14="http://schemas.microsoft.com/office/word/2010/wordprocessingDrawing" xmlns:wp="http://schemas.openxmlformats.org/drawingml/2006/wordprocessingDrawing" xmlns:w10="urn:schemas-microsoft-com:office:word" xmlns:w="http://schemas.openxmlformats.org/wordprocessingml/2006/main" xmlns:w14="http://schemas.microsoft.com/office/word/2010/wordml" xmlns:w15="http://schemas.microsoft.com/office/word/2012/wordml" xmlns:w16cex="http://schemas.microsoft.com/office/word/2018/wordml/cex" xmlns:w16cid="http://schemas.microsoft.com/office/word/2016/wordml/cid" xmlns:w16="http://schemas.microsoft.com/office/word/2018/wordml" xmlns:w16du="http://schemas.microsoft.com/office/word/2023/wordml/word16du" xmlns:w16sdtdh="http://schemas.microsoft.com/office/word/2020/wordml/sdtdatahash" xmlns:w16sdtfl="http://schemas.microsoft.com/office/word/2024/wordml/sdtformatlock" xmlns:w16se="http://schemas.microsoft.com/office/word/2015/wordml/symex" xmlns:wpg="http://schemas.microsoft.com/office/word/2010/wordprocessingGroup" xmlns:wpi="http://schemas.microsoft.com/office/word/2010/wordprocessingInk" xmlns:wne="http://schemas.microsoft.com/office/word/2006/wordml" xmlns:wps="http://schemas.microsoft.com/office/word/2010/wordprocessingShape" mc:Ignorable="w14 w15 w16se w16cid w16 w16cex w16sdtdh w16sdtfl w16du wp14">
   <w:abstractNum w:abstractNumId="0" w15:restartNumberingAfterBreak="0">
     <w:nsid w:val="03185582"/>
     <w:multiLevelType w:val="multilevel"/>

</xml_diff>

<commit_message>
Centralizar backend y completar auditoria del proyecto
</commit_message>
<xml_diff>
--- a/TFG.docx
+++ b/TFG.docx
@@ -118,7 +118,7 @@
       <w:pPr>
         <w:pStyle w:val="Ttulo1"/>
       </w:pPr>
-      <w:bookmarkStart w:id="0" w:name="_Toc238490931"/>
+      <w:bookmarkStart w:id="0" w:name="_Toc238679584"/>
       <w:r>
         <w:lastRenderedPageBreak/>
         <w:t>Resumen</w:t>
@@ -127,7 +127,7 @@
     </w:p>
     <w:p>
       <w:r>
-        <w:t>El phishing se ha consolidado como una de las ciberamenazas más persistentes y dañinas del panorama actual de la ciberseguridad. Este Trabajo Fin de Grado aborda el diseño, la implementación y la evaluación de una aplicación web local para detectar phishing en correos electrónicos. La solución combina un sistema heurístico explicable con un clasificador neuronal basado en TF-IDF y perceptrón multicapa (MLP). Desarrollada en Python con Streamlit, permite analizar texto pegado, archivos .eml y mensajes importados mediante la API de Gmail, además de entrenar y evaluar modelos en español e inglés. El análisis puede ejecutarse dentro de la aplicación mediante módulos reutilizables y, de forma opcional, exponerse a la extensión de Gmail o a clientes locales mediante una API HTTP; ninguna de esas interfaces envía el correo a un servicio externo. La memoria estudia el fenómeno del phishing desde su base psicológica y su evolución reciente, revisa el estado del arte en machine learning y deep learning, y presenta los resultados obtenidos durante la validación del prototipo. Los resultados confirman que combinar reglas explicables y aprendizaje supervisado constituye una base funcional y extensible para la detección de este tipo de amenazas.</w:t>
+        <w:t>El phishing se ha consolidado como una de las ciberamenazas más persistentes y dañinas. Este Trabajo Fin de Grado diseña, implementa y evalúa un sistema cliente-servidor para detectar phishing en correo. Streamlit, la extensión y el monitor envían las entradas a una API central que combina heurística explicable y modelos TF-IDF + MLP en español e inglés. El servidor es el único responsable de parsear, analizar, entrenar y versionar los modelos, de modo que una actualización se aplica a todos los clientes. La memoria revisa el estado del arte y presenta una validación reproducible, delimitando expresamente sus límites frente a producción.</w:t>
       </w:r>
     </w:p>
     <w:p/>
@@ -140,7 +140,7 @@
       <w:pPr>
         <w:pStyle w:val="Ttulo1"/>
       </w:pPr>
-      <w:bookmarkStart w:id="1" w:name="_Toc238490932"/>
+      <w:bookmarkStart w:id="1" w:name="_Toc238679585"/>
       <w:r>
         <w:lastRenderedPageBreak/>
         <w:t>Abstract</w:t>
@@ -149,7 +149,7 @@
     </w:p>
     <w:p>
       <w:r>
-        <w:t>Phishing has become one of the most persistent and damaging threats in today's cybersecurity landscape. This Bachelor's Thesis presents the design, implementation and evaluation of a local web application for detecting phishing emails. The solution combines an explainable heuristic system with a neural classifier based on TF-IDF and a multilayer perceptron (MLP). Built in Python with Streamlit, it can analyse pasted text, .eml files and messages imported through the Gmail API, as well as train and evaluate Spanish and English models. The analysis runs through reusable local modules and can optionally be exposed to the Gmail extension or local clients through an HTTP API; email content is not sent to an external service. The document examines phishing from its psychological foundations and recent evolution, reviews the state of the art in machine learning and deep learning, and reports the results obtained during prototype validation. The results show that combining explainable rules with supervised learning provides a functional and extensible basis for detecting this type of threat.</w:t>
+        <w:t>Phishing remains one of the most persistent and damaging cybersecurity threats. This Bachelor's Thesis designs, implements and evaluates a client-server system for phishing email detection. The browser uses Streamlit as the presentation layer, while Streamlit, the Gmail extension and the monitor send text, EML or structured fields through HTTP to a mandatory central backend. Only the server parses messages, combines explainable heuristics with Spanish and English TF-IDF + MLP models, trains them and keeps one active version per language, so an update is shared by every client. The prototype is validated with automated tests, real browser-to-backend journeys and a controlled bilingual holdout, while its limitations for production deployment are stated explicitly.</w:t>
       </w:r>
     </w:p>
     <w:p/>
@@ -167,7 +167,7 @@
       <w:pPr>
         <w:pStyle w:val="Ttulo1"/>
       </w:pPr>
-      <w:bookmarkStart w:id="2" w:name="_Toc238490933"/>
+      <w:bookmarkStart w:id="2" w:name="_Toc238679586"/>
       <w:r>
         <w:lastRenderedPageBreak/>
         <w:t>Agradecimientos</w:t>
@@ -183,7 +183,7 @@
       <w:pPr>
         <w:pStyle w:val="Ttulo1"/>
       </w:pPr>
-      <w:bookmarkStart w:id="3" w:name="_Toc238490934"/>
+      <w:bookmarkStart w:id="3" w:name="_Toc238679587"/>
       <w:r>
         <w:lastRenderedPageBreak/>
         <w:t>Índice de figuras y tablas</w:t>
@@ -261,7 +261,7 @@
       <w:pPr>
         <w:pStyle w:val="Ttulo1"/>
       </w:pPr>
-      <w:bookmarkStart w:id="4" w:name="_Toc238490935"/>
+      <w:bookmarkStart w:id="4" w:name="_Toc238679588"/>
       <w:r>
         <w:lastRenderedPageBreak/>
         <w:t>Abreviaturas</w:t>
@@ -270,7 +270,7 @@
     </w:p>
     <w:p>
       <w:r>
-        <w:t>API: Interfaz de operaciones que permite a un cliente local enviar datos al backend mediante un contrato HTTP; Gmail y Telegram son integraciones externas distintas.</w:t>
+        <w:t>API: Interfaz de operaciones que permite a un cliente enviar datos al backend mediante un contrato HTTP; Gmail y Telegram son integraciones externas distintas.</w:t>
       </w:r>
     </w:p>
     <w:p>
@@ -530,7 +530,7 @@
           <w:r>
             <w:fldChar w:fldCharType="separate"/>
           </w:r>
-          <w:hyperlink w:anchor="_Toc238490931" w:history="1">
+          <w:hyperlink w:anchor="_Toc238679584" w:history="1">
             <w:r>
               <w:rPr>
                 <w:rStyle w:val="Hipervnculo"/>
@@ -557,7 +557,7 @@
                 <w:noProof/>
                 <w:webHidden/>
               </w:rPr>
-              <w:instrText xml:space="preserve"> PAGEREF _Toc238490931 \h </w:instrText>
+              <w:instrText xml:space="preserve"> PAGEREF _Toc238679584 \h </w:instrText>
             </w:r>
             <w:r>
               <w:rPr>
@@ -605,7 +605,7 @@
               <w14:ligatures w14:val="standardContextual"/>
             </w:rPr>
           </w:pPr>
-          <w:hyperlink w:anchor="_Toc238490932" w:history="1">
+          <w:hyperlink w:anchor="_Toc238679585" w:history="1">
             <w:r>
               <w:rPr>
                 <w:rStyle w:val="Hipervnculo"/>
@@ -632,7 +632,7 @@
                 <w:noProof/>
                 <w:webHidden/>
               </w:rPr>
-              <w:instrText xml:space="preserve"> PAGEREF _Toc238490932 \h </w:instrText>
+              <w:instrText xml:space="preserve"> PAGEREF _Toc238679585 \h </w:instrText>
             </w:r>
             <w:r>
               <w:rPr>
@@ -680,7 +680,7 @@
               <w14:ligatures w14:val="standardContextual"/>
             </w:rPr>
           </w:pPr>
-          <w:hyperlink w:anchor="_Toc238490933" w:history="1">
+          <w:hyperlink w:anchor="_Toc238679586" w:history="1">
             <w:r>
               <w:rPr>
                 <w:rStyle w:val="Hipervnculo"/>
@@ -707,7 +707,7 @@
                 <w:noProof/>
                 <w:webHidden/>
               </w:rPr>
-              <w:instrText xml:space="preserve"> PAGEREF _Toc238490933 \h </w:instrText>
+              <w:instrText xml:space="preserve"> PAGEREF _Toc238679586 \h </w:instrText>
             </w:r>
             <w:r>
               <w:rPr>
@@ -755,7 +755,7 @@
               <w14:ligatures w14:val="standardContextual"/>
             </w:rPr>
           </w:pPr>
-          <w:hyperlink w:anchor="_Toc238490934" w:history="1">
+          <w:hyperlink w:anchor="_Toc238679587" w:history="1">
             <w:r>
               <w:rPr>
                 <w:rStyle w:val="Hipervnculo"/>
@@ -782,7 +782,7 @@
                 <w:noProof/>
                 <w:webHidden/>
               </w:rPr>
-              <w:instrText xml:space="preserve"> PAGEREF _Toc238490934 \h </w:instrText>
+              <w:instrText xml:space="preserve"> PAGEREF _Toc238679587 \h </w:instrText>
             </w:r>
             <w:r>
               <w:rPr>
@@ -830,7 +830,7 @@
               <w14:ligatures w14:val="standardContextual"/>
             </w:rPr>
           </w:pPr>
-          <w:hyperlink w:anchor="_Toc238490935" w:history="1">
+          <w:hyperlink w:anchor="_Toc238679588" w:history="1">
             <w:r>
               <w:rPr>
                 <w:rStyle w:val="Hipervnculo"/>
@@ -857,7 +857,7 @@
                 <w:noProof/>
                 <w:webHidden/>
               </w:rPr>
-              <w:instrText xml:space="preserve"> PAGEREF _Toc238490935 \h </w:instrText>
+              <w:instrText xml:space="preserve"> PAGEREF _Toc238679588 \h </w:instrText>
             </w:r>
             <w:r>
               <w:rPr>
@@ -905,7 +905,7 @@
               <w14:ligatures w14:val="standardContextual"/>
             </w:rPr>
           </w:pPr>
-          <w:hyperlink w:anchor="_Toc238490936" w:history="1">
+          <w:hyperlink w:anchor="_Toc238679589" w:history="1">
             <w:r>
               <w:rPr>
                 <w:rStyle w:val="Hipervnculo"/>
@@ -932,7 +932,7 @@
                 <w:noProof/>
                 <w:webHidden/>
               </w:rPr>
-              <w:instrText xml:space="preserve"> PAGEREF _Toc238490936 \h </w:instrText>
+              <w:instrText xml:space="preserve"> PAGEREF _Toc238679589 \h </w:instrText>
             </w:r>
             <w:r>
               <w:rPr>
@@ -952,7 +952,7 @@
                 <w:noProof/>
                 <w:webHidden/>
               </w:rPr>
-              <w:t>10</w:t>
+              <w:t>11</w:t>
             </w:r>
             <w:r>
               <w:rPr>
@@ -980,7 +980,7 @@
               <w14:ligatures w14:val="standardContextual"/>
             </w:rPr>
           </w:pPr>
-          <w:hyperlink w:anchor="_Toc238490937" w:history="1">
+          <w:hyperlink w:anchor="_Toc238679590" w:history="1">
             <w:r>
               <w:rPr>
                 <w:rStyle w:val="Hipervnculo"/>
@@ -1007,7 +1007,7 @@
                 <w:noProof/>
                 <w:webHidden/>
               </w:rPr>
-              <w:instrText xml:space="preserve"> PAGEREF _Toc238490937 \h </w:instrText>
+              <w:instrText xml:space="preserve"> PAGEREF _Toc238679590 \h </w:instrText>
             </w:r>
             <w:r>
               <w:rPr>
@@ -1027,7 +1027,7 @@
                 <w:noProof/>
                 <w:webHidden/>
               </w:rPr>
-              <w:t>11</w:t>
+              <w:t>12</w:t>
             </w:r>
             <w:r>
               <w:rPr>
@@ -1055,7 +1055,7 @@
               <w14:ligatures w14:val="standardContextual"/>
             </w:rPr>
           </w:pPr>
-          <w:hyperlink w:anchor="_Toc238490938" w:history="1">
+          <w:hyperlink w:anchor="_Toc238679591" w:history="1">
             <w:r>
               <w:rPr>
                 <w:rStyle w:val="Hipervnculo"/>
@@ -1082,7 +1082,7 @@
                 <w:noProof/>
                 <w:webHidden/>
               </w:rPr>
-              <w:instrText xml:space="preserve"> PAGEREF _Toc238490938 \h </w:instrText>
+              <w:instrText xml:space="preserve"> PAGEREF _Toc238679591 \h </w:instrText>
             </w:r>
             <w:r>
               <w:rPr>
@@ -1102,7 +1102,7 @@
                 <w:noProof/>
                 <w:webHidden/>
               </w:rPr>
-              <w:t>11</w:t>
+              <w:t>12</w:t>
             </w:r>
             <w:r>
               <w:rPr>
@@ -1130,7 +1130,7 @@
               <w14:ligatures w14:val="standardContextual"/>
             </w:rPr>
           </w:pPr>
-          <w:hyperlink w:anchor="_Toc238490939" w:history="1">
+          <w:hyperlink w:anchor="_Toc238679592" w:history="1">
             <w:r>
               <w:rPr>
                 <w:rStyle w:val="Hipervnculo"/>
@@ -1157,7 +1157,7 @@
                 <w:noProof/>
                 <w:webHidden/>
               </w:rPr>
-              <w:instrText xml:space="preserve"> PAGEREF _Toc238490939 \h </w:instrText>
+              <w:instrText xml:space="preserve"> PAGEREF _Toc238679592 \h </w:instrText>
             </w:r>
             <w:r>
               <w:rPr>
@@ -1177,7 +1177,7 @@
                 <w:noProof/>
                 <w:webHidden/>
               </w:rPr>
-              <w:t>11</w:t>
+              <w:t>12</w:t>
             </w:r>
             <w:r>
               <w:rPr>
@@ -1205,7 +1205,7 @@
               <w14:ligatures w14:val="standardContextual"/>
             </w:rPr>
           </w:pPr>
-          <w:hyperlink w:anchor="_Toc238490940" w:history="1">
+          <w:hyperlink w:anchor="_Toc238679593" w:history="1">
             <w:r>
               <w:rPr>
                 <w:rStyle w:val="Hipervnculo"/>
@@ -1232,7 +1232,7 @@
                 <w:noProof/>
                 <w:webHidden/>
               </w:rPr>
-              <w:instrText xml:space="preserve"> PAGEREF _Toc238490940 \h </w:instrText>
+              <w:instrText xml:space="preserve"> PAGEREF _Toc238679593 \h </w:instrText>
             </w:r>
             <w:r>
               <w:rPr>
@@ -1252,7 +1252,7 @@
                 <w:noProof/>
                 <w:webHidden/>
               </w:rPr>
-              <w:t>12</w:t>
+              <w:t>13</w:t>
             </w:r>
             <w:r>
               <w:rPr>
@@ -1280,7 +1280,7 @@
               <w14:ligatures w14:val="standardContextual"/>
             </w:rPr>
           </w:pPr>
-          <w:hyperlink w:anchor="_Toc238490941" w:history="1">
+          <w:hyperlink w:anchor="_Toc238679594" w:history="1">
             <w:r>
               <w:rPr>
                 <w:rStyle w:val="Hipervnculo"/>
@@ -1307,7 +1307,7 @@
                 <w:noProof/>
                 <w:webHidden/>
               </w:rPr>
-              <w:instrText xml:space="preserve"> PAGEREF _Toc238490941 \h </w:instrText>
+              <w:instrText xml:space="preserve"> PAGEREF _Toc238679594 \h </w:instrText>
             </w:r>
             <w:r>
               <w:rPr>
@@ -1327,7 +1327,7 @@
                 <w:noProof/>
                 <w:webHidden/>
               </w:rPr>
-              <w:t>13</w:t>
+              <w:t>14</w:t>
             </w:r>
             <w:r>
               <w:rPr>
@@ -1355,7 +1355,7 @@
               <w14:ligatures w14:val="standardContextual"/>
             </w:rPr>
           </w:pPr>
-          <w:hyperlink w:anchor="_Toc238490942" w:history="1">
+          <w:hyperlink w:anchor="_Toc238679595" w:history="1">
             <w:r>
               <w:rPr>
                 <w:rStyle w:val="Hipervnculo"/>
@@ -1382,7 +1382,7 @@
                 <w:noProof/>
                 <w:webHidden/>
               </w:rPr>
-              <w:instrText xml:space="preserve"> PAGEREF _Toc238490942 \h </w:instrText>
+              <w:instrText xml:space="preserve"> PAGEREF _Toc238679595 \h </w:instrText>
             </w:r>
             <w:r>
               <w:rPr>
@@ -1402,7 +1402,7 @@
                 <w:noProof/>
                 <w:webHidden/>
               </w:rPr>
-              <w:t>14</w:t>
+              <w:t>15</w:t>
             </w:r>
             <w:r>
               <w:rPr>
@@ -1430,7 +1430,7 @@
               <w14:ligatures w14:val="standardContextual"/>
             </w:rPr>
           </w:pPr>
-          <w:hyperlink w:anchor="_Toc238490943" w:history="1">
+          <w:hyperlink w:anchor="_Toc238679596" w:history="1">
             <w:r>
               <w:rPr>
                 <w:rStyle w:val="Hipervnculo"/>
@@ -1457,7 +1457,7 @@
                 <w:noProof/>
                 <w:webHidden/>
               </w:rPr>
-              <w:instrText xml:space="preserve"> PAGEREF _Toc238490943 \h </w:instrText>
+              <w:instrText xml:space="preserve"> PAGEREF _Toc238679596 \h </w:instrText>
             </w:r>
             <w:r>
               <w:rPr>
@@ -1477,7 +1477,7 @@
                 <w:noProof/>
                 <w:webHidden/>
               </w:rPr>
-              <w:t>14</w:t>
+              <w:t>15</w:t>
             </w:r>
             <w:r>
               <w:rPr>
@@ -1505,7 +1505,7 @@
               <w14:ligatures w14:val="standardContextual"/>
             </w:rPr>
           </w:pPr>
-          <w:hyperlink w:anchor="_Toc238490944" w:history="1">
+          <w:hyperlink w:anchor="_Toc238679597" w:history="1">
             <w:r>
               <w:rPr>
                 <w:rStyle w:val="Hipervnculo"/>
@@ -1532,7 +1532,7 @@
                 <w:noProof/>
                 <w:webHidden/>
               </w:rPr>
-              <w:instrText xml:space="preserve"> PAGEREF _Toc238490944 \h </w:instrText>
+              <w:instrText xml:space="preserve"> PAGEREF _Toc238679597 \h </w:instrText>
             </w:r>
             <w:r>
               <w:rPr>
@@ -1552,7 +1552,7 @@
                 <w:noProof/>
                 <w:webHidden/>
               </w:rPr>
-              <w:t>15</w:t>
+              <w:t>16</w:t>
             </w:r>
             <w:r>
               <w:rPr>
@@ -1580,7 +1580,7 @@
               <w14:ligatures w14:val="standardContextual"/>
             </w:rPr>
           </w:pPr>
-          <w:hyperlink w:anchor="_Toc238490945" w:history="1">
+          <w:hyperlink w:anchor="_Toc238679598" w:history="1">
             <w:r>
               <w:rPr>
                 <w:rStyle w:val="Hipervnculo"/>
@@ -1607,7 +1607,7 @@
                 <w:noProof/>
                 <w:webHidden/>
               </w:rPr>
-              <w:instrText xml:space="preserve"> PAGEREF _Toc238490945 \h </w:instrText>
+              <w:instrText xml:space="preserve"> PAGEREF _Toc238679598 \h </w:instrText>
             </w:r>
             <w:r>
               <w:rPr>
@@ -1627,7 +1627,7 @@
                 <w:noProof/>
                 <w:webHidden/>
               </w:rPr>
-              <w:t>16</w:t>
+              <w:t>17</w:t>
             </w:r>
             <w:r>
               <w:rPr>
@@ -1655,7 +1655,7 @@
               <w14:ligatures w14:val="standardContextual"/>
             </w:rPr>
           </w:pPr>
-          <w:hyperlink w:anchor="_Toc238490946" w:history="1">
+          <w:hyperlink w:anchor="_Toc238679599" w:history="1">
             <w:r>
               <w:rPr>
                 <w:rStyle w:val="Hipervnculo"/>
@@ -1682,7 +1682,7 @@
                 <w:noProof/>
                 <w:webHidden/>
               </w:rPr>
-              <w:instrText xml:space="preserve"> PAGEREF _Toc238490946 \h </w:instrText>
+              <w:instrText xml:space="preserve"> PAGEREF _Toc238679599 \h </w:instrText>
             </w:r>
             <w:r>
               <w:rPr>
@@ -1702,7 +1702,7 @@
                 <w:noProof/>
                 <w:webHidden/>
               </w:rPr>
-              <w:t>16</w:t>
+              <w:t>17</w:t>
             </w:r>
             <w:r>
               <w:rPr>
@@ -1730,7 +1730,7 @@
               <w14:ligatures w14:val="standardContextual"/>
             </w:rPr>
           </w:pPr>
-          <w:hyperlink w:anchor="_Toc238490947" w:history="1">
+          <w:hyperlink w:anchor="_Toc238679600" w:history="1">
             <w:r>
               <w:rPr>
                 <w:rStyle w:val="Hipervnculo"/>
@@ -1757,7 +1757,7 @@
                 <w:noProof/>
                 <w:webHidden/>
               </w:rPr>
-              <w:instrText xml:space="preserve"> PAGEREF _Toc238490947 \h </w:instrText>
+              <w:instrText xml:space="preserve"> PAGEREF _Toc238679600 \h </w:instrText>
             </w:r>
             <w:r>
               <w:rPr>
@@ -1777,7 +1777,7 @@
                 <w:noProof/>
                 <w:webHidden/>
               </w:rPr>
-              <w:t>16</w:t>
+              <w:t>17</w:t>
             </w:r>
             <w:r>
               <w:rPr>
@@ -1805,7 +1805,7 @@
               <w14:ligatures w14:val="standardContextual"/>
             </w:rPr>
           </w:pPr>
-          <w:hyperlink w:anchor="_Toc238490948" w:history="1">
+          <w:hyperlink w:anchor="_Toc238679601" w:history="1">
             <w:r>
               <w:rPr>
                 <w:rStyle w:val="Hipervnculo"/>
@@ -1832,7 +1832,7 @@
                 <w:noProof/>
                 <w:webHidden/>
               </w:rPr>
-              <w:instrText xml:space="preserve"> PAGEREF _Toc238490948 \h </w:instrText>
+              <w:instrText xml:space="preserve"> PAGEREF _Toc238679601 \h </w:instrText>
             </w:r>
             <w:r>
               <w:rPr>
@@ -1852,7 +1852,7 @@
                 <w:noProof/>
                 <w:webHidden/>
               </w:rPr>
-              <w:t>16</w:t>
+              <w:t>17</w:t>
             </w:r>
             <w:r>
               <w:rPr>
@@ -1880,7 +1880,7 @@
               <w14:ligatures w14:val="standardContextual"/>
             </w:rPr>
           </w:pPr>
-          <w:hyperlink w:anchor="_Toc238490949" w:history="1">
+          <w:hyperlink w:anchor="_Toc238679602" w:history="1">
             <w:r>
               <w:rPr>
                 <w:rStyle w:val="Hipervnculo"/>
@@ -1907,7 +1907,7 @@
                 <w:noProof/>
                 <w:webHidden/>
               </w:rPr>
-              <w:instrText xml:space="preserve"> PAGEREF _Toc238490949 \h </w:instrText>
+              <w:instrText xml:space="preserve"> PAGEREF _Toc238679602 \h </w:instrText>
             </w:r>
             <w:r>
               <w:rPr>
@@ -1927,7 +1927,7 @@
                 <w:noProof/>
                 <w:webHidden/>
               </w:rPr>
-              <w:t>17</w:t>
+              <w:t>18</w:t>
             </w:r>
             <w:r>
               <w:rPr>
@@ -1955,7 +1955,7 @@
               <w14:ligatures w14:val="standardContextual"/>
             </w:rPr>
           </w:pPr>
-          <w:hyperlink w:anchor="_Toc238490950" w:history="1">
+          <w:hyperlink w:anchor="_Toc238679603" w:history="1">
             <w:r>
               <w:rPr>
                 <w:rStyle w:val="Hipervnculo"/>
@@ -1982,7 +1982,7 @@
                 <w:noProof/>
                 <w:webHidden/>
               </w:rPr>
-              <w:instrText xml:space="preserve"> PAGEREF _Toc238490950 \h </w:instrText>
+              <w:instrText xml:space="preserve"> PAGEREF _Toc238679603 \h </w:instrText>
             </w:r>
             <w:r>
               <w:rPr>
@@ -2002,7 +2002,7 @@
                 <w:noProof/>
                 <w:webHidden/>
               </w:rPr>
-              <w:t>17</w:t>
+              <w:t>18</w:t>
             </w:r>
             <w:r>
               <w:rPr>
@@ -2030,7 +2030,7 @@
               <w14:ligatures w14:val="standardContextual"/>
             </w:rPr>
           </w:pPr>
-          <w:hyperlink w:anchor="_Toc238490951" w:history="1">
+          <w:hyperlink w:anchor="_Toc238679604" w:history="1">
             <w:r>
               <w:rPr>
                 <w:rStyle w:val="Hipervnculo"/>
@@ -2057,7 +2057,7 @@
                 <w:noProof/>
                 <w:webHidden/>
               </w:rPr>
-              <w:instrText xml:space="preserve"> PAGEREF _Toc238490951 \h </w:instrText>
+              <w:instrText xml:space="preserve"> PAGEREF _Toc238679604 \h </w:instrText>
             </w:r>
             <w:r>
               <w:rPr>
@@ -2077,7 +2077,7 @@
                 <w:noProof/>
                 <w:webHidden/>
               </w:rPr>
-              <w:t>18</w:t>
+              <w:t>19</w:t>
             </w:r>
             <w:r>
               <w:rPr>
@@ -2105,7 +2105,7 @@
               <w14:ligatures w14:val="standardContextual"/>
             </w:rPr>
           </w:pPr>
-          <w:hyperlink w:anchor="_Toc238490952" w:history="1">
+          <w:hyperlink w:anchor="_Toc238679605" w:history="1">
             <w:r>
               <w:rPr>
                 <w:rStyle w:val="Hipervnculo"/>
@@ -2132,7 +2132,7 @@
                 <w:noProof/>
                 <w:webHidden/>
               </w:rPr>
-              <w:instrText xml:space="preserve"> PAGEREF _Toc238490952 \h </w:instrText>
+              <w:instrText xml:space="preserve"> PAGEREF _Toc238679605 \h </w:instrText>
             </w:r>
             <w:r>
               <w:rPr>
@@ -2152,7 +2152,7 @@
                 <w:noProof/>
                 <w:webHidden/>
               </w:rPr>
-              <w:t>18</w:t>
+              <w:t>19</w:t>
             </w:r>
             <w:r>
               <w:rPr>
@@ -2180,7 +2180,7 @@
               <w14:ligatures w14:val="standardContextual"/>
             </w:rPr>
           </w:pPr>
-          <w:hyperlink w:anchor="_Toc238490953" w:history="1">
+          <w:hyperlink w:anchor="_Toc238679606" w:history="1">
             <w:r>
               <w:rPr>
                 <w:rStyle w:val="Hipervnculo"/>
@@ -2207,7 +2207,7 @@
                 <w:noProof/>
                 <w:webHidden/>
               </w:rPr>
-              <w:instrText xml:space="preserve"> PAGEREF _Toc238490953 \h </w:instrText>
+              <w:instrText xml:space="preserve"> PAGEREF _Toc238679606 \h </w:instrText>
             </w:r>
             <w:r>
               <w:rPr>
@@ -2227,7 +2227,7 @@
                 <w:noProof/>
                 <w:webHidden/>
               </w:rPr>
-              <w:t>18</w:t>
+              <w:t>19</w:t>
             </w:r>
             <w:r>
               <w:rPr>
@@ -2255,7 +2255,7 @@
               <w14:ligatures w14:val="standardContextual"/>
             </w:rPr>
           </w:pPr>
-          <w:hyperlink w:anchor="_Toc238490954" w:history="1">
+          <w:hyperlink w:anchor="_Toc238679607" w:history="1">
             <w:r>
               <w:rPr>
                 <w:rStyle w:val="Hipervnculo"/>
@@ -2282,7 +2282,7 @@
                 <w:noProof/>
                 <w:webHidden/>
               </w:rPr>
-              <w:instrText xml:space="preserve"> PAGEREF _Toc238490954 \h </w:instrText>
+              <w:instrText xml:space="preserve"> PAGEREF _Toc238679607 \h </w:instrText>
             </w:r>
             <w:r>
               <w:rPr>
@@ -2302,7 +2302,7 @@
                 <w:noProof/>
                 <w:webHidden/>
               </w:rPr>
-              <w:t>19</w:t>
+              <w:t>20</w:t>
             </w:r>
             <w:r>
               <w:rPr>
@@ -2330,7 +2330,7 @@
               <w14:ligatures w14:val="standardContextual"/>
             </w:rPr>
           </w:pPr>
-          <w:hyperlink w:anchor="_Toc238490955" w:history="1">
+          <w:hyperlink w:anchor="_Toc238679608" w:history="1">
             <w:r>
               <w:rPr>
                 <w:rStyle w:val="Hipervnculo"/>
@@ -2357,7 +2357,7 @@
                 <w:noProof/>
                 <w:webHidden/>
               </w:rPr>
-              <w:instrText xml:space="preserve"> PAGEREF _Toc238490955 \h </w:instrText>
+              <w:instrText xml:space="preserve"> PAGEREF _Toc238679608 \h </w:instrText>
             </w:r>
             <w:r>
               <w:rPr>
@@ -2377,7 +2377,7 @@
                 <w:noProof/>
                 <w:webHidden/>
               </w:rPr>
-              <w:t>19</w:t>
+              <w:t>20</w:t>
             </w:r>
             <w:r>
               <w:rPr>
@@ -2405,7 +2405,7 @@
               <w14:ligatures w14:val="standardContextual"/>
             </w:rPr>
           </w:pPr>
-          <w:hyperlink w:anchor="_Toc238490956" w:history="1">
+          <w:hyperlink w:anchor="_Toc238679609" w:history="1">
             <w:r>
               <w:rPr>
                 <w:rStyle w:val="Hipervnculo"/>
@@ -2432,7 +2432,7 @@
                 <w:noProof/>
                 <w:webHidden/>
               </w:rPr>
-              <w:instrText xml:space="preserve"> PAGEREF _Toc238490956 \h </w:instrText>
+              <w:instrText xml:space="preserve"> PAGEREF _Toc238679609 \h </w:instrText>
             </w:r>
             <w:r>
               <w:rPr>
@@ -2452,7 +2452,7 @@
                 <w:noProof/>
                 <w:webHidden/>
               </w:rPr>
-              <w:t>19</w:t>
+              <w:t>20</w:t>
             </w:r>
             <w:r>
               <w:rPr>
@@ -2480,7 +2480,7 @@
               <w14:ligatures w14:val="standardContextual"/>
             </w:rPr>
           </w:pPr>
-          <w:hyperlink w:anchor="_Toc238490957" w:history="1">
+          <w:hyperlink w:anchor="_Toc238679610" w:history="1">
             <w:r>
               <w:rPr>
                 <w:rStyle w:val="Hipervnculo"/>
@@ -2507,7 +2507,7 @@
                 <w:noProof/>
                 <w:webHidden/>
               </w:rPr>
-              <w:instrText xml:space="preserve"> PAGEREF _Toc238490957 \h </w:instrText>
+              <w:instrText xml:space="preserve"> PAGEREF _Toc238679610 \h </w:instrText>
             </w:r>
             <w:r>
               <w:rPr>
@@ -2527,7 +2527,7 @@
                 <w:noProof/>
                 <w:webHidden/>
               </w:rPr>
-              <w:t>20</w:t>
+              <w:t>21</w:t>
             </w:r>
             <w:r>
               <w:rPr>
@@ -2555,7 +2555,7 @@
               <w14:ligatures w14:val="standardContextual"/>
             </w:rPr>
           </w:pPr>
-          <w:hyperlink w:anchor="_Toc238490958" w:history="1">
+          <w:hyperlink w:anchor="_Toc238679611" w:history="1">
             <w:r>
               <w:rPr>
                 <w:rStyle w:val="Hipervnculo"/>
@@ -2582,7 +2582,7 @@
                 <w:noProof/>
                 <w:webHidden/>
               </w:rPr>
-              <w:instrText xml:space="preserve"> PAGEREF _Toc238490958 \h </w:instrText>
+              <w:instrText xml:space="preserve"> PAGEREF _Toc238679611 \h </w:instrText>
             </w:r>
             <w:r>
               <w:rPr>
@@ -2602,7 +2602,7 @@
                 <w:noProof/>
                 <w:webHidden/>
               </w:rPr>
-              <w:t>20</w:t>
+              <w:t>21</w:t>
             </w:r>
             <w:r>
               <w:rPr>
@@ -2630,7 +2630,7 @@
               <w14:ligatures w14:val="standardContextual"/>
             </w:rPr>
           </w:pPr>
-          <w:hyperlink w:anchor="_Toc238490959" w:history="1">
+          <w:hyperlink w:anchor="_Toc238679612" w:history="1">
             <w:r>
               <w:rPr>
                 <w:rStyle w:val="Hipervnculo"/>
@@ -2657,7 +2657,7 @@
                 <w:noProof/>
                 <w:webHidden/>
               </w:rPr>
-              <w:instrText xml:space="preserve"> PAGEREF _Toc238490959 \h </w:instrText>
+              <w:instrText xml:space="preserve"> PAGEREF _Toc238679612 \h </w:instrText>
             </w:r>
             <w:r>
               <w:rPr>
@@ -2677,7 +2677,7 @@
                 <w:noProof/>
                 <w:webHidden/>
               </w:rPr>
-              <w:t>21</w:t>
+              <w:t>22</w:t>
             </w:r>
             <w:r>
               <w:rPr>
@@ -2705,7 +2705,7 @@
               <w14:ligatures w14:val="standardContextual"/>
             </w:rPr>
           </w:pPr>
-          <w:hyperlink w:anchor="_Toc238490960" w:history="1">
+          <w:hyperlink w:anchor="_Toc238679613" w:history="1">
             <w:r>
               <w:rPr>
                 <w:rStyle w:val="Hipervnculo"/>
@@ -2732,7 +2732,7 @@
                 <w:noProof/>
                 <w:webHidden/>
               </w:rPr>
-              <w:instrText xml:space="preserve"> PAGEREF _Toc238490960 \h </w:instrText>
+              <w:instrText xml:space="preserve"> PAGEREF _Toc238679613 \h </w:instrText>
             </w:r>
             <w:r>
               <w:rPr>
@@ -2752,7 +2752,7 @@
                 <w:noProof/>
                 <w:webHidden/>
               </w:rPr>
-              <w:t>21</w:t>
+              <w:t>22</w:t>
             </w:r>
             <w:r>
               <w:rPr>
@@ -2780,7 +2780,7 @@
               <w14:ligatures w14:val="standardContextual"/>
             </w:rPr>
           </w:pPr>
-          <w:hyperlink w:anchor="_Toc238490961" w:history="1">
+          <w:hyperlink w:anchor="_Toc238679614" w:history="1">
             <w:r>
               <w:rPr>
                 <w:rStyle w:val="Hipervnculo"/>
@@ -2807,7 +2807,7 @@
                 <w:noProof/>
                 <w:webHidden/>
               </w:rPr>
-              <w:instrText xml:space="preserve"> PAGEREF _Toc238490961 \h </w:instrText>
+              <w:instrText xml:space="preserve"> PAGEREF _Toc238679614 \h </w:instrText>
             </w:r>
             <w:r>
               <w:rPr>
@@ -2827,7 +2827,7 @@
                 <w:noProof/>
                 <w:webHidden/>
               </w:rPr>
-              <w:t>21</w:t>
+              <w:t>22</w:t>
             </w:r>
             <w:r>
               <w:rPr>
@@ -2855,7 +2855,7 @@
               <w14:ligatures w14:val="standardContextual"/>
             </w:rPr>
           </w:pPr>
-          <w:hyperlink w:anchor="_Toc238490962" w:history="1">
+          <w:hyperlink w:anchor="_Toc238679615" w:history="1">
             <w:r>
               <w:rPr>
                 <w:rStyle w:val="Hipervnculo"/>
@@ -2882,7 +2882,7 @@
                 <w:noProof/>
                 <w:webHidden/>
               </w:rPr>
-              <w:instrText xml:space="preserve"> PAGEREF _Toc238490962 \h </w:instrText>
+              <w:instrText xml:space="preserve"> PAGEREF _Toc238679615 \h </w:instrText>
             </w:r>
             <w:r>
               <w:rPr>
@@ -2902,7 +2902,7 @@
                 <w:noProof/>
                 <w:webHidden/>
               </w:rPr>
-              <w:t>22</w:t>
+              <w:t>23</w:t>
             </w:r>
             <w:r>
               <w:rPr>
@@ -2930,7 +2930,7 @@
               <w14:ligatures w14:val="standardContextual"/>
             </w:rPr>
           </w:pPr>
-          <w:hyperlink w:anchor="_Toc238490963" w:history="1">
+          <w:hyperlink w:anchor="_Toc238679616" w:history="1">
             <w:r>
               <w:rPr>
                 <w:rStyle w:val="Hipervnculo"/>
@@ -2957,7 +2957,7 @@
                 <w:noProof/>
                 <w:webHidden/>
               </w:rPr>
-              <w:instrText xml:space="preserve"> PAGEREF _Toc238490963 \h </w:instrText>
+              <w:instrText xml:space="preserve"> PAGEREF _Toc238679616 \h </w:instrText>
             </w:r>
             <w:r>
               <w:rPr>
@@ -2977,7 +2977,7 @@
                 <w:noProof/>
                 <w:webHidden/>
               </w:rPr>
-              <w:t>23</w:t>
+              <w:t>24</w:t>
             </w:r>
             <w:r>
               <w:rPr>
@@ -3005,7 +3005,7 @@
               <w14:ligatures w14:val="standardContextual"/>
             </w:rPr>
           </w:pPr>
-          <w:hyperlink w:anchor="_Toc238490964" w:history="1">
+          <w:hyperlink w:anchor="_Toc238679617" w:history="1">
             <w:r>
               <w:rPr>
                 <w:rStyle w:val="Hipervnculo"/>
@@ -3032,7 +3032,7 @@
                 <w:noProof/>
                 <w:webHidden/>
               </w:rPr>
-              <w:instrText xml:space="preserve"> PAGEREF _Toc238490964 \h </w:instrText>
+              <w:instrText xml:space="preserve"> PAGEREF _Toc238679617 \h </w:instrText>
             </w:r>
             <w:r>
               <w:rPr>
@@ -3052,7 +3052,7 @@
                 <w:noProof/>
                 <w:webHidden/>
               </w:rPr>
-              <w:t>24</w:t>
+              <w:t>25</w:t>
             </w:r>
             <w:r>
               <w:rPr>
@@ -3080,7 +3080,7 @@
               <w14:ligatures w14:val="standardContextual"/>
             </w:rPr>
           </w:pPr>
-          <w:hyperlink w:anchor="_Toc238490965" w:history="1">
+          <w:hyperlink w:anchor="_Toc238679618" w:history="1">
             <w:r>
               <w:rPr>
                 <w:rStyle w:val="Hipervnculo"/>
@@ -3107,7 +3107,7 @@
                 <w:noProof/>
                 <w:webHidden/>
               </w:rPr>
-              <w:instrText xml:space="preserve"> PAGEREF _Toc238490965 \h </w:instrText>
+              <w:instrText xml:space="preserve"> PAGEREF _Toc238679618 \h </w:instrText>
             </w:r>
             <w:r>
               <w:rPr>
@@ -3127,7 +3127,7 @@
                 <w:noProof/>
                 <w:webHidden/>
               </w:rPr>
-              <w:t>24</w:t>
+              <w:t>25</w:t>
             </w:r>
             <w:r>
               <w:rPr>
@@ -3155,7 +3155,7 @@
               <w14:ligatures w14:val="standardContextual"/>
             </w:rPr>
           </w:pPr>
-          <w:hyperlink w:anchor="_Toc238490966" w:history="1">
+          <w:hyperlink w:anchor="_Toc238679619" w:history="1">
             <w:r>
               <w:rPr>
                 <w:rStyle w:val="Hipervnculo"/>
@@ -3183,7 +3183,7 @@
                 <w:noProof/>
                 <w:webHidden/>
               </w:rPr>
-              <w:instrText xml:space="preserve"> PAGEREF _Toc238490966 \h </w:instrText>
+              <w:instrText xml:space="preserve"> PAGEREF _Toc238679619 \h </w:instrText>
             </w:r>
             <w:r>
               <w:rPr>
@@ -3203,7 +3203,7 @@
                 <w:noProof/>
                 <w:webHidden/>
               </w:rPr>
-              <w:t>24</w:t>
+              <w:t>25</w:t>
             </w:r>
             <w:r>
               <w:rPr>
@@ -3231,7 +3231,7 @@
               <w14:ligatures w14:val="standardContextual"/>
             </w:rPr>
           </w:pPr>
-          <w:hyperlink w:anchor="_Toc238490967" w:history="1">
+          <w:hyperlink w:anchor="_Toc238679620" w:history="1">
             <w:r>
               <w:rPr>
                 <w:rStyle w:val="Hipervnculo"/>
@@ -3259,7 +3259,7 @@
                 <w:noProof/>
                 <w:webHidden/>
               </w:rPr>
-              <w:instrText xml:space="preserve"> PAGEREF _Toc238490967 \h </w:instrText>
+              <w:instrText xml:space="preserve"> PAGEREF _Toc238679620 \h </w:instrText>
             </w:r>
             <w:r>
               <w:rPr>
@@ -3279,7 +3279,7 @@
                 <w:noProof/>
                 <w:webHidden/>
               </w:rPr>
-              <w:t>25</w:t>
+              <w:t>26</w:t>
             </w:r>
             <w:r>
               <w:rPr>
@@ -3307,7 +3307,7 @@
               <w14:ligatures w14:val="standardContextual"/>
             </w:rPr>
           </w:pPr>
-          <w:hyperlink w:anchor="_Toc238490968" w:history="1">
+          <w:hyperlink w:anchor="_Toc238679621" w:history="1">
             <w:r>
               <w:rPr>
                 <w:rStyle w:val="Hipervnculo"/>
@@ -3335,7 +3335,7 @@
                 <w:noProof/>
                 <w:webHidden/>
               </w:rPr>
-              <w:instrText xml:space="preserve"> PAGEREF _Toc238490968 \h </w:instrText>
+              <w:instrText xml:space="preserve"> PAGEREF _Toc238679621 \h </w:instrText>
             </w:r>
             <w:r>
               <w:rPr>
@@ -3355,7 +3355,7 @@
                 <w:noProof/>
                 <w:webHidden/>
               </w:rPr>
-              <w:t>25</w:t>
+              <w:t>26</w:t>
             </w:r>
             <w:r>
               <w:rPr>
@@ -3383,7 +3383,7 @@
               <w14:ligatures w14:val="standardContextual"/>
             </w:rPr>
           </w:pPr>
-          <w:hyperlink w:anchor="_Toc238490969" w:history="1">
+          <w:hyperlink w:anchor="_Toc238679622" w:history="1">
             <w:r>
               <w:rPr>
                 <w:rStyle w:val="Hipervnculo"/>
@@ -3411,7 +3411,7 @@
                 <w:noProof/>
                 <w:webHidden/>
               </w:rPr>
-              <w:instrText xml:space="preserve"> PAGEREF _Toc238490969 \h </w:instrText>
+              <w:instrText xml:space="preserve"> PAGEREF _Toc238679622 \h </w:instrText>
             </w:r>
             <w:r>
               <w:rPr>
@@ -3431,7 +3431,7 @@
                 <w:noProof/>
                 <w:webHidden/>
               </w:rPr>
-              <w:t>26</w:t>
+              <w:t>27</w:t>
             </w:r>
             <w:r>
               <w:rPr>
@@ -3459,7 +3459,7 @@
               <w14:ligatures w14:val="standardContextual"/>
             </w:rPr>
           </w:pPr>
-          <w:hyperlink w:anchor="_Toc238490970" w:history="1">
+          <w:hyperlink w:anchor="_Toc238679623" w:history="1">
             <w:r>
               <w:rPr>
                 <w:rStyle w:val="Hipervnculo"/>
@@ -3487,7 +3487,7 @@
                 <w:noProof/>
                 <w:webHidden/>
               </w:rPr>
-              <w:instrText xml:space="preserve"> PAGEREF _Toc238490970 \h </w:instrText>
+              <w:instrText xml:space="preserve"> PAGEREF _Toc238679623 \h </w:instrText>
             </w:r>
             <w:r>
               <w:rPr>
@@ -3507,7 +3507,7 @@
                 <w:noProof/>
                 <w:webHidden/>
               </w:rPr>
-              <w:t>26</w:t>
+              <w:t>27</w:t>
             </w:r>
             <w:r>
               <w:rPr>
@@ -3535,7 +3535,7 @@
               <w14:ligatures w14:val="standardContextual"/>
             </w:rPr>
           </w:pPr>
-          <w:hyperlink w:anchor="_Toc238490971" w:history="1">
+          <w:hyperlink w:anchor="_Toc238679624" w:history="1">
             <w:r>
               <w:rPr>
                 <w:rStyle w:val="Hipervnculo"/>
@@ -3562,7 +3562,7 @@
                 <w:noProof/>
                 <w:webHidden/>
               </w:rPr>
-              <w:instrText xml:space="preserve"> PAGEREF _Toc238490971 \h </w:instrText>
+              <w:instrText xml:space="preserve"> PAGEREF _Toc238679624 \h </w:instrText>
             </w:r>
             <w:r>
               <w:rPr>
@@ -3582,7 +3582,7 @@
                 <w:noProof/>
                 <w:webHidden/>
               </w:rPr>
-              <w:t>27</w:t>
+              <w:t>28</w:t>
             </w:r>
             <w:r>
               <w:rPr>
@@ -3610,7 +3610,7 @@
               <w14:ligatures w14:val="standardContextual"/>
             </w:rPr>
           </w:pPr>
-          <w:hyperlink w:anchor="_Toc238490972" w:history="1">
+          <w:hyperlink w:anchor="_Toc238679625" w:history="1">
             <w:r>
               <w:rPr>
                 <w:rStyle w:val="Hipervnculo"/>
@@ -3637,7 +3637,7 @@
                 <w:noProof/>
                 <w:webHidden/>
               </w:rPr>
-              <w:instrText xml:space="preserve"> PAGEREF _Toc238490972 \h </w:instrText>
+              <w:instrText xml:space="preserve"> PAGEREF _Toc238679625 \h </w:instrText>
             </w:r>
             <w:r>
               <w:rPr>
@@ -3657,7 +3657,7 @@
                 <w:noProof/>
                 <w:webHidden/>
               </w:rPr>
-              <w:t>28</w:t>
+              <w:t>29</w:t>
             </w:r>
             <w:r>
               <w:rPr>
@@ -3685,7 +3685,7 @@
               <w14:ligatures w14:val="standardContextual"/>
             </w:rPr>
           </w:pPr>
-          <w:hyperlink w:anchor="_Toc238490973" w:history="1">
+          <w:hyperlink w:anchor="_Toc238679626" w:history="1">
             <w:r>
               <w:rPr>
                 <w:rStyle w:val="Hipervnculo"/>
@@ -3712,7 +3712,7 @@
                 <w:noProof/>
                 <w:webHidden/>
               </w:rPr>
-              <w:instrText xml:space="preserve"> PAGEREF _Toc238490973 \h </w:instrText>
+              <w:instrText xml:space="preserve"> PAGEREF _Toc238679626 \h </w:instrText>
             </w:r>
             <w:r>
               <w:rPr>
@@ -3732,7 +3732,7 @@
                 <w:noProof/>
                 <w:webHidden/>
               </w:rPr>
-              <w:t>28</w:t>
+              <w:t>29</w:t>
             </w:r>
             <w:r>
               <w:rPr>
@@ -3760,7 +3760,7 @@
               <w14:ligatures w14:val="standardContextual"/>
             </w:rPr>
           </w:pPr>
-          <w:hyperlink w:anchor="_Toc238490974" w:history="1">
+          <w:hyperlink w:anchor="_Toc238679627" w:history="1">
             <w:r>
               <w:rPr>
                 <w:rStyle w:val="Hipervnculo"/>
@@ -3787,7 +3787,7 @@
                 <w:noProof/>
                 <w:webHidden/>
               </w:rPr>
-              <w:instrText xml:space="preserve"> PAGEREF _Toc238490974 \h </w:instrText>
+              <w:instrText xml:space="preserve"> PAGEREF _Toc238679627 \h </w:instrText>
             </w:r>
             <w:r>
               <w:rPr>
@@ -3807,7 +3807,7 @@
                 <w:noProof/>
                 <w:webHidden/>
               </w:rPr>
-              <w:t>28</w:t>
+              <w:t>29</w:t>
             </w:r>
             <w:r>
               <w:rPr>
@@ -3835,7 +3835,7 @@
               <w14:ligatures w14:val="standardContextual"/>
             </w:rPr>
           </w:pPr>
-          <w:hyperlink w:anchor="_Toc238490975" w:history="1">
+          <w:hyperlink w:anchor="_Toc238679628" w:history="1">
             <w:r>
               <w:rPr>
                 <w:rStyle w:val="Hipervnculo"/>
@@ -3862,7 +3862,7 @@
                 <w:noProof/>
                 <w:webHidden/>
               </w:rPr>
-              <w:instrText xml:space="preserve"> PAGEREF _Toc238490975 \h </w:instrText>
+              <w:instrText xml:space="preserve"> PAGEREF _Toc238679628 \h </w:instrText>
             </w:r>
             <w:r>
               <w:rPr>
@@ -3882,7 +3882,7 @@
                 <w:noProof/>
                 <w:webHidden/>
               </w:rPr>
-              <w:t>29</w:t>
+              <w:t>30</w:t>
             </w:r>
             <w:r>
               <w:rPr>
@@ -3910,7 +3910,7 @@
               <w14:ligatures w14:val="standardContextual"/>
             </w:rPr>
           </w:pPr>
-          <w:hyperlink w:anchor="_Toc238490976" w:history="1">
+          <w:hyperlink w:anchor="_Toc238679629" w:history="1">
             <w:r>
               <w:rPr>
                 <w:rStyle w:val="Hipervnculo"/>
@@ -3937,7 +3937,7 @@
                 <w:noProof/>
                 <w:webHidden/>
               </w:rPr>
-              <w:instrText xml:space="preserve"> PAGEREF _Toc238490976 \h </w:instrText>
+              <w:instrText xml:space="preserve"> PAGEREF _Toc238679629 \h </w:instrText>
             </w:r>
             <w:r>
               <w:rPr>
@@ -3957,7 +3957,7 @@
                 <w:noProof/>
                 <w:webHidden/>
               </w:rPr>
-              <w:t>29</w:t>
+              <w:t>30</w:t>
             </w:r>
             <w:r>
               <w:rPr>
@@ -3985,7 +3985,7 @@
               <w14:ligatures w14:val="standardContextual"/>
             </w:rPr>
           </w:pPr>
-          <w:hyperlink w:anchor="_Toc238490977" w:history="1">
+          <w:hyperlink w:anchor="_Toc238679630" w:history="1">
             <w:r>
               <w:rPr>
                 <w:rStyle w:val="Hipervnculo"/>
@@ -4012,7 +4012,7 @@
                 <w:noProof/>
                 <w:webHidden/>
               </w:rPr>
-              <w:instrText xml:space="preserve"> PAGEREF _Toc238490977 \h </w:instrText>
+              <w:instrText xml:space="preserve"> PAGEREF _Toc238679630 \h </w:instrText>
             </w:r>
             <w:r>
               <w:rPr>
@@ -4032,7 +4032,7 @@
                 <w:noProof/>
                 <w:webHidden/>
               </w:rPr>
-              <w:t>29</w:t>
+              <w:t>30</w:t>
             </w:r>
             <w:r>
               <w:rPr>
@@ -4060,7 +4060,7 @@
               <w14:ligatures w14:val="standardContextual"/>
             </w:rPr>
           </w:pPr>
-          <w:hyperlink w:anchor="_Toc238490978" w:history="1">
+          <w:hyperlink w:anchor="_Toc238679631" w:history="1">
             <w:r>
               <w:rPr>
                 <w:rStyle w:val="Hipervnculo"/>
@@ -4087,7 +4087,7 @@
                 <w:noProof/>
                 <w:webHidden/>
               </w:rPr>
-              <w:instrText xml:space="preserve"> PAGEREF _Toc238490978 \h </w:instrText>
+              <w:instrText xml:space="preserve"> PAGEREF _Toc238679631 \h </w:instrText>
             </w:r>
             <w:r>
               <w:rPr>
@@ -4107,7 +4107,7 @@
                 <w:noProof/>
                 <w:webHidden/>
               </w:rPr>
-              <w:t>30</w:t>
+              <w:t>31</w:t>
             </w:r>
             <w:r>
               <w:rPr>
@@ -4135,7 +4135,7 @@
               <w14:ligatures w14:val="standardContextual"/>
             </w:rPr>
           </w:pPr>
-          <w:hyperlink w:anchor="_Toc238490979" w:history="1">
+          <w:hyperlink w:anchor="_Toc238679632" w:history="1">
             <w:r>
               <w:rPr>
                 <w:rStyle w:val="Hipervnculo"/>
@@ -4162,7 +4162,7 @@
                 <w:noProof/>
                 <w:webHidden/>
               </w:rPr>
-              <w:instrText xml:space="preserve"> PAGEREF _Toc238490979 \h </w:instrText>
+              <w:instrText xml:space="preserve"> PAGEREF _Toc238679632 \h </w:instrText>
             </w:r>
             <w:r>
               <w:rPr>
@@ -4182,7 +4182,7 @@
                 <w:noProof/>
                 <w:webHidden/>
               </w:rPr>
-              <w:t>30</w:t>
+              <w:t>31</w:t>
             </w:r>
             <w:r>
               <w:rPr>
@@ -4210,7 +4210,7 @@
               <w14:ligatures w14:val="standardContextual"/>
             </w:rPr>
           </w:pPr>
-          <w:hyperlink w:anchor="_Toc238490980" w:history="1">
+          <w:hyperlink w:anchor="_Toc238679633" w:history="1">
             <w:r>
               <w:rPr>
                 <w:rStyle w:val="Hipervnculo"/>
@@ -4237,7 +4237,7 @@
                 <w:noProof/>
                 <w:webHidden/>
               </w:rPr>
-              <w:instrText xml:space="preserve"> PAGEREF _Toc238490980 \h </w:instrText>
+              <w:instrText xml:space="preserve"> PAGEREF _Toc238679633 \h </w:instrText>
             </w:r>
             <w:r>
               <w:rPr>
@@ -4257,7 +4257,7 @@
                 <w:noProof/>
                 <w:webHidden/>
               </w:rPr>
-              <w:t>31</w:t>
+              <w:t>32</w:t>
             </w:r>
             <w:r>
               <w:rPr>
@@ -4285,7 +4285,7 @@
               <w14:ligatures w14:val="standardContextual"/>
             </w:rPr>
           </w:pPr>
-          <w:hyperlink w:anchor="_Toc238490981" w:history="1">
+          <w:hyperlink w:anchor="_Toc238679634" w:history="1">
             <w:r>
               <w:rPr>
                 <w:rStyle w:val="Hipervnculo"/>
@@ -4312,7 +4312,7 @@
                 <w:noProof/>
                 <w:webHidden/>
               </w:rPr>
-              <w:instrText xml:space="preserve"> PAGEREF _Toc238490981 \h </w:instrText>
+              <w:instrText xml:space="preserve"> PAGEREF _Toc238679634 \h </w:instrText>
             </w:r>
             <w:r>
               <w:rPr>
@@ -4332,7 +4332,7 @@
                 <w:noProof/>
                 <w:webHidden/>
               </w:rPr>
-              <w:t>32</w:t>
+              <w:t>33</w:t>
             </w:r>
             <w:r>
               <w:rPr>
@@ -4360,7 +4360,7 @@
               <w14:ligatures w14:val="standardContextual"/>
             </w:rPr>
           </w:pPr>
-          <w:hyperlink w:anchor="_Toc238490982" w:history="1">
+          <w:hyperlink w:anchor="_Toc238679635" w:history="1">
             <w:r>
               <w:rPr>
                 <w:rStyle w:val="Hipervnculo"/>
@@ -4387,7 +4387,7 @@
                 <w:noProof/>
                 <w:webHidden/>
               </w:rPr>
-              <w:instrText xml:space="preserve"> PAGEREF _Toc238490982 \h </w:instrText>
+              <w:instrText xml:space="preserve"> PAGEREF _Toc238679635 \h </w:instrText>
             </w:r>
             <w:r>
               <w:rPr>
@@ -4407,7 +4407,7 @@
                 <w:noProof/>
                 <w:webHidden/>
               </w:rPr>
-              <w:t>32</w:t>
+              <w:t>33</w:t>
             </w:r>
             <w:r>
               <w:rPr>
@@ -4435,7 +4435,7 @@
               <w14:ligatures w14:val="standardContextual"/>
             </w:rPr>
           </w:pPr>
-          <w:hyperlink w:anchor="_Toc238490983" w:history="1">
+          <w:hyperlink w:anchor="_Toc238679636" w:history="1">
             <w:r>
               <w:rPr>
                 <w:rStyle w:val="Hipervnculo"/>
@@ -4462,7 +4462,7 @@
                 <w:noProof/>
                 <w:webHidden/>
               </w:rPr>
-              <w:instrText xml:space="preserve"> PAGEREF _Toc238490983 \h </w:instrText>
+              <w:instrText xml:space="preserve"> PAGEREF _Toc238679636 \h </w:instrText>
             </w:r>
             <w:r>
               <w:rPr>
@@ -4482,7 +4482,7 @@
                 <w:noProof/>
                 <w:webHidden/>
               </w:rPr>
-              <w:t>32</w:t>
+              <w:t>33</w:t>
             </w:r>
             <w:r>
               <w:rPr>
@@ -4510,7 +4510,7 @@
               <w14:ligatures w14:val="standardContextual"/>
             </w:rPr>
           </w:pPr>
-          <w:hyperlink w:anchor="_Toc238490984" w:history="1">
+          <w:hyperlink w:anchor="_Toc238679637" w:history="1">
             <w:r>
               <w:rPr>
                 <w:rStyle w:val="Hipervnculo"/>
@@ -4537,7 +4537,7 @@
                 <w:noProof/>
                 <w:webHidden/>
               </w:rPr>
-              <w:instrText xml:space="preserve"> PAGEREF _Toc238490984 \h </w:instrText>
+              <w:instrText xml:space="preserve"> PAGEREF _Toc238679637 \h </w:instrText>
             </w:r>
             <w:r>
               <w:rPr>
@@ -4557,7 +4557,7 @@
                 <w:noProof/>
                 <w:webHidden/>
               </w:rPr>
-              <w:t>32</w:t>
+              <w:t>33</w:t>
             </w:r>
             <w:r>
               <w:rPr>
@@ -4585,7 +4585,7 @@
               <w14:ligatures w14:val="standardContextual"/>
             </w:rPr>
           </w:pPr>
-          <w:hyperlink w:anchor="_Toc238490985" w:history="1">
+          <w:hyperlink w:anchor="_Toc238679638" w:history="1">
             <w:r>
               <w:rPr>
                 <w:rStyle w:val="Hipervnculo"/>
@@ -4612,7 +4612,7 @@
                 <w:noProof/>
                 <w:webHidden/>
               </w:rPr>
-              <w:instrText xml:space="preserve"> PAGEREF _Toc238490985 \h </w:instrText>
+              <w:instrText xml:space="preserve"> PAGEREF _Toc238679638 \h </w:instrText>
             </w:r>
             <w:r>
               <w:rPr>
@@ -4632,7 +4632,7 @@
                 <w:noProof/>
                 <w:webHidden/>
               </w:rPr>
-              <w:t>32</w:t>
+              <w:t>33</w:t>
             </w:r>
             <w:r>
               <w:rPr>
@@ -4660,7 +4660,7 @@
               <w14:ligatures w14:val="standardContextual"/>
             </w:rPr>
           </w:pPr>
-          <w:hyperlink w:anchor="_Toc238490986" w:history="1">
+          <w:hyperlink w:anchor="_Toc238679639" w:history="1">
             <w:r>
               <w:rPr>
                 <w:rStyle w:val="Hipervnculo"/>
@@ -4687,7 +4687,7 @@
                 <w:noProof/>
                 <w:webHidden/>
               </w:rPr>
-              <w:instrText xml:space="preserve"> PAGEREF _Toc238490986 \h </w:instrText>
+              <w:instrText xml:space="preserve"> PAGEREF _Toc238679639 \h </w:instrText>
             </w:r>
             <w:r>
               <w:rPr>
@@ -4707,7 +4707,7 @@
                 <w:noProof/>
                 <w:webHidden/>
               </w:rPr>
-              <w:t>32</w:t>
+              <w:t>33</w:t>
             </w:r>
             <w:r>
               <w:rPr>
@@ -4735,7 +4735,7 @@
               <w14:ligatures w14:val="standardContextual"/>
             </w:rPr>
           </w:pPr>
-          <w:hyperlink w:anchor="_Toc238490987" w:history="1">
+          <w:hyperlink w:anchor="_Toc238679640" w:history="1">
             <w:r>
               <w:rPr>
                 <w:rStyle w:val="Hipervnculo"/>
@@ -4762,7 +4762,7 @@
                 <w:noProof/>
                 <w:webHidden/>
               </w:rPr>
-              <w:instrText xml:space="preserve"> PAGEREF _Toc238490987 \h </w:instrText>
+              <w:instrText xml:space="preserve"> PAGEREF _Toc238679640 \h </w:instrText>
             </w:r>
             <w:r>
               <w:rPr>
@@ -4782,7 +4782,7 @@
                 <w:noProof/>
                 <w:webHidden/>
               </w:rPr>
-              <w:t>33</w:t>
+              <w:t>34</w:t>
             </w:r>
             <w:r>
               <w:rPr>
@@ -4810,7 +4810,7 @@
               <w14:ligatures w14:val="standardContextual"/>
             </w:rPr>
           </w:pPr>
-          <w:hyperlink w:anchor="_Toc238490988" w:history="1">
+          <w:hyperlink w:anchor="_Toc238679641" w:history="1">
             <w:r>
               <w:rPr>
                 <w:rStyle w:val="Hipervnculo"/>
@@ -4837,7 +4837,7 @@
                 <w:noProof/>
                 <w:webHidden/>
               </w:rPr>
-              <w:instrText xml:space="preserve"> PAGEREF _Toc238490988 \h </w:instrText>
+              <w:instrText xml:space="preserve"> PAGEREF _Toc238679641 \h </w:instrText>
             </w:r>
             <w:r>
               <w:rPr>
@@ -4857,7 +4857,7 @@
                 <w:noProof/>
                 <w:webHidden/>
               </w:rPr>
-              <w:t>33</w:t>
+              <w:t>34</w:t>
             </w:r>
             <w:r>
               <w:rPr>
@@ -4885,7 +4885,7 @@
               <w14:ligatures w14:val="standardContextual"/>
             </w:rPr>
           </w:pPr>
-          <w:hyperlink w:anchor="_Toc238490989" w:history="1">
+          <w:hyperlink w:anchor="_Toc238679642" w:history="1">
             <w:r>
               <w:rPr>
                 <w:rStyle w:val="Hipervnculo"/>
@@ -4912,7 +4912,7 @@
                 <w:noProof/>
                 <w:webHidden/>
               </w:rPr>
-              <w:instrText xml:space="preserve"> PAGEREF _Toc238490989 \h </w:instrText>
+              <w:instrText xml:space="preserve"> PAGEREF _Toc238679642 \h </w:instrText>
             </w:r>
             <w:r>
               <w:rPr>
@@ -4932,7 +4932,7 @@
                 <w:noProof/>
                 <w:webHidden/>
               </w:rPr>
-              <w:t>33</w:t>
+              <w:t>34</w:t>
             </w:r>
             <w:r>
               <w:rPr>
@@ -4960,7 +4960,7 @@
               <w14:ligatures w14:val="standardContextual"/>
             </w:rPr>
           </w:pPr>
-          <w:hyperlink w:anchor="_Toc238490990" w:history="1">
+          <w:hyperlink w:anchor="_Toc238679643" w:history="1">
             <w:r>
               <w:rPr>
                 <w:rStyle w:val="Hipervnculo"/>
@@ -4987,7 +4987,7 @@
                 <w:noProof/>
                 <w:webHidden/>
               </w:rPr>
-              <w:instrText xml:space="preserve"> PAGEREF _Toc238490990 \h </w:instrText>
+              <w:instrText xml:space="preserve"> PAGEREF _Toc238679643 \h </w:instrText>
             </w:r>
             <w:r>
               <w:rPr>
@@ -5007,7 +5007,7 @@
                 <w:noProof/>
                 <w:webHidden/>
               </w:rPr>
-              <w:t>34</w:t>
+              <w:t>35</w:t>
             </w:r>
             <w:r>
               <w:rPr>
@@ -5035,7 +5035,7 @@
               <w14:ligatures w14:val="standardContextual"/>
             </w:rPr>
           </w:pPr>
-          <w:hyperlink w:anchor="_Toc238490991" w:history="1">
+          <w:hyperlink w:anchor="_Toc238679644" w:history="1">
             <w:r>
               <w:rPr>
                 <w:rStyle w:val="Hipervnculo"/>
@@ -5062,7 +5062,7 @@
                 <w:noProof/>
                 <w:webHidden/>
               </w:rPr>
-              <w:instrText xml:space="preserve"> PAGEREF _Toc238490991 \h </w:instrText>
+              <w:instrText xml:space="preserve"> PAGEREF _Toc238679644 \h </w:instrText>
             </w:r>
             <w:r>
               <w:rPr>
@@ -5082,7 +5082,7 @@
                 <w:noProof/>
                 <w:webHidden/>
               </w:rPr>
-              <w:t>35</w:t>
+              <w:t>36</w:t>
             </w:r>
             <w:r>
               <w:rPr>
@@ -5110,7 +5110,7 @@
               <w14:ligatures w14:val="standardContextual"/>
             </w:rPr>
           </w:pPr>
-          <w:hyperlink w:anchor="_Toc238490992" w:history="1">
+          <w:hyperlink w:anchor="_Toc238679645" w:history="1">
             <w:r>
               <w:rPr>
                 <w:rStyle w:val="Hipervnculo"/>
@@ -5137,7 +5137,7 @@
                 <w:noProof/>
                 <w:webHidden/>
               </w:rPr>
-              <w:instrText xml:space="preserve"> PAGEREF _Toc238490992 \h </w:instrText>
+              <w:instrText xml:space="preserve"> PAGEREF _Toc238679645 \h </w:instrText>
             </w:r>
             <w:r>
               <w:rPr>
@@ -5157,7 +5157,7 @@
                 <w:noProof/>
                 <w:webHidden/>
               </w:rPr>
-              <w:t>36</w:t>
+              <w:t>37</w:t>
             </w:r>
             <w:r>
               <w:rPr>
@@ -5185,7 +5185,7 @@
               <w14:ligatures w14:val="standardContextual"/>
             </w:rPr>
           </w:pPr>
-          <w:hyperlink w:anchor="_Toc238490993" w:history="1">
+          <w:hyperlink w:anchor="_Toc238679646" w:history="1">
             <w:r>
               <w:rPr>
                 <w:rStyle w:val="Hipervnculo"/>
@@ -5213,7 +5213,7 @@
                 <w:noProof/>
                 <w:webHidden/>
               </w:rPr>
-              <w:instrText xml:space="preserve"> PAGEREF _Toc238490993 \h </w:instrText>
+              <w:instrText xml:space="preserve"> PAGEREF _Toc238679646 \h </w:instrText>
             </w:r>
             <w:r>
               <w:rPr>
@@ -5233,7 +5233,7 @@
                 <w:noProof/>
                 <w:webHidden/>
               </w:rPr>
-              <w:t>37</w:t>
+              <w:t>38</w:t>
             </w:r>
             <w:r>
               <w:rPr>
@@ -5261,7 +5261,7 @@
               <w14:ligatures w14:val="standardContextual"/>
             </w:rPr>
           </w:pPr>
-          <w:hyperlink w:anchor="_Toc238490994" w:history="1">
+          <w:hyperlink w:anchor="_Toc238679647" w:history="1">
             <w:r>
               <w:rPr>
                 <w:rStyle w:val="Hipervnculo"/>
@@ -5289,7 +5289,7 @@
                 <w:noProof/>
                 <w:webHidden/>
               </w:rPr>
-              <w:instrText xml:space="preserve"> PAGEREF _Toc238490994 \h </w:instrText>
+              <w:instrText xml:space="preserve"> PAGEREF _Toc238679647 \h </w:instrText>
             </w:r>
             <w:r>
               <w:rPr>
@@ -5309,7 +5309,7 @@
                 <w:noProof/>
                 <w:webHidden/>
               </w:rPr>
-              <w:t>37</w:t>
+              <w:t>38</w:t>
             </w:r>
             <w:r>
               <w:rPr>
@@ -5337,7 +5337,7 @@
               <w14:ligatures w14:val="standardContextual"/>
             </w:rPr>
           </w:pPr>
-          <w:hyperlink w:anchor="_Toc238490995" w:history="1">
+          <w:hyperlink w:anchor="_Toc238679648" w:history="1">
             <w:r>
               <w:rPr>
                 <w:rStyle w:val="Hipervnculo"/>
@@ -5365,7 +5365,7 @@
                 <w:noProof/>
                 <w:webHidden/>
               </w:rPr>
-              <w:instrText xml:space="preserve"> PAGEREF _Toc238490995 \h </w:instrText>
+              <w:instrText xml:space="preserve"> PAGEREF _Toc238679648 \h </w:instrText>
             </w:r>
             <w:r>
               <w:rPr>
@@ -5385,7 +5385,7 @@
                 <w:noProof/>
                 <w:webHidden/>
               </w:rPr>
-              <w:t>38</w:t>
+              <w:t>39</w:t>
             </w:r>
             <w:r>
               <w:rPr>
@@ -5413,7 +5413,7 @@
               <w14:ligatures w14:val="standardContextual"/>
             </w:rPr>
           </w:pPr>
-          <w:hyperlink w:anchor="_Toc238490996" w:history="1">
+          <w:hyperlink w:anchor="_Toc238679649" w:history="1">
             <w:r>
               <w:rPr>
                 <w:rStyle w:val="Hipervnculo"/>
@@ -5441,7 +5441,7 @@
                 <w:noProof/>
                 <w:webHidden/>
               </w:rPr>
-              <w:instrText xml:space="preserve"> PAGEREF _Toc238490996 \h </w:instrText>
+              <w:instrText xml:space="preserve"> PAGEREF _Toc238679649 \h </w:instrText>
             </w:r>
             <w:r>
               <w:rPr>
@@ -5461,7 +5461,7 @@
                 <w:noProof/>
                 <w:webHidden/>
               </w:rPr>
-              <w:t>38</w:t>
+              <w:t>39</w:t>
             </w:r>
             <w:r>
               <w:rPr>
@@ -5489,7 +5489,7 @@
               <w14:ligatures w14:val="standardContextual"/>
             </w:rPr>
           </w:pPr>
-          <w:hyperlink w:anchor="_Toc238490997" w:history="1">
+          <w:hyperlink w:anchor="_Toc238679650" w:history="1">
             <w:r>
               <w:rPr>
                 <w:rStyle w:val="Hipervnculo"/>
@@ -5517,7 +5517,7 @@
                 <w:noProof/>
                 <w:webHidden/>
               </w:rPr>
-              <w:instrText xml:space="preserve"> PAGEREF _Toc238490997 \h </w:instrText>
+              <w:instrText xml:space="preserve"> PAGEREF _Toc238679650 \h </w:instrText>
             </w:r>
             <w:r>
               <w:rPr>
@@ -5537,7 +5537,7 @@
                 <w:noProof/>
                 <w:webHidden/>
               </w:rPr>
-              <w:t>38</w:t>
+              <w:t>39</w:t>
             </w:r>
             <w:r>
               <w:rPr>
@@ -5565,7 +5565,7 @@
               <w14:ligatures w14:val="standardContextual"/>
             </w:rPr>
           </w:pPr>
-          <w:hyperlink w:anchor="_Toc238490998" w:history="1">
+          <w:hyperlink w:anchor="_Toc238679651" w:history="1">
             <w:r>
               <w:rPr>
                 <w:rStyle w:val="Hipervnculo"/>
@@ -5593,7 +5593,7 @@
                 <w:noProof/>
                 <w:webHidden/>
               </w:rPr>
-              <w:instrText xml:space="preserve"> PAGEREF _Toc238490998 \h </w:instrText>
+              <w:instrText xml:space="preserve"> PAGEREF _Toc238679651 \h </w:instrText>
             </w:r>
             <w:r>
               <w:rPr>
@@ -5613,7 +5613,7 @@
                 <w:noProof/>
                 <w:webHidden/>
               </w:rPr>
-              <w:t>39</w:t>
+              <w:t>40</w:t>
             </w:r>
             <w:r>
               <w:rPr>
@@ -5641,7 +5641,7 @@
               <w14:ligatures w14:val="standardContextual"/>
             </w:rPr>
           </w:pPr>
-          <w:hyperlink w:anchor="_Toc238490999" w:history="1">
+          <w:hyperlink w:anchor="_Toc238679652" w:history="1">
             <w:r>
               <w:rPr>
                 <w:rStyle w:val="Hipervnculo"/>
@@ -5669,7 +5669,7 @@
                 <w:noProof/>
                 <w:webHidden/>
               </w:rPr>
-              <w:instrText xml:space="preserve"> PAGEREF _Toc238490999 \h </w:instrText>
+              <w:instrText xml:space="preserve"> PAGEREF _Toc238679652 \h </w:instrText>
             </w:r>
             <w:r>
               <w:rPr>
@@ -5689,7 +5689,7 @@
                 <w:noProof/>
                 <w:webHidden/>
               </w:rPr>
-              <w:t>40</w:t>
+              <w:t>41</w:t>
             </w:r>
             <w:r>
               <w:rPr>
@@ -5717,7 +5717,7 @@
               <w14:ligatures w14:val="standardContextual"/>
             </w:rPr>
           </w:pPr>
-          <w:hyperlink w:anchor="_Toc238491000" w:history="1">
+          <w:hyperlink w:anchor="_Toc238679653" w:history="1">
             <w:r>
               <w:rPr>
                 <w:rStyle w:val="Hipervnculo"/>
@@ -5744,7 +5744,7 @@
                 <w:noProof/>
                 <w:webHidden/>
               </w:rPr>
-              <w:instrText xml:space="preserve"> PAGEREF _Toc238491000 \h </w:instrText>
+              <w:instrText xml:space="preserve"> PAGEREF _Toc238679653 \h </w:instrText>
             </w:r>
             <w:r>
               <w:rPr>
@@ -5764,7 +5764,7 @@
                 <w:noProof/>
                 <w:webHidden/>
               </w:rPr>
-              <w:t>40</w:t>
+              <w:t>41</w:t>
             </w:r>
             <w:r>
               <w:rPr>
@@ -5792,7 +5792,7 @@
               <w14:ligatures w14:val="standardContextual"/>
             </w:rPr>
           </w:pPr>
-          <w:hyperlink w:anchor="_Toc238491001" w:history="1">
+          <w:hyperlink w:anchor="_Toc238679654" w:history="1">
             <w:r>
               <w:rPr>
                 <w:rStyle w:val="Hipervnculo"/>
@@ -5820,7 +5820,7 @@
                 <w:noProof/>
                 <w:webHidden/>
               </w:rPr>
-              <w:instrText xml:space="preserve"> PAGEREF _Toc238491001 \h </w:instrText>
+              <w:instrText xml:space="preserve"> PAGEREF _Toc238679654 \h </w:instrText>
             </w:r>
             <w:r>
               <w:rPr>
@@ -5840,7 +5840,82 @@
                 <w:noProof/>
                 <w:webHidden/>
               </w:rPr>
-              <w:t>40</w:t>
+              <w:t>41</w:t>
+            </w:r>
+            <w:r>
+              <w:rPr>
+                <w:noProof/>
+                <w:webHidden/>
+              </w:rPr>
+              <w:fldChar w:fldCharType="end"/>
+            </w:r>
+          </w:hyperlink>
+        </w:p>
+        <w:p>
+          <w:pPr>
+            <w:pStyle w:val="TDC2"/>
+            <w:tabs>
+              <w:tab w:val="right" w:leader="dot" w:pos="8494"/>
+            </w:tabs>
+            <w:rPr>
+              <w:rFonts w:asciiTheme="minorHAnsi" w:hAnsiTheme="minorHAnsi"/>
+              <w:noProof/>
+              <w:color w:val="auto"/>
+              <w:kern w:val="2"/>
+              <w:sz w:val="24"/>
+              <w:szCs w:val="24"/>
+              <w:lang w:eastAsia="es-ES"/>
+              <w14:ligatures w14:val="standardContextual"/>
+            </w:rPr>
+          </w:pPr>
+          <w:hyperlink w:anchor="_Toc238679655" w:history="1">
+            <w:r>
+              <w:rPr>
+                <w:rStyle w:val="Hipervnculo"/>
+                <w:noProof/>
+              </w:rPr>
+              <w:t>Anexo E: Resumen de arquitectura y evidencia</w:t>
+            </w:r>
+            <w:r>
+              <w:rPr>
+                <w:noProof/>
+                <w:webHidden/>
+              </w:rPr>
+              <w:tab/>
+            </w:r>
+            <w:r>
+              <w:rPr>
+                <w:noProof/>
+                <w:webHidden/>
+              </w:rPr>
+              <w:fldChar w:fldCharType="begin"/>
+            </w:r>
+            <w:r>
+              <w:rPr>
+                <w:noProof/>
+                <w:webHidden/>
+              </w:rPr>
+              <w:instrText xml:space="preserve"> PAGEREF _Toc238679655 \h </w:instrText>
+            </w:r>
+            <w:r>
+              <w:rPr>
+                <w:noProof/>
+                <w:webHidden/>
+              </w:rPr>
+            </w:r>
+            <w:r>
+              <w:rPr>
+                <w:noProof/>
+                <w:webHidden/>
+              </w:rPr>
+              <w:fldChar w:fldCharType="separate"/>
+            </w:r>
+            <w:r>
+              <w:rPr>
+                <w:noProof/>
+                <w:webHidden/>
+              </w:rPr>
+              <w:t>42</w:t>
             </w:r>
             <w:r>
               <w:rPr>
@@ -5857,6 +5932,7 @@
               <w:b/>
               <w:bCs/>
             </w:rPr>
+            <w:lastRenderedPageBreak/>
             <w:fldChar w:fldCharType="end"/>
           </w:r>
         </w:p>
@@ -5866,7 +5942,7 @@
       <w:pPr>
         <w:pStyle w:val="Ttulo1"/>
       </w:pPr>
-      <w:bookmarkStart w:id="5" w:name="_Toc238490936"/>
+      <w:bookmarkStart w:id="5" w:name="_Toc238679589"/>
       <w:r>
         <w:lastRenderedPageBreak/>
         <w:t>Introducción</w:t>
@@ -5962,7 +6038,7 @@
     </w:p>
     <w:p>
       <w:r>
-        <w:t>La metodología seguida ha combinado una revisión bibliográfica de fuentes académicas y de industria con un desarrollo iterativo del prototipo. El sistema se ha implementado en Python como una aplicación web modular con un núcleo local compartido: la interfaz Streamlit invoca los servicios de análisis directamente y, opcionalmente, el mismo caso de uso se expone mediante una API HTTP local y una extensión de Gmail. La validación se ha realizado mediante pruebas automatizadas, pruebas funcionales de los flujos principales y evaluación del clasificador sobre datos sintéticos controlados en español e inglés.</w:t>
+        <w:t>La metodología seguida ha combinado una revisión bibliográfica de fuentes académicas y de industria con un desarrollo iterativo del prototipo. El sistema se ha implementado en Python con una arquitectura cliente-servidor: el navegador usa Streamlit como presentación, mientras Streamlit, la extensión y el monitor envían las entradas por HTTP al backend central. Solo el servidor normaliza, analiza, entrena y mantiene las versiones activas de los modelos. La validación se ha realizado mediante pruebas automatizadas, recorridos funcionales cliente-servidor y evaluación controlada del clasificador en español e inglés.</w:t>
       </w:r>
     </w:p>
     <w:p>
@@ -5974,7 +6050,7 @@
       <w:pPr>
         <w:pStyle w:val="Ttulo1"/>
       </w:pPr>
-      <w:bookmarkStart w:id="6" w:name="_Toc238490937"/>
+      <w:bookmarkStart w:id="6" w:name="_Toc238679590"/>
       <w:r>
         <w:lastRenderedPageBreak/>
         <w:t>Marco teórico del phishing</w:t>
@@ -5985,7 +6061,7 @@
       <w:pPr>
         <w:pStyle w:val="Ttulo2"/>
       </w:pPr>
-      <w:bookmarkStart w:id="7" w:name="_Toc238490938"/>
+      <w:bookmarkStart w:id="7" w:name="_Toc238679591"/>
       <w:r>
         <w:t>Concepto y contexto actual</w:t>
       </w:r>
@@ -5993,7 +6069,7 @@
     </w:p>
     <w:p>
       <w:r>
-        <w:t>El phishing se ha consolidado como una de las ciberamenazas más persistentes y dañinas del panorama actual de la ciberseguridad. Según el Anti-Phishing Working Group (APWG), en el segundo trimestre de 2025 se detectaron 1 130 393 ataques de phishing únicos, el mayor volumen trimestral desde 2023 y parte de una tendencia creciente que no muestra signos de desaceleración (Anti-Phishing Working Group, 2025).</w:t>
+        <w:t>El phishing se ha consolidado como una de las ciberamenazas más persistentes y dañinas. Este Trabajo Fin de Grado diseña, implementa y evalúa un sistema cliente-servidor para detectar phishing en correo. Streamlit, la extensión y el monitor envían las entradas a una API central que combina heurística explicable y modelos TF-IDF + MLP en español e inglés. El servidor es el único responsable de parsear, analizar, entrenar y versionar los modelos, de modo que una actualización se aplica a todos los clientes. La memoria revisa el estado del arte y presenta una validación reproducible, delimitando expresamente sus límites frente a producción.</w:t>
       </w:r>
     </w:p>
     <w:p>
@@ -6027,7 +6103,7 @@
       <w:pPr>
         <w:pStyle w:val="Ttulo2"/>
       </w:pPr>
-      <w:bookmarkStart w:id="8" w:name="_Toc238490939"/>
+      <w:bookmarkStart w:id="8" w:name="_Toc238679592"/>
       <w:r>
         <w:t>Fases de un ataque de phishing</w:t>
       </w:r>
@@ -6260,7 +6336,7 @@
       <w:pPr>
         <w:pStyle w:val="Ttulo3"/>
       </w:pPr>
-      <w:bookmarkStart w:id="9" w:name="_Toc238490940"/>
+      <w:bookmarkStart w:id="9" w:name="_Toc238679593"/>
       <w:r>
         <w:t>Preparación y Recopilación de Información (Reconocimiento)</w:t>
       </w:r>
@@ -6326,7 +6402,7 @@
       <w:pPr>
         <w:pStyle w:val="Ttulo3"/>
       </w:pPr>
-      <w:bookmarkStart w:id="10" w:name="_Toc238490941"/>
+      <w:bookmarkStart w:id="10" w:name="_Toc238679594"/>
       <w:r>
         <w:t>Creación y Lanzamiento del Cebo (Setup y Ataque)</w:t>
       </w:r>
@@ -6410,7 +6486,7 @@
           <w:noProof/>
         </w:rPr>
         <w:drawing>
-          <wp:inline distT="0" distB="0" distL="0" distR="0" wp14:anchorId="5F2B1234" wp14:editId="2F79471A">
+          <wp:inline distT="0" distB="0" distL="0" distR="0" wp14:anchorId="5F2B1234" wp14:editId="65BF450A">
             <wp:extent cx="5398135" cy="3598545"/>
             <wp:effectExtent l="0" t="0" r="0" b="1905"/>
             <wp:docPr id="2138688316" name="Imagen 4" descr="Figura o captura del sistema de detección, imagen 2." title="Figura del TFG 2"/>
@@ -6463,7 +6539,7 @@
       <w:pPr>
         <w:pStyle w:val="Ttulo3"/>
       </w:pPr>
-      <w:bookmarkStart w:id="11" w:name="_Toc238490942"/>
+      <w:bookmarkStart w:id="11" w:name="_Toc238679595"/>
       <w:r>
         <w:t>Interacción y Explotación (Colección Inicial)</w:t>
       </w:r>
@@ -6528,7 +6604,7 @@
       <w:pPr>
         <w:pStyle w:val="Ttulo3"/>
       </w:pPr>
-      <w:bookmarkStart w:id="12" w:name="_Toc238490943"/>
+      <w:bookmarkStart w:id="12" w:name="_Toc238679596"/>
       <w:r>
         <w:t>Adquisición y Monetización de los Datos</w:t>
       </w:r>
@@ -7176,7 +7252,7 @@
       <w:pPr>
         <w:pStyle w:val="Ttulo3"/>
       </w:pPr>
-      <w:bookmarkStart w:id="13" w:name="_Toc238490944"/>
+      <w:bookmarkStart w:id="13" w:name="_Toc238679597"/>
       <w:r>
         <w:t>Comparación crítica de modelos de fases</w:t>
       </w:r>
@@ -7817,7 +7893,7 @@
         <w:pStyle w:val="Ttulo3"/>
         <w:spacing w:line="278" w:lineRule="auto"/>
       </w:pPr>
-      <w:bookmarkStart w:id="14" w:name="_Toc238490945"/>
+      <w:bookmarkStart w:id="14" w:name="_Toc238679598"/>
       <w:r>
         <w:lastRenderedPageBreak/>
         <w:t>Puntos de intervención y controles</w:t>
@@ -8423,7 +8499,7 @@
       <w:pPr>
         <w:pStyle w:val="Ttulo2"/>
       </w:pPr>
-      <w:bookmarkStart w:id="15" w:name="_Toc238490946"/>
+      <w:bookmarkStart w:id="15" w:name="_Toc238679599"/>
       <w:r>
         <w:t>Tipos, clasificación y evolución de los ataques de phishing</w:t>
       </w:r>
@@ -8433,7 +8509,7 @@
       <w:pPr>
         <w:pStyle w:val="Ttulo3"/>
       </w:pPr>
-      <w:bookmarkStart w:id="16" w:name="_Toc238490947"/>
+      <w:bookmarkStart w:id="16" w:name="_Toc238679600"/>
       <w:r>
         <w:t>Introducción a la clasificación</w:t>
       </w:r>
@@ -8451,7 +8527,7 @@
       <w:pPr>
         <w:pStyle w:val="Ttulo3"/>
       </w:pPr>
-      <w:bookmarkStart w:id="17" w:name="_Toc238490948"/>
+      <w:bookmarkStart w:id="17" w:name="_Toc238679601"/>
       <w:r>
         <w:t>Clasificación según el vector de entrega</w:t>
       </w:r>
@@ -8525,7 +8601,7 @@
       <w:pPr>
         <w:pStyle w:val="Ttulo3"/>
       </w:pPr>
-      <w:bookmarkStart w:id="18" w:name="_Toc238490949"/>
+      <w:bookmarkStart w:id="18" w:name="_Toc238679602"/>
       <w:r>
         <w:t>Clasificación según el grado de personalización y objetivo</w:t>
       </w:r>
@@ -8603,7 +8679,7 @@
       <w:pPr>
         <w:pStyle w:val="Ttulo3"/>
       </w:pPr>
-      <w:bookmarkStart w:id="19" w:name="_Toc238490950"/>
+      <w:bookmarkStart w:id="19" w:name="_Toc238679603"/>
       <w:r>
         <w:t>Clasificación según la técnica de explotación</w:t>
       </w:r>
@@ -8673,7 +8749,7 @@
       <w:pPr>
         <w:pStyle w:val="Ttulo3"/>
       </w:pPr>
-      <w:bookmarkStart w:id="20" w:name="_Toc238490951"/>
+      <w:bookmarkStart w:id="20" w:name="_Toc238679604"/>
       <w:r>
         <w:t>Evolución histórica resumida</w:t>
       </w:r>
@@ -8771,7 +8847,7 @@
       <w:pPr>
         <w:pStyle w:val="Ttulo3"/>
       </w:pPr>
-      <w:bookmarkStart w:id="21" w:name="_Toc238490952"/>
+      <w:bookmarkStart w:id="21" w:name="_Toc238679605"/>
       <w:r>
         <w:t>Impacto actual (2025)</w:t>
       </w:r>
@@ -8797,7 +8873,7 @@
       <w:pPr>
         <w:pStyle w:val="Ttulo2"/>
       </w:pPr>
-      <w:bookmarkStart w:id="22" w:name="_Toc238490953"/>
+      <w:bookmarkStart w:id="22" w:name="_Toc238679606"/>
       <w:r>
         <w:t>La ingeniería social como fundamento psicológico y sociotécnico del phishing</w:t>
       </w:r>
@@ -8815,7 +8891,7 @@
       <w:pPr>
         <w:pStyle w:val="Ttulo3"/>
       </w:pPr>
-      <w:bookmarkStart w:id="23" w:name="_Toc238490954"/>
+      <w:bookmarkStart w:id="23" w:name="_Toc238679607"/>
       <w:r>
         <w:lastRenderedPageBreak/>
         <w:t>Principios psicológicos fundamentales explotados</w:t>
@@ -9468,7 +9544,7 @@
       <w:pPr>
         <w:pStyle w:val="Ttulo3"/>
       </w:pPr>
-      <w:bookmarkStart w:id="24" w:name="_Toc238490955"/>
+      <w:bookmarkStart w:id="24" w:name="_Toc238679608"/>
       <w:r>
         <w:t>Sesgos cognitivos específicos explotados</w:t>
       </w:r>
@@ -9542,7 +9618,7 @@
       <w:pPr>
         <w:pStyle w:val="Ttulo3"/>
       </w:pPr>
-      <w:bookmarkStart w:id="25" w:name="_Toc238490956"/>
+      <w:bookmarkStart w:id="25" w:name="_Toc238679609"/>
       <w:r>
         <w:t>El impacto de la inteligencia artificial generativa en la ingeniería social (2023-2025)</w:t>
       </w:r>
@@ -9603,7 +9679,7 @@
       <w:pPr>
         <w:pStyle w:val="Ttulo3"/>
       </w:pPr>
-      <w:bookmarkStart w:id="26" w:name="_Toc238490957"/>
+      <w:bookmarkStart w:id="26" w:name="_Toc238679610"/>
       <w:r>
         <w:t>Consecuencias organizativas y humanas</w:t>
       </w:r>
@@ -9629,7 +9705,7 @@
       <w:pPr>
         <w:pStyle w:val="Ttulo3"/>
       </w:pPr>
-      <w:bookmarkStart w:id="27" w:name="_Toc238490958"/>
+      <w:bookmarkStart w:id="27" w:name="_Toc238679611"/>
       <w:r>
         <w:t>Implicaciones para la detección</w:t>
       </w:r>
@@ -9708,7 +9784,7 @@
       <w:pPr>
         <w:pStyle w:val="Ttulo1"/>
       </w:pPr>
-      <w:bookmarkStart w:id="28" w:name="_Toc238490959"/>
+      <w:bookmarkStart w:id="28" w:name="_Toc238679612"/>
       <w:r>
         <w:lastRenderedPageBreak/>
         <w:t>Estado del arte en técnicas de detección y prevención de phishing basadas en Machine Learning y Deep Learning (2018-2025)</w:t>
@@ -9749,7 +9825,7 @@
       <w:pPr>
         <w:pStyle w:val="Ttulo2"/>
       </w:pPr>
-      <w:bookmarkStart w:id="29" w:name="_Toc238490960"/>
+      <w:bookmarkStart w:id="29" w:name="_Toc238679613"/>
       <w:r>
         <w:t>Evolución de los enfoques de detección</w:t>
       </w:r>
@@ -9821,7 +9897,7 @@
       <w:pPr>
         <w:pStyle w:val="Ttulo2"/>
       </w:pPr>
-      <w:bookmarkStart w:id="30" w:name="_Toc238490961"/>
+      <w:bookmarkStart w:id="30" w:name="_Toc238679614"/>
       <w:r>
         <w:t>Técnicas clásicas de Machine Learning (representativas 2019-2022)</w:t>
       </w:r>
@@ -10737,7 +10813,7 @@
       <w:pPr>
         <w:pStyle w:val="Ttulo2"/>
       </w:pPr>
-      <w:bookmarkStart w:id="31" w:name="_Toc238490962"/>
+      <w:bookmarkStart w:id="31" w:name="_Toc238679615"/>
       <w:r>
         <w:t>Técnicas de Deep Learning y Transformers (2023-2025)</w:t>
       </w:r>
@@ -12331,7 +12407,7 @@
       <w:pPr>
         <w:pStyle w:val="Ttulo2"/>
       </w:pPr>
-      <w:bookmarkStart w:id="32" w:name="_Toc238490963"/>
+      <w:bookmarkStart w:id="32" w:name="_Toc238679616"/>
       <w:r>
         <w:t>Enfoques híbridos y basados en comportamiento (UEBA)</w:t>
       </w:r>
@@ -12418,7 +12494,7 @@
       <w:pPr>
         <w:pStyle w:val="Ttulo2"/>
       </w:pPr>
-      <w:bookmarkStart w:id="33" w:name="_Toc238490964"/>
+      <w:bookmarkStart w:id="33" w:name="_Toc238679617"/>
       <w:r>
         <w:t>Limitaciones actuales de los enfoques</w:t>
       </w:r>
@@ -12518,7 +12594,7 @@
       <w:pPr>
         <w:pStyle w:val="Ttulo2"/>
       </w:pPr>
-      <w:bookmarkStart w:id="34" w:name="_Toc238490965"/>
+      <w:bookmarkStart w:id="34" w:name="_Toc238679618"/>
       <w:r>
         <w:t>Conclusiones del estado del arte y hueco de investigación</w:t>
       </w:r>
@@ -12607,7 +12683,7 @@
           <w:bCs/>
         </w:rPr>
       </w:pPr>
-      <w:bookmarkStart w:id="35" w:name="_Toc238490966"/>
+      <w:bookmarkStart w:id="35" w:name="_Toc238679619"/>
       <w:r>
         <w:rPr>
           <w:bCs/>
@@ -12628,7 +12704,7 @@
           <w:bCs/>
         </w:rPr>
       </w:pPr>
-      <w:bookmarkStart w:id="36" w:name="_Toc238490967"/>
+      <w:bookmarkStart w:id="36" w:name="_Toc238679620"/>
       <w:r>
         <w:rPr>
           <w:bCs/>
@@ -12650,7 +12726,7 @@
     </w:p>
     <w:p>
       <w:r>
-        <w:t>Una vez consolidado el marco teórico, se adoptó un enfoque de desarrollo en espiral adaptado al tamaño del trabajo, llevado a cabo entre febrero y junio de 2026. Primero se construyó un núcleo heurístico explicable, después se añadió el clasificador neuronal TF-IDF + MLP y, a continuación, se desarrolló la aplicación Streamlit con sus vistas de detección, configuración, entrenamiento y monitorización. La integración con Gmail y Telegram reutiliza los mismos módulos locales de análisis. Cada avance se cerró con la ejecución de la suite de pruebas, manteniendo el prototipo en un estado funcional durante todo el proceso.</w:t>
+        <w:t>Una vez consolidado el marco teórico, se adoptó un enfoque de desarrollo en espiral adaptado al tamaño del trabajo, llevado a cabo entre febrero y junio de 2026. Primero se construyó un núcleo heurístico explicable, después se añadió el clasificador neuronal TF-IDF + MLP y, a continuación, se separaron el backend HTTP central y los clientes Streamlit, extensión y monitor. Gmail aporta mensajes autorizados y Telegram actúa como salida opcional; ambos se coordinan alrededor del contrato del servidor. Cada avance se cerró con la ejecución de la suite de pruebas, manteniendo el prototipo en un estado funcional durante todo el proceso.</w:t>
       </w:r>
     </w:p>
     <w:p>
@@ -12665,7 +12741,7 @@
           <w:bCs/>
         </w:rPr>
       </w:pPr>
-      <w:bookmarkStart w:id="37" w:name="_Toc238490968"/>
+      <w:bookmarkStart w:id="37" w:name="_Toc238679621"/>
       <w:r>
         <w:rPr>
           <w:bCs/>
@@ -13554,7 +13630,7 @@
     </w:tbl>
     <w:p>
       <w:r>
-        <w:t>La carga de trabajo del segundo cuatrimestre se concentró en el motor heurístico, el clasificador neuronal y la interfaz web, por ser los componentes que reúnen la lógica central del prototipo. Las integraciones con Gmail y Telegram se incorporaron posteriormente reutilizando el mismo servicio de análisis; además, se añadió una API HTTP local y un adaptador para la extensión de Gmail sin duplicar las reglas del dominio.</w:t>
+        <w:t>La carga de trabajo del segundo cuatrimestre se concentró en el motor heurístico, el clasificador neuronal y el backend central, que reúnen la lógica del prototipo. Después se adaptaron Streamlit, Gmail, la extensión y el monitor como clientes del mismo contrato HTTP. La extensión llama directamente al servidor; el proceso del puerto 8765 se conserva únicamente como proxy de compatibilidad, sin reglas ni modelos propios.</w:t>
       </w:r>
     </w:p>
     <w:p>
@@ -13564,7 +13640,7 @@
           <w:bCs/>
         </w:rPr>
       </w:pPr>
-      <w:bookmarkStart w:id="38" w:name="_Toc238490969"/>
+      <w:bookmarkStart w:id="38" w:name="_Toc238679622"/>
       <w:r>
         <w:rPr>
           <w:bCs/>
@@ -14271,7 +14347,7 @@
           <w:bCs/>
         </w:rPr>
       </w:pPr>
-      <w:bookmarkStart w:id="39" w:name="_Toc238490970"/>
+      <w:bookmarkStart w:id="39" w:name="_Toc238679623"/>
       <w:r>
         <w:rPr>
           <w:bCs/>
@@ -14282,7 +14358,7 @@
     </w:p>
     <w:p>
       <w:r>
-        <w:t>La validación del sistema se ha realizado en tres niveles complementarios. En primer lugar, la versión final ejecuta 47 pruebas unitarias y de integración con unittest. Estas pruebas cubren el parseo de archivos .eml, las reglas heurísticas, el servicio común de análisis, la configuración, la integración con Gmail, la monitorización, el clasificador neuronal, la persistencia de modelos y las notificaciones por Telegram.</w:t>
+        <w:t>La validación del sistema se realiza en cuatro niveles complementarios: 72 pruebas Python de componentes e integración, 2 recorridos reales con Chromium, un benchmark reproducible de arranque/inferencia y un holdout controlado bilingüe de 40 casos. Uno de los recorridos levanta cliente web y backend en procesos separados y verifica el intercambio HTTP. El holdout está separado del entrenamiento, pero su carácter sintético impide extrapolarlo a producción.</w:t>
       </w:r>
     </w:p>
     <w:p>
@@ -14298,7 +14374,7 @@
       <w:pPr>
         <w:pStyle w:val="Ttulo2"/>
       </w:pPr>
-      <w:bookmarkStart w:id="40" w:name="_Toc238490971"/>
+      <w:bookmarkStart w:id="40" w:name="_Toc238679624"/>
       <w:r>
         <w:t>Aspectos éticos y de protección de datos</w:t>
       </w:r>
@@ -14318,7 +14394,7 @@
       <w:pPr>
         <w:pStyle w:val="Ttulo1"/>
       </w:pPr>
-      <w:bookmarkStart w:id="41" w:name="_Toc238490972"/>
+      <w:bookmarkStart w:id="41" w:name="_Toc238679625"/>
       <w:r>
         <w:lastRenderedPageBreak/>
         <w:t>Diseño e implementación de la aplicación web</w:t>
@@ -14345,7 +14421,7 @@
         </w:rPr>
       </w:pPr>
       <w:r>
-        <w:t>El prototipo se centra en el análisis de mensajes de correo electrónico desde una aplicación web y varias entradas locales. El origen puede ser texto pegado, un archivo .eml, un mensaje importado mediante Gmail, el correo visible en la extensión de navegador o un JSON enviado a la API local. A partir de la entrada, el sistema extrae cabeceras, remitente, asunto, cuerpo en texto plano, contenido HTML, enlaces, anclas y adjuntos, y genera una evaluación de riesgo mediante reglas heurísticas, modelo neuronal o una combinación ponderada.</w:t>
+        <w:t>El prototipo se centra en el análisis de mensajes desde varios clientes. El origen puede ser texto, EML, Gmail, la extensión o JSON. El cliente transporta la entrada y el backend central extrae cabeceras, remitente, asunto, cuerpo, HTML, enlaces, anclas y adjuntos para generar el riesgo heurístico, neuronal o combinado. La interfaz recibe un contrato ya calculado y se limita a presentarlo.</w:t>
       </w:r>
     </w:p>
     <w:p>
@@ -14355,7 +14431,7 @@
           <w:rFonts w:eastAsiaTheme="minorEastAsia"/>
         </w:rPr>
       </w:pPr>
-      <w:bookmarkStart w:id="42" w:name="_Toc238490973"/>
+      <w:bookmarkStart w:id="42" w:name="_Toc238679626"/>
       <w:r>
         <w:rPr>
           <w:rFonts w:eastAsiaTheme="minorEastAsia"/>
@@ -14394,7 +14470,7 @@
           <w:rFonts w:eastAsiaTheme="minorEastAsia"/>
         </w:rPr>
       </w:pPr>
-      <w:bookmarkStart w:id="43" w:name="_Toc238490974"/>
+      <w:bookmarkStart w:id="43" w:name="_Toc238679627"/>
       <w:r>
         <w:rPr>
           <w:rFonts w:eastAsiaTheme="minorEastAsia"/>
@@ -14410,7 +14486,7 @@
         </w:rPr>
       </w:pPr>
       <w:r>
-        <w:t>La solución adopta una arquitectura modular con un núcleo local compartido. Streamlit proporciona la capa de presentación y organiza las vistas de inicio, configuración, detección, monitorización y entrenamiento; estas vistas pueden invocar directamente los servicios del paquete sistema_phishing. De forma opcional, el mismo caso de uso se expone mediante un servidor HTTP local y una extensión de Gmail, sin enviar el contenido a un servicio externo.</w:t>
+        <w:t>La solución adopta una arquitectura cliente-servidor. El navegador se comunica con Streamlit, que actúa como capa de presentación y cliente HTTP del backend central; la extensión y el monitor consumen esa misma API. Solo backend_server.py normaliza, analiza, entrena y mantiene los modelos activos. En la configuración académica ambos lados se ejecutan en el mismo equipo y sobre loopback, pero son procesos y responsabilidades independientes.</w:t>
       </w:r>
     </w:p>
     <w:p>
@@ -14420,7 +14496,7 @@
         </w:rPr>
       </w:pPr>
       <w:r>
-        <w:t>A nivel interno, el paquete sistema_phishing agrupa los componentes del dominio. analysis_service.py coordina los modos heurístico, neuronal y combinado y selecciona el modelo según el idioma del correo. analizador_email.py normaliza texto y archivos .eml; correo.py define la representación común; signal_builder.py construye las señales; scorer.py calcula la puntuación; explanations.py genera explicaciones; y modelo_neural.py encapsula el pipeline TF-IDF + MLP y su persistencia. Las vistas Streamlit consumen estas funciones mediante llamadas locales.</w:t>
+        <w:t>A nivel interno, backend_client.py implementa el transporte común de los clientes y http_api.py define las rutas. backend_service.py concentra análisis, datasets, evaluación, entrenamiento, metadatos y activación de versiones. Dentro del servidor, analysis_service.py coordina los modos y la caché lingüística; analizador_email.py normaliza EML; signal_builder.py, scorer.py y explanations.py construyen el resultado; modelo_neural.py encapsula TF-IDF + MLP. Las vistas Streamlit no importan almacenamiento ni ejecutan inferencia.</w:t>
       </w:r>
     </w:p>
     <w:p>
@@ -14440,7 +14516,7 @@
           <w:rFonts w:eastAsiaTheme="minorEastAsia"/>
         </w:rPr>
       </w:pPr>
-      <w:bookmarkStart w:id="44" w:name="_Toc238490975"/>
+      <w:bookmarkStart w:id="44" w:name="_Toc238679628"/>
       <w:r>
         <w:rPr>
           <w:rFonts w:eastAsiaTheme="minorEastAsia"/>
@@ -14493,7 +14569,7 @@
         </w:rPr>
       </w:pPr>
       <w:r>
-        <w:t>RiskScorer asigna una ponderación a cada señal activa y calcula una puntuación final entre 0 y 100. Si la puntuación supera el umbral configurado, el mensaje se clasifica como phishing probable. ExplanationBuilder transforma las señales en explicaciones comprensibles. El mismo servicio puede producir el resultado desde Streamlit, la API local, la extensión o el monitor; si se supera el umbral, la monitorización puede enviar una alerta por Telegram y registrar el identificador del mensaje para evitar duplicados.</w:t>
+        <w:t>RiskScorer asigna una ponderación a cada señal activa y calcula una puntuación final entre 0 y 100. Si la puntuación supera el umbral configurado, el mensaje se clasifica como phishing probable. ExplanationBuilder transforma las señales en explicaciones comprensibles. El backend central devuelve ese resultado por HTTP a Streamlit, la extensión o el monitor; los clientes solo lo presentan o, en el caso del monitor, pueden generar una alerta de Telegram y registrar el identificador para evitar duplicados.</w:t>
       </w:r>
     </w:p>
     <w:p>
@@ -14503,7 +14579,7 @@
           <w:rFonts w:eastAsiaTheme="minorEastAsia"/>
         </w:rPr>
       </w:pPr>
-      <w:bookmarkStart w:id="45" w:name="_Toc238490976"/>
+      <w:bookmarkStart w:id="45" w:name="_Toc238679629"/>
       <w:r>
         <w:rPr>
           <w:rFonts w:eastAsiaTheme="minorEastAsia"/>
@@ -14584,7 +14660,7 @@
           <w:rFonts w:eastAsiaTheme="minorEastAsia"/>
         </w:rPr>
       </w:pPr>
-      <w:bookmarkStart w:id="46" w:name="_Toc238490977"/>
+      <w:bookmarkStart w:id="46" w:name="_Toc238679630"/>
       <w:r>
         <w:rPr>
           <w:rFonts w:eastAsiaTheme="minorEastAsia"/>
@@ -14620,7 +14696,7 @@
         </w:rPr>
       </w:pPr>
       <w:r>
-        <w:t>El sistema permite entrenar modelos en español e inglés, utilizando stopwords específicas para cada idioma. La aplicación de entrenamiento acepta uno o varios archivos CSV, permite configurar las columnas de texto, asunto, cuerpo y etiqueta, y admite formatos habituales de datasets públicos. Durante la evaluación se muestran la matriz de confusión, accuracy, precisión, recall, F1 y accuracy balanceada. También es posible entrenar hasta tres redes en memoria, compararlas sobre un conjunto de prueba independiente y combinar varios CSV de entrenamiento.</w:t>
+        <w:t>El sistema permite una versión activa en español y otra en inglés. La vista de entrenamiento serializa los CSV y los hiperparámetros y los envía al backend, que valida datos, entrena desde cero, guarda el artefacto de forma atómica e invalida la caché. Evaluación y comparación también se ejecutan en el servidor; los clientes reciben únicamente métricas y metadatos.</w:t>
       </w:r>
     </w:p>
     <w:p>
@@ -14640,7 +14716,7 @@
           <w:rFonts w:eastAsiaTheme="minorEastAsia"/>
         </w:rPr>
       </w:pPr>
-      <w:bookmarkStart w:id="47" w:name="_Toc238490978"/>
+      <w:bookmarkStart w:id="47" w:name="_Toc238679631"/>
       <w:r>
         <w:rPr>
           <w:rFonts w:eastAsiaTheme="minorEastAsia"/>
@@ -14656,7 +14732,7 @@
         </w:rPr>
       </w:pPr>
       <w:r>
-        <w:t>La aplicación principal se desarrolla con Streamlit (src/app.py) y organiza la interfaz en cinco vistas: Inicio, Configuración, Detección, Monitor y Entrenamiento. La vista de detección permite analizar texto pegado, archivos .eml o correos importados desde Gmail y seleccionar el modo heurístico, neuronal o combinado. La vista de configuración gestiona Gmail, Telegram, los parámetros del monitor y los hiperparámetros del modelo. La vista de entrenamiento permite cargar CSV, entrenar hasta tres configuraciones y comparar sus métricas.</w:t>
+        <w:t>El cliente web se desarrolla con Streamlit y organiza cinco vistas: Inicio, Configuración, Detección, Monitor y Entrenamiento. Sus responsabilidades son recoger entradas, llamar mediante BackendClient y presentar la respuesta. Detección admite texto, EML o Gmail y los tres modos; Entrenamiento administra las versiones centrales sin cargar modelos en el proceso de interfaz.</w:t>
       </w:r>
     </w:p>
     <w:p>
@@ -14679,14 +14755,14 @@
         </w:rPr>
       </w:pPr>
       <w:r>
-        <w:t>La integración con Gmail se realiza desde la propia aplicación mediante OAuth. La vista de detección permite consultar e importar mensajes, mientras que la vista Monitor ejecuta comprobaciones bajo demanda y muestra el resultado de cada correo. De forma opcional, el proceso monitor_gmail.py reutiliza el mismo servicio local para realizar comprobaciones periódicas y enviar alertas por Telegram, sin introducir una capa de análisis remota.</w:t>
+        <w:t>La integración con Gmail usa OAuth de solo lectura. La vista de detección obtiene EML autorizados y los remite al backend; el proceso monitor_gmail.py hace lo mismo periódicamente y puede notificar por Telegram. Ambos consumen la misma versión central y un fallo temporal queda controlado para reintento.</w:t>
       </w:r>
     </w:p>
     <w:p>
       <w:pPr>
         <w:pStyle w:val="Ttulo2"/>
       </w:pPr>
-      <w:bookmarkStart w:id="48" w:name="_Toc238490979"/>
+      <w:bookmarkStart w:id="48" w:name="_Toc238679632"/>
       <w:r>
         <w:t>Diseño modular</w:t>
       </w:r>
@@ -14699,7 +14775,7 @@
         </w:rPr>
       </w:pPr>
       <w:r>
-        <w:t>Durante el desarrollo se ha realizado una refactorización orientada a mejorar la mantenibilidad y aplicar principios de diseño SOLID. El sistema separa la presentación Streamlit, la coordinación de los casos de uso, la construcción de señales, la generación de explicaciones, el cálculo de riesgo, el procesamiento de datasets y la lógica del modelo neuronal. La interfaz depende de servicios locales estables y no de detalles internos de cada regla o clasificador.</w:t>
+        <w:t>Durante el desarrollo se ha realizado una refactorización orientada a SOLID y a una frontera cliente-servidor explícita. La presentación depende de BackendClient; el servidor separa transporte, casos de uso, señales, puntuación, explicaciones, datasets y aprendizaje. Así, los detalles del modelo permanecen fuera de Streamlit, extensión y monitor.</w:t>
       </w:r>
     </w:p>
     <w:p>
@@ -14723,14 +14799,14 @@
         </w:rPr>
       </w:pPr>
       <w:r>
-        <w:t>Esta separación facilita la evolución del prototipo. Pueden añadirse reglas en los módulos de señales, sustituirse el clasificador neuronal o incorporarse nuevas fuentes de entrada sin alterar la navegación de la aplicación. La versión final ejecuta correctamente 47 pruebas automatizadas que protegen los componentes principales y sus integraciones locales.</w:t>
+        <w:t>Esta separación facilita la evolución del prototipo. Pueden añadirse reglas o sustituirse el clasificador en el servidor sin redistribuir los clientes. La versión revisada ejecuta correctamente 72 pruebas Python y 2 recorridos reales con Chromium; GitHub Actions repite pruebas, Ruff, evaluación reproducible y navegación de interfaz.</w:t>
       </w:r>
     </w:p>
     <w:p>
       <w:pPr>
         <w:pStyle w:val="Ttulo2"/>
       </w:pPr>
-      <w:bookmarkStart w:id="49" w:name="_Toc238490980"/>
+      <w:bookmarkStart w:id="49" w:name="_Toc238679633"/>
       <w:r>
         <w:rPr>
           <w:rFonts w:eastAsiaTheme="minorEastAsia"/>
@@ -14770,7 +14846,7 @@
       <w:pPr>
         <w:pStyle w:val="Ttulo1"/>
       </w:pPr>
-      <w:bookmarkStart w:id="50" w:name="_Toc238490981"/>
+      <w:bookmarkStart w:id="50" w:name="_Toc238679634"/>
       <w:r>
         <w:lastRenderedPageBreak/>
         <w:t>Pruebas, resultados y discusión</w:t>
@@ -14781,7 +14857,7 @@
       <w:pPr>
         <w:pStyle w:val="Ttulo2"/>
       </w:pPr>
-      <w:bookmarkStart w:id="51" w:name="_Toc238490982"/>
+      <w:bookmarkStart w:id="51" w:name="_Toc238679635"/>
       <w:r>
         <w:t>Pruebas unitarias y de integración</w:t>
       </w:r>
@@ -14794,14 +14870,14 @@
         </w:rPr>
       </w:pPr>
       <w:r>
-        <w:t>La versión final ejecuta 47 pruebas unitarias y de integración mediante unittest. Cubren el parseo de .eml, la construcción de resultados combinados, la carga de configuración, la decodificación de mensajes de Gmail, la monitorización, las reglas heurísticas, el clasificador neuronal, la persistencia de modelos, la API HTTP y las notificaciones por Telegram. Todas finalizaron correctamente; los únicos avisos observados corresponden a iteraciones reducidas del MLP en pruebas rápidas y no implican fallos funcionales.</w:t>
+        <w:t>La versión revisada ejecuta 72 pruebas unitarias y de integración mediante unittest. Cubren EML, combinación, cliente HTTP, entrenamiento central, Gmail, monitor, heurísticas, clasificador, persistencia, API, autenticación administrativa, extensión, evaluación y Telegram. Además, 2 pruebas con Chromium recorren la extensión y un análisis real entre Streamlit y backend. Todas finalizaron correctamente; los avisos de convergencia proceden de iteraciones reducidas del MLP en pruebas rápidas.</w:t>
       </w:r>
     </w:p>
     <w:p>
       <w:pPr>
         <w:pStyle w:val="Ttulo2"/>
       </w:pPr>
-      <w:bookmarkStart w:id="52" w:name="_Toc238490983"/>
+      <w:bookmarkStart w:id="52" w:name="_Toc238679636"/>
       <w:r>
         <w:t>Rendimiento y eficiencia de arranque</w:t>
       </w:r>
@@ -14826,7 +14902,7 @@
       <w:pPr>
         <w:pStyle w:val="Ttulo2"/>
       </w:pPr>
-      <w:bookmarkStart w:id="53" w:name="_Toc238490984"/>
+      <w:bookmarkStart w:id="53" w:name="_Toc238679637"/>
       <w:r>
         <w:t>Dataset de ejemplo</w:t>
       </w:r>
@@ -14841,7 +14917,7 @@
       <w:pPr>
         <w:pStyle w:val="Ttulo2"/>
       </w:pPr>
-      <w:bookmarkStart w:id="54" w:name="_Toc238490985"/>
+      <w:bookmarkStart w:id="54" w:name="_Toc238679638"/>
       <w:r>
         <w:t>Resultados del clasificador neuronal</w:t>
       </w:r>
@@ -14849,14 +14925,14 @@
     </w:p>
     <w:p>
       <w:r>
-        <w:t>La evaluación cuantitativa de un modelo entrenado debe realizarse desde la vista de Entrenamiento con un CSV de prueba independiente. El sistema separa los datos de entrenamiento y prueba cuando el usuario proporciona ambos conjuntos y muestra accuracy, precisión, recall, F1, accuracy balanceada y la matriz VP/VN/FP/FN. Los ejemplos sintéticos incluidos en el repositorio son deliberadamente pequeños y no permiten afirmar métricas generalizables; por ello, cualquier cifra debe acompañarse del tamaño, el idioma y el origen del conjunto evaluado.</w:t>
+        <w:t>La evaluación separada incorpora un desafío controlado bilingüe de 40 mensajes, equilibrado por idioma y clase, creado después de congelar los modelos y excluido del entrenamiento. Con umbral 45, el modo neuronal obtuvo 87,5 % de accuracy, 94,1 % de precisión, 80,0 % de recall y 86,5 % de F1; el combinado 55,0 %, 100,0 %, 10,0 % y 18,2 %; y el heurístico 50,0 %, 0,0 %, 0,0 % y 0,0 %. El evaluador registra SHA-256 de datos/modelos y conserva cada error. Al ser textos sintéticos sin cabeceras reales, estas cifras son regresión funcional y no estiman producción.</w:t>
       </w:r>
     </w:p>
     <w:p>
       <w:pPr>
         <w:pStyle w:val="Ttulo2"/>
       </w:pPr>
-      <w:bookmarkStart w:id="55" w:name="_Toc238490986"/>
+      <w:bookmarkStart w:id="55" w:name="_Toc238679639"/>
       <w:r>
         <w:t>Comportamiento del sistema heurístico</w:t>
       </w:r>
@@ -14872,21 +14948,19 @@
         <w:rPr>
           <w:rFonts w:asciiTheme="minorHAnsi" w:hAnsiTheme="minorHAnsi"/>
         </w:rPr>
-        <w:t xml:space="preserve">El sistema heurístico es deliberadamente conservador: solo clasifica como phishing probable los mensajes que superan el umbral (por defecto 45 sobre 100) acumulando varias señales. </w:t>
+        <w:t>El sistema heurístico es deliberadamente conservador. En el desafío controlado no superó el umbral en los 20 mensajes maliciosos, porque los casos sintéticos carecen de Received y resultados SPF/DKIM/DMARC y sus dominios .example son inocuos. El combinado heredó esta limitación: con peso neuronal 40 %, una predicción neuronal alta no basta por sí sola para superar 45. Este hallazgo exige calibrar pesos y umbral en un conjunto de validación distinto y confirmar después en un corpus externo; no se ajusta el sistema contra el holdout publicado.</w:t>
       </w:r>
       <w:r>
         <w:rPr>
           <w:rFonts w:asciiTheme="minorHAnsi" w:hAnsiTheme="minorHAnsi"/>
         </w:rPr>
-        <w:lastRenderedPageBreak/>
-        <w:t>Sobre el dataset de ejemplo, construido con mensajes sintéticos sin cabeceras reales (sin Received ni resultados SPF/DKIM/DMARC), la heurística por sí sola detecta las señales de contenido (lenguaje urgente, saludo genérico, solicitud de credenciales o enlaces sospechosos) pero rara vez alcanza el umbral. Este comportamiento es el esperado y evidencia que sus mejores resultados se obtienen con correos reales que incluyen cabeceras de autenticación y enlaces a dominios conocidos: la heurística aporta explicabilidad, mientras que la generalización la aporta el modelo neuronal, de ahí el interés del modo combinado.</w:t>
       </w:r>
     </w:p>
     <w:p>
       <w:pPr>
         <w:pStyle w:val="Ttulo2"/>
       </w:pPr>
-      <w:bookmarkStart w:id="56" w:name="_Toc238490987"/>
+      <w:bookmarkStart w:id="56" w:name="_Toc238679640"/>
       <w:r>
         <w:t>Prueba funcional de la aplicación web</w:t>
       </w:r>
@@ -14899,14 +14973,14 @@
         </w:rPr>
       </w:pPr>
       <w:r>
-        <w:t>Se realizaron comprobaciones funcionales sobre mensajes sintéticos en español e inglés y sobre un correo legítimo de control. Las comprobaciones verificaron que el servicio devuelve los tres resultados, aplica el umbral común, selecciona el detector del idioma correspondiente y conserva las señales y explicaciones heurísticas. La suite de 47 pruebas añade casos específicos para la API, el límite de archivos EML, la caché por idioma y el manejo de entradas malformadas; no se presentan estas comprobaciones como una evaluación estadística de producción.</w:t>
+        <w:t>Se realizaron 72 pruebas Python y 2 recorridos Chromium. Las comprobaciones verifican los tres modos, el cliente HTTP, entrenamiento y versión central, caché por idioma, señales, API, límites, token administrativo, extensión y Streamlit. El reto de 40 casos añade una medición separada, pero no se presenta como evaluación estadística de producción.</w:t>
       </w:r>
     </w:p>
     <w:p>
       <w:pPr>
         <w:pStyle w:val="Ttulo2"/>
       </w:pPr>
-      <w:bookmarkStart w:id="57" w:name="_Toc238490988"/>
+      <w:bookmarkStart w:id="57" w:name="_Toc238679641"/>
       <w:r>
         <w:t>Discusión</w:t>
       </w:r>
@@ -14919,7 +14993,7 @@
         </w:rPr>
       </w:pPr>
       <w:r>
-        <w:t>Los resultados confirman el diseño como una base funcional: la heurística aporta señales comprensibles sobre contenido y cabeceras, el clasificador neuronal reconoce patrones aprendidos y el modo combinado equilibra ambas perspectivas. La principal limitación es el tamaño del conjunto sintético de demostración y la ausencia de un corpus de producción representativo, que pueden provocar sobreajuste y métricas poco generalizables. Para una evaluación rigurosa será necesario entrenar con datasets públicos amplios y recientes y comparar con métodos del estado del arte. Aun así, el prototipo demuestra la viabilidad de integrar reglas explicables y aprendizaje supervisado en una aplicación local con varias interfaces.</w:t>
+        <w:t>Los resultados confirman el diseño como base funcional y revelan una limitación importante: el clasificador neuronal reconoce la mayoría del reto controlado, pero la combinación 60/40 y el umbral 45 reducen demasiado el recall cuando faltan cabeceras completas. La evidencia se conserva sin recalibrar sobre el propio holdout. La principal tarea experimental pendiente es validar y calibrar con corpus reales, recientes, licenciados y deduplicados frente a todas las fuentes de entrenamiento.</w:t>
       </w:r>
     </w:p>
     <w:p>
@@ -14927,7 +15001,7 @@
         <w:pStyle w:val="Ttulo1"/>
         <w:pageBreakBefore w:val="0"/>
       </w:pPr>
-      <w:bookmarkStart w:id="58" w:name="_Toc238490989"/>
+      <w:bookmarkStart w:id="58" w:name="_Toc238679642"/>
       <w:r>
         <w:t>Conclusiones</w:t>
       </w:r>
@@ -14940,7 +15014,7 @@
         </w:rPr>
       </w:pPr>
       <w:r>
-        <w:t>El Trabajo Fin de Grado ha alcanzado los objetivos planteados. Se ha estudiado el phishing desde su base psicológica y su evolución reciente, se ha revisado el estado del arte en machine learning y deep learning y se ha desarrollado una aplicación web funcional que combina análisis heurístico explicable con un clasificador neuronal TF-IDF + MLP. La aplicación permite analizar texto pegado, archivos .eml y correos importados mediante Gmail, mientras que el mismo núcleo se reutiliza opcionalmente desde una API HTTP local, una extensión de Gmail y un monitor con Telegram.</w:t>
+        <w:t>El Trabajo Fin de Grado ha alcanzado los objetivos planteados. Se ha estudiado el phishing desde su base psicológica y su evolución reciente, se ha revisado el estado del arte en machine learning y deep learning y se ha desarrollado un sistema cliente-servidor funcional que combina análisis heurístico explicable con un clasificador neuronal TF-IDF + MLP. Streamlit, la extensión de Gmail y el monitor envían texto, EML o campos estructurados al backend central obligatorio, que procesa la entrada y mantiene los modelos compartidos.</w:t>
       </w:r>
     </w:p>
     <w:p>
@@ -14983,7 +15057,6 @@
         </w:rPr>
       </w:pPr>
       <w:r>
-        <w:lastRenderedPageBreak/>
         <w:t>El tercer objetivo, revisar el estado del arte en técnicas de detección, se desarrolla en la sección dedicada a machine learning clásico, deep learning, transformers y enfoques híbridos, y concluye con el hueco de investigación que justifica el prototipo.</w:t>
       </w:r>
     </w:p>
@@ -15004,7 +15077,7 @@
         </w:rPr>
       </w:pPr>
       <w:r>
-        <w:t>El quinto objetivo, integrar la aplicación con Gmail y proporcionar alertas mediante Telegram, se cumple mediante el acceso OAuth incorporado en las vistas Streamlit y la monitorización opcional que reutiliza el mismo servicio local de análisis.</w:t>
+        <w:t>El quinto objetivo, integrar la aplicación con Gmail y proporcionar alertas mediante Telegram, se cumple mediante OAuth de solo lectura y el monitor opcional. Los mensajes autorizados se envían al backend central y Telegram recibe únicamente la alerta configurada; ni Streamlit ni el monitor duplican la lógica de análisis.</w:t>
       </w:r>
     </w:p>
     <w:p>
@@ -15014,7 +15087,7 @@
         </w:rPr>
       </w:pPr>
       <w:r>
-        <w:t>El sexto objetivo, evaluar el comportamiento del sistema mediante pruebas unitarias, de integración y funcionales, se aborda con la suite actual de 47 casos, la evaluación del clasificador con un conjunto de prueba independiente cuando se proporciona y la comprobación de mensajes sospechosos y legítimos en español e inglés.</w:t>
+        <w:t>El sexto objetivo, evaluar el comportamiento del sistema, se aborda con 72 pruebas Python, 2 recorridos Chromium —incluido web a backend—, benchmark reproducible y un holdout controlado bilingüe de 40 casos con hashes, matriz de confusión y resultados por mensaje. La estimación sobre correo real sigue delimitada como trabajo pendiente.</w:t>
       </w:r>
     </w:p>
     <w:p>
@@ -15024,14 +15097,14 @@
         </w:rPr>
       </w:pPr>
       <w:r>
-        <w:t>Entre los logros principales destacan la modularidad del código, la selección del modelo por idioma, la API local compartida, la extensión de Gmail, la integración de Gmail y Telegram, la incorporación de métricas de exactitud, precisión, recall, F1 y accuracy balanceada en la vista de entrenamiento y un benchmark reproducible de rendimiento. La carga diferida reduce el arranque de las heurísticas un 96,6 % y el de la aplicación un 76,2 % sin alterar la inferencia. El prototipo demuestra la viabilidad de un detector de phishing explicable, eficiente y extensible dentro del alcance de un Trabajo Fin de Grado.</w:t>
+        <w:t>Entre los logros principales destacan la arquitectura cliente-servidor, una versión activa por idioma compartida por todos los clientes, activación atómica de modelos, Gmail/Telegram, 72 pruebas Python, 2 pruebas de navegador, CI y evaluación trazable. La carga diferida reduce el arranque de heurísticas un 96,6 % y el de la aplicación un 76,2 %. El holdout hace visible la necesidad de calibrar el modo combinado.</w:t>
       </w:r>
     </w:p>
     <w:p>
       <w:pPr>
         <w:pStyle w:val="Ttulo2"/>
       </w:pPr>
-      <w:bookmarkStart w:id="59" w:name="_Toc238490990"/>
+      <w:bookmarkStart w:id="59" w:name="_Toc238679643"/>
       <w:r>
         <w:t>Trabajo futuro</w:t>
       </w:r>
@@ -15044,14 +15117,14 @@
         </w:rPr>
       </w:pPr>
       <w:r>
-        <w:t>Como trabajo futuro se plantea ampliar la evaluación con datasets públicos recientes en español e inglés y estudiar la robustez frente a ataques adversariales. En el plano del modelo, podrá sustituirse TF-IDF + MLP por transformers o LLMs con detección explícita de autoridad, urgencia y escasez y con explicaciones en lenguaje natural. También se contempla integrar reputación de dominios, análisis dinámico de páginas y etiquetado seguro de mensajes en Gmail. Para una publicación multiusuario de la aplicación web será necesario añadir autenticación, gestión de secretos, aislamiento de sesiones y una política de protección de datos.</w:t>
+        <w:t>Como trabajo futuro prioritario se plantea evaluar datasets reales y recientes en español e inglés, con licencia, procedencia temporal y deduplicación frente a las fuentes de entrenamiento. Pesos y umbral deben calibrarse en validación y confirmarse en un test externo separado. También se estudiarán ataques adversariales, transformers/LLM, reputación de dominios, análisis dinámico y etiquetado seguro. Un despliegue multiusuario requerirá autenticación, TLS, rate limiting, secretos e aislamiento de sesiones.</w:t>
       </w:r>
     </w:p>
     <w:p>
       <w:pPr>
         <w:pStyle w:val="Ttulo1"/>
       </w:pPr>
-      <w:bookmarkStart w:id="60" w:name="_Toc238490991"/>
+      <w:bookmarkStart w:id="60" w:name="_Toc238679644"/>
       <w:r>
         <w:lastRenderedPageBreak/>
         <w:t>Glosario</w:t>
@@ -15065,7 +15138,7 @@
         </w:rPr>
       </w:pPr>
       <w:r>
-        <w:t>API: Interfaz de operaciones que permite a un cliente local enviar datos al backend mediante un contrato HTTP; Gmail y Telegram son integraciones externas distintas.</w:t>
+        <w:t>API: Interfaz de operaciones que permite a un cliente enviar datos al backend mediante un contrato HTTP; Gmail y Telegram son integraciones externas distintas.</w:t>
       </w:r>
     </w:p>
     <w:p>
@@ -15075,7 +15148,7 @@
         </w:rPr>
       </w:pPr>
       <w:r>
-        <w:t>Aplicación web local: Interfaz Streamlit que integra la presentación y el núcleo de análisis en el mismo entorno; el proyecto también ofrece API y extensión locales opcionales.</w:t>
+        <w:t>Aplicación web cliente-servidor: El navegador usa Streamlit como capa de presentación y Streamlit llama por HTTP al backend central obligatorio. En la configuración académica ambos procesos se ejecutan en el mismo equipo; la extensión y el monitor consumen el mismo contrato.</w:t>
       </w:r>
     </w:p>
     <w:p>
@@ -15417,7 +15490,7 @@
       <w:pPr>
         <w:pStyle w:val="Ttulo1"/>
       </w:pPr>
-      <w:bookmarkStart w:id="61" w:name="_Toc238490992"/>
+      <w:bookmarkStart w:id="61" w:name="_Toc238679645"/>
       <w:r>
         <w:lastRenderedPageBreak/>
         <w:t>Referencias</w:t>
@@ -15753,7 +15826,7 @@
           <w:bCs/>
         </w:rPr>
       </w:pPr>
-      <w:bookmarkStart w:id="62" w:name="_Toc238490993"/>
+      <w:bookmarkStart w:id="62" w:name="_Toc238679646"/>
       <w:r>
         <w:rPr>
           <w:bCs/>
@@ -15774,7 +15847,7 @@
           <w:bCs/>
         </w:rPr>
       </w:pPr>
-      <w:bookmarkStart w:id="63" w:name="_Toc238490994"/>
+      <w:bookmarkStart w:id="63" w:name="_Toc238679647"/>
       <w:r>
         <w:rPr>
           <w:bCs/>
@@ -15785,7 +15858,7 @@
     </w:p>
     <w:p>
       <w:r>
-        <w:t>La siguiente estructura recoge los componentes principales que forman parte del alcance de la aplicación web y de su motor local de análisis:</w:t>
+        <w:t>La siguiente estructura recoge los componentes principales de la aplicación cliente-servidor, sus clientes y el backend central de análisis:</w:t>
       </w:r>
     </w:p>
     <w:p>
@@ -15827,7 +15900,7 @@
         <w:pStyle w:val="CdigoTFG"/>
       </w:pPr>
       <w:r>
-        <w:t>│   ├── backend_server.py             # API HTTP local</w:t>
+        <w:t>│   ├── backend_server.py             # Servidor HTTP central</w:t>
       </w:r>
     </w:p>
     <w:p>
@@ -15835,7 +15908,7 @@
         <w:pStyle w:val="CdigoTFG"/>
       </w:pPr>
       <w:r>
-        <w:t>│   ├── config_app.py                 # Configuración de Gmail, Telegram y modelos</w:t>
+        <w:t>│   ├── config_app.py                 # Configuración de clientes y servidor</w:t>
       </w:r>
     </w:p>
     <w:p>
@@ -15843,7 +15916,7 @@
         <w:pStyle w:val="CdigoTFG"/>
       </w:pPr>
       <w:r>
-        <w:t>│   ├── detect_app.py                 # Detección desde texto, EML y Gmail</w:t>
+        <w:t>│   ├── detect_app.py                 # Cliente web de detección</w:t>
       </w:r>
     </w:p>
     <w:p>
@@ -15851,7 +15924,7 @@
         <w:pStyle w:val="CdigoTFG"/>
       </w:pPr>
       <w:r>
-        <w:t>│   ├── gmail_extension_server.py     # Adaptador de la extensión Gmail</w:t>
+        <w:t>│   ├── gmail_extension_server.py     # Proxy legado opcional (puerto 8765)</w:t>
       </w:r>
     </w:p>
     <w:p>
@@ -15907,7 +15980,7 @@
         <w:pStyle w:val="CdigoTFG"/>
       </w:pPr>
       <w:r>
-        <w:t>│       ├── analysis_service.py       # Coordinación del análisis local</w:t>
+        <w:t>│       ├── analysis_service.py       # Coordinación del análisis en servidor</w:t>
       </w:r>
     </w:p>
     <w:p>
@@ -15923,7 +15996,39 @@
         <w:pStyle w:val="CdigoTFG"/>
       </w:pPr>
       <w:r>
-        <w:t>│       ├── backend_service.py        # Compatibilidad con el backend</w:t>
+        <w:t>│       ├── backend_service.py        # Casos de uso del servidor central</w:t>
+      </w:r>
+    </w:p>
+    <w:p>
+      <w:pPr>
+        <w:pStyle w:val="CdigoTFG"/>
+      </w:pPr>
+      <w:r>
+        <w:t>│       ├── backend_client.py         # Cliente HTTP compartido</w:t>
+      </w:r>
+    </w:p>
+    <w:p>
+      <w:pPr>
+        <w:pStyle w:val="CdigoTFG"/>
+      </w:pPr>
+      <w:r>
+        <w:t>│       ├── model_config.py           # Configuración ML ligera para clientes</w:t>
+      </w:r>
+    </w:p>
+    <w:p>
+      <w:pPr>
+        <w:pStyle w:val="CdigoTFG"/>
+      </w:pPr>
+      <w:r>
+        <w:t>│       ├── file_utils.py             # Escrituras atómicas de secretos y estado</w:t>
+      </w:r>
+    </w:p>
+    <w:p>
+      <w:pPr>
+        <w:pStyle w:val="CdigoTFG"/>
+      </w:pPr>
+      <w:r>
+        <w:t>│       ├── network.py                # Política de loopback y bind</w:t>
       </w:r>
     </w:p>
     <w:p>
@@ -16142,7 +16247,7 @@
           <w:bCs/>
         </w:rPr>
       </w:pPr>
-      <w:bookmarkStart w:id="64" w:name="_Toc238490995"/>
+      <w:bookmarkStart w:id="64" w:name="_Toc238679648"/>
       <w:r>
         <w:rPr>
           <w:bCs/>
@@ -16163,7 +16268,7 @@
           <w:bCs/>
         </w:rPr>
       </w:pPr>
-      <w:bookmarkStart w:id="65" w:name="_Toc238490996"/>
+      <w:bookmarkStart w:id="65" w:name="_Toc238679649"/>
       <w:r>
         <w:rPr>
           <w:bCs/>
@@ -16259,7 +16364,7 @@
           <w:bCs/>
         </w:rPr>
       </w:pPr>
-      <w:bookmarkStart w:id="66" w:name="_Toc238490997"/>
+      <w:bookmarkStart w:id="66" w:name="_Toc238679650"/>
       <w:r>
         <w:rPr>
           <w:bCs/>
@@ -16716,7 +16821,7 @@
           <w:bCs/>
         </w:rPr>
       </w:pPr>
-      <w:bookmarkStart w:id="67" w:name="_Toc238490998"/>
+      <w:bookmarkStart w:id="67" w:name="_Toc238679651"/>
       <w:r>
         <w:rPr>
           <w:bCs/>
@@ -17004,7 +17109,7 @@
           <w:bCs/>
         </w:rPr>
       </w:pPr>
-      <w:bookmarkStart w:id="68" w:name="_Toc238490999"/>
+      <w:bookmarkStart w:id="68" w:name="_Toc238679652"/>
       <w:r>
         <w:rPr>
           <w:bCs/>
@@ -17016,7 +17121,7 @@
     </w:p>
     <w:p>
       <w:r>
-        <w:t>Este anexo resume los pasos necesarios para ejecutar la aplicación web y sus adaptadores locales. Streamlit se inicia con src/app.py; la API HTTP local escucha por defecto en 127.0.0.1:8766 y expone /health y /analyze, mientras que el servidor de la extensión Gmail utiliza 127.0.0.1:8765. La guía ampliada, la configuración de credenciales y la solución de problemas se mantienen en el archivo README del repositorio.</w:t>
+        <w:t>Este anexo resume la ejecución cliente-servidor local. Primero se inicia el backend obligatorio en 127.0.0.1:8766 y después Streamlit en 127.0.0.1:8501. La extensión apunta directamente al backend desde Opciones y el monitor usa PHISHING_BACKEND_URL. El puerto 8765 queda como proxy antiguo opcional. Fuera de loopback los clientes exigen HTTPS y --allow-remote exige un token administrativo de al menos 24 caracteres; todavía hacen falta autenticación de inferencia, rate limiting y controles operativos.</w:t>
       </w:r>
     </w:p>
     <w:p>
@@ -17071,7 +17176,7 @@
         <w:pStyle w:val="CdigoTFG"/>
       </w:pPr>
       <w:r>
-        <w:t>pip install -r requirements.txt</w:t>
+        <w:t>python -m pip install -r requirements-dev.txt -c constraints.txt</w:t>
       </w:r>
     </w:p>
     <w:p>
@@ -17084,7 +17189,7 @@
         <w:pStyle w:val="CdigoTFG"/>
       </w:pPr>
       <w:r>
-        <w:t># 3. Ejecutar la aplicación web</w:t>
+        <w:t># 3. Ejecutar primero el backend central</w:t>
       </w:r>
     </w:p>
     <w:p>
@@ -17092,7 +17197,7 @@
         <w:pStyle w:val="CdigoTFG"/>
       </w:pPr>
       <w:r>
-        <w:t>streamlit run src/app.py</w:t>
+        <w:t>$env:PYTHONPATH="src"; python src/backend_server.py</w:t>
       </w:r>
     </w:p>
     <w:p>
@@ -17105,7 +17210,7 @@
         <w:pStyle w:val="CdigoTFG"/>
       </w:pPr>
       <w:r>
-        <w:t># 3b. Opcional: API HTTP local</w:t>
+        <w:t># 3b. Ejecutar el cliente web en otra terminal</w:t>
       </w:r>
     </w:p>
     <w:p>
@@ -17113,7 +17218,7 @@
         <w:pStyle w:val="CdigoTFG"/>
       </w:pPr>
       <w:r>
-        <w:t>$env:PYTHONPATH="src"; python src/backend_server.py</w:t>
+        <w:t>$env:PYTHONPATH="src"; streamlit run src/app.py</w:t>
       </w:r>
     </w:p>
     <w:p>
@@ -17121,7 +17226,7 @@
         <w:pStyle w:val="CdigoTFG"/>
       </w:pPr>
       <w:r>
-        <w:t># 3c. Opcional: servidor de la extensión Gmail</w:t>
+        <w:t># 3c. El proxy 8765 solo se usa por compatibilidad antigua</w:t>
       </w:r>
     </w:p>
     <w:p>
@@ -17152,7 +17257,7 @@
       <w:pPr>
         <w:pStyle w:val="Ttulo2"/>
       </w:pPr>
-      <w:bookmarkStart w:id="69" w:name="_Toc238491000"/>
+      <w:bookmarkStart w:id="69" w:name="_Toc238679653"/>
       <w:r>
         <w:t>C.1. Uso del prototipo</w:t>
       </w:r>
@@ -17160,7 +17265,7 @@
     </w:p>
     <w:p>
       <w:r>
-        <w:t>La aplicación ofrece varias entradas: texto pegado, archivos .eml y correos importados mediante Gmail desde la vista Detección; la extensión de Gmail envía además el mensaje visible al servidor local. La API acepta un objeto JSON con asunto, remitente, cuerpo, enlaces, anclas y cabeceras, y devuelve la misma estructura de riesgo que consume la extensión y otros clientes locales.</w:t>
+        <w:t>La aplicación ofrece texto, EML y Gmail desde Streamlit, además del correo visible en la extensión. Todos esos clientes envían la entrada al backend central. /analyze acepta campos JSON o EML Base64 y devuelve riesgo, señales, explicación, idioma y versión para que cada cliente se limite a presentarlos.</w:t>
       </w:r>
     </w:p>
     <w:p>
@@ -17170,17 +17275,17 @@
     </w:p>
     <w:p>
       <w:r>
-        <w:t>El clasificador neuronal asigna una probabilidad de phishing y selecciona el modelo según el idioma detectado. La interfaz Streamlit presenta conjuntamente la puntuación del modelo y las señales explicables de la heurística.</w:t>
-      </w:r>
-    </w:p>
-    <w:p>
-      <w:r>
-        <w:t>Desde la vista Monitor se pueden comprobar correos nuevos de Gmail y, si Telegram está configurado, enviar una alerta con el remitente, el asunto y la puntuación de riesgo.</w:t>
-      </w:r>
-    </w:p>
-    <w:p>
-      <w:r>
-        <w:t>Un caso de uso habitual consiste en cargar un .eml, pegar el contenido, abrir el correo en Gmail o enviarlo a la API local. El sistema procesa la entrada en el entorno local y muestra las señales detectadas, permitiendo decidir con criterio si es seguro o debe reportarse; el tiempo de respuesta depende del tamaño del mensaje y de si es necesario entrenar un modelo sintético de sustitución.</w:t>
+        <w:t>El clasificador neuronal del backend asigna la probabilidad y selecciona el modelo por idioma. Streamlit recibe conjuntamente la puntuación neuronal y las señales heurísticas; no carga el pipeline ni recalcula la decisión.</w:t>
+      </w:r>
+    </w:p>
+    <w:p>
+      <w:r>
+        <w:t>Desde la vista Monitor se consultan correos de Gmail y se envían al backend. Si Telegram está configurado, el cliente puede alertar con el remitente, asunto y puntuación devueltos por el servidor.</w:t>
+      </w:r>
+    </w:p>
+    <w:p>
+      <w:r>
+        <w:t>Un caso habitual consiste en levantar backend y web, cargar un EML o pegar texto. El cliente envía la entrada, el servidor la procesa con la versión central y devuelve señales y riesgo. Para separar físicamente ambos lados se publica el backend detrás de HTTPS y se cambia PHISHING_BACKEND_URL; la latencia dependerá entonces también de la red.</w:t>
       </w:r>
     </w:p>
     <w:p>
@@ -17190,7 +17295,7 @@
           <w:bCs/>
         </w:rPr>
       </w:pPr>
-      <w:bookmarkStart w:id="70" w:name="_Toc238491001"/>
+      <w:bookmarkStart w:id="70" w:name="_Toc238679654"/>
       <w:r>
         <w:rPr>
           <w:bCs/>
@@ -17209,7 +17314,7 @@
         <w:pStyle w:val="ListadecomprobacinTFG"/>
       </w:pPr>
       <w:r>
-        <w:t>Verificado: Comprobación de la suite de 47 pruebas unitarias y de integración.</w:t>
+        <w:t>Verificado: 72 pruebas Python y 2 recorridos reales con Chromium, incluido cliente web a backend.</w:t>
       </w:r>
     </w:p>
     <w:p>
@@ -17239,7 +17344,7 @@
         <w:pStyle w:val="ListadecomprobacinTFG"/>
       </w:pPr>
       <w:r>
-        <w:t>Verificado: Evaluación con un CSV de prueba independiente y métricas documentadas.</w:t>
+        <w:t>Verificado: holdout controlado bilingüe de 40 casos, hashes, métricas y errores por caso; pendiente corpus externo representativo.</w:t>
       </w:r>
     </w:p>
     <w:p>
@@ -17255,7 +17360,7 @@
         <w:pStyle w:val="ListadecomprobacinTFG"/>
       </w:pPr>
       <w:r>
-        <w:t>Verificado: Arranque y navegación de la aplicación Streamlit.</w:t>
+        <w:t>Verificado: arranque separado de backend y Streamlit, navegación y análisis HTTP completo.</w:t>
       </w:r>
     </w:p>
     <w:p>
@@ -17290,9 +17395,33 @@
         <w:t>Verificado: Monitorización de Gmail y notificación opcional por Telegram.</w:t>
       </w:r>
     </w:p>
+    <w:p>
+      <w:pPr>
+        <w:pStyle w:val="Ttulo2"/>
+      </w:pPr>
+      <w:bookmarkStart w:id="71" w:name="_Toc238679655"/>
+      <w:r>
+        <w:t>Anexo E: Resumen de arquitectura y evidencia</w:t>
+      </w:r>
+      <w:bookmarkEnd w:id="71"/>
+    </w:p>
+    <w:p>
+      <w:r>
+        <w:t>El sistema es cliente-servidor. Streamlit, la extensión y el monitor son clientes HTTP; backend_server.py centraliza parser, análisis, entrenamiento y una versión activa por idioma. En la configuración de defensa todos los procesos están en el mismo equipo y loopback, pero el servidor es obligatorio y puede separarse cambiando PHISHING_BACKEND_URL.</w:t>
+      </w:r>
+    </w:p>
+    <w:p>
+      <w:r>
+        <w:t>La evidencia reproducible comprende 72 pruebas Python, 2 recorridos con Chromium, integración continua, benchmark y un holdout controlado bilingüe de 40 casos. Este último detecta regresiones, pero no sustituye una evaluación externa representativa.</w:t>
+      </w:r>
+    </w:p>
     <w:sectPr>
-      <w:headerReference w:type="default" r:id="rId10"/>
-      <w:footerReference w:type="default" r:id="rId11"/>
+      <w:headerReference w:type="even" r:id="rId10"/>
+      <w:headerReference w:type="default" r:id="rId11"/>
+      <w:footerReference w:type="even" r:id="rId12"/>
+      <w:footerReference w:type="default" r:id="rId13"/>
+      <w:headerReference w:type="first" r:id="rId14"/>
+      <w:footerReference w:type="first" r:id="rId15"/>
       <w:pgSz w:w="11906" w:h="16838"/>
       <w:pgMar w:top="1417" w:right="1701" w:bottom="1417" w:left="1701" w:header="708" w:footer="708" w:gutter="0"/>
       <w:cols w:space="708"/>
@@ -17329,6 +17458,16 @@
 </file>
 
 <file path=word/footer1.xml><?xml version="1.0" encoding="utf-8"?>
+<w:ftr xmlns:wpc="http://schemas.microsoft.com/office/word/2010/wordprocessingCanvas" xmlns:cx="http://schemas.microsoft.com/office/drawing/2014/chartex" xmlns:cx1="http://schemas.microsoft.com/office/drawing/2015/9/8/chartex" xmlns:cx2="http://schemas.microsoft.com/office/drawing/2015/10/21/chartex" xmlns:cx3="http://schemas.microsoft.com/office/drawing/2016/5/9/chartex" xmlns:cx4="http://schemas.microsoft.com/office/drawing/2016/5/10/chartex" xmlns:cx5="http://schemas.microsoft.com/office/drawing/2016/5/11/chartex" xmlns:cx6="http://schemas.microsoft.com/office/drawing/2016/5/12/chartex" xmlns:cx7="http://schemas.microsoft.com/office/drawing/2016/5/13/chartex" xmlns:cx8="http://schemas.microsoft.com/office/drawing/2016/5/14/chartex" xmlns:mc="http://schemas.openxmlformats.org/markup-compatibility/2006" xmlns:aink="http://schemas.microsoft.com/office/drawing/2016/ink" xmlns:am3d="http://schemas.microsoft.com/office/drawing/2017/model3d" xmlns:o="urn:schemas-microsoft-com:office:office" xmlns:oel="http://schemas.microsoft.com/office/2019/extlst" xmlns:r="http://schemas.openxmlformats.org/officeDocument/2006/relationships" xmlns:m="http://schemas.openxmlformats.org/officeDocument/2006/math" xmlns:v="urn:schemas-microsoft-com:vml" xmlns:wp14="http://schemas.microsoft.com/office/word/2010/wordprocessingDrawing" xmlns:wp="http://schemas.openxmlformats.org/drawingml/2006/wordprocessingDrawing" xmlns:w10="urn:schemas-microsoft-com:office:word" xmlns:w="http://schemas.openxmlformats.org/wordprocessingml/2006/main" xmlns:w14="http://schemas.microsoft.com/office/word/2010/wordml" xmlns:w15="http://schemas.microsoft.com/office/word/2012/wordml" xmlns:w16cex="http://schemas.microsoft.com/office/word/2018/wordml/cex" xmlns:w16cid="http://schemas.microsoft.com/office/word/2016/wordml/cid" xmlns:w16="http://schemas.microsoft.com/office/word/2018/wordml" xmlns:w16du="http://schemas.microsoft.com/office/word/2023/wordml/word16du" xmlns:w16sdtdh="http://schemas.microsoft.com/office/word/2020/wordml/sdtdatahash" xmlns:w16sdtfl="http://schemas.microsoft.com/office/word/2024/wordml/sdtformatlock" xmlns:w16se="http://schemas.microsoft.com/office/word/2015/wordml/symex" xmlns:wpg="http://schemas.microsoft.com/office/word/2010/wordprocessingGroup" xmlns:wpi="http://schemas.microsoft.com/office/word/2010/wordprocessingInk" xmlns:wne="http://schemas.microsoft.com/office/word/2006/wordml" xmlns:wps="http://schemas.microsoft.com/office/word/2010/wordprocessingShape" mc:Ignorable="w14 w15 w16se w16cid w16 w16cex w16sdtdh w16sdtfl w16du wp14">
+  <w:p>
+    <w:pPr>
+      <w:pStyle w:val="Piedepgina"/>
+    </w:pPr>
+  </w:p>
+</w:ftr>
+</file>
+
+<file path=word/footer2.xml><?xml version="1.0" encoding="utf-8"?>
 <w:ftr xmlns:wpc="http://schemas.microsoft.com/office/word/2010/wordprocessingCanvas" xmlns:cx="http://schemas.microsoft.com/office/drawing/2014/chartex" xmlns:cx1="http://schemas.microsoft.com/office/drawing/2015/9/8/chartex" xmlns:cx2="http://schemas.microsoft.com/office/drawing/2015/10/21/chartex" xmlns:cx3="http://schemas.microsoft.com/office/drawing/2016/5/9/chartex" xmlns:cx4="http://schemas.microsoft.com/office/drawing/2016/5/10/chartex" xmlns:cx5="http://schemas.microsoft.com/office/drawing/2016/5/11/chartex" xmlns:cx6="http://schemas.microsoft.com/office/drawing/2016/5/12/chartex" xmlns:cx7="http://schemas.microsoft.com/office/drawing/2016/5/13/chartex" xmlns:cx8="http://schemas.microsoft.com/office/drawing/2016/5/14/chartex" xmlns:mc="http://schemas.openxmlformats.org/markup-compatibility/2006" xmlns:aink="http://schemas.microsoft.com/office/drawing/2016/ink" xmlns:am3d="http://schemas.microsoft.com/office/drawing/2017/model3d" xmlns:o="urn:schemas-microsoft-com:office:office" xmlns:oel="http://schemas.microsoft.com/office/2019/extlst" xmlns:r="http://schemas.openxmlformats.org/officeDocument/2006/relationships" xmlns:m="http://schemas.openxmlformats.org/officeDocument/2006/math" xmlns:v="urn:schemas-microsoft-com:vml" xmlns:wp14="http://schemas.microsoft.com/office/word/2010/wordprocessingDrawing" xmlns:wp="http://schemas.openxmlformats.org/drawingml/2006/wordprocessingDrawing" xmlns:w10="urn:schemas-microsoft-com:office:word" xmlns:w="http://schemas.openxmlformats.org/wordprocessingml/2006/main" xmlns:w14="http://schemas.microsoft.com/office/word/2010/wordml" xmlns:w15="http://schemas.microsoft.com/office/word/2012/wordml" xmlns:w16cex="http://schemas.microsoft.com/office/word/2018/wordml/cex" xmlns:w16cid="http://schemas.microsoft.com/office/word/2016/wordml/cid" xmlns:w16="http://schemas.microsoft.com/office/word/2018/wordml" xmlns:w16du="http://schemas.microsoft.com/office/word/2023/wordml/word16du" xmlns:w16sdtdh="http://schemas.microsoft.com/office/word/2020/wordml/sdtdatahash" xmlns:w16sdtfl="http://schemas.microsoft.com/office/word/2024/wordml/sdtformatlock" xmlns:w16se="http://schemas.microsoft.com/office/word/2015/wordml/symex" xmlns:wpg="http://schemas.microsoft.com/office/word/2010/wordprocessingGroup" xmlns:wpi="http://schemas.microsoft.com/office/word/2010/wordprocessingInk" xmlns:wne="http://schemas.microsoft.com/office/word/2006/wordml" xmlns:wps="http://schemas.microsoft.com/office/word/2010/wordprocessingShape" mc:Ignorable="w14 w15 w16se w16cid w16 w16cex w16sdtdh w16sdtfl w16du wp14">
   <w:sdt>
     <w:sdtPr>
@@ -17371,6 +17510,16 @@
 </w:ftr>
 </file>
 
+<file path=word/footer3.xml><?xml version="1.0" encoding="utf-8"?>
+<w:ftr xmlns:wpc="http://schemas.microsoft.com/office/word/2010/wordprocessingCanvas" xmlns:cx="http://schemas.microsoft.com/office/drawing/2014/chartex" xmlns:cx1="http://schemas.microsoft.com/office/drawing/2015/9/8/chartex" xmlns:cx2="http://schemas.microsoft.com/office/drawing/2015/10/21/chartex" xmlns:cx3="http://schemas.microsoft.com/office/drawing/2016/5/9/chartex" xmlns:cx4="http://schemas.microsoft.com/office/drawing/2016/5/10/chartex" xmlns:cx5="http://schemas.microsoft.com/office/drawing/2016/5/11/chartex" xmlns:cx6="http://schemas.microsoft.com/office/drawing/2016/5/12/chartex" xmlns:cx7="http://schemas.microsoft.com/office/drawing/2016/5/13/chartex" xmlns:cx8="http://schemas.microsoft.com/office/drawing/2016/5/14/chartex" xmlns:mc="http://schemas.openxmlformats.org/markup-compatibility/2006" xmlns:aink="http://schemas.microsoft.com/office/drawing/2016/ink" xmlns:am3d="http://schemas.microsoft.com/office/drawing/2017/model3d" xmlns:o="urn:schemas-microsoft-com:office:office" xmlns:oel="http://schemas.microsoft.com/office/2019/extlst" xmlns:r="http://schemas.openxmlformats.org/officeDocument/2006/relationships" xmlns:m="http://schemas.openxmlformats.org/officeDocument/2006/math" xmlns:v="urn:schemas-microsoft-com:vml" xmlns:wp14="http://schemas.microsoft.com/office/word/2010/wordprocessingDrawing" xmlns:wp="http://schemas.openxmlformats.org/drawingml/2006/wordprocessingDrawing" xmlns:w10="urn:schemas-microsoft-com:office:word" xmlns:w="http://schemas.openxmlformats.org/wordprocessingml/2006/main" xmlns:w14="http://schemas.microsoft.com/office/word/2010/wordml" xmlns:w15="http://schemas.microsoft.com/office/word/2012/wordml" xmlns:w16cex="http://schemas.microsoft.com/office/word/2018/wordml/cex" xmlns:w16cid="http://schemas.microsoft.com/office/word/2016/wordml/cid" xmlns:w16="http://schemas.microsoft.com/office/word/2018/wordml" xmlns:w16du="http://schemas.microsoft.com/office/word/2023/wordml/word16du" xmlns:w16sdtdh="http://schemas.microsoft.com/office/word/2020/wordml/sdtdatahash" xmlns:w16sdtfl="http://schemas.microsoft.com/office/word/2024/wordml/sdtformatlock" xmlns:w16se="http://schemas.microsoft.com/office/word/2015/wordml/symex" xmlns:wpg="http://schemas.microsoft.com/office/word/2010/wordprocessingGroup" xmlns:wpi="http://schemas.microsoft.com/office/word/2010/wordprocessingInk" xmlns:wne="http://schemas.microsoft.com/office/word/2006/wordml" xmlns:wps="http://schemas.microsoft.com/office/word/2010/wordprocessingShape" mc:Ignorable="w14 w15 w16se w16cid w16 w16cex w16sdtdh w16sdtfl w16du wp14">
+  <w:p>
+    <w:pPr>
+      <w:pStyle w:val="Piedepgina"/>
+    </w:pPr>
+  </w:p>
+</w:ftr>
+</file>
+
 <file path=word/footnotes.xml><?xml version="1.0" encoding="utf-8"?>
 <w:footnotes xmlns:wpc="http://schemas.microsoft.com/office/word/2010/wordprocessingCanvas" xmlns:cx="http://schemas.microsoft.com/office/drawing/2014/chartex" xmlns:cx1="http://schemas.microsoft.com/office/drawing/2015/9/8/chartex" xmlns:cx2="http://schemas.microsoft.com/office/drawing/2015/10/21/chartex" xmlns:cx3="http://schemas.microsoft.com/office/drawing/2016/5/9/chartex" xmlns:cx4="http://schemas.microsoft.com/office/drawing/2016/5/10/chartex" xmlns:cx5="http://schemas.microsoft.com/office/drawing/2016/5/11/chartex" xmlns:cx6="http://schemas.microsoft.com/office/drawing/2016/5/12/chartex" xmlns:cx7="http://schemas.microsoft.com/office/drawing/2016/5/13/chartex" xmlns:cx8="http://schemas.microsoft.com/office/drawing/2016/5/14/chartex" xmlns:mc="http://schemas.openxmlformats.org/markup-compatibility/2006" xmlns:aink="http://schemas.microsoft.com/office/drawing/2016/ink" xmlns:am3d="http://schemas.microsoft.com/office/drawing/2017/model3d" xmlns:o="urn:schemas-microsoft-com:office:office" xmlns:oel="http://schemas.microsoft.com/office/2019/extlst" xmlns:r="http://schemas.openxmlformats.org/officeDocument/2006/relationships" xmlns:m="http://schemas.openxmlformats.org/officeDocument/2006/math" xmlns:v="urn:schemas-microsoft-com:vml" xmlns:wp14="http://schemas.microsoft.com/office/word/2010/wordprocessingDrawing" xmlns:wp="http://schemas.openxmlformats.org/drawingml/2006/wordprocessingDrawing" xmlns:w10="urn:schemas-microsoft-com:office:word" xmlns:w="http://schemas.openxmlformats.org/wordprocessingml/2006/main" xmlns:w14="http://schemas.microsoft.com/office/word/2010/wordml" xmlns:w15="http://schemas.microsoft.com/office/word/2012/wordml" xmlns:w16cex="http://schemas.microsoft.com/office/word/2018/wordml/cex" xmlns:w16cid="http://schemas.microsoft.com/office/word/2016/wordml/cid" xmlns:w16="http://schemas.microsoft.com/office/word/2018/wordml" xmlns:w16du="http://schemas.microsoft.com/office/word/2023/wordml/word16du" xmlns:w16sdtdh="http://schemas.microsoft.com/office/word/2020/wordml/sdtdatahash" xmlns:w16sdtfl="http://schemas.microsoft.com/office/word/2024/wordml/sdtformatlock" xmlns:w16se="http://schemas.microsoft.com/office/word/2015/wordml/symex" xmlns:wpg="http://schemas.microsoft.com/office/word/2010/wordprocessingGroup" xmlns:wpi="http://schemas.microsoft.com/office/word/2010/wordprocessingInk" xmlns:wne="http://schemas.microsoft.com/office/word/2006/wordml" xmlns:wps="http://schemas.microsoft.com/office/word/2010/wordprocessingShape" mc:Ignorable="w14 w15 w16se w16cid w16 w16cex w16sdtdh w16sdtfl w16du wp14">
   <w:footnote w:type="separator" w:id="-1">
@@ -17401,9 +17550,29 @@
   <w:p>
     <w:pPr>
       <w:pStyle w:val="Encabezado"/>
+    </w:pPr>
+  </w:p>
+</w:hdr>
+</file>
+
+<file path=word/header2.xml><?xml version="1.0" encoding="utf-8"?>
+<w:hdr xmlns:wpc="http://schemas.microsoft.com/office/word/2010/wordprocessingCanvas" xmlns:cx="http://schemas.microsoft.com/office/drawing/2014/chartex" xmlns:cx1="http://schemas.microsoft.com/office/drawing/2015/9/8/chartex" xmlns:cx2="http://schemas.microsoft.com/office/drawing/2015/10/21/chartex" xmlns:cx3="http://schemas.microsoft.com/office/drawing/2016/5/9/chartex" xmlns:cx4="http://schemas.microsoft.com/office/drawing/2016/5/10/chartex" xmlns:cx5="http://schemas.microsoft.com/office/drawing/2016/5/11/chartex" xmlns:cx6="http://schemas.microsoft.com/office/drawing/2016/5/12/chartex" xmlns:cx7="http://schemas.microsoft.com/office/drawing/2016/5/13/chartex" xmlns:cx8="http://schemas.microsoft.com/office/drawing/2016/5/14/chartex" xmlns:mc="http://schemas.openxmlformats.org/markup-compatibility/2006" xmlns:aink="http://schemas.microsoft.com/office/drawing/2016/ink" xmlns:am3d="http://schemas.microsoft.com/office/drawing/2017/model3d" xmlns:o="urn:schemas-microsoft-com:office:office" xmlns:oel="http://schemas.microsoft.com/office/2019/extlst" xmlns:r="http://schemas.openxmlformats.org/officeDocument/2006/relationships" xmlns:m="http://schemas.openxmlformats.org/officeDocument/2006/math" xmlns:v="urn:schemas-microsoft-com:vml" xmlns:wp14="http://schemas.microsoft.com/office/word/2010/wordprocessingDrawing" xmlns:wp="http://schemas.openxmlformats.org/drawingml/2006/wordprocessingDrawing" xmlns:w10="urn:schemas-microsoft-com:office:word" xmlns:w="http://schemas.openxmlformats.org/wordprocessingml/2006/main" xmlns:w14="http://schemas.microsoft.com/office/word/2010/wordml" xmlns:w15="http://schemas.microsoft.com/office/word/2012/wordml" xmlns:w16cex="http://schemas.microsoft.com/office/word/2018/wordml/cex" xmlns:w16cid="http://schemas.microsoft.com/office/word/2016/wordml/cid" xmlns:w16="http://schemas.microsoft.com/office/word/2018/wordml" xmlns:w16du="http://schemas.microsoft.com/office/word/2023/wordml/word16du" xmlns:w16sdtdh="http://schemas.microsoft.com/office/word/2020/wordml/sdtdatahash" xmlns:w16sdtfl="http://schemas.microsoft.com/office/word/2024/wordml/sdtformatlock" xmlns:w16se="http://schemas.microsoft.com/office/word/2015/wordml/symex" xmlns:wpg="http://schemas.microsoft.com/office/word/2010/wordprocessingGroup" xmlns:wpi="http://schemas.microsoft.com/office/word/2010/wordprocessingInk" xmlns:wne="http://schemas.microsoft.com/office/word/2006/wordml" xmlns:wps="http://schemas.microsoft.com/office/word/2010/wordprocessingShape" mc:Ignorable="w14 w15 w16se w16cid w16 w16cex w16sdtdh w16sdtfl w16du wp14">
+  <w:p>
+    <w:pPr>
+      <w:pStyle w:val="Encabezado"/>
       <w:jc w:val="center"/>
     </w:pPr>
   </w:p>
+  <w:p>
+    <w:pPr>
+      <w:pStyle w:val="Encabezado"/>
+    </w:pPr>
+  </w:p>
+</w:hdr>
+</file>
+
+<file path=word/header3.xml><?xml version="1.0" encoding="utf-8"?>
+<w:hdr xmlns:wpc="http://schemas.microsoft.com/office/word/2010/wordprocessingCanvas" xmlns:cx="http://schemas.microsoft.com/office/drawing/2014/chartex" xmlns:cx1="http://schemas.microsoft.com/office/drawing/2015/9/8/chartex" xmlns:cx2="http://schemas.microsoft.com/office/drawing/2015/10/21/chartex" xmlns:cx3="http://schemas.microsoft.com/office/drawing/2016/5/9/chartex" xmlns:cx4="http://schemas.microsoft.com/office/drawing/2016/5/10/chartex" xmlns:cx5="http://schemas.microsoft.com/office/drawing/2016/5/11/chartex" xmlns:cx6="http://schemas.microsoft.com/office/drawing/2016/5/12/chartex" xmlns:cx7="http://schemas.microsoft.com/office/drawing/2016/5/13/chartex" xmlns:cx8="http://schemas.microsoft.com/office/drawing/2016/5/14/chartex" xmlns:mc="http://schemas.openxmlformats.org/markup-compatibility/2006" xmlns:aink="http://schemas.microsoft.com/office/drawing/2016/ink" xmlns:am3d="http://schemas.microsoft.com/office/drawing/2017/model3d" xmlns:o="urn:schemas-microsoft-com:office:office" xmlns:oel="http://schemas.microsoft.com/office/2019/extlst" xmlns:r="http://schemas.openxmlformats.org/officeDocument/2006/relationships" xmlns:m="http://schemas.openxmlformats.org/officeDocument/2006/math" xmlns:v="urn:schemas-microsoft-com:vml" xmlns:wp14="http://schemas.microsoft.com/office/word/2010/wordprocessingDrawing" xmlns:wp="http://schemas.openxmlformats.org/drawingml/2006/wordprocessingDrawing" xmlns:w10="urn:schemas-microsoft-com:office:word" xmlns:w="http://schemas.openxmlformats.org/wordprocessingml/2006/main" xmlns:w14="http://schemas.microsoft.com/office/word/2010/wordml" xmlns:w15="http://schemas.microsoft.com/office/word/2012/wordml" xmlns:w16cex="http://schemas.microsoft.com/office/word/2018/wordml/cex" xmlns:w16cid="http://schemas.microsoft.com/office/word/2016/wordml/cid" xmlns:w16="http://schemas.microsoft.com/office/word/2018/wordml" xmlns:w16du="http://schemas.microsoft.com/office/word/2023/wordml/word16du" xmlns:w16sdtdh="http://schemas.microsoft.com/office/word/2020/wordml/sdtdatahash" xmlns:w16sdtfl="http://schemas.microsoft.com/office/word/2024/wordml/sdtformatlock" xmlns:w16se="http://schemas.microsoft.com/office/word/2015/wordml/symex" xmlns:wpg="http://schemas.microsoft.com/office/word/2010/wordprocessingGroup" xmlns:wpi="http://schemas.microsoft.com/office/word/2010/wordprocessingInk" xmlns:wne="http://schemas.microsoft.com/office/word/2006/wordml" xmlns:wps="http://schemas.microsoft.com/office/word/2010/wordprocessingShape" mc:Ignorable="w14 w15 w16se w16cid w16 w16cex w16sdtdh w16sdtfl w16du wp14">
   <w:p>
     <w:pPr>
       <w:pStyle w:val="Encabezado"/>

</xml_diff>

<commit_message>
Separar almacenamiento de cliente y servidor
</commit_message>
<xml_diff>
--- a/TFG.docx
+++ b/TFG.docx
@@ -118,7 +118,7 @@
       <w:pPr>
         <w:pStyle w:val="Ttulo1"/>
       </w:pPr>
-      <w:bookmarkStart w:id="0" w:name="_Toc239058028"/>
+      <w:bookmarkStart w:id="0" w:name="_Toc239096987"/>
       <w:r>
         <w:lastRenderedPageBreak/>
         <w:t>Resumen</w:t>
@@ -140,7 +140,7 @@
       <w:pPr>
         <w:pStyle w:val="Ttulo1"/>
       </w:pPr>
-      <w:bookmarkStart w:id="1" w:name="_Toc239058029"/>
+      <w:bookmarkStart w:id="1" w:name="_Toc239096988"/>
       <w:r>
         <w:lastRenderedPageBreak/>
         <w:t>Abstract</w:t>
@@ -167,7 +167,7 @@
       <w:pPr>
         <w:pStyle w:val="Ttulo1"/>
       </w:pPr>
-      <w:bookmarkStart w:id="2" w:name="_Toc239058030"/>
+      <w:bookmarkStart w:id="2" w:name="_Toc239096989"/>
       <w:r>
         <w:lastRenderedPageBreak/>
         <w:t>Agradecimientos</w:t>
@@ -183,7 +183,7 @@
       <w:pPr>
         <w:pStyle w:val="Ttulo1"/>
       </w:pPr>
-      <w:bookmarkStart w:id="3" w:name="_Toc239058031"/>
+      <w:bookmarkStart w:id="3" w:name="_Toc239096990"/>
       <w:r>
         <w:lastRenderedPageBreak/>
         <w:t>Índice de figuras y tablas</w:t>
@@ -291,7 +291,7 @@
       <w:pPr>
         <w:pStyle w:val="Ttulo1"/>
       </w:pPr>
-      <w:bookmarkStart w:id="4" w:name="_Toc239058032"/>
+      <w:bookmarkStart w:id="4" w:name="_Toc239096991"/>
       <w:r>
         <w:lastRenderedPageBreak/>
         <w:t>Abreviaturas</w:t>
@@ -560,7 +560,7 @@
           <w:r>
             <w:fldChar w:fldCharType="separate"/>
           </w:r>
-          <w:hyperlink w:anchor="_Toc239058028" w:history="1">
+          <w:hyperlink w:anchor="_Toc239096987" w:history="1">
             <w:r>
               <w:rPr>
                 <w:rStyle w:val="Hipervnculo"/>
@@ -587,7 +587,7 @@
                 <w:noProof/>
                 <w:webHidden/>
               </w:rPr>
-              <w:instrText xml:space="preserve"> PAGEREF _Toc239058028 \h </w:instrText>
+              <w:instrText xml:space="preserve"> PAGEREF _Toc239096987 \h </w:instrText>
             </w:r>
             <w:r>
               <w:rPr>
@@ -635,7 +635,7 @@
               <w14:ligatures w14:val="standardContextual"/>
             </w:rPr>
           </w:pPr>
-          <w:hyperlink w:anchor="_Toc239058029" w:history="1">
+          <w:hyperlink w:anchor="_Toc239096988" w:history="1">
             <w:r>
               <w:rPr>
                 <w:rStyle w:val="Hipervnculo"/>
@@ -662,7 +662,7 @@
                 <w:noProof/>
                 <w:webHidden/>
               </w:rPr>
-              <w:instrText xml:space="preserve"> PAGEREF _Toc239058029 \h </w:instrText>
+              <w:instrText xml:space="preserve"> PAGEREF _Toc239096988 \h </w:instrText>
             </w:r>
             <w:r>
               <w:rPr>
@@ -710,7 +710,7 @@
               <w14:ligatures w14:val="standardContextual"/>
             </w:rPr>
           </w:pPr>
-          <w:hyperlink w:anchor="_Toc239058030" w:history="1">
+          <w:hyperlink w:anchor="_Toc239096989" w:history="1">
             <w:r>
               <w:rPr>
                 <w:rStyle w:val="Hipervnculo"/>
@@ -737,7 +737,7 @@
                 <w:noProof/>
                 <w:webHidden/>
               </w:rPr>
-              <w:instrText xml:space="preserve"> PAGEREF _Toc239058030 \h </w:instrText>
+              <w:instrText xml:space="preserve"> PAGEREF _Toc239096989 \h </w:instrText>
             </w:r>
             <w:r>
               <w:rPr>
@@ -785,7 +785,7 @@
               <w14:ligatures w14:val="standardContextual"/>
             </w:rPr>
           </w:pPr>
-          <w:hyperlink w:anchor="_Toc239058031" w:history="1">
+          <w:hyperlink w:anchor="_Toc239096990" w:history="1">
             <w:r>
               <w:rPr>
                 <w:rStyle w:val="Hipervnculo"/>
@@ -812,7 +812,7 @@
                 <w:noProof/>
                 <w:webHidden/>
               </w:rPr>
-              <w:instrText xml:space="preserve"> PAGEREF _Toc239058031 \h </w:instrText>
+              <w:instrText xml:space="preserve"> PAGEREF _Toc239096990 \h </w:instrText>
             </w:r>
             <w:r>
               <w:rPr>
@@ -860,7 +860,7 @@
               <w14:ligatures w14:val="standardContextual"/>
             </w:rPr>
           </w:pPr>
-          <w:hyperlink w:anchor="_Toc239058032" w:history="1">
+          <w:hyperlink w:anchor="_Toc239096991" w:history="1">
             <w:r>
               <w:rPr>
                 <w:rStyle w:val="Hipervnculo"/>
@@ -887,7 +887,7 @@
                 <w:noProof/>
                 <w:webHidden/>
               </w:rPr>
-              <w:instrText xml:space="preserve"> PAGEREF _Toc239058032 \h </w:instrText>
+              <w:instrText xml:space="preserve"> PAGEREF _Toc239096991 \h </w:instrText>
             </w:r>
             <w:r>
               <w:rPr>
@@ -935,7 +935,7 @@
               <w14:ligatures w14:val="standardContextual"/>
             </w:rPr>
           </w:pPr>
-          <w:hyperlink w:anchor="_Toc239058033" w:history="1">
+          <w:hyperlink w:anchor="_Toc239096992" w:history="1">
             <w:r>
               <w:rPr>
                 <w:rStyle w:val="Hipervnculo"/>
@@ -962,7 +962,7 @@
                 <w:noProof/>
                 <w:webHidden/>
               </w:rPr>
-              <w:instrText xml:space="preserve"> PAGEREF _Toc239058033 \h </w:instrText>
+              <w:instrText xml:space="preserve"> PAGEREF _Toc239096992 \h </w:instrText>
             </w:r>
             <w:r>
               <w:rPr>
@@ -1010,7 +1010,7 @@
               <w14:ligatures w14:val="standardContextual"/>
             </w:rPr>
           </w:pPr>
-          <w:hyperlink w:anchor="_Toc239058034" w:history="1">
+          <w:hyperlink w:anchor="_Toc239096993" w:history="1">
             <w:r>
               <w:rPr>
                 <w:rStyle w:val="Hipervnculo"/>
@@ -1037,7 +1037,7 @@
                 <w:noProof/>
                 <w:webHidden/>
               </w:rPr>
-              <w:instrText xml:space="preserve"> PAGEREF _Toc239058034 \h </w:instrText>
+              <w:instrText xml:space="preserve"> PAGEREF _Toc239096993 \h </w:instrText>
             </w:r>
             <w:r>
               <w:rPr>
@@ -1085,7 +1085,7 @@
               <w14:ligatures w14:val="standardContextual"/>
             </w:rPr>
           </w:pPr>
-          <w:hyperlink w:anchor="_Toc239058035" w:history="1">
+          <w:hyperlink w:anchor="_Toc239096994" w:history="1">
             <w:r>
               <w:rPr>
                 <w:rStyle w:val="Hipervnculo"/>
@@ -1112,7 +1112,7 @@
                 <w:noProof/>
                 <w:webHidden/>
               </w:rPr>
-              <w:instrText xml:space="preserve"> PAGEREF _Toc239058035 \h </w:instrText>
+              <w:instrText xml:space="preserve"> PAGEREF _Toc239096994 \h </w:instrText>
             </w:r>
             <w:r>
               <w:rPr>
@@ -1160,7 +1160,7 @@
               <w14:ligatures w14:val="standardContextual"/>
             </w:rPr>
           </w:pPr>
-          <w:hyperlink w:anchor="_Toc239058036" w:history="1">
+          <w:hyperlink w:anchor="_Toc239096995" w:history="1">
             <w:r>
               <w:rPr>
                 <w:rStyle w:val="Hipervnculo"/>
@@ -1187,7 +1187,7 @@
                 <w:noProof/>
                 <w:webHidden/>
               </w:rPr>
-              <w:instrText xml:space="preserve"> PAGEREF _Toc239058036 \h </w:instrText>
+              <w:instrText xml:space="preserve"> PAGEREF _Toc239096995 \h </w:instrText>
             </w:r>
             <w:r>
               <w:rPr>
@@ -1235,7 +1235,7 @@
               <w14:ligatures w14:val="standardContextual"/>
             </w:rPr>
           </w:pPr>
-          <w:hyperlink w:anchor="_Toc239058037" w:history="1">
+          <w:hyperlink w:anchor="_Toc239096996" w:history="1">
             <w:r>
               <w:rPr>
                 <w:rStyle w:val="Hipervnculo"/>
@@ -1262,7 +1262,7 @@
                 <w:noProof/>
                 <w:webHidden/>
               </w:rPr>
-              <w:instrText xml:space="preserve"> PAGEREF _Toc239058037 \h </w:instrText>
+              <w:instrText xml:space="preserve"> PAGEREF _Toc239096996 \h </w:instrText>
             </w:r>
             <w:r>
               <w:rPr>
@@ -1310,7 +1310,7 @@
               <w14:ligatures w14:val="standardContextual"/>
             </w:rPr>
           </w:pPr>
-          <w:hyperlink w:anchor="_Toc239058038" w:history="1">
+          <w:hyperlink w:anchor="_Toc239096997" w:history="1">
             <w:r>
               <w:rPr>
                 <w:rStyle w:val="Hipervnculo"/>
@@ -1337,7 +1337,7 @@
                 <w:noProof/>
                 <w:webHidden/>
               </w:rPr>
-              <w:instrText xml:space="preserve"> PAGEREF _Toc239058038 \h </w:instrText>
+              <w:instrText xml:space="preserve"> PAGEREF _Toc239096997 \h </w:instrText>
             </w:r>
             <w:r>
               <w:rPr>
@@ -1385,7 +1385,7 @@
               <w14:ligatures w14:val="standardContextual"/>
             </w:rPr>
           </w:pPr>
-          <w:hyperlink w:anchor="_Toc239058039" w:history="1">
+          <w:hyperlink w:anchor="_Toc239096998" w:history="1">
             <w:r>
               <w:rPr>
                 <w:rStyle w:val="Hipervnculo"/>
@@ -1412,7 +1412,7 @@
                 <w:noProof/>
                 <w:webHidden/>
               </w:rPr>
-              <w:instrText xml:space="preserve"> PAGEREF _Toc239058039 \h </w:instrText>
+              <w:instrText xml:space="preserve"> PAGEREF _Toc239096998 \h </w:instrText>
             </w:r>
             <w:r>
               <w:rPr>
@@ -1460,7 +1460,7 @@
               <w14:ligatures w14:val="standardContextual"/>
             </w:rPr>
           </w:pPr>
-          <w:hyperlink w:anchor="_Toc239058040" w:history="1">
+          <w:hyperlink w:anchor="_Toc239096999" w:history="1">
             <w:r>
               <w:rPr>
                 <w:rStyle w:val="Hipervnculo"/>
@@ -1487,7 +1487,7 @@
                 <w:noProof/>
                 <w:webHidden/>
               </w:rPr>
-              <w:instrText xml:space="preserve"> PAGEREF _Toc239058040 \h </w:instrText>
+              <w:instrText xml:space="preserve"> PAGEREF _Toc239096999 \h </w:instrText>
             </w:r>
             <w:r>
               <w:rPr>
@@ -1535,7 +1535,7 @@
               <w14:ligatures w14:val="standardContextual"/>
             </w:rPr>
           </w:pPr>
-          <w:hyperlink w:anchor="_Toc239058041" w:history="1">
+          <w:hyperlink w:anchor="_Toc239097000" w:history="1">
             <w:r>
               <w:rPr>
                 <w:rStyle w:val="Hipervnculo"/>
@@ -1562,7 +1562,7 @@
                 <w:noProof/>
                 <w:webHidden/>
               </w:rPr>
-              <w:instrText xml:space="preserve"> PAGEREF _Toc239058041 \h </w:instrText>
+              <w:instrText xml:space="preserve"> PAGEREF _Toc239097000 \h </w:instrText>
             </w:r>
             <w:r>
               <w:rPr>
@@ -1610,7 +1610,7 @@
               <w14:ligatures w14:val="standardContextual"/>
             </w:rPr>
           </w:pPr>
-          <w:hyperlink w:anchor="_Toc239058042" w:history="1">
+          <w:hyperlink w:anchor="_Toc239097001" w:history="1">
             <w:r>
               <w:rPr>
                 <w:rStyle w:val="Hipervnculo"/>
@@ -1637,7 +1637,7 @@
                 <w:noProof/>
                 <w:webHidden/>
               </w:rPr>
-              <w:instrText xml:space="preserve"> PAGEREF _Toc239058042 \h </w:instrText>
+              <w:instrText xml:space="preserve"> PAGEREF _Toc239097001 \h </w:instrText>
             </w:r>
             <w:r>
               <w:rPr>
@@ -1685,7 +1685,7 @@
               <w14:ligatures w14:val="standardContextual"/>
             </w:rPr>
           </w:pPr>
-          <w:hyperlink w:anchor="_Toc239058043" w:history="1">
+          <w:hyperlink w:anchor="_Toc239097002" w:history="1">
             <w:r>
               <w:rPr>
                 <w:rStyle w:val="Hipervnculo"/>
@@ -1712,7 +1712,7 @@
                 <w:noProof/>
                 <w:webHidden/>
               </w:rPr>
-              <w:instrText xml:space="preserve"> PAGEREF _Toc239058043 \h </w:instrText>
+              <w:instrText xml:space="preserve"> PAGEREF _Toc239097002 \h </w:instrText>
             </w:r>
             <w:r>
               <w:rPr>
@@ -1760,7 +1760,7 @@
               <w14:ligatures w14:val="standardContextual"/>
             </w:rPr>
           </w:pPr>
-          <w:hyperlink w:anchor="_Toc239058044" w:history="1">
+          <w:hyperlink w:anchor="_Toc239097003" w:history="1">
             <w:r>
               <w:rPr>
                 <w:rStyle w:val="Hipervnculo"/>
@@ -1787,7 +1787,7 @@
                 <w:noProof/>
                 <w:webHidden/>
               </w:rPr>
-              <w:instrText xml:space="preserve"> PAGEREF _Toc239058044 \h </w:instrText>
+              <w:instrText xml:space="preserve"> PAGEREF _Toc239097003 \h </w:instrText>
             </w:r>
             <w:r>
               <w:rPr>
@@ -1835,7 +1835,7 @@
               <w14:ligatures w14:val="standardContextual"/>
             </w:rPr>
           </w:pPr>
-          <w:hyperlink w:anchor="_Toc239058045" w:history="1">
+          <w:hyperlink w:anchor="_Toc239097004" w:history="1">
             <w:r>
               <w:rPr>
                 <w:rStyle w:val="Hipervnculo"/>
@@ -1862,7 +1862,7 @@
                 <w:noProof/>
                 <w:webHidden/>
               </w:rPr>
-              <w:instrText xml:space="preserve"> PAGEREF _Toc239058045 \h </w:instrText>
+              <w:instrText xml:space="preserve"> PAGEREF _Toc239097004 \h </w:instrText>
             </w:r>
             <w:r>
               <w:rPr>
@@ -1910,7 +1910,7 @@
               <w14:ligatures w14:val="standardContextual"/>
             </w:rPr>
           </w:pPr>
-          <w:hyperlink w:anchor="_Toc239058046" w:history="1">
+          <w:hyperlink w:anchor="_Toc239097005" w:history="1">
             <w:r>
               <w:rPr>
                 <w:rStyle w:val="Hipervnculo"/>
@@ -1937,7 +1937,7 @@
                 <w:noProof/>
                 <w:webHidden/>
               </w:rPr>
-              <w:instrText xml:space="preserve"> PAGEREF _Toc239058046 \h </w:instrText>
+              <w:instrText xml:space="preserve"> PAGEREF _Toc239097005 \h </w:instrText>
             </w:r>
             <w:r>
               <w:rPr>
@@ -1985,7 +1985,7 @@
               <w14:ligatures w14:val="standardContextual"/>
             </w:rPr>
           </w:pPr>
-          <w:hyperlink w:anchor="_Toc239058047" w:history="1">
+          <w:hyperlink w:anchor="_Toc239097006" w:history="1">
             <w:r>
               <w:rPr>
                 <w:rStyle w:val="Hipervnculo"/>
@@ -2012,7 +2012,7 @@
                 <w:noProof/>
                 <w:webHidden/>
               </w:rPr>
-              <w:instrText xml:space="preserve"> PAGEREF _Toc239058047 \h </w:instrText>
+              <w:instrText xml:space="preserve"> PAGEREF _Toc239097006 \h </w:instrText>
             </w:r>
             <w:r>
               <w:rPr>
@@ -2060,7 +2060,7 @@
               <w14:ligatures w14:val="standardContextual"/>
             </w:rPr>
           </w:pPr>
-          <w:hyperlink w:anchor="_Toc239058048" w:history="1">
+          <w:hyperlink w:anchor="_Toc239097007" w:history="1">
             <w:r>
               <w:rPr>
                 <w:rStyle w:val="Hipervnculo"/>
@@ -2087,7 +2087,7 @@
                 <w:noProof/>
                 <w:webHidden/>
               </w:rPr>
-              <w:instrText xml:space="preserve"> PAGEREF _Toc239058048 \h </w:instrText>
+              <w:instrText xml:space="preserve"> PAGEREF _Toc239097007 \h </w:instrText>
             </w:r>
             <w:r>
               <w:rPr>
@@ -2135,7 +2135,7 @@
               <w14:ligatures w14:val="standardContextual"/>
             </w:rPr>
           </w:pPr>
-          <w:hyperlink w:anchor="_Toc239058049" w:history="1">
+          <w:hyperlink w:anchor="_Toc239097008" w:history="1">
             <w:r>
               <w:rPr>
                 <w:rStyle w:val="Hipervnculo"/>
@@ -2162,7 +2162,7 @@
                 <w:noProof/>
                 <w:webHidden/>
               </w:rPr>
-              <w:instrText xml:space="preserve"> PAGEREF _Toc239058049 \h </w:instrText>
+              <w:instrText xml:space="preserve"> PAGEREF _Toc239097008 \h </w:instrText>
             </w:r>
             <w:r>
               <w:rPr>
@@ -2210,7 +2210,7 @@
               <w14:ligatures w14:val="standardContextual"/>
             </w:rPr>
           </w:pPr>
-          <w:hyperlink w:anchor="_Toc239058050" w:history="1">
+          <w:hyperlink w:anchor="_Toc239097009" w:history="1">
             <w:r>
               <w:rPr>
                 <w:rStyle w:val="Hipervnculo"/>
@@ -2237,7 +2237,7 @@
                 <w:noProof/>
                 <w:webHidden/>
               </w:rPr>
-              <w:instrText xml:space="preserve"> PAGEREF _Toc239058050 \h </w:instrText>
+              <w:instrText xml:space="preserve"> PAGEREF _Toc239097009 \h </w:instrText>
             </w:r>
             <w:r>
               <w:rPr>
@@ -2285,7 +2285,7 @@
               <w14:ligatures w14:val="standardContextual"/>
             </w:rPr>
           </w:pPr>
-          <w:hyperlink w:anchor="_Toc239058051" w:history="1">
+          <w:hyperlink w:anchor="_Toc239097010" w:history="1">
             <w:r>
               <w:rPr>
                 <w:rStyle w:val="Hipervnculo"/>
@@ -2312,7 +2312,7 @@
                 <w:noProof/>
                 <w:webHidden/>
               </w:rPr>
-              <w:instrText xml:space="preserve"> PAGEREF _Toc239058051 \h </w:instrText>
+              <w:instrText xml:space="preserve"> PAGEREF _Toc239097010 \h </w:instrText>
             </w:r>
             <w:r>
               <w:rPr>
@@ -2360,7 +2360,7 @@
               <w14:ligatures w14:val="standardContextual"/>
             </w:rPr>
           </w:pPr>
-          <w:hyperlink w:anchor="_Toc239058052" w:history="1">
+          <w:hyperlink w:anchor="_Toc239097011" w:history="1">
             <w:r>
               <w:rPr>
                 <w:rStyle w:val="Hipervnculo"/>
@@ -2387,7 +2387,7 @@
                 <w:noProof/>
                 <w:webHidden/>
               </w:rPr>
-              <w:instrText xml:space="preserve"> PAGEREF _Toc239058052 \h </w:instrText>
+              <w:instrText xml:space="preserve"> PAGEREF _Toc239097011 \h </w:instrText>
             </w:r>
             <w:r>
               <w:rPr>
@@ -2435,7 +2435,7 @@
               <w14:ligatures w14:val="standardContextual"/>
             </w:rPr>
           </w:pPr>
-          <w:hyperlink w:anchor="_Toc239058053" w:history="1">
+          <w:hyperlink w:anchor="_Toc239097012" w:history="1">
             <w:r>
               <w:rPr>
                 <w:rStyle w:val="Hipervnculo"/>
@@ -2462,7 +2462,7 @@
                 <w:noProof/>
                 <w:webHidden/>
               </w:rPr>
-              <w:instrText xml:space="preserve"> PAGEREF _Toc239058053 \h </w:instrText>
+              <w:instrText xml:space="preserve"> PAGEREF _Toc239097012 \h </w:instrText>
             </w:r>
             <w:r>
               <w:rPr>
@@ -2510,7 +2510,7 @@
               <w14:ligatures w14:val="standardContextual"/>
             </w:rPr>
           </w:pPr>
-          <w:hyperlink w:anchor="_Toc239058054" w:history="1">
+          <w:hyperlink w:anchor="_Toc239097013" w:history="1">
             <w:r>
               <w:rPr>
                 <w:rStyle w:val="Hipervnculo"/>
@@ -2537,7 +2537,7 @@
                 <w:noProof/>
                 <w:webHidden/>
               </w:rPr>
-              <w:instrText xml:space="preserve"> PAGEREF _Toc239058054 \h </w:instrText>
+              <w:instrText xml:space="preserve"> PAGEREF _Toc239097013 \h </w:instrText>
             </w:r>
             <w:r>
               <w:rPr>
@@ -2585,7 +2585,7 @@
               <w14:ligatures w14:val="standardContextual"/>
             </w:rPr>
           </w:pPr>
-          <w:hyperlink w:anchor="_Toc239058055" w:history="1">
+          <w:hyperlink w:anchor="_Toc239097014" w:history="1">
             <w:r>
               <w:rPr>
                 <w:rStyle w:val="Hipervnculo"/>
@@ -2612,7 +2612,7 @@
                 <w:noProof/>
                 <w:webHidden/>
               </w:rPr>
-              <w:instrText xml:space="preserve"> PAGEREF _Toc239058055 \h </w:instrText>
+              <w:instrText xml:space="preserve"> PAGEREF _Toc239097014 \h </w:instrText>
             </w:r>
             <w:r>
               <w:rPr>
@@ -2660,7 +2660,7 @@
               <w14:ligatures w14:val="standardContextual"/>
             </w:rPr>
           </w:pPr>
-          <w:hyperlink w:anchor="_Toc239058056" w:history="1">
+          <w:hyperlink w:anchor="_Toc239097015" w:history="1">
             <w:r>
               <w:rPr>
                 <w:rStyle w:val="Hipervnculo"/>
@@ -2687,7 +2687,7 @@
                 <w:noProof/>
                 <w:webHidden/>
               </w:rPr>
-              <w:instrText xml:space="preserve"> PAGEREF _Toc239058056 \h </w:instrText>
+              <w:instrText xml:space="preserve"> PAGEREF _Toc239097015 \h </w:instrText>
             </w:r>
             <w:r>
               <w:rPr>
@@ -2735,7 +2735,7 @@
               <w14:ligatures w14:val="standardContextual"/>
             </w:rPr>
           </w:pPr>
-          <w:hyperlink w:anchor="_Toc239058057" w:history="1">
+          <w:hyperlink w:anchor="_Toc239097016" w:history="1">
             <w:r>
               <w:rPr>
                 <w:rStyle w:val="Hipervnculo"/>
@@ -2762,7 +2762,7 @@
                 <w:noProof/>
                 <w:webHidden/>
               </w:rPr>
-              <w:instrText xml:space="preserve"> PAGEREF _Toc239058057 \h </w:instrText>
+              <w:instrText xml:space="preserve"> PAGEREF _Toc239097016 \h </w:instrText>
             </w:r>
             <w:r>
               <w:rPr>
@@ -2810,7 +2810,7 @@
               <w14:ligatures w14:val="standardContextual"/>
             </w:rPr>
           </w:pPr>
-          <w:hyperlink w:anchor="_Toc239058058" w:history="1">
+          <w:hyperlink w:anchor="_Toc239097017" w:history="1">
             <w:r>
               <w:rPr>
                 <w:rStyle w:val="Hipervnculo"/>
@@ -2837,7 +2837,7 @@
                 <w:noProof/>
                 <w:webHidden/>
               </w:rPr>
-              <w:instrText xml:space="preserve"> PAGEREF _Toc239058058 \h </w:instrText>
+              <w:instrText xml:space="preserve"> PAGEREF _Toc239097017 \h </w:instrText>
             </w:r>
             <w:r>
               <w:rPr>
@@ -2885,7 +2885,7 @@
               <w14:ligatures w14:val="standardContextual"/>
             </w:rPr>
           </w:pPr>
-          <w:hyperlink w:anchor="_Toc239058059" w:history="1">
+          <w:hyperlink w:anchor="_Toc239097018" w:history="1">
             <w:r>
               <w:rPr>
                 <w:rStyle w:val="Hipervnculo"/>
@@ -2912,7 +2912,7 @@
                 <w:noProof/>
                 <w:webHidden/>
               </w:rPr>
-              <w:instrText xml:space="preserve"> PAGEREF _Toc239058059 \h </w:instrText>
+              <w:instrText xml:space="preserve"> PAGEREF _Toc239097018 \h </w:instrText>
             </w:r>
             <w:r>
               <w:rPr>
@@ -2960,7 +2960,7 @@
               <w14:ligatures w14:val="standardContextual"/>
             </w:rPr>
           </w:pPr>
-          <w:hyperlink w:anchor="_Toc239058060" w:history="1">
+          <w:hyperlink w:anchor="_Toc239097019" w:history="1">
             <w:r>
               <w:rPr>
                 <w:rStyle w:val="Hipervnculo"/>
@@ -2987,7 +2987,7 @@
                 <w:noProof/>
                 <w:webHidden/>
               </w:rPr>
-              <w:instrText xml:space="preserve"> PAGEREF _Toc239058060 \h </w:instrText>
+              <w:instrText xml:space="preserve"> PAGEREF _Toc239097019 \h </w:instrText>
             </w:r>
             <w:r>
               <w:rPr>
@@ -3035,7 +3035,7 @@
               <w14:ligatures w14:val="standardContextual"/>
             </w:rPr>
           </w:pPr>
-          <w:hyperlink w:anchor="_Toc239058061" w:history="1">
+          <w:hyperlink w:anchor="_Toc239097020" w:history="1">
             <w:r>
               <w:rPr>
                 <w:rStyle w:val="Hipervnculo"/>
@@ -3062,7 +3062,7 @@
                 <w:noProof/>
                 <w:webHidden/>
               </w:rPr>
-              <w:instrText xml:space="preserve"> PAGEREF _Toc239058061 \h </w:instrText>
+              <w:instrText xml:space="preserve"> PAGEREF _Toc239097020 \h </w:instrText>
             </w:r>
             <w:r>
               <w:rPr>
@@ -3110,7 +3110,7 @@
               <w14:ligatures w14:val="standardContextual"/>
             </w:rPr>
           </w:pPr>
-          <w:hyperlink w:anchor="_Toc239058062" w:history="1">
+          <w:hyperlink w:anchor="_Toc239097021" w:history="1">
             <w:r>
               <w:rPr>
                 <w:rStyle w:val="Hipervnculo"/>
@@ -3137,7 +3137,7 @@
                 <w:noProof/>
                 <w:webHidden/>
               </w:rPr>
-              <w:instrText xml:space="preserve"> PAGEREF _Toc239058062 \h </w:instrText>
+              <w:instrText xml:space="preserve"> PAGEREF _Toc239097021 \h </w:instrText>
             </w:r>
             <w:r>
               <w:rPr>
@@ -3185,7 +3185,7 @@
               <w14:ligatures w14:val="standardContextual"/>
             </w:rPr>
           </w:pPr>
-          <w:hyperlink w:anchor="_Toc239058063" w:history="1">
+          <w:hyperlink w:anchor="_Toc239097022" w:history="1">
             <w:r>
               <w:rPr>
                 <w:rStyle w:val="Hipervnculo"/>
@@ -3213,7 +3213,7 @@
                 <w:noProof/>
                 <w:webHidden/>
               </w:rPr>
-              <w:instrText xml:space="preserve"> PAGEREF _Toc239058063 \h </w:instrText>
+              <w:instrText xml:space="preserve"> PAGEREF _Toc239097022 \h </w:instrText>
             </w:r>
             <w:r>
               <w:rPr>
@@ -3261,7 +3261,7 @@
               <w14:ligatures w14:val="standardContextual"/>
             </w:rPr>
           </w:pPr>
-          <w:hyperlink w:anchor="_Toc239058064" w:history="1">
+          <w:hyperlink w:anchor="_Toc239097023" w:history="1">
             <w:r>
               <w:rPr>
                 <w:rStyle w:val="Hipervnculo"/>
@@ -3289,7 +3289,7 @@
                 <w:noProof/>
                 <w:webHidden/>
               </w:rPr>
-              <w:instrText xml:space="preserve"> PAGEREF _Toc239058064 \h </w:instrText>
+              <w:instrText xml:space="preserve"> PAGEREF _Toc239097023 \h </w:instrText>
             </w:r>
             <w:r>
               <w:rPr>
@@ -3337,7 +3337,7 @@
               <w14:ligatures w14:val="standardContextual"/>
             </w:rPr>
           </w:pPr>
-          <w:hyperlink w:anchor="_Toc239058065" w:history="1">
+          <w:hyperlink w:anchor="_Toc239097024" w:history="1">
             <w:r>
               <w:rPr>
                 <w:rStyle w:val="Hipervnculo"/>
@@ -3365,7 +3365,7 @@
                 <w:noProof/>
                 <w:webHidden/>
               </w:rPr>
-              <w:instrText xml:space="preserve"> PAGEREF _Toc239058065 \h </w:instrText>
+              <w:instrText xml:space="preserve"> PAGEREF _Toc239097024 \h </w:instrText>
             </w:r>
             <w:r>
               <w:rPr>
@@ -3413,7 +3413,7 @@
               <w14:ligatures w14:val="standardContextual"/>
             </w:rPr>
           </w:pPr>
-          <w:hyperlink w:anchor="_Toc239058066" w:history="1">
+          <w:hyperlink w:anchor="_Toc239097025" w:history="1">
             <w:r>
               <w:rPr>
                 <w:rStyle w:val="Hipervnculo"/>
@@ -3441,7 +3441,7 @@
                 <w:noProof/>
                 <w:webHidden/>
               </w:rPr>
-              <w:instrText xml:space="preserve"> PAGEREF _Toc239058066 \h </w:instrText>
+              <w:instrText xml:space="preserve"> PAGEREF _Toc239097025 \h </w:instrText>
             </w:r>
             <w:r>
               <w:rPr>
@@ -3489,7 +3489,7 @@
               <w14:ligatures w14:val="standardContextual"/>
             </w:rPr>
           </w:pPr>
-          <w:hyperlink w:anchor="_Toc239058067" w:history="1">
+          <w:hyperlink w:anchor="_Toc239097026" w:history="1">
             <w:r>
               <w:rPr>
                 <w:rStyle w:val="Hipervnculo"/>
@@ -3517,7 +3517,7 @@
                 <w:noProof/>
                 <w:webHidden/>
               </w:rPr>
-              <w:instrText xml:space="preserve"> PAGEREF _Toc239058067 \h </w:instrText>
+              <w:instrText xml:space="preserve"> PAGEREF _Toc239097026 \h </w:instrText>
             </w:r>
             <w:r>
               <w:rPr>
@@ -3565,7 +3565,7 @@
               <w14:ligatures w14:val="standardContextual"/>
             </w:rPr>
           </w:pPr>
-          <w:hyperlink w:anchor="_Toc239058068" w:history="1">
+          <w:hyperlink w:anchor="_Toc239097027" w:history="1">
             <w:r>
               <w:rPr>
                 <w:rStyle w:val="Hipervnculo"/>
@@ -3592,7 +3592,7 @@
                 <w:noProof/>
                 <w:webHidden/>
               </w:rPr>
-              <w:instrText xml:space="preserve"> PAGEREF _Toc239058068 \h </w:instrText>
+              <w:instrText xml:space="preserve"> PAGEREF _Toc239097027 \h </w:instrText>
             </w:r>
             <w:r>
               <w:rPr>
@@ -3640,7 +3640,7 @@
               <w14:ligatures w14:val="standardContextual"/>
             </w:rPr>
           </w:pPr>
-          <w:hyperlink w:anchor="_Toc239058069" w:history="1">
+          <w:hyperlink w:anchor="_Toc239097028" w:history="1">
             <w:r>
               <w:rPr>
                 <w:rStyle w:val="Hipervnculo"/>
@@ -3667,7 +3667,7 @@
                 <w:noProof/>
                 <w:webHidden/>
               </w:rPr>
-              <w:instrText xml:space="preserve"> PAGEREF _Toc239058069 \h </w:instrText>
+              <w:instrText xml:space="preserve"> PAGEREF _Toc239097028 \h </w:instrText>
             </w:r>
             <w:r>
               <w:rPr>
@@ -3715,7 +3715,7 @@
               <w14:ligatures w14:val="standardContextual"/>
             </w:rPr>
           </w:pPr>
-          <w:hyperlink w:anchor="_Toc239058070" w:history="1">
+          <w:hyperlink w:anchor="_Toc239097029" w:history="1">
             <w:r>
               <w:rPr>
                 <w:rStyle w:val="Hipervnculo"/>
@@ -3742,7 +3742,7 @@
                 <w:noProof/>
                 <w:webHidden/>
               </w:rPr>
-              <w:instrText xml:space="preserve"> PAGEREF _Toc239058070 \h </w:instrText>
+              <w:instrText xml:space="preserve"> PAGEREF _Toc239097029 \h </w:instrText>
             </w:r>
             <w:r>
               <w:rPr>
@@ -3790,7 +3790,7 @@
               <w14:ligatures w14:val="standardContextual"/>
             </w:rPr>
           </w:pPr>
-          <w:hyperlink w:anchor="_Toc239058071" w:history="1">
+          <w:hyperlink w:anchor="_Toc239097030" w:history="1">
             <w:r>
               <w:rPr>
                 <w:rStyle w:val="Hipervnculo"/>
@@ -3817,7 +3817,7 @@
                 <w:noProof/>
                 <w:webHidden/>
               </w:rPr>
-              <w:instrText xml:space="preserve"> PAGEREF _Toc239058071 \h </w:instrText>
+              <w:instrText xml:space="preserve"> PAGEREF _Toc239097030 \h </w:instrText>
             </w:r>
             <w:r>
               <w:rPr>
@@ -3865,7 +3865,7 @@
               <w14:ligatures w14:val="standardContextual"/>
             </w:rPr>
           </w:pPr>
-          <w:hyperlink w:anchor="_Toc239058072" w:history="1">
+          <w:hyperlink w:anchor="_Toc239097031" w:history="1">
             <w:r>
               <w:rPr>
                 <w:rStyle w:val="Hipervnculo"/>
@@ -3892,7 +3892,7 @@
                 <w:noProof/>
                 <w:webHidden/>
               </w:rPr>
-              <w:instrText xml:space="preserve"> PAGEREF _Toc239058072 \h </w:instrText>
+              <w:instrText xml:space="preserve"> PAGEREF _Toc239097031 \h </w:instrText>
             </w:r>
             <w:r>
               <w:rPr>
@@ -3940,7 +3940,7 @@
               <w14:ligatures w14:val="standardContextual"/>
             </w:rPr>
           </w:pPr>
-          <w:hyperlink w:anchor="_Toc239058073" w:history="1">
+          <w:hyperlink w:anchor="_Toc239097032" w:history="1">
             <w:r>
               <w:rPr>
                 <w:rStyle w:val="Hipervnculo"/>
@@ -3967,7 +3967,7 @@
                 <w:noProof/>
                 <w:webHidden/>
               </w:rPr>
-              <w:instrText xml:space="preserve"> PAGEREF _Toc239058073 \h </w:instrText>
+              <w:instrText xml:space="preserve"> PAGEREF _Toc239097032 \h </w:instrText>
             </w:r>
             <w:r>
               <w:rPr>
@@ -4015,7 +4015,7 @@
               <w14:ligatures w14:val="standardContextual"/>
             </w:rPr>
           </w:pPr>
-          <w:hyperlink w:anchor="_Toc239058074" w:history="1">
+          <w:hyperlink w:anchor="_Toc239097033" w:history="1">
             <w:r>
               <w:rPr>
                 <w:rStyle w:val="Hipervnculo"/>
@@ -4042,7 +4042,7 @@
                 <w:noProof/>
                 <w:webHidden/>
               </w:rPr>
-              <w:instrText xml:space="preserve"> PAGEREF _Toc239058074 \h </w:instrText>
+              <w:instrText xml:space="preserve"> PAGEREF _Toc239097033 \h </w:instrText>
             </w:r>
             <w:r>
               <w:rPr>
@@ -4090,7 +4090,7 @@
               <w14:ligatures w14:val="standardContextual"/>
             </w:rPr>
           </w:pPr>
-          <w:hyperlink w:anchor="_Toc239058075" w:history="1">
+          <w:hyperlink w:anchor="_Toc239097034" w:history="1">
             <w:r>
               <w:rPr>
                 <w:rStyle w:val="Hipervnculo"/>
@@ -4117,7 +4117,7 @@
                 <w:noProof/>
                 <w:webHidden/>
               </w:rPr>
-              <w:instrText xml:space="preserve"> PAGEREF _Toc239058075 \h </w:instrText>
+              <w:instrText xml:space="preserve"> PAGEREF _Toc239097034 \h </w:instrText>
             </w:r>
             <w:r>
               <w:rPr>
@@ -4165,7 +4165,7 @@
               <w14:ligatures w14:val="standardContextual"/>
             </w:rPr>
           </w:pPr>
-          <w:hyperlink w:anchor="_Toc239058076" w:history="1">
+          <w:hyperlink w:anchor="_Toc239097035" w:history="1">
             <w:r>
               <w:rPr>
                 <w:rStyle w:val="Hipervnculo"/>
@@ -4192,7 +4192,7 @@
                 <w:noProof/>
                 <w:webHidden/>
               </w:rPr>
-              <w:instrText xml:space="preserve"> PAGEREF _Toc239058076 \h </w:instrText>
+              <w:instrText xml:space="preserve"> PAGEREF _Toc239097035 \h </w:instrText>
             </w:r>
             <w:r>
               <w:rPr>
@@ -4240,7 +4240,7 @@
               <w14:ligatures w14:val="standardContextual"/>
             </w:rPr>
           </w:pPr>
-          <w:hyperlink w:anchor="_Toc239058077" w:history="1">
+          <w:hyperlink w:anchor="_Toc239097036" w:history="1">
             <w:r>
               <w:rPr>
                 <w:rStyle w:val="Hipervnculo"/>
@@ -4267,7 +4267,7 @@
                 <w:noProof/>
                 <w:webHidden/>
               </w:rPr>
-              <w:instrText xml:space="preserve"> PAGEREF _Toc239058077 \h </w:instrText>
+              <w:instrText xml:space="preserve"> PAGEREF _Toc239097036 \h </w:instrText>
             </w:r>
             <w:r>
               <w:rPr>
@@ -4315,7 +4315,7 @@
               <w14:ligatures w14:val="standardContextual"/>
             </w:rPr>
           </w:pPr>
-          <w:hyperlink w:anchor="_Toc239058078" w:history="1">
+          <w:hyperlink w:anchor="_Toc239097037" w:history="1">
             <w:r>
               <w:rPr>
                 <w:rStyle w:val="Hipervnculo"/>
@@ -4342,7 +4342,7 @@
                 <w:noProof/>
                 <w:webHidden/>
               </w:rPr>
-              <w:instrText xml:space="preserve"> PAGEREF _Toc239058078 \h </w:instrText>
+              <w:instrText xml:space="preserve"> PAGEREF _Toc239097037 \h </w:instrText>
             </w:r>
             <w:r>
               <w:rPr>
@@ -4390,7 +4390,7 @@
               <w14:ligatures w14:val="standardContextual"/>
             </w:rPr>
           </w:pPr>
-          <w:hyperlink w:anchor="_Toc239058079" w:history="1">
+          <w:hyperlink w:anchor="_Toc239097038" w:history="1">
             <w:r>
               <w:rPr>
                 <w:rStyle w:val="Hipervnculo"/>
@@ -4417,7 +4417,7 @@
                 <w:noProof/>
                 <w:webHidden/>
               </w:rPr>
-              <w:instrText xml:space="preserve"> PAGEREF _Toc239058079 \h </w:instrText>
+              <w:instrText xml:space="preserve"> PAGEREF _Toc239097038 \h </w:instrText>
             </w:r>
             <w:r>
               <w:rPr>
@@ -4437,7 +4437,7 @@
                 <w:noProof/>
                 <w:webHidden/>
               </w:rPr>
-              <w:t>33</w:t>
+              <w:t>34</w:t>
             </w:r>
             <w:r>
               <w:rPr>
@@ -4465,7 +4465,7 @@
               <w14:ligatures w14:val="standardContextual"/>
             </w:rPr>
           </w:pPr>
-          <w:hyperlink w:anchor="_Toc239058080" w:history="1">
+          <w:hyperlink w:anchor="_Toc239097039" w:history="1">
             <w:r>
               <w:rPr>
                 <w:rStyle w:val="Hipervnculo"/>
@@ -4492,7 +4492,7 @@
                 <w:noProof/>
                 <w:webHidden/>
               </w:rPr>
-              <w:instrText xml:space="preserve"> PAGEREF _Toc239058080 \h </w:instrText>
+              <w:instrText xml:space="preserve"> PAGEREF _Toc239097039 \h </w:instrText>
             </w:r>
             <w:r>
               <w:rPr>
@@ -4512,7 +4512,7 @@
                 <w:noProof/>
                 <w:webHidden/>
               </w:rPr>
-              <w:t>33</w:t>
+              <w:t>34</w:t>
             </w:r>
             <w:r>
               <w:rPr>
@@ -4540,7 +4540,7 @@
               <w14:ligatures w14:val="standardContextual"/>
             </w:rPr>
           </w:pPr>
-          <w:hyperlink w:anchor="_Toc239058081" w:history="1">
+          <w:hyperlink w:anchor="_Toc239097040" w:history="1">
             <w:r>
               <w:rPr>
                 <w:rStyle w:val="Hipervnculo"/>
@@ -4567,7 +4567,7 @@
                 <w:noProof/>
                 <w:webHidden/>
               </w:rPr>
-              <w:instrText xml:space="preserve"> PAGEREF _Toc239058081 \h </w:instrText>
+              <w:instrText xml:space="preserve"> PAGEREF _Toc239097040 \h </w:instrText>
             </w:r>
             <w:r>
               <w:rPr>
@@ -4587,7 +4587,7 @@
                 <w:noProof/>
                 <w:webHidden/>
               </w:rPr>
-              <w:t>33</w:t>
+              <w:t>34</w:t>
             </w:r>
             <w:r>
               <w:rPr>
@@ -4615,7 +4615,7 @@
               <w14:ligatures w14:val="standardContextual"/>
             </w:rPr>
           </w:pPr>
-          <w:hyperlink w:anchor="_Toc239058082" w:history="1">
+          <w:hyperlink w:anchor="_Toc239097041" w:history="1">
             <w:r>
               <w:rPr>
                 <w:rStyle w:val="Hipervnculo"/>
@@ -4642,7 +4642,7 @@
                 <w:noProof/>
                 <w:webHidden/>
               </w:rPr>
-              <w:instrText xml:space="preserve"> PAGEREF _Toc239058082 \h </w:instrText>
+              <w:instrText xml:space="preserve"> PAGEREF _Toc239097041 \h </w:instrText>
             </w:r>
             <w:r>
               <w:rPr>
@@ -4662,7 +4662,7 @@
                 <w:noProof/>
                 <w:webHidden/>
               </w:rPr>
-              <w:t>33</w:t>
+              <w:t>34</w:t>
             </w:r>
             <w:r>
               <w:rPr>
@@ -4690,7 +4690,7 @@
               <w14:ligatures w14:val="standardContextual"/>
             </w:rPr>
           </w:pPr>
-          <w:hyperlink w:anchor="_Toc239058083" w:history="1">
+          <w:hyperlink w:anchor="_Toc239097042" w:history="1">
             <w:r>
               <w:rPr>
                 <w:rStyle w:val="Hipervnculo"/>
@@ -4717,7 +4717,7 @@
                 <w:noProof/>
                 <w:webHidden/>
               </w:rPr>
-              <w:instrText xml:space="preserve"> PAGEREF _Toc239058083 \h </w:instrText>
+              <w:instrText xml:space="preserve"> PAGEREF _Toc239097042 \h </w:instrText>
             </w:r>
             <w:r>
               <w:rPr>
@@ -4737,7 +4737,7 @@
                 <w:noProof/>
                 <w:webHidden/>
               </w:rPr>
-              <w:t>34</w:t>
+              <w:t>35</w:t>
             </w:r>
             <w:r>
               <w:rPr>
@@ -4765,7 +4765,7 @@
               <w14:ligatures w14:val="standardContextual"/>
             </w:rPr>
           </w:pPr>
-          <w:hyperlink w:anchor="_Toc239058084" w:history="1">
+          <w:hyperlink w:anchor="_Toc239097043" w:history="1">
             <w:r>
               <w:rPr>
                 <w:rStyle w:val="Hipervnculo"/>
@@ -4792,7 +4792,7 @@
                 <w:noProof/>
                 <w:webHidden/>
               </w:rPr>
-              <w:instrText xml:space="preserve"> PAGEREF _Toc239058084 \h </w:instrText>
+              <w:instrText xml:space="preserve"> PAGEREF _Toc239097043 \h </w:instrText>
             </w:r>
             <w:r>
               <w:rPr>
@@ -4812,7 +4812,7 @@
                 <w:noProof/>
                 <w:webHidden/>
               </w:rPr>
-              <w:t>35</w:t>
+              <w:t>36</w:t>
             </w:r>
             <w:r>
               <w:rPr>
@@ -4840,7 +4840,7 @@
               <w14:ligatures w14:val="standardContextual"/>
             </w:rPr>
           </w:pPr>
-          <w:hyperlink w:anchor="_Toc239058085" w:history="1">
+          <w:hyperlink w:anchor="_Toc239097044" w:history="1">
             <w:r>
               <w:rPr>
                 <w:rStyle w:val="Hipervnculo"/>
@@ -4867,7 +4867,7 @@
                 <w:noProof/>
                 <w:webHidden/>
               </w:rPr>
-              <w:instrText xml:space="preserve"> PAGEREF _Toc239058085 \h </w:instrText>
+              <w:instrText xml:space="preserve"> PAGEREF _Toc239097044 \h </w:instrText>
             </w:r>
             <w:r>
               <w:rPr>
@@ -4887,7 +4887,7 @@
                 <w:noProof/>
                 <w:webHidden/>
               </w:rPr>
-              <w:t>35</w:t>
+              <w:t>36</w:t>
             </w:r>
             <w:r>
               <w:rPr>
@@ -4915,7 +4915,7 @@
               <w14:ligatures w14:val="standardContextual"/>
             </w:rPr>
           </w:pPr>
-          <w:hyperlink w:anchor="_Toc239058086" w:history="1">
+          <w:hyperlink w:anchor="_Toc239097045" w:history="1">
             <w:r>
               <w:rPr>
                 <w:rStyle w:val="Hipervnculo"/>
@@ -4942,7 +4942,7 @@
                 <w:noProof/>
                 <w:webHidden/>
               </w:rPr>
-              <w:instrText xml:space="preserve"> PAGEREF _Toc239058086 \h </w:instrText>
+              <w:instrText xml:space="preserve"> PAGEREF _Toc239097045 \h </w:instrText>
             </w:r>
             <w:r>
               <w:rPr>
@@ -4962,7 +4962,7 @@
                 <w:noProof/>
                 <w:webHidden/>
               </w:rPr>
-              <w:t>35</w:t>
+              <w:t>36</w:t>
             </w:r>
             <w:r>
               <w:rPr>
@@ -4990,7 +4990,7 @@
               <w14:ligatures w14:val="standardContextual"/>
             </w:rPr>
           </w:pPr>
-          <w:hyperlink w:anchor="_Toc239058087" w:history="1">
+          <w:hyperlink w:anchor="_Toc239097046" w:history="1">
             <w:r>
               <w:rPr>
                 <w:rStyle w:val="Hipervnculo"/>
@@ -5017,7 +5017,7 @@
                 <w:noProof/>
                 <w:webHidden/>
               </w:rPr>
-              <w:instrText xml:space="preserve"> PAGEREF _Toc239058087 \h </w:instrText>
+              <w:instrText xml:space="preserve"> PAGEREF _Toc239097046 \h </w:instrText>
             </w:r>
             <w:r>
               <w:rPr>
@@ -5037,7 +5037,7 @@
                 <w:noProof/>
                 <w:webHidden/>
               </w:rPr>
-              <w:t>36</w:t>
+              <w:t>37</w:t>
             </w:r>
             <w:r>
               <w:rPr>
@@ -5065,7 +5065,7 @@
               <w14:ligatures w14:val="standardContextual"/>
             </w:rPr>
           </w:pPr>
-          <w:hyperlink w:anchor="_Toc239058088" w:history="1">
+          <w:hyperlink w:anchor="_Toc239097047" w:history="1">
             <w:r>
               <w:rPr>
                 <w:rStyle w:val="Hipervnculo"/>
@@ -5092,7 +5092,7 @@
                 <w:noProof/>
                 <w:webHidden/>
               </w:rPr>
-              <w:instrText xml:space="preserve"> PAGEREF _Toc239058088 \h </w:instrText>
+              <w:instrText xml:space="preserve"> PAGEREF _Toc239097047 \h </w:instrText>
             </w:r>
             <w:r>
               <w:rPr>
@@ -5112,7 +5112,7 @@
                 <w:noProof/>
                 <w:webHidden/>
               </w:rPr>
-              <w:t>36</w:t>
+              <w:t>37</w:t>
             </w:r>
             <w:r>
               <w:rPr>
@@ -5140,7 +5140,7 @@
               <w14:ligatures w14:val="standardContextual"/>
             </w:rPr>
           </w:pPr>
-          <w:hyperlink w:anchor="_Toc239058089" w:history="1">
+          <w:hyperlink w:anchor="_Toc239097048" w:history="1">
             <w:r>
               <w:rPr>
                 <w:rStyle w:val="Hipervnculo"/>
@@ -5167,7 +5167,7 @@
                 <w:noProof/>
                 <w:webHidden/>
               </w:rPr>
-              <w:instrText xml:space="preserve"> PAGEREF _Toc239058089 \h </w:instrText>
+              <w:instrText xml:space="preserve"> PAGEREF _Toc239097048 \h </w:instrText>
             </w:r>
             <w:r>
               <w:rPr>
@@ -5187,7 +5187,7 @@
                 <w:noProof/>
                 <w:webHidden/>
               </w:rPr>
-              <w:t>37</w:t>
+              <w:t>38</w:t>
             </w:r>
             <w:r>
               <w:rPr>
@@ -5215,7 +5215,7 @@
               <w14:ligatures w14:val="standardContextual"/>
             </w:rPr>
           </w:pPr>
-          <w:hyperlink w:anchor="_Toc239058090" w:history="1">
+          <w:hyperlink w:anchor="_Toc239097049" w:history="1">
             <w:r>
               <w:rPr>
                 <w:rStyle w:val="Hipervnculo"/>
@@ -5242,7 +5242,7 @@
                 <w:noProof/>
                 <w:webHidden/>
               </w:rPr>
-              <w:instrText xml:space="preserve"> PAGEREF _Toc239058090 \h </w:instrText>
+              <w:instrText xml:space="preserve"> PAGEREF _Toc239097049 \h </w:instrText>
             </w:r>
             <w:r>
               <w:rPr>
@@ -5262,7 +5262,7 @@
                 <w:noProof/>
                 <w:webHidden/>
               </w:rPr>
-              <w:t>38</w:t>
+              <w:t>39</w:t>
             </w:r>
             <w:r>
               <w:rPr>
@@ -5290,7 +5290,7 @@
               <w14:ligatures w14:val="standardContextual"/>
             </w:rPr>
           </w:pPr>
-          <w:hyperlink w:anchor="_Toc239058091" w:history="1">
+          <w:hyperlink w:anchor="_Toc239097050" w:history="1">
             <w:r>
               <w:rPr>
                 <w:rStyle w:val="Hipervnculo"/>
@@ -5317,7 +5317,7 @@
                 <w:noProof/>
                 <w:webHidden/>
               </w:rPr>
-              <w:instrText xml:space="preserve"> PAGEREF _Toc239058091 \h </w:instrText>
+              <w:instrText xml:space="preserve"> PAGEREF _Toc239097050 \h </w:instrText>
             </w:r>
             <w:r>
               <w:rPr>
@@ -5337,7 +5337,7 @@
                 <w:noProof/>
                 <w:webHidden/>
               </w:rPr>
-              <w:t>39</w:t>
+              <w:t>40</w:t>
             </w:r>
             <w:r>
               <w:rPr>
@@ -5365,7 +5365,7 @@
               <w14:ligatures w14:val="standardContextual"/>
             </w:rPr>
           </w:pPr>
-          <w:hyperlink w:anchor="_Toc239058092" w:history="1">
+          <w:hyperlink w:anchor="_Toc239097051" w:history="1">
             <w:r>
               <w:rPr>
                 <w:rStyle w:val="Hipervnculo"/>
@@ -5393,7 +5393,7 @@
                 <w:noProof/>
                 <w:webHidden/>
               </w:rPr>
-              <w:instrText xml:space="preserve"> PAGEREF _Toc239058092 \h </w:instrText>
+              <w:instrText xml:space="preserve"> PAGEREF _Toc239097051 \h </w:instrText>
             </w:r>
             <w:r>
               <w:rPr>
@@ -5413,7 +5413,7 @@
                 <w:noProof/>
                 <w:webHidden/>
               </w:rPr>
-              <w:t>40</w:t>
+              <w:t>41</w:t>
             </w:r>
             <w:r>
               <w:rPr>
@@ -5441,7 +5441,7 @@
               <w14:ligatures w14:val="standardContextual"/>
             </w:rPr>
           </w:pPr>
-          <w:hyperlink w:anchor="_Toc239058093" w:history="1">
+          <w:hyperlink w:anchor="_Toc239097052" w:history="1">
             <w:r>
               <w:rPr>
                 <w:rStyle w:val="Hipervnculo"/>
@@ -5469,7 +5469,7 @@
                 <w:noProof/>
                 <w:webHidden/>
               </w:rPr>
-              <w:instrText xml:space="preserve"> PAGEREF _Toc239058093 \h </w:instrText>
+              <w:instrText xml:space="preserve"> PAGEREF _Toc239097052 \h </w:instrText>
             </w:r>
             <w:r>
               <w:rPr>
@@ -5489,7 +5489,7 @@
                 <w:noProof/>
                 <w:webHidden/>
               </w:rPr>
-              <w:t>40</w:t>
+              <w:t>41</w:t>
             </w:r>
             <w:r>
               <w:rPr>
@@ -5517,7 +5517,7 @@
               <w14:ligatures w14:val="standardContextual"/>
             </w:rPr>
           </w:pPr>
-          <w:hyperlink w:anchor="_Toc239058094" w:history="1">
+          <w:hyperlink w:anchor="_Toc239097053" w:history="1">
             <w:r>
               <w:rPr>
                 <w:rStyle w:val="Hipervnculo"/>
@@ -5545,7 +5545,7 @@
                 <w:noProof/>
                 <w:webHidden/>
               </w:rPr>
-              <w:instrText xml:space="preserve"> PAGEREF _Toc239058094 \h </w:instrText>
+              <w:instrText xml:space="preserve"> PAGEREF _Toc239097053 \h </w:instrText>
             </w:r>
             <w:r>
               <w:rPr>
@@ -5565,7 +5565,7 @@
                 <w:noProof/>
                 <w:webHidden/>
               </w:rPr>
-              <w:t>41</w:t>
+              <w:t>42</w:t>
             </w:r>
             <w:r>
               <w:rPr>
@@ -5593,7 +5593,7 @@
               <w14:ligatures w14:val="standardContextual"/>
             </w:rPr>
           </w:pPr>
-          <w:hyperlink w:anchor="_Toc239058095" w:history="1">
+          <w:hyperlink w:anchor="_Toc239097054" w:history="1">
             <w:r>
               <w:rPr>
                 <w:rStyle w:val="Hipervnculo"/>
@@ -5621,7 +5621,7 @@
                 <w:noProof/>
                 <w:webHidden/>
               </w:rPr>
-              <w:instrText xml:space="preserve"> PAGEREF _Toc239058095 \h </w:instrText>
+              <w:instrText xml:space="preserve"> PAGEREF _Toc239097054 \h </w:instrText>
             </w:r>
             <w:r>
               <w:rPr>
@@ -5641,7 +5641,7 @@
                 <w:noProof/>
                 <w:webHidden/>
               </w:rPr>
-              <w:t>41</w:t>
+              <w:t>42</w:t>
             </w:r>
             <w:r>
               <w:rPr>
@@ -5669,7 +5669,7 @@
               <w14:ligatures w14:val="standardContextual"/>
             </w:rPr>
           </w:pPr>
-          <w:hyperlink w:anchor="_Toc239058096" w:history="1">
+          <w:hyperlink w:anchor="_Toc239097055" w:history="1">
             <w:r>
               <w:rPr>
                 <w:rStyle w:val="Hipervnculo"/>
@@ -5697,7 +5697,7 @@
                 <w:noProof/>
                 <w:webHidden/>
               </w:rPr>
-              <w:instrText xml:space="preserve"> PAGEREF _Toc239058096 \h </w:instrText>
+              <w:instrText xml:space="preserve"> PAGEREF _Toc239097055 \h </w:instrText>
             </w:r>
             <w:r>
               <w:rPr>
@@ -5717,7 +5717,7 @@
                 <w:noProof/>
                 <w:webHidden/>
               </w:rPr>
-              <w:t>41</w:t>
+              <w:t>42</w:t>
             </w:r>
             <w:r>
               <w:rPr>
@@ -5745,7 +5745,7 @@
               <w14:ligatures w14:val="standardContextual"/>
             </w:rPr>
           </w:pPr>
-          <w:hyperlink w:anchor="_Toc239058097" w:history="1">
+          <w:hyperlink w:anchor="_Toc239097056" w:history="1">
             <w:r>
               <w:rPr>
                 <w:rStyle w:val="Hipervnculo"/>
@@ -5773,7 +5773,7 @@
                 <w:noProof/>
                 <w:webHidden/>
               </w:rPr>
-              <w:instrText xml:space="preserve"> PAGEREF _Toc239058097 \h </w:instrText>
+              <w:instrText xml:space="preserve"> PAGEREF _Toc239097056 \h </w:instrText>
             </w:r>
             <w:r>
               <w:rPr>
@@ -5793,7 +5793,7 @@
                 <w:noProof/>
                 <w:webHidden/>
               </w:rPr>
-              <w:t>42</w:t>
+              <w:t>43</w:t>
             </w:r>
             <w:r>
               <w:rPr>
@@ -5821,7 +5821,7 @@
               <w14:ligatures w14:val="standardContextual"/>
             </w:rPr>
           </w:pPr>
-          <w:hyperlink w:anchor="_Toc239058098" w:history="1">
+          <w:hyperlink w:anchor="_Toc239097057" w:history="1">
             <w:r>
               <w:rPr>
                 <w:rStyle w:val="Hipervnculo"/>
@@ -5849,7 +5849,7 @@
                 <w:noProof/>
                 <w:webHidden/>
               </w:rPr>
-              <w:instrText xml:space="preserve"> PAGEREF _Toc239058098 \h </w:instrText>
+              <w:instrText xml:space="preserve"> PAGEREF _Toc239097057 \h </w:instrText>
             </w:r>
             <w:r>
               <w:rPr>
@@ -5869,7 +5869,7 @@
                 <w:noProof/>
                 <w:webHidden/>
               </w:rPr>
-              <w:t>43</w:t>
+              <w:t>44</w:t>
             </w:r>
             <w:r>
               <w:rPr>
@@ -5897,7 +5897,7 @@
               <w14:ligatures w14:val="standardContextual"/>
             </w:rPr>
           </w:pPr>
-          <w:hyperlink w:anchor="_Toc239058099" w:history="1">
+          <w:hyperlink w:anchor="_Toc239097058" w:history="1">
             <w:r>
               <w:rPr>
                 <w:rStyle w:val="Hipervnculo"/>
@@ -5924,7 +5924,7 @@
                 <w:noProof/>
                 <w:webHidden/>
               </w:rPr>
-              <w:instrText xml:space="preserve"> PAGEREF _Toc239058099 \h </w:instrText>
+              <w:instrText xml:space="preserve"> PAGEREF _Toc239097058 \h </w:instrText>
             </w:r>
             <w:r>
               <w:rPr>
@@ -5944,7 +5944,7 @@
                 <w:noProof/>
                 <w:webHidden/>
               </w:rPr>
-              <w:t>43</w:t>
+              <w:t>44</w:t>
             </w:r>
             <w:r>
               <w:rPr>
@@ -5972,7 +5972,7 @@
               <w14:ligatures w14:val="standardContextual"/>
             </w:rPr>
           </w:pPr>
-          <w:hyperlink w:anchor="_Toc239058100" w:history="1">
+          <w:hyperlink w:anchor="_Toc239097059" w:history="1">
             <w:r>
               <w:rPr>
                 <w:rStyle w:val="Hipervnculo"/>
@@ -6000,7 +6000,7 @@
                 <w:noProof/>
                 <w:webHidden/>
               </w:rPr>
-              <w:instrText xml:space="preserve"> PAGEREF _Toc239058100 \h </w:instrText>
+              <w:instrText xml:space="preserve"> PAGEREF _Toc239097059 \h </w:instrText>
             </w:r>
             <w:r>
               <w:rPr>
@@ -6020,7 +6020,7 @@
                 <w:noProof/>
                 <w:webHidden/>
               </w:rPr>
-              <w:t>44</w:t>
+              <w:t>45</w:t>
             </w:r>
             <w:r>
               <w:rPr>
@@ -6048,7 +6048,7 @@
               <w14:ligatures w14:val="standardContextual"/>
             </w:rPr>
           </w:pPr>
-          <w:hyperlink w:anchor="_Toc239058101" w:history="1">
+          <w:hyperlink w:anchor="_Toc239097060" w:history="1">
             <w:r>
               <w:rPr>
                 <w:rStyle w:val="Hipervnculo"/>
@@ -6075,7 +6075,7 @@
                 <w:noProof/>
                 <w:webHidden/>
               </w:rPr>
-              <w:instrText xml:space="preserve"> PAGEREF _Toc239058101 \h </w:instrText>
+              <w:instrText xml:space="preserve"> PAGEREF _Toc239097060 \h </w:instrText>
             </w:r>
             <w:r>
               <w:rPr>
@@ -6095,7 +6095,7 @@
                 <w:noProof/>
                 <w:webHidden/>
               </w:rPr>
-              <w:t>44</w:t>
+              <w:t>45</w:t>
             </w:r>
             <w:r>
               <w:rPr>
@@ -6121,7 +6121,7 @@
       <w:pPr>
         <w:pStyle w:val="Ttulo1"/>
       </w:pPr>
-      <w:bookmarkStart w:id="5" w:name="_Toc239058033"/>
+      <w:bookmarkStart w:id="5" w:name="_Toc239096992"/>
       <w:r>
         <w:lastRenderedPageBreak/>
         <w:t>Introducción</w:t>
@@ -6229,7 +6229,7 @@
       <w:pPr>
         <w:pStyle w:val="Ttulo1"/>
       </w:pPr>
-      <w:bookmarkStart w:id="6" w:name="_Toc239058034"/>
+      <w:bookmarkStart w:id="6" w:name="_Toc239096993"/>
       <w:r>
         <w:lastRenderedPageBreak/>
         <w:t>Marco teórico del phishing</w:t>
@@ -6240,7 +6240,7 @@
       <w:pPr>
         <w:pStyle w:val="Ttulo2"/>
       </w:pPr>
-      <w:bookmarkStart w:id="7" w:name="_Toc239058035"/>
+      <w:bookmarkStart w:id="7" w:name="_Toc239096994"/>
       <w:r>
         <w:t>Concepto y contexto actual</w:t>
       </w:r>
@@ -6282,7 +6282,7 @@
       <w:pPr>
         <w:pStyle w:val="Ttulo2"/>
       </w:pPr>
-      <w:bookmarkStart w:id="8" w:name="_Toc239058036"/>
+      <w:bookmarkStart w:id="8" w:name="_Toc239096995"/>
       <w:r>
         <w:t>Fases de un ataque de phishing</w:t>
       </w:r>
@@ -6515,7 +6515,7 @@
       <w:pPr>
         <w:pStyle w:val="Ttulo3"/>
       </w:pPr>
-      <w:bookmarkStart w:id="9" w:name="_Toc239058037"/>
+      <w:bookmarkStart w:id="9" w:name="_Toc239096996"/>
       <w:r>
         <w:t>Preparación y Recopilación de Información (Reconocimiento)</w:t>
       </w:r>
@@ -6581,7 +6581,7 @@
       <w:pPr>
         <w:pStyle w:val="Ttulo3"/>
       </w:pPr>
-      <w:bookmarkStart w:id="10" w:name="_Toc239058038"/>
+      <w:bookmarkStart w:id="10" w:name="_Toc239096997"/>
       <w:r>
         <w:t>Creación y Lanzamiento del Cebo (Setup y Ataque)</w:t>
       </w:r>
@@ -6665,7 +6665,7 @@
           <w:noProof/>
         </w:rPr>
         <w:drawing>
-          <wp:inline distT="0" distB="0" distL="0" distR="0" wp14:anchorId="5F2B1234" wp14:editId="0BB2D557">
+          <wp:inline distT="0" distB="0" distL="0" distR="0" wp14:anchorId="5F2B1234" wp14:editId="7C3DE67D">
             <wp:extent cx="5398135" cy="3598545"/>
             <wp:effectExtent l="0" t="0" r="0" b="1905"/>
             <wp:docPr id="2138688316" name="Imagen 4" descr="Figura o captura del sistema de detección, imagen 2." title="Figura del TFG 2"/>
@@ -6718,7 +6718,7 @@
       <w:pPr>
         <w:pStyle w:val="Ttulo3"/>
       </w:pPr>
-      <w:bookmarkStart w:id="11" w:name="_Toc239058039"/>
+      <w:bookmarkStart w:id="11" w:name="_Toc239096998"/>
       <w:r>
         <w:t>Interacción y Explotación (Colección Inicial)</w:t>
       </w:r>
@@ -6783,7 +6783,7 @@
       <w:pPr>
         <w:pStyle w:val="Ttulo3"/>
       </w:pPr>
-      <w:bookmarkStart w:id="12" w:name="_Toc239058040"/>
+      <w:bookmarkStart w:id="12" w:name="_Toc239096999"/>
       <w:r>
         <w:t>Adquisición y Monetización de los Datos</w:t>
       </w:r>
@@ -7431,7 +7431,7 @@
       <w:pPr>
         <w:pStyle w:val="Ttulo3"/>
       </w:pPr>
-      <w:bookmarkStart w:id="13" w:name="_Toc239058041"/>
+      <w:bookmarkStart w:id="13" w:name="_Toc239097000"/>
       <w:r>
         <w:t>Comparación crítica de modelos de fases</w:t>
       </w:r>
@@ -8072,7 +8072,7 @@
         <w:pStyle w:val="Ttulo3"/>
         <w:spacing w:line="278" w:lineRule="auto"/>
       </w:pPr>
-      <w:bookmarkStart w:id="14" w:name="_Toc239058042"/>
+      <w:bookmarkStart w:id="14" w:name="_Toc239097001"/>
       <w:r>
         <w:lastRenderedPageBreak/>
         <w:t>Puntos de intervención y controles</w:t>
@@ -8678,7 +8678,7 @@
       <w:pPr>
         <w:pStyle w:val="Ttulo2"/>
       </w:pPr>
-      <w:bookmarkStart w:id="15" w:name="_Toc239058043"/>
+      <w:bookmarkStart w:id="15" w:name="_Toc239097002"/>
       <w:r>
         <w:t>Tipos, clasificación y evolución de los ataques de phishing</w:t>
       </w:r>
@@ -8688,7 +8688,7 @@
       <w:pPr>
         <w:pStyle w:val="Ttulo3"/>
       </w:pPr>
-      <w:bookmarkStart w:id="16" w:name="_Toc239058044"/>
+      <w:bookmarkStart w:id="16" w:name="_Toc239097003"/>
       <w:r>
         <w:t>Introducción a la clasificación</w:t>
       </w:r>
@@ -8706,7 +8706,7 @@
       <w:pPr>
         <w:pStyle w:val="Ttulo3"/>
       </w:pPr>
-      <w:bookmarkStart w:id="17" w:name="_Toc239058045"/>
+      <w:bookmarkStart w:id="17" w:name="_Toc239097004"/>
       <w:r>
         <w:t>Clasificación según el vector de entrega</w:t>
       </w:r>
@@ -8780,7 +8780,7 @@
       <w:pPr>
         <w:pStyle w:val="Ttulo3"/>
       </w:pPr>
-      <w:bookmarkStart w:id="18" w:name="_Toc239058046"/>
+      <w:bookmarkStart w:id="18" w:name="_Toc239097005"/>
       <w:r>
         <w:t>Clasificación según el grado de personalización y objetivo</w:t>
       </w:r>
@@ -8858,7 +8858,7 @@
       <w:pPr>
         <w:pStyle w:val="Ttulo3"/>
       </w:pPr>
-      <w:bookmarkStart w:id="19" w:name="_Toc239058047"/>
+      <w:bookmarkStart w:id="19" w:name="_Toc239097006"/>
       <w:r>
         <w:t>Clasificación según la técnica de explotación</w:t>
       </w:r>
@@ -8928,7 +8928,7 @@
       <w:pPr>
         <w:pStyle w:val="Ttulo3"/>
       </w:pPr>
-      <w:bookmarkStart w:id="20" w:name="_Toc239058048"/>
+      <w:bookmarkStart w:id="20" w:name="_Toc239097007"/>
       <w:r>
         <w:t>Evolución histórica resumida</w:t>
       </w:r>
@@ -9026,7 +9026,7 @@
       <w:pPr>
         <w:pStyle w:val="Ttulo3"/>
       </w:pPr>
-      <w:bookmarkStart w:id="21" w:name="_Toc239058049"/>
+      <w:bookmarkStart w:id="21" w:name="_Toc239097008"/>
       <w:r>
         <w:t>Impacto actual (2025)</w:t>
       </w:r>
@@ -9052,7 +9052,7 @@
       <w:pPr>
         <w:pStyle w:val="Ttulo2"/>
       </w:pPr>
-      <w:bookmarkStart w:id="22" w:name="_Toc239058050"/>
+      <w:bookmarkStart w:id="22" w:name="_Toc239097009"/>
       <w:r>
         <w:t>La ingeniería social como fundamento psicológico y sociotécnico del phishing</w:t>
       </w:r>
@@ -9070,7 +9070,7 @@
       <w:pPr>
         <w:pStyle w:val="Ttulo3"/>
       </w:pPr>
-      <w:bookmarkStart w:id="23" w:name="_Toc239058051"/>
+      <w:bookmarkStart w:id="23" w:name="_Toc239097010"/>
       <w:r>
         <w:lastRenderedPageBreak/>
         <w:t>Principios psicológicos fundamentales explotados</w:t>
@@ -9723,7 +9723,7 @@
       <w:pPr>
         <w:pStyle w:val="Ttulo3"/>
       </w:pPr>
-      <w:bookmarkStart w:id="24" w:name="_Toc239058052"/>
+      <w:bookmarkStart w:id="24" w:name="_Toc239097011"/>
       <w:r>
         <w:t>Sesgos cognitivos específicos explotados</w:t>
       </w:r>
@@ -9797,7 +9797,7 @@
       <w:pPr>
         <w:pStyle w:val="Ttulo3"/>
       </w:pPr>
-      <w:bookmarkStart w:id="25" w:name="_Toc239058053"/>
+      <w:bookmarkStart w:id="25" w:name="_Toc239097012"/>
       <w:r>
         <w:t>El impacto de la inteligencia artificial generativa en la ingeniería social (2023-2025)</w:t>
       </w:r>
@@ -9858,7 +9858,7 @@
       <w:pPr>
         <w:pStyle w:val="Ttulo3"/>
       </w:pPr>
-      <w:bookmarkStart w:id="26" w:name="_Toc239058054"/>
+      <w:bookmarkStart w:id="26" w:name="_Toc239097013"/>
       <w:r>
         <w:t>Consecuencias organizativas y humanas</w:t>
       </w:r>
@@ -9884,7 +9884,7 @@
       <w:pPr>
         <w:pStyle w:val="Ttulo3"/>
       </w:pPr>
-      <w:bookmarkStart w:id="27" w:name="_Toc239058055"/>
+      <w:bookmarkStart w:id="27" w:name="_Toc239097014"/>
       <w:r>
         <w:t>Implicaciones para la detección</w:t>
       </w:r>
@@ -9963,7 +9963,7 @@
       <w:pPr>
         <w:pStyle w:val="Ttulo1"/>
       </w:pPr>
-      <w:bookmarkStart w:id="28" w:name="_Toc239058056"/>
+      <w:bookmarkStart w:id="28" w:name="_Toc239097015"/>
       <w:r>
         <w:lastRenderedPageBreak/>
         <w:t>Estado del arte en técnicas de detección y prevención de phishing basadas en Machine Learning y Deep Learning (2018-2025)</w:t>
@@ -10004,7 +10004,7 @@
       <w:pPr>
         <w:pStyle w:val="Ttulo2"/>
       </w:pPr>
-      <w:bookmarkStart w:id="29" w:name="_Toc239058057"/>
+      <w:bookmarkStart w:id="29" w:name="_Toc239097016"/>
       <w:r>
         <w:t>Evolución de los enfoques de detección</w:t>
       </w:r>
@@ -10076,7 +10076,7 @@
       <w:pPr>
         <w:pStyle w:val="Ttulo2"/>
       </w:pPr>
-      <w:bookmarkStart w:id="30" w:name="_Toc239058058"/>
+      <w:bookmarkStart w:id="30" w:name="_Toc239097017"/>
       <w:r>
         <w:t>Técnicas clásicas de Machine Learning (representativas 2019-2022)</w:t>
       </w:r>
@@ -10992,7 +10992,7 @@
       <w:pPr>
         <w:pStyle w:val="Ttulo2"/>
       </w:pPr>
-      <w:bookmarkStart w:id="31" w:name="_Toc239058059"/>
+      <w:bookmarkStart w:id="31" w:name="_Toc239097018"/>
       <w:r>
         <w:t>Técnicas de Deep Learning y Transformers (2023-2025)</w:t>
       </w:r>
@@ -12586,7 +12586,7 @@
       <w:pPr>
         <w:pStyle w:val="Ttulo2"/>
       </w:pPr>
-      <w:bookmarkStart w:id="32" w:name="_Toc239058060"/>
+      <w:bookmarkStart w:id="32" w:name="_Toc239097019"/>
       <w:r>
         <w:t>Enfoques híbridos y basados en comportamiento (UEBA)</w:t>
       </w:r>
@@ -12673,7 +12673,7 @@
       <w:pPr>
         <w:pStyle w:val="Ttulo2"/>
       </w:pPr>
-      <w:bookmarkStart w:id="33" w:name="_Toc239058061"/>
+      <w:bookmarkStart w:id="33" w:name="_Toc239097020"/>
       <w:r>
         <w:t>Limitaciones actuales de los enfoques</w:t>
       </w:r>
@@ -12773,7 +12773,7 @@
       <w:pPr>
         <w:pStyle w:val="Ttulo2"/>
       </w:pPr>
-      <w:bookmarkStart w:id="34" w:name="_Toc239058062"/>
+      <w:bookmarkStart w:id="34" w:name="_Toc239097021"/>
       <w:r>
         <w:t>Conclusiones del estado del arte y hueco de investigación</w:t>
       </w:r>
@@ -12862,7 +12862,7 @@
           <w:bCs/>
         </w:rPr>
       </w:pPr>
-      <w:bookmarkStart w:id="35" w:name="_Toc239058063"/>
+      <w:bookmarkStart w:id="35" w:name="_Toc239097022"/>
       <w:r>
         <w:rPr>
           <w:bCs/>
@@ -12883,7 +12883,7 @@
           <w:bCs/>
         </w:rPr>
       </w:pPr>
-      <w:bookmarkStart w:id="36" w:name="_Toc239058064"/>
+      <w:bookmarkStart w:id="36" w:name="_Toc239097023"/>
       <w:r>
         <w:rPr>
           <w:bCs/>
@@ -12910,10 +12910,7 @@
     </w:p>
     <w:p>
       <w:r>
-        <w:t>Durante el desarrollo se emplearon herramientas de inteligencia artificial generativa como apoyo para consultas técnicas puntuales, diagnóstico y resolución de errores, revisión de fragmentos de código, asistencia en el CSS de la interfaz y revisión de documentación. Antes de incorporar los cambios se realizaron las comprobaciones correspondientes; las decisiones técnicas, la interpretación de los resultados y la responsabilidad final corresponden al autor. Estas herramientas no se utilizaron como fuente ac</w:t>
-      </w:r>
-      <w:r>
-        <w:t>adémica: los contenidos teóricos se contrastaron y citaron mediante sus fuentes originales.</w:t>
+        <w:t>Durante el desarrollo se emplearon herramientas de inteligencia artificial generativa como apoyo para consultas técnicas puntuales, diagnóstico y resolución de errores, revisión de fragmentos de código, asistencia en el CSS de la interfaz y revisión de documentación. Antes de incorporar los cambios se realizaron las comprobaciones correspondientes; las decisiones técnicas, la interpretación de los resultados y la responsabilidad final corresponden al autor. Estas herramientas no se utilizaron como fuente académica: los contenidos teóricos se contrastaron y citaron mediante sus fuentes originales.</w:t>
       </w:r>
     </w:p>
     <w:p>
@@ -12928,7 +12925,7 @@
           <w:bCs/>
         </w:rPr>
       </w:pPr>
-      <w:bookmarkStart w:id="37" w:name="_Toc239058065"/>
+      <w:bookmarkStart w:id="37" w:name="_Toc239097024"/>
       <w:r>
         <w:rPr>
           <w:bCs/>
@@ -13827,7 +13824,7 @@
           <w:bCs/>
         </w:rPr>
       </w:pPr>
-      <w:bookmarkStart w:id="38" w:name="_Toc239058066"/>
+      <w:bookmarkStart w:id="38" w:name="_Toc239097025"/>
       <w:r>
         <w:rPr>
           <w:bCs/>
@@ -14534,7 +14531,7 @@
           <w:bCs/>
         </w:rPr>
       </w:pPr>
-      <w:bookmarkStart w:id="39" w:name="_Toc239058067"/>
+      <w:bookmarkStart w:id="39" w:name="_Toc239097026"/>
       <w:r>
         <w:rPr>
           <w:bCs/>
@@ -14545,7 +14542,7 @@
     </w:p>
     <w:p>
       <w:r>
-        <w:t xml:space="preserve">La validación del sistema se realiza en seis niveles complementarios: 89 pruebas Python de componentes e integración, 2 recorridos reales con Chromium, un benchmark reproducible, una calibración bilingüe de 40 casos, 16 EML locales reservados y un diagnóstico de 1.528 textos externos DIFrauD. Un recorrido levanta cliente web y backend separados; otro prueba </w:t>
+        <w:t xml:space="preserve">La validación del sistema se realiza en seis niveles complementarios: 94 pruebas Python de componentes e integración, 2 recorridos reales con Chromium, un benchmark reproducible, una calibración bilingüe de 40 casos, 16 EML locales reservados y un diagnóstico de 1.528 textos externos DIFrauD. Un recorrido levanta cliente web y backend separados; otro prueba </w:t>
       </w:r>
       <w:r>
         <w:lastRenderedPageBreak/>
@@ -14561,7 +14558,7 @@
       <w:pPr>
         <w:pStyle w:val="Ttulo2"/>
       </w:pPr>
-      <w:bookmarkStart w:id="40" w:name="_Toc239058068"/>
+      <w:bookmarkStart w:id="40" w:name="_Toc239097027"/>
       <w:r>
         <w:t>Aspectos éticos y de protección de datos</w:t>
       </w:r>
@@ -14581,7 +14578,7 @@
       <w:pPr>
         <w:pStyle w:val="Ttulo1"/>
       </w:pPr>
-      <w:bookmarkStart w:id="41" w:name="_Toc239058069"/>
+      <w:bookmarkStart w:id="41" w:name="_Toc239097028"/>
       <w:r>
         <w:lastRenderedPageBreak/>
         <w:t>Diseño e implementación de la aplicación web</w:t>
@@ -14618,7 +14615,7 @@
           <w:rFonts w:eastAsiaTheme="minorEastAsia"/>
         </w:rPr>
       </w:pPr>
-      <w:bookmarkStart w:id="42" w:name="_Toc239058070"/>
+      <w:bookmarkStart w:id="42" w:name="_Toc239097029"/>
       <w:r>
         <w:rPr>
           <w:rFonts w:eastAsiaTheme="minorEastAsia"/>
@@ -14654,7 +14651,7 @@
       <w:pPr>
         <w:pStyle w:val="Ttulo2"/>
       </w:pPr>
-      <w:bookmarkStart w:id="43" w:name="_Toc239058071"/>
+      <w:bookmarkStart w:id="43" w:name="_Toc239097030"/>
       <w:r>
         <w:t>Cambios respecto a la propuesta inicial</w:t>
       </w:r>
@@ -15243,7 +15240,7 @@
           <w:rFonts w:eastAsiaTheme="minorEastAsia"/>
         </w:rPr>
       </w:pPr>
-      <w:bookmarkStart w:id="44" w:name="_Toc239058072"/>
+      <w:bookmarkStart w:id="44" w:name="_Toc239097031"/>
       <w:r>
         <w:rPr>
           <w:rFonts w:eastAsiaTheme="minorEastAsia"/>
@@ -15260,7 +15257,7 @@
         </w:rPr>
       </w:pPr>
       <w:r>
-        <w:t>La solución adopta una arquitectura cliente-servidor. El navegador se comunica con Streamlit, que actúa como capa de presentación y cliente HTTP del backend central; la extensión y el monitor consumen esa misma API. Solo backend_server.py normaliza, analiza, entrena y mantiene los modelos activos. En la configuración académica ambos lados se ejecutan en el mismo equipo y sobre loopback, pero son procesos y responsabilidades independientes. Para una demostración en la red local puede exponerse temporalmente solo Streamlit en 0.0.0.0:8501; el backend permanece en 127.0.0.1:8766 y no se publica.</w:t>
+        <w:t>La solución adopta una arquitectura cliente-servidor. El navegador se comunica con Streamlit, que actúa como capa de presentación y cliente HTTP del backend central; la extensión y el monitor consumen esa misma API. Solo backend_server.py normaliza, analiza, entrena y mantiene los modelos activos. Cada instalación conserva credenciales y preferencias en runtime/client, mientras el backend es propietario de los ajustes y modelos de runtime/server; la interfaz administra los valores centrales por API, no mediante acceso directo al disco. En la configuración académica ambos lados se ejecutan en el mismo equipo y sobre loopback, pero son procesos y responsabilidades independientes. Para una demostración en la red local puede exponerse temporalmente solo Streamlit en 0.0.0.0:8501; el backend permanece en 127.0.0.1:8766 y no se publica.</w:t>
       </w:r>
     </w:p>
     <w:p>
@@ -15270,7 +15267,7 @@
         </w:rPr>
       </w:pPr>
       <w:r>
-        <w:t>A nivel interno, backend_client.py implementa el transporte común de los clientes y http_api.py define las rutas. backend_service.py concentra análisis, datasets, evaluación, entrenamiento, metadatos y activación de versiones. Dentro del servidor, analysis_service.py coordina los modos y la caché lingüística; analizador_email.py normaliza EML; signal_builder.py, scorer.py y explanations.py construyen el resultado; modelo_neural.py encapsula TF-IDF + MLP. Las vistas Streamlit no importan almacenamiento ni ejecutan inferencia.</w:t>
+        <w:t>A nivel interno, backend_client.py implementa el transporte común de los clientes y http_api.py define las rutas, incluidas las operaciones administrativas de ajustes. backend_service.py concentra análisis, configuración central, datasets, evaluación, entrenamiento, metadatos y activación de versiones. runtime_paths.py impone las rutas separadas: credenciales, token y estado en runtime/client; configuración y modelos en runtime/server. Dentro del servidor, analysis_service.py coordina los modos y la caché lingüística; analizador_email.py normaliza EML; signal_builder.py, scorer.py y explanations.py construyen el resultado; modelo_neural.py encapsula TF-IDF + MLP. Las vistas Streamlit no importan almacenamiento de modelos ni ejecutan inferencia.</w:t>
       </w:r>
     </w:p>
     <w:p>
@@ -15290,7 +15287,7 @@
           <w:rFonts w:eastAsiaTheme="minorEastAsia"/>
         </w:rPr>
       </w:pPr>
-      <w:bookmarkStart w:id="45" w:name="_Toc239058073"/>
+      <w:bookmarkStart w:id="45" w:name="_Toc239097032"/>
       <w:r>
         <w:rPr>
           <w:rFonts w:eastAsiaTheme="minorEastAsia"/>
@@ -15342,7 +15339,11 @@
         </w:rPr>
       </w:pPr>
       <w:r>
-        <w:t>RiskScorer asigna una ponderación a cada señal activa y calcula una puntuación final entre 0 y 100. Si la puntuación supera el umbral configurado, el mensaje se clasifica como phishing probable. ExplanationBuilder transforma las señales en explicaciones comprensibles. El backend central devuelve ese resultado por HTTP a Streamlit, la extensión o el monitor; los clientes solo lo presentan o, en el caso del monitor, pueden generar una alerta de Telegram y registrar el identificador para evitar duplicados.</w:t>
+        <w:t xml:space="preserve">RiskScorer asigna una ponderación a cada señal activa y calcula una puntuación final entre 0 y 100. Si la puntuación supera el umbral configurado, el mensaje se clasifica como phishing probable. ExplanationBuilder transforma las señales en explicaciones comprensibles. El backend central devuelve ese resultado por HTTP a Streamlit, la extensión o el monitor; los </w:t>
+      </w:r>
+      <w:r>
+        <w:lastRenderedPageBreak/>
+        <w:t>clientes solo lo presentan o, en el caso del monitor, pueden generar una alerta de Telegram y registrar el identificador para evitar duplicados.</w:t>
       </w:r>
     </w:p>
     <w:p>
@@ -15352,12 +15353,11 @@
           <w:rFonts w:eastAsiaTheme="minorEastAsia"/>
         </w:rPr>
       </w:pPr>
-      <w:bookmarkStart w:id="46" w:name="_Toc239058074"/>
+      <w:bookmarkStart w:id="46" w:name="_Toc239097033"/>
       <w:r>
         <w:rPr>
           <w:rFonts w:eastAsiaTheme="minorEastAsia"/>
         </w:rPr>
-        <w:lastRenderedPageBreak/>
         <w:t>Sistema heurístico</w:t>
       </w:r>
       <w:bookmarkEnd w:id="46"/>
@@ -15431,7 +15431,7 @@
           <w:rFonts w:eastAsiaTheme="minorEastAsia"/>
         </w:rPr>
       </w:pPr>
-      <w:bookmarkStart w:id="47" w:name="_Toc239058075"/>
+      <w:bookmarkStart w:id="47" w:name="_Toc239097034"/>
       <w:r>
         <w:rPr>
           <w:rFonts w:eastAsiaTheme="minorEastAsia"/>
@@ -15450,7 +15450,7 @@
         <w:rPr>
           <w:rFonts w:asciiTheme="minorHAnsi" w:hAnsiTheme="minorHAnsi"/>
         </w:rPr>
-        <w:t>Además del sistema heurístico, se ha implementado un clasificador neuronal basado en scikit-learn. El modelo utiliza un pipeline formado por un vectorizador TF-IDF y un clasificador MLPClassifier. El vectorizador transforma el texto del correo en una representación numérica basada en n-gramas (por defecto unigramas y bigramas) con un máximo de características configurable. Los hiperparámetros de la red (capas ocultas, función de activación, regularización, learning rate, early stopping, etc.) están centralizados en la clase HiperparametrosModelo y pueden ajustarse desde el entorno (.env.local) o desde la interfaz de entrenamiento.</w:t>
+        <w:t>Además del sistema heurístico, se ha implementado un clasificador neuronal basado en scikit-learn. El modelo utiliza un pipeline formado por un vectorizador TF-IDF y un MLPClassifier. Los hiperparámetros están centralizados en HiperparametrosModelo y sus valores predeterminados se persisten en runtime/server/.env.local. La interfaz los consulta y modifica mediante la API administrativa; un cliente puede enviar una excepción explícita al comparar o entrenar, pero no escribe el sistema de archivos del servidor.</w:t>
       </w:r>
     </w:p>
     <w:p>
@@ -15460,7 +15460,7 @@
         </w:rPr>
       </w:pPr>
       <w:r>
-        <w:t>El sistema permite una versión activa en español y otra en inglés. La vista de entrenamiento serializa los CSV y los hiperparámetros y los envía al backend, que valida datos, entrena desde cero, guarda el artefacto de forma atómica e invalida la caché. Evaluación y comparación también se ejecutan en el servidor; los clientes reciben únicamente métricas y metadatos.</w:t>
+        <w:t>El sistema permite una versión activa en español y otra en inglés. La vista de entrenamiento serializa los CSV y, solo cuando se solicita una excepción, los hiperparámetros; de lo contrario, el backend usa sus valores centrales persistidos. El servidor valida datos, entrena desde cero, guarda el artefacto de forma atómica en runtime/server/models e invalida la caché. Evaluación y comparación también se ejecutan en el servidor; los clientes reciben únicamente métricas y metadatos.</w:t>
       </w:r>
     </w:p>
     <w:p>
@@ -15470,7 +15470,7 @@
         </w:rPr>
       </w:pPr>
       <w:r>
-        <w:t>Los modelos entrenados se almacenan en disco mediante joblib, diferenciando entre el modelo en español (modelo_neural_es.joblib) y el modelo en inglés (modelo_neural_en.joblib). Durante el análisis, el sistema detecta el idioma del correo con langdetect y reutiliza un detector cacheado por idioma, no uno fijado para toda la sesión. Si el modelo del idioma esperado no existe, está corrupto o tiene metadatos incompatibles, se entrena un modelo sintético del mismo idioma; nunca se reutiliza silenciosamente el modelo de la lengua opuesta.</w:t>
+        <w:t>Los modelos entrenados se almacenan mediante joblib en runtime/server/models, diferenciando el artefacto español del inglés. Solo el backend accede a esas rutas. Durante el análisis, el servidor detecta el idioma con langdetect y reutiliza un detector cacheado por idioma. Si el modelo esperado no existe, está corrupto o tiene metadatos incompatibles, se entrena un modelo sintético del mismo idioma; nunca se reutiliza silenciosamente el modelo de la lengua opuesta.</w:t>
       </w:r>
     </w:p>
     <w:p>
@@ -15480,7 +15480,7 @@
           <w:rFonts w:eastAsiaTheme="minorEastAsia"/>
         </w:rPr>
       </w:pPr>
-      <w:bookmarkStart w:id="48" w:name="_Toc239058076"/>
+      <w:bookmarkStart w:id="48" w:name="_Toc239097035"/>
       <w:r>
         <w:rPr>
           <w:rFonts w:eastAsiaTheme="minorEastAsia"/>
@@ -15527,7 +15527,7 @@
       <w:pPr>
         <w:pStyle w:val="Ttulo2"/>
       </w:pPr>
-      <w:bookmarkStart w:id="49" w:name="_Toc239058077"/>
+      <w:bookmarkStart w:id="49" w:name="_Toc239097036"/>
       <w:r>
         <w:t>Diseño modular</w:t>
       </w:r>
@@ -15540,7 +15540,7 @@
         </w:rPr>
       </w:pPr>
       <w:r>
-        <w:t>Durante el desarrollo se ha realizado una refactorización orientada a SOLID y a una frontera cliente-servidor explícita. La presentación depende de BackendClient; el servidor separa transporte, casos de uso, señales, puntuación, explicaciones, datasets y aprendizaje. Así, los detalles del modelo permanecen fuera de Streamlit, extensión y monitor.</w:t>
+        <w:t>Durante el desarrollo se ha realizado una refactorización orientada a SOLID y a una frontera cliente-servidor explícita. La presentación depende de BackendClient; el servidor separa transporte, casos de uso, señales, puntuación, explicaciones, datasets y aprendizaje. El almacenamiento sigue la misma frontera: runtime/client contiene secretos y preferencias propios de cada instalación, mientras runtime/server contiene configuración y modelos centrales. Así, los detalles del modelo permanecen fuera de Streamlit, extensión y monitor.</w:t>
       </w:r>
     </w:p>
     <w:p>
@@ -15563,14 +15563,14 @@
         </w:rPr>
       </w:pPr>
       <w:r>
-        <w:t>Esta separación facilita la evolución del prototipo. Pueden añadirse reglas o sustituirse el clasificador en el servidor sin redistribuir los clientes. La versión revisada ejecuta correctamente 89 pruebas Python y 2 recorridos reales con Chromium; GitHub Actions repite pruebas, Ruff, calibración, evaluación reproducible, respaldo de defensa y navegación de interfaz.</w:t>
+        <w:t>Esta separación facilita la evolución del prototipo. Pueden añadirse reglas o sustituirse el clasificador en el servidor sin redistribuir los clientes. La versión revisada ejecuta correctamente 94 pruebas Python y 2 recorridos reales con Chromium; GitHub Actions repite pruebas, Ruff, calibración, evaluación reproducible, respaldo de defensa y navegación de interfaz.</w:t>
       </w:r>
     </w:p>
     <w:p>
       <w:pPr>
         <w:pStyle w:val="Ttulo2"/>
       </w:pPr>
-      <w:bookmarkStart w:id="50" w:name="_Toc239058078"/>
+      <w:bookmarkStart w:id="50" w:name="_Toc239097037"/>
       <w:r>
         <w:rPr>
           <w:rFonts w:eastAsiaTheme="minorEastAsia"/>
@@ -15596,7 +15596,11 @@
         </w:rPr>
       </w:pPr>
       <w:r>
-        <w:t>El modelo neuronal depende de la calidad y representatividad de los datasets utilizados para el entrenamiento. Aunque la aplicación permite entrenar con CSV externos, su rendimiento real debe evaluarse con conjuntos amplios, recientes y equilibrados. Por último, el prototipo no incorpora transformers ni LLMs, aunque el estado del arte los identifica como una línea prometedora junto con la detección semántica de principios de ingeniería social.</w:t>
+        <w:t xml:space="preserve">El modelo neuronal depende de la calidad y representatividad de los datasets utilizados para el entrenamiento. Aunque la aplicación permite entrenar con CSV externos, su rendimiento real debe evaluarse con conjuntos amplios, recientes y equilibrados. Por último, el prototipo </w:t>
+      </w:r>
+      <w:r>
+        <w:lastRenderedPageBreak/>
+        <w:t>no incorpora transformers ni LLMs, aunque el estado del arte los identifica como una línea prometedora junto con la detección semántica de principios de ingeniería social.</w:t>
       </w:r>
     </w:p>
     <w:p>
@@ -15610,7 +15614,7 @@
       <w:pPr>
         <w:pStyle w:val="Ttulo1"/>
       </w:pPr>
-      <w:bookmarkStart w:id="51" w:name="_Toc239058079"/>
+      <w:bookmarkStart w:id="51" w:name="_Toc239097038"/>
       <w:r>
         <w:lastRenderedPageBreak/>
         <w:t>Pruebas, resultados y discusión</w:t>
@@ -15621,7 +15625,7 @@
       <w:pPr>
         <w:pStyle w:val="Ttulo2"/>
       </w:pPr>
-      <w:bookmarkStart w:id="52" w:name="_Toc239058080"/>
+      <w:bookmarkStart w:id="52" w:name="_Toc239097039"/>
       <w:r>
         <w:t>Pruebas unitarias y de integración</w:t>
       </w:r>
@@ -15634,14 +15638,14 @@
         </w:rPr>
       </w:pPr>
       <w:r>
-        <w:t>La versión revisada ejecuta 89 pruebas unitarias y de integración mediante unittest. Cubren EML, señales BEC, combinación calibrada, selección determinista de idioma, cliente HTTP, entrenamiento central, Gmail, monitor, heurísticas, clasificador, persistencia, API, autenticación administrativa, extensión, evaluación externa, respaldo de defensa y Telegram. Una prueba integral recorre Gmail EML, JSON, HTTP, backend, estado y alerta Telegram. Además, 2 pruebas con Chromium recorren la extensión y un análisis real entre Streamlit y backend. Todas finalizaron correctamente; los avisos de convergencia proceden de iteraciones reducidas del MLP en pruebas rápidas.</w:t>
+        <w:t>La versión revisada ejecuta 94 pruebas unitarias y de integración mediante unittest. Cubren EML, señales BEC, combinación calibrada, selección determinista de idioma, cliente HTTP, entrenamiento central, Gmail, monitor, heurísticas, clasificador, persistencia separada, ajustes por API, autenticación administrativa, extensión, evaluación externa, respaldo de defensa y Telegram. Una prueba integral recorre Gmail EML, JSON, HTTP, backend, estado y alerta Telegram. Además, 2 pruebas con Chromium recorren la extensión y un análisis real entre Streamlit y backend. Todas finalizaron correctamente; los avisos de convergencia proceden de iteraciones reducidas del MLP en pruebas rápidas.</w:t>
       </w:r>
     </w:p>
     <w:p>
       <w:pPr>
         <w:pStyle w:val="Ttulo2"/>
       </w:pPr>
-      <w:bookmarkStart w:id="53" w:name="_Toc239058081"/>
+      <w:bookmarkStart w:id="53" w:name="_Toc239097040"/>
       <w:r>
         <w:t>Rendimiento y eficiencia de arranque</w:t>
       </w:r>
@@ -15666,7 +15670,7 @@
       <w:pPr>
         <w:pStyle w:val="Ttulo2"/>
       </w:pPr>
-      <w:bookmarkStart w:id="54" w:name="_Toc239058082"/>
+      <w:bookmarkStart w:id="54" w:name="_Toc239097041"/>
       <w:r>
         <w:t>Diseño experimental y datasets</w:t>
       </w:r>
@@ -17156,7 +17160,7 @@
       <w:pPr>
         <w:pStyle w:val="Ttulo2"/>
       </w:pPr>
-      <w:bookmarkStart w:id="55" w:name="_Toc239058083"/>
+      <w:bookmarkStart w:id="55" w:name="_Toc239097042"/>
       <w:r>
         <w:t>Resultados comparados</w:t>
       </w:r>
@@ -19657,7 +19661,7 @@
       <w:pPr>
         <w:pStyle w:val="Ttulo2"/>
       </w:pPr>
-      <w:bookmarkStart w:id="56" w:name="_Toc239058084"/>
+      <w:bookmarkStart w:id="56" w:name="_Toc239097043"/>
       <w:r>
         <w:t>Comportamiento del sistema heurístico</w:t>
       </w:r>
@@ -19680,7 +19684,7 @@
       <w:pPr>
         <w:pStyle w:val="Ttulo2"/>
       </w:pPr>
-      <w:bookmarkStart w:id="57" w:name="_Toc239058085"/>
+      <w:bookmarkStart w:id="57" w:name="_Toc239097044"/>
       <w:r>
         <w:t>Prueba funcional de la aplicación web</w:t>
       </w:r>
@@ -19693,14 +19697,14 @@
         </w:rPr>
       </w:pPr>
       <w:r>
-        <w:t>Se realizaron 89 pruebas Python y 2 recorridos Chromium. Las comprobaciones verifican los tres modos, calibración, idioma determinista, EML serializable, Gmail a backend y Telegram, cliente HTTP, entrenamiento y versión central, caché, señales BEC, API, límites, token administrativo, evaluación externa, respaldo, extensión y Streamlit. Los 16 EML y DIFrauD añaden medición separada con sus límites expresos; no se presentan como evaluación estadística de producción.</w:t>
+        <w:t>Se realizaron 94 pruebas Python y 2 recorridos Chromium. Las comprobaciones verifican los tres modos, calibración, idioma determinista, EML serializable, Gmail a backend y Telegram, cliente HTTP, entrenamiento y versión central, separación de datos, ajustes centrales, caché, señales BEC, API, límites, token administrativo, evaluación externa, respaldo, extensión y Streamlit. Los 16 EML y DIFrauD añaden medición separada con sus límites expresos; no se presentan como evaluación estadística de producción.</w:t>
       </w:r>
     </w:p>
     <w:p>
       <w:pPr>
         <w:pStyle w:val="Ttulo3"/>
       </w:pPr>
-      <w:bookmarkStart w:id="58" w:name="_Toc239058086"/>
+      <w:bookmarkStart w:id="58" w:name="_Toc239097045"/>
       <w:r>
         <w:t>Evidencia visual del prototipo</w:t>
       </w:r>
@@ -19723,7 +19727,7 @@
         </w:rPr>
         <w:lastRenderedPageBreak/>
         <w:drawing>
-          <wp:inline distT="0" distB="0" distL="0" distR="0" wp14:anchorId="517F1E3F" wp14:editId="14B846D5">
+          <wp:inline distT="0" distB="0" distL="0" distR="0" wp14:anchorId="04904560" wp14:editId="2DC23896">
             <wp:extent cx="5715000" cy="3571875"/>
             <wp:effectExtent l="0" t="0" r="0" b="0"/>
             <wp:docPr id="2138688317" name="Picture 2138688317" descr="Pantalla inicial de Streamlit con el backend central conectado."/>
@@ -19780,7 +19784,7 @@
           <w:noProof/>
         </w:rPr>
         <w:drawing>
-          <wp:inline distT="0" distB="0" distL="0" distR="0" wp14:anchorId="7C821B16" wp14:editId="265626A9">
+          <wp:inline distT="0" distB="0" distL="0" distR="0" wp14:anchorId="0F019BA0" wp14:editId="4BBC0764">
             <wp:extent cx="5715000" cy="1489982"/>
             <wp:effectExtent l="0" t="0" r="0" b="0"/>
             <wp:docPr id="2138688318" name="Picture 2138688318" descr="Tarjeta de resultado combinado para un escenario BEC sintético."/>
@@ -19830,7 +19834,7 @@
       <w:pPr>
         <w:pStyle w:val="Ttulo2"/>
       </w:pPr>
-      <w:bookmarkStart w:id="59" w:name="_Toc239058087"/>
+      <w:bookmarkStart w:id="59" w:name="_Toc239097046"/>
       <w:r>
         <w:t>Discusión</w:t>
       </w:r>
@@ -19851,7 +19855,7 @@
         <w:pStyle w:val="Ttulo1"/>
         <w:pageBreakBefore w:val="0"/>
       </w:pPr>
-      <w:bookmarkStart w:id="60" w:name="_Toc239058088"/>
+      <w:bookmarkStart w:id="60" w:name="_Toc239097047"/>
       <w:r>
         <w:t>Conclusiones generales</w:t>
       </w:r>
@@ -19941,7 +19945,7 @@
         </w:rPr>
       </w:pPr>
       <w:r>
-        <w:t>El sexto objetivo, evaluar el comportamiento del sistema, se aborda con 89 pruebas Python, 2 recorridos Chromium —incluido web a backend—, benchmark reproducible, calibración separada de 40 casos, 16 EML reservados y 1.528 textos externos con hashes, matriz de confusión y errores por identificador. La estimación independiente sobre correo real reciente sigue delimitada como trabajo pendiente.</w:t>
+        <w:t>El sexto objetivo, evaluar el comportamiento del sistema, se aborda con 94 pruebas Python, 2 recorridos Chromium —incluido web a backend—, benchmark reproducible, calibración separada de 40 casos, 16 EML reservados y 1.528 textos externos con hashes, matriz de confusión y errores por identificador. La estimación independiente sobre correo real reciente sigue delimitada como trabajo pendiente.</w:t>
       </w:r>
     </w:p>
     <w:p>
@@ -19958,7 +19962,7 @@
       <w:pPr>
         <w:pStyle w:val="Ttulo2"/>
       </w:pPr>
-      <w:bookmarkStart w:id="61" w:name="_Toc239058089"/>
+      <w:bookmarkStart w:id="61" w:name="_Toc239097048"/>
       <w:r>
         <w:t>Trabajo futuro</w:t>
       </w:r>
@@ -19978,7 +19982,7 @@
       <w:pPr>
         <w:pStyle w:val="Ttulo1"/>
       </w:pPr>
-      <w:bookmarkStart w:id="62" w:name="_Toc239058090"/>
+      <w:bookmarkStart w:id="62" w:name="_Toc239097049"/>
       <w:r>
         <w:lastRenderedPageBreak/>
         <w:t>Glosario</w:t>
@@ -20344,7 +20348,7 @@
       <w:pPr>
         <w:pStyle w:val="Ttulo1"/>
       </w:pPr>
-      <w:bookmarkStart w:id="63" w:name="_Toc239058091"/>
+      <w:bookmarkStart w:id="63" w:name="_Toc239097050"/>
       <w:r>
         <w:lastRenderedPageBreak/>
         <w:t>Referencias</w:t>
@@ -20694,7 +20698,7 @@
           <w:bCs/>
         </w:rPr>
       </w:pPr>
-      <w:bookmarkStart w:id="64" w:name="_Toc239058092"/>
+      <w:bookmarkStart w:id="64" w:name="_Toc239097051"/>
       <w:r>
         <w:rPr>
           <w:bCs/>
@@ -20715,7 +20719,7 @@
           <w:bCs/>
         </w:rPr>
       </w:pPr>
-      <w:bookmarkStart w:id="65" w:name="_Toc239058093"/>
+      <w:bookmarkStart w:id="65" w:name="_Toc239097052"/>
       <w:r>
         <w:rPr>
           <w:bCs/>
@@ -21105,7 +21109,47 @@
         <w:pStyle w:val="CdigoTFG"/>
       </w:pPr>
       <w:r>
-        <w:t>└── .env.example</w:t>
+        <w:t>├── .env.example                    # Aviso de migración</w:t>
+      </w:r>
+    </w:p>
+    <w:p>
+      <w:pPr>
+        <w:pStyle w:val="CdigoTFG"/>
+      </w:pPr>
+      <w:r>
+        <w:t>├── config/                            # Plantillas cliente/servidor</w:t>
+      </w:r>
+    </w:p>
+    <w:p>
+      <w:pPr>
+        <w:pStyle w:val="CdigoTFG"/>
+      </w:pPr>
+      <w:r>
+        <w:t>└── runtime/                           # Datos persistentes separados</w:t>
+      </w:r>
+    </w:p>
+    <w:p>
+      <w:pPr>
+        <w:pStyle w:val="CdigoTFG"/>
+      </w:pPr>
+      <w:r>
+        <w:t xml:space="preserve">    ├── client/                       # Secretos y preferencias (Git ignora)</w:t>
+      </w:r>
+    </w:p>
+    <w:p>
+      <w:pPr>
+        <w:pStyle w:val="CdigoTFG"/>
+      </w:pPr>
+      <w:r>
+        <w:t xml:space="preserve">    └── server/                       # Ajustes y modelos centrales</w:t>
+      </w:r>
+    </w:p>
+    <w:p>
+      <w:pPr>
+        <w:pStyle w:val="CdigoTFG"/>
+      </w:pPr>
+      <w:r>
+        <w:t xml:space="preserve">        └── models/                   # Artefactos ES/EN</w:t>
       </w:r>
     </w:p>
     <w:p>
@@ -21115,7 +21159,7 @@
           <w:bCs/>
         </w:rPr>
       </w:pPr>
-      <w:bookmarkStart w:id="66" w:name="_Toc239058094"/>
+      <w:bookmarkStart w:id="66" w:name="_Toc239097053"/>
       <w:r>
         <w:rPr>
           <w:bCs/>
@@ -21136,7 +21180,7 @@
           <w:bCs/>
         </w:rPr>
       </w:pPr>
-      <w:bookmarkStart w:id="67" w:name="_Toc239058095"/>
+      <w:bookmarkStart w:id="67" w:name="_Toc239097054"/>
       <w:r>
         <w:rPr>
           <w:bCs/>
@@ -21232,7 +21276,7 @@
           <w:bCs/>
         </w:rPr>
       </w:pPr>
-      <w:bookmarkStart w:id="68" w:name="_Toc239058096"/>
+      <w:bookmarkStart w:id="68" w:name="_Toc239097055"/>
       <w:r>
         <w:rPr>
           <w:bCs/>
@@ -21390,6 +21434,7 @@
         <w:pStyle w:val="CdigoTFG"/>
       </w:pPr>
       <w:r>
+        <w:lastRenderedPageBreak/>
         <w:t xml:space="preserve">        classifier = NeuralPhishingClassifier(language=idioma_esperado)</w:t>
       </w:r>
     </w:p>
@@ -21422,7 +21467,6 @@
         <w:pStyle w:val="CdigoTFG"/>
       </w:pPr>
       <w:r>
-        <w:lastRenderedPageBreak/>
         <w:t xml:space="preserve">    def __init__(self, config, heuristic_analyzer=None, detector_loader=None, language_detector=None):</w:t>
       </w:r>
     </w:p>
@@ -21689,7 +21733,7 @@
           <w:bCs/>
         </w:rPr>
       </w:pPr>
-      <w:bookmarkStart w:id="69" w:name="_Toc239058097"/>
+      <w:bookmarkStart w:id="69" w:name="_Toc239097056"/>
       <w:r>
         <w:rPr>
           <w:bCs/>
@@ -21927,6 +21971,7 @@
         <w:pStyle w:val="CdigoTFG"/>
       </w:pPr>
       <w:r>
+        <w:lastRenderedPageBreak/>
         <w:t xml:space="preserve">            "is_phishing": probability &gt;= 0.5,</w:t>
       </w:r>
     </w:p>
@@ -21959,7 +22004,6 @@
         <w:pStyle w:val="CdigoTFG"/>
       </w:pPr>
       <w:r>
-        <w:lastRenderedPageBreak/>
         <w:t xml:space="preserve">            "subject": subject,</w:t>
       </w:r>
     </w:p>
@@ -21978,7 +22022,7 @@
           <w:bCs/>
         </w:rPr>
       </w:pPr>
-      <w:bookmarkStart w:id="70" w:name="_Toc239058098"/>
+      <w:bookmarkStart w:id="70" w:name="_Toc239097057"/>
       <w:r>
         <w:rPr>
           <w:bCs/>
@@ -22125,7 +22169,7 @@
       <w:pPr>
         <w:pStyle w:val="Ttulo2"/>
       </w:pPr>
-      <w:bookmarkStart w:id="71" w:name="_Toc239058099"/>
+      <w:bookmarkStart w:id="71" w:name="_Toc239097058"/>
       <w:r>
         <w:t>C.1. Uso del prototipo</w:t>
       </w:r>
@@ -22153,11 +22197,8 @@
     </w:p>
     <w:p>
       <w:r>
-        <w:t xml:space="preserve">Un caso habitual consiste en levantar backend y web, cargar un EML o pegar texto. El cliente envía la entrada, el servidor la procesa con la versión central y devuelve señales y riesgo. </w:t>
-      </w:r>
-      <w:r>
         <w:lastRenderedPageBreak/>
-        <w:t>Para separar físicamente ambos lados se publica el backend detrás de HTTPS y se cambia PHISHING_BACKEND_URL; la latencia dependerá entonces también de la red.</w:t>
+        <w:t>Un caso habitual consiste en levantar backend y web, cargar un EML o pegar texto. El cliente envía la entrada, el servidor la procesa con la versión central y devuelve señales y riesgo. Para separar físicamente ambos lados se publica el backend detrás de HTTPS y se cambia PHISHING_BACKEND_URL; la latencia dependerá entonces también de la red.</w:t>
       </w:r>
     </w:p>
     <w:p>
@@ -22167,7 +22208,7 @@
           <w:bCs/>
         </w:rPr>
       </w:pPr>
-      <w:bookmarkStart w:id="72" w:name="_Toc239058100"/>
+      <w:bookmarkStart w:id="72" w:name="_Toc239097059"/>
       <w:r>
         <w:rPr>
           <w:bCs/>
@@ -22186,7 +22227,7 @@
         <w:pStyle w:val="ListadecomprobacinTFG"/>
       </w:pPr>
       <w:r>
-        <w:t>Verificado: 89 pruebas Python y 2 recorridos reales con Chromium, incluido cliente web a backend.</w:t>
+        <w:t>Verificado: 94 pruebas Python y 2 recorridos reales con Chromium, incluido cliente web a backend.</w:t>
       </w:r>
     </w:p>
     <w:p>
@@ -22270,7 +22311,7 @@
       <w:pPr>
         <w:pStyle w:val="Ttulo2"/>
       </w:pPr>
-      <w:bookmarkStart w:id="73" w:name="_Toc239058101"/>
+      <w:bookmarkStart w:id="73" w:name="_Toc239097060"/>
       <w:r>
         <w:t>Anexo E: Resumen de arquitectura y evidencia</w:t>
       </w:r>
@@ -22283,7 +22324,12 @@
     </w:p>
     <w:p>
       <w:r>
-        <w:t>La evidencia reproducible comprende 89 pruebas Python, 2 recorridos con Chromium, integración continua, benchmark, calibración separada de 40 casos, evaluación de 16 EML reservados y diagnóstico de 1.528 textos DIFrauD. Los EML son sintéticos y DIFrauD conserva riesgo de solapamiento; ninguna cifra estima producción.</w:t>
+        <w:t>La evidencia reproducible comprende 94 pruebas Python, 2 recorridos con Chromium, integración continua, benchmark, calibración separada de 40 casos, evaluación de 16 EML reservados y diagnóstico de 1.528 textos DIFrauD. Los EML son sintéticos y DIFrauD conserva riesgo de solapamiento; ninguna cifra estima producción.</w:t>
+      </w:r>
+    </w:p>
+    <w:p>
+      <w:r>
+        <w:t>La persistencia se separa por propietario: runtime/client guarda las credenciales OAuth, el token, el estado del monitor y las preferencias de cada instalación; runtime/server guarda los ajustes centrales y los modelos ES/EN. GET/POST /settings permite administrarlos sin compartir el sistema de archivos del servidor.</w:t>
       </w:r>
     </w:p>
     <w:sectPr>

</xml_diff>

<commit_message>
Documentar concurrencia y actualizar defensa
</commit_message>
<xml_diff>
--- a/TFG.docx
+++ b/TFG.docx
@@ -118,7 +118,7 @@
       <w:pPr>
         <w:pStyle w:val="Ttulo1"/>
       </w:pPr>
-      <w:bookmarkStart w:id="0" w:name="_Toc239096987"/>
+      <w:bookmarkStart w:id="0" w:name="_Toc239113248"/>
       <w:r>
         <w:lastRenderedPageBreak/>
         <w:t>Resumen</w:t>
@@ -140,7 +140,7 @@
       <w:pPr>
         <w:pStyle w:val="Ttulo1"/>
       </w:pPr>
-      <w:bookmarkStart w:id="1" w:name="_Toc239096988"/>
+      <w:bookmarkStart w:id="1" w:name="_Toc239113249"/>
       <w:r>
         <w:lastRenderedPageBreak/>
         <w:t>Abstract</w:t>
@@ -167,7 +167,7 @@
       <w:pPr>
         <w:pStyle w:val="Ttulo1"/>
       </w:pPr>
-      <w:bookmarkStart w:id="2" w:name="_Toc239096989"/>
+      <w:bookmarkStart w:id="2" w:name="_Toc239113250"/>
       <w:r>
         <w:lastRenderedPageBreak/>
         <w:t>Agradecimientos</w:t>
@@ -183,7 +183,7 @@
       <w:pPr>
         <w:pStyle w:val="Ttulo1"/>
       </w:pPr>
-      <w:bookmarkStart w:id="3" w:name="_Toc239096990"/>
+      <w:bookmarkStart w:id="3" w:name="_Toc239113251"/>
       <w:r>
         <w:lastRenderedPageBreak/>
         <w:t>Índice de figuras y tablas</w:t>
@@ -291,7 +291,7 @@
       <w:pPr>
         <w:pStyle w:val="Ttulo1"/>
       </w:pPr>
-      <w:bookmarkStart w:id="4" w:name="_Toc239096991"/>
+      <w:bookmarkStart w:id="4" w:name="_Toc239113252"/>
       <w:r>
         <w:lastRenderedPageBreak/>
         <w:t>Abreviaturas</w:t>
@@ -560,7 +560,7 @@
           <w:r>
             <w:fldChar w:fldCharType="separate"/>
           </w:r>
-          <w:hyperlink w:anchor="_Toc239096987" w:history="1">
+          <w:hyperlink w:anchor="_Toc239113248" w:history="1">
             <w:r>
               <w:rPr>
                 <w:rStyle w:val="Hipervnculo"/>
@@ -587,7 +587,7 @@
                 <w:noProof/>
                 <w:webHidden/>
               </w:rPr>
-              <w:instrText xml:space="preserve"> PAGEREF _Toc239096987 \h </w:instrText>
+              <w:instrText xml:space="preserve"> PAGEREF _Toc239113248 \h </w:instrText>
             </w:r>
             <w:r>
               <w:rPr>
@@ -635,7 +635,7 @@
               <w14:ligatures w14:val="standardContextual"/>
             </w:rPr>
           </w:pPr>
-          <w:hyperlink w:anchor="_Toc239096988" w:history="1">
+          <w:hyperlink w:anchor="_Toc239113249" w:history="1">
             <w:r>
               <w:rPr>
                 <w:rStyle w:val="Hipervnculo"/>
@@ -662,7 +662,7 @@
                 <w:noProof/>
                 <w:webHidden/>
               </w:rPr>
-              <w:instrText xml:space="preserve"> PAGEREF _Toc239096988 \h </w:instrText>
+              <w:instrText xml:space="preserve"> PAGEREF _Toc239113249 \h </w:instrText>
             </w:r>
             <w:r>
               <w:rPr>
@@ -710,7 +710,7 @@
               <w14:ligatures w14:val="standardContextual"/>
             </w:rPr>
           </w:pPr>
-          <w:hyperlink w:anchor="_Toc239096989" w:history="1">
+          <w:hyperlink w:anchor="_Toc239113250" w:history="1">
             <w:r>
               <w:rPr>
                 <w:rStyle w:val="Hipervnculo"/>
@@ -737,7 +737,7 @@
                 <w:noProof/>
                 <w:webHidden/>
               </w:rPr>
-              <w:instrText xml:space="preserve"> PAGEREF _Toc239096989 \h </w:instrText>
+              <w:instrText xml:space="preserve"> PAGEREF _Toc239113250 \h </w:instrText>
             </w:r>
             <w:r>
               <w:rPr>
@@ -785,7 +785,7 @@
               <w14:ligatures w14:val="standardContextual"/>
             </w:rPr>
           </w:pPr>
-          <w:hyperlink w:anchor="_Toc239096990" w:history="1">
+          <w:hyperlink w:anchor="_Toc239113251" w:history="1">
             <w:r>
               <w:rPr>
                 <w:rStyle w:val="Hipervnculo"/>
@@ -812,7 +812,7 @@
                 <w:noProof/>
                 <w:webHidden/>
               </w:rPr>
-              <w:instrText xml:space="preserve"> PAGEREF _Toc239096990 \h </w:instrText>
+              <w:instrText xml:space="preserve"> PAGEREF _Toc239113251 \h </w:instrText>
             </w:r>
             <w:r>
               <w:rPr>
@@ -860,7 +860,7 @@
               <w14:ligatures w14:val="standardContextual"/>
             </w:rPr>
           </w:pPr>
-          <w:hyperlink w:anchor="_Toc239096991" w:history="1">
+          <w:hyperlink w:anchor="_Toc239113252" w:history="1">
             <w:r>
               <w:rPr>
                 <w:rStyle w:val="Hipervnculo"/>
@@ -887,7 +887,7 @@
                 <w:noProof/>
                 <w:webHidden/>
               </w:rPr>
-              <w:instrText xml:space="preserve"> PAGEREF _Toc239096991 \h </w:instrText>
+              <w:instrText xml:space="preserve"> PAGEREF _Toc239113252 \h </w:instrText>
             </w:r>
             <w:r>
               <w:rPr>
@@ -935,7 +935,7 @@
               <w14:ligatures w14:val="standardContextual"/>
             </w:rPr>
           </w:pPr>
-          <w:hyperlink w:anchor="_Toc239096992" w:history="1">
+          <w:hyperlink w:anchor="_Toc239113253" w:history="1">
             <w:r>
               <w:rPr>
                 <w:rStyle w:val="Hipervnculo"/>
@@ -962,7 +962,7 @@
                 <w:noProof/>
                 <w:webHidden/>
               </w:rPr>
-              <w:instrText xml:space="preserve"> PAGEREF _Toc239096992 \h </w:instrText>
+              <w:instrText xml:space="preserve"> PAGEREF _Toc239113253 \h </w:instrText>
             </w:r>
             <w:r>
               <w:rPr>
@@ -1010,7 +1010,7 @@
               <w14:ligatures w14:val="standardContextual"/>
             </w:rPr>
           </w:pPr>
-          <w:hyperlink w:anchor="_Toc239096993" w:history="1">
+          <w:hyperlink w:anchor="_Toc239113254" w:history="1">
             <w:r>
               <w:rPr>
                 <w:rStyle w:val="Hipervnculo"/>
@@ -1037,7 +1037,7 @@
                 <w:noProof/>
                 <w:webHidden/>
               </w:rPr>
-              <w:instrText xml:space="preserve"> PAGEREF _Toc239096993 \h </w:instrText>
+              <w:instrText xml:space="preserve"> PAGEREF _Toc239113254 \h </w:instrText>
             </w:r>
             <w:r>
               <w:rPr>
@@ -1085,7 +1085,7 @@
               <w14:ligatures w14:val="standardContextual"/>
             </w:rPr>
           </w:pPr>
-          <w:hyperlink w:anchor="_Toc239096994" w:history="1">
+          <w:hyperlink w:anchor="_Toc239113255" w:history="1">
             <w:r>
               <w:rPr>
                 <w:rStyle w:val="Hipervnculo"/>
@@ -1112,7 +1112,7 @@
                 <w:noProof/>
                 <w:webHidden/>
               </w:rPr>
-              <w:instrText xml:space="preserve"> PAGEREF _Toc239096994 \h </w:instrText>
+              <w:instrText xml:space="preserve"> PAGEREF _Toc239113255 \h </w:instrText>
             </w:r>
             <w:r>
               <w:rPr>
@@ -1160,7 +1160,7 @@
               <w14:ligatures w14:val="standardContextual"/>
             </w:rPr>
           </w:pPr>
-          <w:hyperlink w:anchor="_Toc239096995" w:history="1">
+          <w:hyperlink w:anchor="_Toc239113256" w:history="1">
             <w:r>
               <w:rPr>
                 <w:rStyle w:val="Hipervnculo"/>
@@ -1187,7 +1187,7 @@
                 <w:noProof/>
                 <w:webHidden/>
               </w:rPr>
-              <w:instrText xml:space="preserve"> PAGEREF _Toc239096995 \h </w:instrText>
+              <w:instrText xml:space="preserve"> PAGEREF _Toc239113256 \h </w:instrText>
             </w:r>
             <w:r>
               <w:rPr>
@@ -1235,7 +1235,7 @@
               <w14:ligatures w14:val="standardContextual"/>
             </w:rPr>
           </w:pPr>
-          <w:hyperlink w:anchor="_Toc239096996" w:history="1">
+          <w:hyperlink w:anchor="_Toc239113257" w:history="1">
             <w:r>
               <w:rPr>
                 <w:rStyle w:val="Hipervnculo"/>
@@ -1262,7 +1262,7 @@
                 <w:noProof/>
                 <w:webHidden/>
               </w:rPr>
-              <w:instrText xml:space="preserve"> PAGEREF _Toc239096996 \h </w:instrText>
+              <w:instrText xml:space="preserve"> PAGEREF _Toc239113257 \h </w:instrText>
             </w:r>
             <w:r>
               <w:rPr>
@@ -1310,7 +1310,7 @@
               <w14:ligatures w14:val="standardContextual"/>
             </w:rPr>
           </w:pPr>
-          <w:hyperlink w:anchor="_Toc239096997" w:history="1">
+          <w:hyperlink w:anchor="_Toc239113258" w:history="1">
             <w:r>
               <w:rPr>
                 <w:rStyle w:val="Hipervnculo"/>
@@ -1337,7 +1337,7 @@
                 <w:noProof/>
                 <w:webHidden/>
               </w:rPr>
-              <w:instrText xml:space="preserve"> PAGEREF _Toc239096997 \h </w:instrText>
+              <w:instrText xml:space="preserve"> PAGEREF _Toc239113258 \h </w:instrText>
             </w:r>
             <w:r>
               <w:rPr>
@@ -1385,7 +1385,7 @@
               <w14:ligatures w14:val="standardContextual"/>
             </w:rPr>
           </w:pPr>
-          <w:hyperlink w:anchor="_Toc239096998" w:history="1">
+          <w:hyperlink w:anchor="_Toc239113259" w:history="1">
             <w:r>
               <w:rPr>
                 <w:rStyle w:val="Hipervnculo"/>
@@ -1412,7 +1412,7 @@
                 <w:noProof/>
                 <w:webHidden/>
               </w:rPr>
-              <w:instrText xml:space="preserve"> PAGEREF _Toc239096998 \h </w:instrText>
+              <w:instrText xml:space="preserve"> PAGEREF _Toc239113259 \h </w:instrText>
             </w:r>
             <w:r>
               <w:rPr>
@@ -1460,7 +1460,7 @@
               <w14:ligatures w14:val="standardContextual"/>
             </w:rPr>
           </w:pPr>
-          <w:hyperlink w:anchor="_Toc239096999" w:history="1">
+          <w:hyperlink w:anchor="_Toc239113260" w:history="1">
             <w:r>
               <w:rPr>
                 <w:rStyle w:val="Hipervnculo"/>
@@ -1487,7 +1487,7 @@
                 <w:noProof/>
                 <w:webHidden/>
               </w:rPr>
-              <w:instrText xml:space="preserve"> PAGEREF _Toc239096999 \h </w:instrText>
+              <w:instrText xml:space="preserve"> PAGEREF _Toc239113260 \h </w:instrText>
             </w:r>
             <w:r>
               <w:rPr>
@@ -1535,7 +1535,7 @@
               <w14:ligatures w14:val="standardContextual"/>
             </w:rPr>
           </w:pPr>
-          <w:hyperlink w:anchor="_Toc239097000" w:history="1">
+          <w:hyperlink w:anchor="_Toc239113261" w:history="1">
             <w:r>
               <w:rPr>
                 <w:rStyle w:val="Hipervnculo"/>
@@ -1562,7 +1562,7 @@
                 <w:noProof/>
                 <w:webHidden/>
               </w:rPr>
-              <w:instrText xml:space="preserve"> PAGEREF _Toc239097000 \h </w:instrText>
+              <w:instrText xml:space="preserve"> PAGEREF _Toc239113261 \h </w:instrText>
             </w:r>
             <w:r>
               <w:rPr>
@@ -1610,7 +1610,7 @@
               <w14:ligatures w14:val="standardContextual"/>
             </w:rPr>
           </w:pPr>
-          <w:hyperlink w:anchor="_Toc239097001" w:history="1">
+          <w:hyperlink w:anchor="_Toc239113262" w:history="1">
             <w:r>
               <w:rPr>
                 <w:rStyle w:val="Hipervnculo"/>
@@ -1637,7 +1637,7 @@
                 <w:noProof/>
                 <w:webHidden/>
               </w:rPr>
-              <w:instrText xml:space="preserve"> PAGEREF _Toc239097001 \h </w:instrText>
+              <w:instrText xml:space="preserve"> PAGEREF _Toc239113262 \h </w:instrText>
             </w:r>
             <w:r>
               <w:rPr>
@@ -1685,7 +1685,7 @@
               <w14:ligatures w14:val="standardContextual"/>
             </w:rPr>
           </w:pPr>
-          <w:hyperlink w:anchor="_Toc239097002" w:history="1">
+          <w:hyperlink w:anchor="_Toc239113263" w:history="1">
             <w:r>
               <w:rPr>
                 <w:rStyle w:val="Hipervnculo"/>
@@ -1712,7 +1712,7 @@
                 <w:noProof/>
                 <w:webHidden/>
               </w:rPr>
-              <w:instrText xml:space="preserve"> PAGEREF _Toc239097002 \h </w:instrText>
+              <w:instrText xml:space="preserve"> PAGEREF _Toc239113263 \h </w:instrText>
             </w:r>
             <w:r>
               <w:rPr>
@@ -1760,7 +1760,7 @@
               <w14:ligatures w14:val="standardContextual"/>
             </w:rPr>
           </w:pPr>
-          <w:hyperlink w:anchor="_Toc239097003" w:history="1">
+          <w:hyperlink w:anchor="_Toc239113264" w:history="1">
             <w:r>
               <w:rPr>
                 <w:rStyle w:val="Hipervnculo"/>
@@ -1787,7 +1787,7 @@
                 <w:noProof/>
                 <w:webHidden/>
               </w:rPr>
-              <w:instrText xml:space="preserve"> PAGEREF _Toc239097003 \h </w:instrText>
+              <w:instrText xml:space="preserve"> PAGEREF _Toc239113264 \h </w:instrText>
             </w:r>
             <w:r>
               <w:rPr>
@@ -1835,7 +1835,7 @@
               <w14:ligatures w14:val="standardContextual"/>
             </w:rPr>
           </w:pPr>
-          <w:hyperlink w:anchor="_Toc239097004" w:history="1">
+          <w:hyperlink w:anchor="_Toc239113265" w:history="1">
             <w:r>
               <w:rPr>
                 <w:rStyle w:val="Hipervnculo"/>
@@ -1862,7 +1862,7 @@
                 <w:noProof/>
                 <w:webHidden/>
               </w:rPr>
-              <w:instrText xml:space="preserve"> PAGEREF _Toc239097004 \h </w:instrText>
+              <w:instrText xml:space="preserve"> PAGEREF _Toc239113265 \h </w:instrText>
             </w:r>
             <w:r>
               <w:rPr>
@@ -1910,7 +1910,7 @@
               <w14:ligatures w14:val="standardContextual"/>
             </w:rPr>
           </w:pPr>
-          <w:hyperlink w:anchor="_Toc239097005" w:history="1">
+          <w:hyperlink w:anchor="_Toc239113266" w:history="1">
             <w:r>
               <w:rPr>
                 <w:rStyle w:val="Hipervnculo"/>
@@ -1937,7 +1937,7 @@
                 <w:noProof/>
                 <w:webHidden/>
               </w:rPr>
-              <w:instrText xml:space="preserve"> PAGEREF _Toc239097005 \h </w:instrText>
+              <w:instrText xml:space="preserve"> PAGEREF _Toc239113266 \h </w:instrText>
             </w:r>
             <w:r>
               <w:rPr>
@@ -1985,7 +1985,7 @@
               <w14:ligatures w14:val="standardContextual"/>
             </w:rPr>
           </w:pPr>
-          <w:hyperlink w:anchor="_Toc239097006" w:history="1">
+          <w:hyperlink w:anchor="_Toc239113267" w:history="1">
             <w:r>
               <w:rPr>
                 <w:rStyle w:val="Hipervnculo"/>
@@ -2012,7 +2012,7 @@
                 <w:noProof/>
                 <w:webHidden/>
               </w:rPr>
-              <w:instrText xml:space="preserve"> PAGEREF _Toc239097006 \h </w:instrText>
+              <w:instrText xml:space="preserve"> PAGEREF _Toc239113267 \h </w:instrText>
             </w:r>
             <w:r>
               <w:rPr>
@@ -2060,7 +2060,7 @@
               <w14:ligatures w14:val="standardContextual"/>
             </w:rPr>
           </w:pPr>
-          <w:hyperlink w:anchor="_Toc239097007" w:history="1">
+          <w:hyperlink w:anchor="_Toc239113268" w:history="1">
             <w:r>
               <w:rPr>
                 <w:rStyle w:val="Hipervnculo"/>
@@ -2087,7 +2087,7 @@
                 <w:noProof/>
                 <w:webHidden/>
               </w:rPr>
-              <w:instrText xml:space="preserve"> PAGEREF _Toc239097007 \h </w:instrText>
+              <w:instrText xml:space="preserve"> PAGEREF _Toc239113268 \h </w:instrText>
             </w:r>
             <w:r>
               <w:rPr>
@@ -2135,7 +2135,7 @@
               <w14:ligatures w14:val="standardContextual"/>
             </w:rPr>
           </w:pPr>
-          <w:hyperlink w:anchor="_Toc239097008" w:history="1">
+          <w:hyperlink w:anchor="_Toc239113269" w:history="1">
             <w:r>
               <w:rPr>
                 <w:rStyle w:val="Hipervnculo"/>
@@ -2162,7 +2162,7 @@
                 <w:noProof/>
                 <w:webHidden/>
               </w:rPr>
-              <w:instrText xml:space="preserve"> PAGEREF _Toc239097008 \h </w:instrText>
+              <w:instrText xml:space="preserve"> PAGEREF _Toc239113269 \h </w:instrText>
             </w:r>
             <w:r>
               <w:rPr>
@@ -2210,7 +2210,7 @@
               <w14:ligatures w14:val="standardContextual"/>
             </w:rPr>
           </w:pPr>
-          <w:hyperlink w:anchor="_Toc239097009" w:history="1">
+          <w:hyperlink w:anchor="_Toc239113270" w:history="1">
             <w:r>
               <w:rPr>
                 <w:rStyle w:val="Hipervnculo"/>
@@ -2237,7 +2237,7 @@
                 <w:noProof/>
                 <w:webHidden/>
               </w:rPr>
-              <w:instrText xml:space="preserve"> PAGEREF _Toc239097009 \h </w:instrText>
+              <w:instrText xml:space="preserve"> PAGEREF _Toc239113270 \h </w:instrText>
             </w:r>
             <w:r>
               <w:rPr>
@@ -2285,7 +2285,7 @@
               <w14:ligatures w14:val="standardContextual"/>
             </w:rPr>
           </w:pPr>
-          <w:hyperlink w:anchor="_Toc239097010" w:history="1">
+          <w:hyperlink w:anchor="_Toc239113271" w:history="1">
             <w:r>
               <w:rPr>
                 <w:rStyle w:val="Hipervnculo"/>
@@ -2312,7 +2312,7 @@
                 <w:noProof/>
                 <w:webHidden/>
               </w:rPr>
-              <w:instrText xml:space="preserve"> PAGEREF _Toc239097010 \h </w:instrText>
+              <w:instrText xml:space="preserve"> PAGEREF _Toc239113271 \h </w:instrText>
             </w:r>
             <w:r>
               <w:rPr>
@@ -2360,7 +2360,7 @@
               <w14:ligatures w14:val="standardContextual"/>
             </w:rPr>
           </w:pPr>
-          <w:hyperlink w:anchor="_Toc239097011" w:history="1">
+          <w:hyperlink w:anchor="_Toc239113272" w:history="1">
             <w:r>
               <w:rPr>
                 <w:rStyle w:val="Hipervnculo"/>
@@ -2387,7 +2387,7 @@
                 <w:noProof/>
                 <w:webHidden/>
               </w:rPr>
-              <w:instrText xml:space="preserve"> PAGEREF _Toc239097011 \h </w:instrText>
+              <w:instrText xml:space="preserve"> PAGEREF _Toc239113272 \h </w:instrText>
             </w:r>
             <w:r>
               <w:rPr>
@@ -2435,7 +2435,7 @@
               <w14:ligatures w14:val="standardContextual"/>
             </w:rPr>
           </w:pPr>
-          <w:hyperlink w:anchor="_Toc239097012" w:history="1">
+          <w:hyperlink w:anchor="_Toc239113273" w:history="1">
             <w:r>
               <w:rPr>
                 <w:rStyle w:val="Hipervnculo"/>
@@ -2462,7 +2462,7 @@
                 <w:noProof/>
                 <w:webHidden/>
               </w:rPr>
-              <w:instrText xml:space="preserve"> PAGEREF _Toc239097012 \h </w:instrText>
+              <w:instrText xml:space="preserve"> PAGEREF _Toc239113273 \h </w:instrText>
             </w:r>
             <w:r>
               <w:rPr>
@@ -2510,7 +2510,7 @@
               <w14:ligatures w14:val="standardContextual"/>
             </w:rPr>
           </w:pPr>
-          <w:hyperlink w:anchor="_Toc239097013" w:history="1">
+          <w:hyperlink w:anchor="_Toc239113274" w:history="1">
             <w:r>
               <w:rPr>
                 <w:rStyle w:val="Hipervnculo"/>
@@ -2537,7 +2537,7 @@
                 <w:noProof/>
                 <w:webHidden/>
               </w:rPr>
-              <w:instrText xml:space="preserve"> PAGEREF _Toc239097013 \h </w:instrText>
+              <w:instrText xml:space="preserve"> PAGEREF _Toc239113274 \h </w:instrText>
             </w:r>
             <w:r>
               <w:rPr>
@@ -2585,7 +2585,7 @@
               <w14:ligatures w14:val="standardContextual"/>
             </w:rPr>
           </w:pPr>
-          <w:hyperlink w:anchor="_Toc239097014" w:history="1">
+          <w:hyperlink w:anchor="_Toc239113275" w:history="1">
             <w:r>
               <w:rPr>
                 <w:rStyle w:val="Hipervnculo"/>
@@ -2612,7 +2612,7 @@
                 <w:noProof/>
                 <w:webHidden/>
               </w:rPr>
-              <w:instrText xml:space="preserve"> PAGEREF _Toc239097014 \h </w:instrText>
+              <w:instrText xml:space="preserve"> PAGEREF _Toc239113275 \h </w:instrText>
             </w:r>
             <w:r>
               <w:rPr>
@@ -2660,7 +2660,7 @@
               <w14:ligatures w14:val="standardContextual"/>
             </w:rPr>
           </w:pPr>
-          <w:hyperlink w:anchor="_Toc239097015" w:history="1">
+          <w:hyperlink w:anchor="_Toc239113276" w:history="1">
             <w:r>
               <w:rPr>
                 <w:rStyle w:val="Hipervnculo"/>
@@ -2687,7 +2687,7 @@
                 <w:noProof/>
                 <w:webHidden/>
               </w:rPr>
-              <w:instrText xml:space="preserve"> PAGEREF _Toc239097015 \h </w:instrText>
+              <w:instrText xml:space="preserve"> PAGEREF _Toc239113276 \h </w:instrText>
             </w:r>
             <w:r>
               <w:rPr>
@@ -2735,7 +2735,7 @@
               <w14:ligatures w14:val="standardContextual"/>
             </w:rPr>
           </w:pPr>
-          <w:hyperlink w:anchor="_Toc239097016" w:history="1">
+          <w:hyperlink w:anchor="_Toc239113277" w:history="1">
             <w:r>
               <w:rPr>
                 <w:rStyle w:val="Hipervnculo"/>
@@ -2762,7 +2762,7 @@
                 <w:noProof/>
                 <w:webHidden/>
               </w:rPr>
-              <w:instrText xml:space="preserve"> PAGEREF _Toc239097016 \h </w:instrText>
+              <w:instrText xml:space="preserve"> PAGEREF _Toc239113277 \h </w:instrText>
             </w:r>
             <w:r>
               <w:rPr>
@@ -2810,7 +2810,7 @@
               <w14:ligatures w14:val="standardContextual"/>
             </w:rPr>
           </w:pPr>
-          <w:hyperlink w:anchor="_Toc239097017" w:history="1">
+          <w:hyperlink w:anchor="_Toc239113278" w:history="1">
             <w:r>
               <w:rPr>
                 <w:rStyle w:val="Hipervnculo"/>
@@ -2837,7 +2837,7 @@
                 <w:noProof/>
                 <w:webHidden/>
               </w:rPr>
-              <w:instrText xml:space="preserve"> PAGEREF _Toc239097017 \h </w:instrText>
+              <w:instrText xml:space="preserve"> PAGEREF _Toc239113278 \h </w:instrText>
             </w:r>
             <w:r>
               <w:rPr>
@@ -2885,7 +2885,7 @@
               <w14:ligatures w14:val="standardContextual"/>
             </w:rPr>
           </w:pPr>
-          <w:hyperlink w:anchor="_Toc239097018" w:history="1">
+          <w:hyperlink w:anchor="_Toc239113279" w:history="1">
             <w:r>
               <w:rPr>
                 <w:rStyle w:val="Hipervnculo"/>
@@ -2912,7 +2912,7 @@
                 <w:noProof/>
                 <w:webHidden/>
               </w:rPr>
-              <w:instrText xml:space="preserve"> PAGEREF _Toc239097018 \h </w:instrText>
+              <w:instrText xml:space="preserve"> PAGEREF _Toc239113279 \h </w:instrText>
             </w:r>
             <w:r>
               <w:rPr>
@@ -2960,7 +2960,7 @@
               <w14:ligatures w14:val="standardContextual"/>
             </w:rPr>
           </w:pPr>
-          <w:hyperlink w:anchor="_Toc239097019" w:history="1">
+          <w:hyperlink w:anchor="_Toc239113280" w:history="1">
             <w:r>
               <w:rPr>
                 <w:rStyle w:val="Hipervnculo"/>
@@ -2987,7 +2987,7 @@
                 <w:noProof/>
                 <w:webHidden/>
               </w:rPr>
-              <w:instrText xml:space="preserve"> PAGEREF _Toc239097019 \h </w:instrText>
+              <w:instrText xml:space="preserve"> PAGEREF _Toc239113280 \h </w:instrText>
             </w:r>
             <w:r>
               <w:rPr>
@@ -3035,7 +3035,7 @@
               <w14:ligatures w14:val="standardContextual"/>
             </w:rPr>
           </w:pPr>
-          <w:hyperlink w:anchor="_Toc239097020" w:history="1">
+          <w:hyperlink w:anchor="_Toc239113281" w:history="1">
             <w:r>
               <w:rPr>
                 <w:rStyle w:val="Hipervnculo"/>
@@ -3062,7 +3062,7 @@
                 <w:noProof/>
                 <w:webHidden/>
               </w:rPr>
-              <w:instrText xml:space="preserve"> PAGEREF _Toc239097020 \h </w:instrText>
+              <w:instrText xml:space="preserve"> PAGEREF _Toc239113281 \h </w:instrText>
             </w:r>
             <w:r>
               <w:rPr>
@@ -3110,7 +3110,7 @@
               <w14:ligatures w14:val="standardContextual"/>
             </w:rPr>
           </w:pPr>
-          <w:hyperlink w:anchor="_Toc239097021" w:history="1">
+          <w:hyperlink w:anchor="_Toc239113282" w:history="1">
             <w:r>
               <w:rPr>
                 <w:rStyle w:val="Hipervnculo"/>
@@ -3137,7 +3137,7 @@
                 <w:noProof/>
                 <w:webHidden/>
               </w:rPr>
-              <w:instrText xml:space="preserve"> PAGEREF _Toc239097021 \h </w:instrText>
+              <w:instrText xml:space="preserve"> PAGEREF _Toc239113282 \h </w:instrText>
             </w:r>
             <w:r>
               <w:rPr>
@@ -3185,7 +3185,7 @@
               <w14:ligatures w14:val="standardContextual"/>
             </w:rPr>
           </w:pPr>
-          <w:hyperlink w:anchor="_Toc239097022" w:history="1">
+          <w:hyperlink w:anchor="_Toc239113283" w:history="1">
             <w:r>
               <w:rPr>
                 <w:rStyle w:val="Hipervnculo"/>
@@ -3213,7 +3213,7 @@
                 <w:noProof/>
                 <w:webHidden/>
               </w:rPr>
-              <w:instrText xml:space="preserve"> PAGEREF _Toc239097022 \h </w:instrText>
+              <w:instrText xml:space="preserve"> PAGEREF _Toc239113283 \h </w:instrText>
             </w:r>
             <w:r>
               <w:rPr>
@@ -3261,7 +3261,7 @@
               <w14:ligatures w14:val="standardContextual"/>
             </w:rPr>
           </w:pPr>
-          <w:hyperlink w:anchor="_Toc239097023" w:history="1">
+          <w:hyperlink w:anchor="_Toc239113284" w:history="1">
             <w:r>
               <w:rPr>
                 <w:rStyle w:val="Hipervnculo"/>
@@ -3289,7 +3289,7 @@
                 <w:noProof/>
                 <w:webHidden/>
               </w:rPr>
-              <w:instrText xml:space="preserve"> PAGEREF _Toc239097023 \h </w:instrText>
+              <w:instrText xml:space="preserve"> PAGEREF _Toc239113284 \h </w:instrText>
             </w:r>
             <w:r>
               <w:rPr>
@@ -3337,7 +3337,7 @@
               <w14:ligatures w14:val="standardContextual"/>
             </w:rPr>
           </w:pPr>
-          <w:hyperlink w:anchor="_Toc239097024" w:history="1">
+          <w:hyperlink w:anchor="_Toc239113285" w:history="1">
             <w:r>
               <w:rPr>
                 <w:rStyle w:val="Hipervnculo"/>
@@ -3365,7 +3365,7 @@
                 <w:noProof/>
                 <w:webHidden/>
               </w:rPr>
-              <w:instrText xml:space="preserve"> PAGEREF _Toc239097024 \h </w:instrText>
+              <w:instrText xml:space="preserve"> PAGEREF _Toc239113285 \h </w:instrText>
             </w:r>
             <w:r>
               <w:rPr>
@@ -3413,7 +3413,7 @@
               <w14:ligatures w14:val="standardContextual"/>
             </w:rPr>
           </w:pPr>
-          <w:hyperlink w:anchor="_Toc239097025" w:history="1">
+          <w:hyperlink w:anchor="_Toc239113286" w:history="1">
             <w:r>
               <w:rPr>
                 <w:rStyle w:val="Hipervnculo"/>
@@ -3441,7 +3441,7 @@
                 <w:noProof/>
                 <w:webHidden/>
               </w:rPr>
-              <w:instrText xml:space="preserve"> PAGEREF _Toc239097025 \h </w:instrText>
+              <w:instrText xml:space="preserve"> PAGEREF _Toc239113286 \h </w:instrText>
             </w:r>
             <w:r>
               <w:rPr>
@@ -3489,7 +3489,7 @@
               <w14:ligatures w14:val="standardContextual"/>
             </w:rPr>
           </w:pPr>
-          <w:hyperlink w:anchor="_Toc239097026" w:history="1">
+          <w:hyperlink w:anchor="_Toc239113287" w:history="1">
             <w:r>
               <w:rPr>
                 <w:rStyle w:val="Hipervnculo"/>
@@ -3517,7 +3517,7 @@
                 <w:noProof/>
                 <w:webHidden/>
               </w:rPr>
-              <w:instrText xml:space="preserve"> PAGEREF _Toc239097026 \h </w:instrText>
+              <w:instrText xml:space="preserve"> PAGEREF _Toc239113287 \h </w:instrText>
             </w:r>
             <w:r>
               <w:rPr>
@@ -3565,7 +3565,7 @@
               <w14:ligatures w14:val="standardContextual"/>
             </w:rPr>
           </w:pPr>
-          <w:hyperlink w:anchor="_Toc239097027" w:history="1">
+          <w:hyperlink w:anchor="_Toc239113288" w:history="1">
             <w:r>
               <w:rPr>
                 <w:rStyle w:val="Hipervnculo"/>
@@ -3592,7 +3592,7 @@
                 <w:noProof/>
                 <w:webHidden/>
               </w:rPr>
-              <w:instrText xml:space="preserve"> PAGEREF _Toc239097027 \h </w:instrText>
+              <w:instrText xml:space="preserve"> PAGEREF _Toc239113288 \h </w:instrText>
             </w:r>
             <w:r>
               <w:rPr>
@@ -3640,7 +3640,7 @@
               <w14:ligatures w14:val="standardContextual"/>
             </w:rPr>
           </w:pPr>
-          <w:hyperlink w:anchor="_Toc239097028" w:history="1">
+          <w:hyperlink w:anchor="_Toc239113289" w:history="1">
             <w:r>
               <w:rPr>
                 <w:rStyle w:val="Hipervnculo"/>
@@ -3667,7 +3667,7 @@
                 <w:noProof/>
                 <w:webHidden/>
               </w:rPr>
-              <w:instrText xml:space="preserve"> PAGEREF _Toc239097028 \h </w:instrText>
+              <w:instrText xml:space="preserve"> PAGEREF _Toc239113289 \h </w:instrText>
             </w:r>
             <w:r>
               <w:rPr>
@@ -3715,7 +3715,7 @@
               <w14:ligatures w14:val="standardContextual"/>
             </w:rPr>
           </w:pPr>
-          <w:hyperlink w:anchor="_Toc239097029" w:history="1">
+          <w:hyperlink w:anchor="_Toc239113290" w:history="1">
             <w:r>
               <w:rPr>
                 <w:rStyle w:val="Hipervnculo"/>
@@ -3742,7 +3742,7 @@
                 <w:noProof/>
                 <w:webHidden/>
               </w:rPr>
-              <w:instrText xml:space="preserve"> PAGEREF _Toc239097029 \h </w:instrText>
+              <w:instrText xml:space="preserve"> PAGEREF _Toc239113290 \h </w:instrText>
             </w:r>
             <w:r>
               <w:rPr>
@@ -3790,7 +3790,7 @@
               <w14:ligatures w14:val="standardContextual"/>
             </w:rPr>
           </w:pPr>
-          <w:hyperlink w:anchor="_Toc239097030" w:history="1">
+          <w:hyperlink w:anchor="_Toc239113291" w:history="1">
             <w:r>
               <w:rPr>
                 <w:rStyle w:val="Hipervnculo"/>
@@ -3817,7 +3817,7 @@
                 <w:noProof/>
                 <w:webHidden/>
               </w:rPr>
-              <w:instrText xml:space="preserve"> PAGEREF _Toc239097030 \h </w:instrText>
+              <w:instrText xml:space="preserve"> PAGEREF _Toc239113291 \h </w:instrText>
             </w:r>
             <w:r>
               <w:rPr>
@@ -3865,7 +3865,7 @@
               <w14:ligatures w14:val="standardContextual"/>
             </w:rPr>
           </w:pPr>
-          <w:hyperlink w:anchor="_Toc239097031" w:history="1">
+          <w:hyperlink w:anchor="_Toc239113292" w:history="1">
             <w:r>
               <w:rPr>
                 <w:rStyle w:val="Hipervnculo"/>
@@ -3892,7 +3892,7 @@
                 <w:noProof/>
                 <w:webHidden/>
               </w:rPr>
-              <w:instrText xml:space="preserve"> PAGEREF _Toc239097031 \h </w:instrText>
+              <w:instrText xml:space="preserve"> PAGEREF _Toc239113292 \h </w:instrText>
             </w:r>
             <w:r>
               <w:rPr>
@@ -3940,7 +3940,7 @@
               <w14:ligatures w14:val="standardContextual"/>
             </w:rPr>
           </w:pPr>
-          <w:hyperlink w:anchor="_Toc239097032" w:history="1">
+          <w:hyperlink w:anchor="_Toc239113293" w:history="1">
             <w:r>
               <w:rPr>
                 <w:rStyle w:val="Hipervnculo"/>
@@ -3967,7 +3967,7 @@
                 <w:noProof/>
                 <w:webHidden/>
               </w:rPr>
-              <w:instrText xml:space="preserve"> PAGEREF _Toc239097032 \h </w:instrText>
+              <w:instrText xml:space="preserve"> PAGEREF _Toc239113293 \h </w:instrText>
             </w:r>
             <w:r>
               <w:rPr>
@@ -4015,7 +4015,7 @@
               <w14:ligatures w14:val="standardContextual"/>
             </w:rPr>
           </w:pPr>
-          <w:hyperlink w:anchor="_Toc239097033" w:history="1">
+          <w:hyperlink w:anchor="_Toc239113294" w:history="1">
             <w:r>
               <w:rPr>
                 <w:rStyle w:val="Hipervnculo"/>
@@ -4042,7 +4042,7 @@
                 <w:noProof/>
                 <w:webHidden/>
               </w:rPr>
-              <w:instrText xml:space="preserve"> PAGEREF _Toc239097033 \h </w:instrText>
+              <w:instrText xml:space="preserve"> PAGEREF _Toc239113294 \h </w:instrText>
             </w:r>
             <w:r>
               <w:rPr>
@@ -4090,7 +4090,7 @@
               <w14:ligatures w14:val="standardContextual"/>
             </w:rPr>
           </w:pPr>
-          <w:hyperlink w:anchor="_Toc239097034" w:history="1">
+          <w:hyperlink w:anchor="_Toc239113295" w:history="1">
             <w:r>
               <w:rPr>
                 <w:rStyle w:val="Hipervnculo"/>
@@ -4117,7 +4117,7 @@
                 <w:noProof/>
                 <w:webHidden/>
               </w:rPr>
-              <w:instrText xml:space="preserve"> PAGEREF _Toc239097034 \h </w:instrText>
+              <w:instrText xml:space="preserve"> PAGEREF _Toc239113295 \h </w:instrText>
             </w:r>
             <w:r>
               <w:rPr>
@@ -4165,7 +4165,7 @@
               <w14:ligatures w14:val="standardContextual"/>
             </w:rPr>
           </w:pPr>
-          <w:hyperlink w:anchor="_Toc239097035" w:history="1">
+          <w:hyperlink w:anchor="_Toc239113296" w:history="1">
             <w:r>
               <w:rPr>
                 <w:rStyle w:val="Hipervnculo"/>
@@ -4192,7 +4192,7 @@
                 <w:noProof/>
                 <w:webHidden/>
               </w:rPr>
-              <w:instrText xml:space="preserve"> PAGEREF _Toc239097035 \h </w:instrText>
+              <w:instrText xml:space="preserve"> PAGEREF _Toc239113296 \h </w:instrText>
             </w:r>
             <w:r>
               <w:rPr>
@@ -4240,7 +4240,7 @@
               <w14:ligatures w14:val="standardContextual"/>
             </w:rPr>
           </w:pPr>
-          <w:hyperlink w:anchor="_Toc239097036" w:history="1">
+          <w:hyperlink w:anchor="_Toc239113297" w:history="1">
             <w:r>
               <w:rPr>
                 <w:rStyle w:val="Hipervnculo"/>
@@ -4267,7 +4267,7 @@
                 <w:noProof/>
                 <w:webHidden/>
               </w:rPr>
-              <w:instrText xml:space="preserve"> PAGEREF _Toc239097036 \h </w:instrText>
+              <w:instrText xml:space="preserve"> PAGEREF _Toc239113297 \h </w:instrText>
             </w:r>
             <w:r>
               <w:rPr>
@@ -4315,7 +4315,7 @@
               <w14:ligatures w14:val="standardContextual"/>
             </w:rPr>
           </w:pPr>
-          <w:hyperlink w:anchor="_Toc239097037" w:history="1">
+          <w:hyperlink w:anchor="_Toc239113298" w:history="1">
             <w:r>
               <w:rPr>
                 <w:rStyle w:val="Hipervnculo"/>
@@ -4342,7 +4342,7 @@
                 <w:noProof/>
                 <w:webHidden/>
               </w:rPr>
-              <w:instrText xml:space="preserve"> PAGEREF _Toc239097037 \h </w:instrText>
+              <w:instrText xml:space="preserve"> PAGEREF _Toc239113298 \h </w:instrText>
             </w:r>
             <w:r>
               <w:rPr>
@@ -4390,7 +4390,7 @@
               <w14:ligatures w14:val="standardContextual"/>
             </w:rPr>
           </w:pPr>
-          <w:hyperlink w:anchor="_Toc239097038" w:history="1">
+          <w:hyperlink w:anchor="_Toc239113299" w:history="1">
             <w:r>
               <w:rPr>
                 <w:rStyle w:val="Hipervnculo"/>
@@ -4417,7 +4417,7 @@
                 <w:noProof/>
                 <w:webHidden/>
               </w:rPr>
-              <w:instrText xml:space="preserve"> PAGEREF _Toc239097038 \h </w:instrText>
+              <w:instrText xml:space="preserve"> PAGEREF _Toc239113299 \h </w:instrText>
             </w:r>
             <w:r>
               <w:rPr>
@@ -4465,7 +4465,7 @@
               <w14:ligatures w14:val="standardContextual"/>
             </w:rPr>
           </w:pPr>
-          <w:hyperlink w:anchor="_Toc239097039" w:history="1">
+          <w:hyperlink w:anchor="_Toc239113300" w:history="1">
             <w:r>
               <w:rPr>
                 <w:rStyle w:val="Hipervnculo"/>
@@ -4492,7 +4492,7 @@
                 <w:noProof/>
                 <w:webHidden/>
               </w:rPr>
-              <w:instrText xml:space="preserve"> PAGEREF _Toc239097039 \h </w:instrText>
+              <w:instrText xml:space="preserve"> PAGEREF _Toc239113300 \h </w:instrText>
             </w:r>
             <w:r>
               <w:rPr>
@@ -4540,7 +4540,7 @@
               <w14:ligatures w14:val="standardContextual"/>
             </w:rPr>
           </w:pPr>
-          <w:hyperlink w:anchor="_Toc239097040" w:history="1">
+          <w:hyperlink w:anchor="_Toc239113301" w:history="1">
             <w:r>
               <w:rPr>
                 <w:rStyle w:val="Hipervnculo"/>
@@ -4567,7 +4567,7 @@
                 <w:noProof/>
                 <w:webHidden/>
               </w:rPr>
-              <w:instrText xml:space="preserve"> PAGEREF _Toc239097040 \h </w:instrText>
+              <w:instrText xml:space="preserve"> PAGEREF _Toc239113301 \h </w:instrText>
             </w:r>
             <w:r>
               <w:rPr>
@@ -4615,7 +4615,7 @@
               <w14:ligatures w14:val="standardContextual"/>
             </w:rPr>
           </w:pPr>
-          <w:hyperlink w:anchor="_Toc239097041" w:history="1">
+          <w:hyperlink w:anchor="_Toc239113302" w:history="1">
             <w:r>
               <w:rPr>
                 <w:rStyle w:val="Hipervnculo"/>
@@ -4642,7 +4642,7 @@
                 <w:noProof/>
                 <w:webHidden/>
               </w:rPr>
-              <w:instrText xml:space="preserve"> PAGEREF _Toc239097041 \h </w:instrText>
+              <w:instrText xml:space="preserve"> PAGEREF _Toc239113302 \h </w:instrText>
             </w:r>
             <w:r>
               <w:rPr>
@@ -4690,7 +4690,7 @@
               <w14:ligatures w14:val="standardContextual"/>
             </w:rPr>
           </w:pPr>
-          <w:hyperlink w:anchor="_Toc239097042" w:history="1">
+          <w:hyperlink w:anchor="_Toc239113303" w:history="1">
             <w:r>
               <w:rPr>
                 <w:rStyle w:val="Hipervnculo"/>
@@ -4717,7 +4717,7 @@
                 <w:noProof/>
                 <w:webHidden/>
               </w:rPr>
-              <w:instrText xml:space="preserve"> PAGEREF _Toc239097042 \h </w:instrText>
+              <w:instrText xml:space="preserve"> PAGEREF _Toc239113303 \h </w:instrText>
             </w:r>
             <w:r>
               <w:rPr>
@@ -4765,7 +4765,7 @@
               <w14:ligatures w14:val="standardContextual"/>
             </w:rPr>
           </w:pPr>
-          <w:hyperlink w:anchor="_Toc239097043" w:history="1">
+          <w:hyperlink w:anchor="_Toc239113304" w:history="1">
             <w:r>
               <w:rPr>
                 <w:rStyle w:val="Hipervnculo"/>
@@ -4792,7 +4792,7 @@
                 <w:noProof/>
                 <w:webHidden/>
               </w:rPr>
-              <w:instrText xml:space="preserve"> PAGEREF _Toc239097043 \h </w:instrText>
+              <w:instrText xml:space="preserve"> PAGEREF _Toc239113304 \h </w:instrText>
             </w:r>
             <w:r>
               <w:rPr>
@@ -4840,7 +4840,7 @@
               <w14:ligatures w14:val="standardContextual"/>
             </w:rPr>
           </w:pPr>
-          <w:hyperlink w:anchor="_Toc239097044" w:history="1">
+          <w:hyperlink w:anchor="_Toc239113305" w:history="1">
             <w:r>
               <w:rPr>
                 <w:rStyle w:val="Hipervnculo"/>
@@ -4867,7 +4867,7 @@
                 <w:noProof/>
                 <w:webHidden/>
               </w:rPr>
-              <w:instrText xml:space="preserve"> PAGEREF _Toc239097044 \h </w:instrText>
+              <w:instrText xml:space="preserve"> PAGEREF _Toc239113305 \h </w:instrText>
             </w:r>
             <w:r>
               <w:rPr>
@@ -4915,7 +4915,7 @@
               <w14:ligatures w14:val="standardContextual"/>
             </w:rPr>
           </w:pPr>
-          <w:hyperlink w:anchor="_Toc239097045" w:history="1">
+          <w:hyperlink w:anchor="_Toc239113306" w:history="1">
             <w:r>
               <w:rPr>
                 <w:rStyle w:val="Hipervnculo"/>
@@ -4942,7 +4942,7 @@
                 <w:noProof/>
                 <w:webHidden/>
               </w:rPr>
-              <w:instrText xml:space="preserve"> PAGEREF _Toc239097045 \h </w:instrText>
+              <w:instrText xml:space="preserve"> PAGEREF _Toc239113306 \h </w:instrText>
             </w:r>
             <w:r>
               <w:rPr>
@@ -4990,7 +4990,7 @@
               <w14:ligatures w14:val="standardContextual"/>
             </w:rPr>
           </w:pPr>
-          <w:hyperlink w:anchor="_Toc239097046" w:history="1">
+          <w:hyperlink w:anchor="_Toc239113307" w:history="1">
             <w:r>
               <w:rPr>
                 <w:rStyle w:val="Hipervnculo"/>
@@ -5017,7 +5017,7 @@
                 <w:noProof/>
                 <w:webHidden/>
               </w:rPr>
-              <w:instrText xml:space="preserve"> PAGEREF _Toc239097046 \h </w:instrText>
+              <w:instrText xml:space="preserve"> PAGEREF _Toc239113307 \h </w:instrText>
             </w:r>
             <w:r>
               <w:rPr>
@@ -5065,7 +5065,7 @@
               <w14:ligatures w14:val="standardContextual"/>
             </w:rPr>
           </w:pPr>
-          <w:hyperlink w:anchor="_Toc239097047" w:history="1">
+          <w:hyperlink w:anchor="_Toc239113308" w:history="1">
             <w:r>
               <w:rPr>
                 <w:rStyle w:val="Hipervnculo"/>
@@ -5092,7 +5092,7 @@
                 <w:noProof/>
                 <w:webHidden/>
               </w:rPr>
-              <w:instrText xml:space="preserve"> PAGEREF _Toc239097047 \h </w:instrText>
+              <w:instrText xml:space="preserve"> PAGEREF _Toc239113308 \h </w:instrText>
             </w:r>
             <w:r>
               <w:rPr>
@@ -5140,7 +5140,7 @@
               <w14:ligatures w14:val="standardContextual"/>
             </w:rPr>
           </w:pPr>
-          <w:hyperlink w:anchor="_Toc239097048" w:history="1">
+          <w:hyperlink w:anchor="_Toc239113309" w:history="1">
             <w:r>
               <w:rPr>
                 <w:rStyle w:val="Hipervnculo"/>
@@ -5167,7 +5167,7 @@
                 <w:noProof/>
                 <w:webHidden/>
               </w:rPr>
-              <w:instrText xml:space="preserve"> PAGEREF _Toc239097048 \h </w:instrText>
+              <w:instrText xml:space="preserve"> PAGEREF _Toc239113309 \h </w:instrText>
             </w:r>
             <w:r>
               <w:rPr>
@@ -5215,7 +5215,7 @@
               <w14:ligatures w14:val="standardContextual"/>
             </w:rPr>
           </w:pPr>
-          <w:hyperlink w:anchor="_Toc239097049" w:history="1">
+          <w:hyperlink w:anchor="_Toc239113310" w:history="1">
             <w:r>
               <w:rPr>
                 <w:rStyle w:val="Hipervnculo"/>
@@ -5242,7 +5242,7 @@
                 <w:noProof/>
                 <w:webHidden/>
               </w:rPr>
-              <w:instrText xml:space="preserve"> PAGEREF _Toc239097049 \h </w:instrText>
+              <w:instrText xml:space="preserve"> PAGEREF _Toc239113310 \h </w:instrText>
             </w:r>
             <w:r>
               <w:rPr>
@@ -5290,7 +5290,7 @@
               <w14:ligatures w14:val="standardContextual"/>
             </w:rPr>
           </w:pPr>
-          <w:hyperlink w:anchor="_Toc239097050" w:history="1">
+          <w:hyperlink w:anchor="_Toc239113311" w:history="1">
             <w:r>
               <w:rPr>
                 <w:rStyle w:val="Hipervnculo"/>
@@ -5317,7 +5317,7 @@
                 <w:noProof/>
                 <w:webHidden/>
               </w:rPr>
-              <w:instrText xml:space="preserve"> PAGEREF _Toc239097050 \h </w:instrText>
+              <w:instrText xml:space="preserve"> PAGEREF _Toc239113311 \h </w:instrText>
             </w:r>
             <w:r>
               <w:rPr>
@@ -5365,7 +5365,7 @@
               <w14:ligatures w14:val="standardContextual"/>
             </w:rPr>
           </w:pPr>
-          <w:hyperlink w:anchor="_Toc239097051" w:history="1">
+          <w:hyperlink w:anchor="_Toc239113312" w:history="1">
             <w:r>
               <w:rPr>
                 <w:rStyle w:val="Hipervnculo"/>
@@ -5393,7 +5393,7 @@
                 <w:noProof/>
                 <w:webHidden/>
               </w:rPr>
-              <w:instrText xml:space="preserve"> PAGEREF _Toc239097051 \h </w:instrText>
+              <w:instrText xml:space="preserve"> PAGEREF _Toc239113312 \h </w:instrText>
             </w:r>
             <w:r>
               <w:rPr>
@@ -5441,7 +5441,7 @@
               <w14:ligatures w14:val="standardContextual"/>
             </w:rPr>
           </w:pPr>
-          <w:hyperlink w:anchor="_Toc239097052" w:history="1">
+          <w:hyperlink w:anchor="_Toc239113313" w:history="1">
             <w:r>
               <w:rPr>
                 <w:rStyle w:val="Hipervnculo"/>
@@ -5469,7 +5469,7 @@
                 <w:noProof/>
                 <w:webHidden/>
               </w:rPr>
-              <w:instrText xml:space="preserve"> PAGEREF _Toc239097052 \h </w:instrText>
+              <w:instrText xml:space="preserve"> PAGEREF _Toc239113313 \h </w:instrText>
             </w:r>
             <w:r>
               <w:rPr>
@@ -5517,7 +5517,7 @@
               <w14:ligatures w14:val="standardContextual"/>
             </w:rPr>
           </w:pPr>
-          <w:hyperlink w:anchor="_Toc239097053" w:history="1">
+          <w:hyperlink w:anchor="_Toc239113314" w:history="1">
             <w:r>
               <w:rPr>
                 <w:rStyle w:val="Hipervnculo"/>
@@ -5545,7 +5545,7 @@
                 <w:noProof/>
                 <w:webHidden/>
               </w:rPr>
-              <w:instrText xml:space="preserve"> PAGEREF _Toc239097053 \h </w:instrText>
+              <w:instrText xml:space="preserve"> PAGEREF _Toc239113314 \h </w:instrText>
             </w:r>
             <w:r>
               <w:rPr>
@@ -5593,7 +5593,7 @@
               <w14:ligatures w14:val="standardContextual"/>
             </w:rPr>
           </w:pPr>
-          <w:hyperlink w:anchor="_Toc239097054" w:history="1">
+          <w:hyperlink w:anchor="_Toc239113315" w:history="1">
             <w:r>
               <w:rPr>
                 <w:rStyle w:val="Hipervnculo"/>
@@ -5621,7 +5621,7 @@
                 <w:noProof/>
                 <w:webHidden/>
               </w:rPr>
-              <w:instrText xml:space="preserve"> PAGEREF _Toc239097054 \h </w:instrText>
+              <w:instrText xml:space="preserve"> PAGEREF _Toc239113315 \h </w:instrText>
             </w:r>
             <w:r>
               <w:rPr>
@@ -5669,7 +5669,7 @@
               <w14:ligatures w14:val="standardContextual"/>
             </w:rPr>
           </w:pPr>
-          <w:hyperlink w:anchor="_Toc239097055" w:history="1">
+          <w:hyperlink w:anchor="_Toc239113316" w:history="1">
             <w:r>
               <w:rPr>
                 <w:rStyle w:val="Hipervnculo"/>
@@ -5697,7 +5697,7 @@
                 <w:noProof/>
                 <w:webHidden/>
               </w:rPr>
-              <w:instrText xml:space="preserve"> PAGEREF _Toc239097055 \h </w:instrText>
+              <w:instrText xml:space="preserve"> PAGEREF _Toc239113316 \h </w:instrText>
             </w:r>
             <w:r>
               <w:rPr>
@@ -5745,7 +5745,7 @@
               <w14:ligatures w14:val="standardContextual"/>
             </w:rPr>
           </w:pPr>
-          <w:hyperlink w:anchor="_Toc239097056" w:history="1">
+          <w:hyperlink w:anchor="_Toc239113317" w:history="1">
             <w:r>
               <w:rPr>
                 <w:rStyle w:val="Hipervnculo"/>
@@ -5773,7 +5773,7 @@
                 <w:noProof/>
                 <w:webHidden/>
               </w:rPr>
-              <w:instrText xml:space="preserve"> PAGEREF _Toc239097056 \h </w:instrText>
+              <w:instrText xml:space="preserve"> PAGEREF _Toc239113317 \h </w:instrText>
             </w:r>
             <w:r>
               <w:rPr>
@@ -5821,7 +5821,7 @@
               <w14:ligatures w14:val="standardContextual"/>
             </w:rPr>
           </w:pPr>
-          <w:hyperlink w:anchor="_Toc239097057" w:history="1">
+          <w:hyperlink w:anchor="_Toc239113318" w:history="1">
             <w:r>
               <w:rPr>
                 <w:rStyle w:val="Hipervnculo"/>
@@ -5849,7 +5849,7 @@
                 <w:noProof/>
                 <w:webHidden/>
               </w:rPr>
-              <w:instrText xml:space="preserve"> PAGEREF _Toc239097057 \h </w:instrText>
+              <w:instrText xml:space="preserve"> PAGEREF _Toc239113318 \h </w:instrText>
             </w:r>
             <w:r>
               <w:rPr>
@@ -5897,7 +5897,7 @@
               <w14:ligatures w14:val="standardContextual"/>
             </w:rPr>
           </w:pPr>
-          <w:hyperlink w:anchor="_Toc239097058" w:history="1">
+          <w:hyperlink w:anchor="_Toc239113319" w:history="1">
             <w:r>
               <w:rPr>
                 <w:rStyle w:val="Hipervnculo"/>
@@ -5924,7 +5924,7 @@
                 <w:noProof/>
                 <w:webHidden/>
               </w:rPr>
-              <w:instrText xml:space="preserve"> PAGEREF _Toc239097058 \h </w:instrText>
+              <w:instrText xml:space="preserve"> PAGEREF _Toc239113319 \h </w:instrText>
             </w:r>
             <w:r>
               <w:rPr>
@@ -5972,7 +5972,7 @@
               <w14:ligatures w14:val="standardContextual"/>
             </w:rPr>
           </w:pPr>
-          <w:hyperlink w:anchor="_Toc239097059" w:history="1">
+          <w:hyperlink w:anchor="_Toc239113320" w:history="1">
             <w:r>
               <w:rPr>
                 <w:rStyle w:val="Hipervnculo"/>
@@ -6000,7 +6000,7 @@
                 <w:noProof/>
                 <w:webHidden/>
               </w:rPr>
-              <w:instrText xml:space="preserve"> PAGEREF _Toc239097059 \h </w:instrText>
+              <w:instrText xml:space="preserve"> PAGEREF _Toc239113320 \h </w:instrText>
             </w:r>
             <w:r>
               <w:rPr>
@@ -6048,7 +6048,7 @@
               <w14:ligatures w14:val="standardContextual"/>
             </w:rPr>
           </w:pPr>
-          <w:hyperlink w:anchor="_Toc239097060" w:history="1">
+          <w:hyperlink w:anchor="_Toc239113321" w:history="1">
             <w:r>
               <w:rPr>
                 <w:rStyle w:val="Hipervnculo"/>
@@ -6075,7 +6075,7 @@
                 <w:noProof/>
                 <w:webHidden/>
               </w:rPr>
-              <w:instrText xml:space="preserve"> PAGEREF _Toc239097060 \h </w:instrText>
+              <w:instrText xml:space="preserve"> PAGEREF _Toc239113321 \h </w:instrText>
             </w:r>
             <w:r>
               <w:rPr>
@@ -6121,7 +6121,7 @@
       <w:pPr>
         <w:pStyle w:val="Ttulo1"/>
       </w:pPr>
-      <w:bookmarkStart w:id="5" w:name="_Toc239096992"/>
+      <w:bookmarkStart w:id="5" w:name="_Toc239113253"/>
       <w:r>
         <w:lastRenderedPageBreak/>
         <w:t>Introducción</w:t>
@@ -6229,7 +6229,7 @@
       <w:pPr>
         <w:pStyle w:val="Ttulo1"/>
       </w:pPr>
-      <w:bookmarkStart w:id="6" w:name="_Toc239096993"/>
+      <w:bookmarkStart w:id="6" w:name="_Toc239113254"/>
       <w:r>
         <w:lastRenderedPageBreak/>
         <w:t>Marco teórico del phishing</w:t>
@@ -6240,7 +6240,7 @@
       <w:pPr>
         <w:pStyle w:val="Ttulo2"/>
       </w:pPr>
-      <w:bookmarkStart w:id="7" w:name="_Toc239096994"/>
+      <w:bookmarkStart w:id="7" w:name="_Toc239113255"/>
       <w:r>
         <w:t>Concepto y contexto actual</w:t>
       </w:r>
@@ -6248,7 +6248,7 @@
     </w:p>
     <w:p>
       <w:r>
-        <w:t>El phishing se ha consolidado como una de las ciberamenazas más persistentes y dañinas. Este Trabajo Fin de Grado diseña, implementa y evalúa un sistema cliente-servidor para detectar phishing en correo. Streamlit, la extensión y el monitor envían las entradas a una API central que combina heurística explicable y modelos TF-IDF + MLP en español e inglés. El servidor es el único responsable de parsear, analizar, entrenar y versionar los modelos, de modo que una actualización se aplica a todos los clientes. La memoria revisa el estado del arte y presenta una validación reproducible, delimitando expresamente sus límites frente a producción.</w:t>
+        <w:t>El phishing se ha consolidado como una amenaza persistente porque combina suplantación técnica e ingeniería social para inducir al usuario a revelar información, ejecutar una acción o transferir dinero. Su análisis exige considerar conjuntamente el canal, la identidad aparente, las cabeceras, el contenido y el contexto humano; ninguna señal aislada resulta suficiente en todos los casos.</w:t>
       </w:r>
     </w:p>
     <w:p>
@@ -6282,7 +6282,7 @@
       <w:pPr>
         <w:pStyle w:val="Ttulo2"/>
       </w:pPr>
-      <w:bookmarkStart w:id="8" w:name="_Toc239096995"/>
+      <w:bookmarkStart w:id="8" w:name="_Toc239113256"/>
       <w:r>
         <w:t>Fases de un ataque de phishing</w:t>
       </w:r>
@@ -6515,7 +6515,7 @@
       <w:pPr>
         <w:pStyle w:val="Ttulo3"/>
       </w:pPr>
-      <w:bookmarkStart w:id="9" w:name="_Toc239096996"/>
+      <w:bookmarkStart w:id="9" w:name="_Toc239113257"/>
       <w:r>
         <w:t>Preparación y Recopilación de Información (Reconocimiento)</w:t>
       </w:r>
@@ -6581,7 +6581,7 @@
       <w:pPr>
         <w:pStyle w:val="Ttulo3"/>
       </w:pPr>
-      <w:bookmarkStart w:id="10" w:name="_Toc239096997"/>
+      <w:bookmarkStart w:id="10" w:name="_Toc239113258"/>
       <w:r>
         <w:t>Creación y Lanzamiento del Cebo (Setup y Ataque)</w:t>
       </w:r>
@@ -6665,7 +6665,7 @@
           <w:noProof/>
         </w:rPr>
         <w:drawing>
-          <wp:inline distT="0" distB="0" distL="0" distR="0" wp14:anchorId="5F2B1234" wp14:editId="7C3DE67D">
+          <wp:inline distT="0" distB="0" distL="0" distR="0" wp14:anchorId="5F2B1234" wp14:editId="15618109">
             <wp:extent cx="5398135" cy="3598545"/>
             <wp:effectExtent l="0" t="0" r="0" b="1905"/>
             <wp:docPr id="2138688316" name="Imagen 4" descr="Figura o captura del sistema de detección, imagen 2." title="Figura del TFG 2"/>
@@ -6718,7 +6718,7 @@
       <w:pPr>
         <w:pStyle w:val="Ttulo3"/>
       </w:pPr>
-      <w:bookmarkStart w:id="11" w:name="_Toc239096998"/>
+      <w:bookmarkStart w:id="11" w:name="_Toc239113259"/>
       <w:r>
         <w:t>Interacción y Explotación (Colección Inicial)</w:t>
       </w:r>
@@ -6783,7 +6783,7 @@
       <w:pPr>
         <w:pStyle w:val="Ttulo3"/>
       </w:pPr>
-      <w:bookmarkStart w:id="12" w:name="_Toc239096999"/>
+      <w:bookmarkStart w:id="12" w:name="_Toc239113260"/>
       <w:r>
         <w:t>Adquisición y Monetización de los Datos</w:t>
       </w:r>
@@ -7431,7 +7431,7 @@
       <w:pPr>
         <w:pStyle w:val="Ttulo3"/>
       </w:pPr>
-      <w:bookmarkStart w:id="13" w:name="_Toc239097000"/>
+      <w:bookmarkStart w:id="13" w:name="_Toc239113261"/>
       <w:r>
         <w:t>Comparación crítica de modelos de fases</w:t>
       </w:r>
@@ -8072,7 +8072,7 @@
         <w:pStyle w:val="Ttulo3"/>
         <w:spacing w:line="278" w:lineRule="auto"/>
       </w:pPr>
-      <w:bookmarkStart w:id="14" w:name="_Toc239097001"/>
+      <w:bookmarkStart w:id="14" w:name="_Toc239113262"/>
       <w:r>
         <w:lastRenderedPageBreak/>
         <w:t>Puntos de intervención y controles</w:t>
@@ -8678,7 +8678,7 @@
       <w:pPr>
         <w:pStyle w:val="Ttulo2"/>
       </w:pPr>
-      <w:bookmarkStart w:id="15" w:name="_Toc239097002"/>
+      <w:bookmarkStart w:id="15" w:name="_Toc239113263"/>
       <w:r>
         <w:t>Tipos, clasificación y evolución de los ataques de phishing</w:t>
       </w:r>
@@ -8688,7 +8688,7 @@
       <w:pPr>
         <w:pStyle w:val="Ttulo3"/>
       </w:pPr>
-      <w:bookmarkStart w:id="16" w:name="_Toc239097003"/>
+      <w:bookmarkStart w:id="16" w:name="_Toc239113264"/>
       <w:r>
         <w:t>Introducción a la clasificación</w:t>
       </w:r>
@@ -8706,7 +8706,7 @@
       <w:pPr>
         <w:pStyle w:val="Ttulo3"/>
       </w:pPr>
-      <w:bookmarkStart w:id="17" w:name="_Toc239097004"/>
+      <w:bookmarkStart w:id="17" w:name="_Toc239113265"/>
       <w:r>
         <w:t>Clasificación según el vector de entrega</w:t>
       </w:r>
@@ -8780,7 +8780,7 @@
       <w:pPr>
         <w:pStyle w:val="Ttulo3"/>
       </w:pPr>
-      <w:bookmarkStart w:id="18" w:name="_Toc239097005"/>
+      <w:bookmarkStart w:id="18" w:name="_Toc239113266"/>
       <w:r>
         <w:t>Clasificación según el grado de personalización y objetivo</w:t>
       </w:r>
@@ -8858,7 +8858,7 @@
       <w:pPr>
         <w:pStyle w:val="Ttulo3"/>
       </w:pPr>
-      <w:bookmarkStart w:id="19" w:name="_Toc239097006"/>
+      <w:bookmarkStart w:id="19" w:name="_Toc239113267"/>
       <w:r>
         <w:t>Clasificación según la técnica de explotación</w:t>
       </w:r>
@@ -8928,7 +8928,7 @@
       <w:pPr>
         <w:pStyle w:val="Ttulo3"/>
       </w:pPr>
-      <w:bookmarkStart w:id="20" w:name="_Toc239097007"/>
+      <w:bookmarkStart w:id="20" w:name="_Toc239113268"/>
       <w:r>
         <w:t>Evolución histórica resumida</w:t>
       </w:r>
@@ -9026,7 +9026,7 @@
       <w:pPr>
         <w:pStyle w:val="Ttulo3"/>
       </w:pPr>
-      <w:bookmarkStart w:id="21" w:name="_Toc239097008"/>
+      <w:bookmarkStart w:id="21" w:name="_Toc239113269"/>
       <w:r>
         <w:t>Impacto actual (2025)</w:t>
       </w:r>
@@ -9052,7 +9052,7 @@
       <w:pPr>
         <w:pStyle w:val="Ttulo2"/>
       </w:pPr>
-      <w:bookmarkStart w:id="22" w:name="_Toc239097009"/>
+      <w:bookmarkStart w:id="22" w:name="_Toc239113270"/>
       <w:r>
         <w:t>La ingeniería social como fundamento psicológico y sociotécnico del phishing</w:t>
       </w:r>
@@ -9070,7 +9070,7 @@
       <w:pPr>
         <w:pStyle w:val="Ttulo3"/>
       </w:pPr>
-      <w:bookmarkStart w:id="23" w:name="_Toc239097010"/>
+      <w:bookmarkStart w:id="23" w:name="_Toc239113271"/>
       <w:r>
         <w:lastRenderedPageBreak/>
         <w:t>Principios psicológicos fundamentales explotados</w:t>
@@ -9723,7 +9723,7 @@
       <w:pPr>
         <w:pStyle w:val="Ttulo3"/>
       </w:pPr>
-      <w:bookmarkStart w:id="24" w:name="_Toc239097011"/>
+      <w:bookmarkStart w:id="24" w:name="_Toc239113272"/>
       <w:r>
         <w:t>Sesgos cognitivos específicos explotados</w:t>
       </w:r>
@@ -9797,7 +9797,7 @@
       <w:pPr>
         <w:pStyle w:val="Ttulo3"/>
       </w:pPr>
-      <w:bookmarkStart w:id="25" w:name="_Toc239097012"/>
+      <w:bookmarkStart w:id="25" w:name="_Toc239113273"/>
       <w:r>
         <w:t>El impacto de la inteligencia artificial generativa en la ingeniería social (2023-2025)</w:t>
       </w:r>
@@ -9858,7 +9858,7 @@
       <w:pPr>
         <w:pStyle w:val="Ttulo3"/>
       </w:pPr>
-      <w:bookmarkStart w:id="26" w:name="_Toc239097013"/>
+      <w:bookmarkStart w:id="26" w:name="_Toc239113274"/>
       <w:r>
         <w:t>Consecuencias organizativas y humanas</w:t>
       </w:r>
@@ -9884,7 +9884,7 @@
       <w:pPr>
         <w:pStyle w:val="Ttulo3"/>
       </w:pPr>
-      <w:bookmarkStart w:id="27" w:name="_Toc239097014"/>
+      <w:bookmarkStart w:id="27" w:name="_Toc239113275"/>
       <w:r>
         <w:t>Implicaciones para la detección</w:t>
       </w:r>
@@ -9963,7 +9963,7 @@
       <w:pPr>
         <w:pStyle w:val="Ttulo1"/>
       </w:pPr>
-      <w:bookmarkStart w:id="28" w:name="_Toc239097015"/>
+      <w:bookmarkStart w:id="28" w:name="_Toc239113276"/>
       <w:r>
         <w:lastRenderedPageBreak/>
         <w:t>Estado del arte en técnicas de detección y prevención de phishing basadas en Machine Learning y Deep Learning (2018-2025)</w:t>
@@ -10004,7 +10004,7 @@
       <w:pPr>
         <w:pStyle w:val="Ttulo2"/>
       </w:pPr>
-      <w:bookmarkStart w:id="29" w:name="_Toc239097016"/>
+      <w:bookmarkStart w:id="29" w:name="_Toc239113277"/>
       <w:r>
         <w:t>Evolución de los enfoques de detección</w:t>
       </w:r>
@@ -10076,7 +10076,7 @@
       <w:pPr>
         <w:pStyle w:val="Ttulo2"/>
       </w:pPr>
-      <w:bookmarkStart w:id="30" w:name="_Toc239097017"/>
+      <w:bookmarkStart w:id="30" w:name="_Toc239113278"/>
       <w:r>
         <w:t>Técnicas clásicas de Machine Learning (representativas 2019-2022)</w:t>
       </w:r>
@@ -10992,7 +10992,7 @@
       <w:pPr>
         <w:pStyle w:val="Ttulo2"/>
       </w:pPr>
-      <w:bookmarkStart w:id="31" w:name="_Toc239097018"/>
+      <w:bookmarkStart w:id="31" w:name="_Toc239113279"/>
       <w:r>
         <w:t>Técnicas de Deep Learning y Transformers (2023-2025)</w:t>
       </w:r>
@@ -12586,7 +12586,7 @@
       <w:pPr>
         <w:pStyle w:val="Ttulo2"/>
       </w:pPr>
-      <w:bookmarkStart w:id="32" w:name="_Toc239097019"/>
+      <w:bookmarkStart w:id="32" w:name="_Toc239113280"/>
       <w:r>
         <w:t>Enfoques híbridos y basados en comportamiento (UEBA)</w:t>
       </w:r>
@@ -12673,7 +12673,7 @@
       <w:pPr>
         <w:pStyle w:val="Ttulo2"/>
       </w:pPr>
-      <w:bookmarkStart w:id="33" w:name="_Toc239097020"/>
+      <w:bookmarkStart w:id="33" w:name="_Toc239113281"/>
       <w:r>
         <w:t>Limitaciones actuales de los enfoques</w:t>
       </w:r>
@@ -12773,7 +12773,7 @@
       <w:pPr>
         <w:pStyle w:val="Ttulo2"/>
       </w:pPr>
-      <w:bookmarkStart w:id="34" w:name="_Toc239097021"/>
+      <w:bookmarkStart w:id="34" w:name="_Toc239113282"/>
       <w:r>
         <w:t>Conclusiones del estado del arte y hueco de investigación</w:t>
       </w:r>
@@ -12862,7 +12862,7 @@
           <w:bCs/>
         </w:rPr>
       </w:pPr>
-      <w:bookmarkStart w:id="35" w:name="_Toc239097022"/>
+      <w:bookmarkStart w:id="35" w:name="_Toc239113283"/>
       <w:r>
         <w:rPr>
           <w:bCs/>
@@ -12883,7 +12883,7 @@
           <w:bCs/>
         </w:rPr>
       </w:pPr>
-      <w:bookmarkStart w:id="36" w:name="_Toc239097023"/>
+      <w:bookmarkStart w:id="36" w:name="_Toc239113284"/>
       <w:r>
         <w:rPr>
           <w:bCs/>
@@ -12925,7 +12925,7 @@
           <w:bCs/>
         </w:rPr>
       </w:pPr>
-      <w:bookmarkStart w:id="37" w:name="_Toc239097024"/>
+      <w:bookmarkStart w:id="37" w:name="_Toc239113285"/>
       <w:r>
         <w:rPr>
           <w:bCs/>
@@ -13824,7 +13824,7 @@
           <w:bCs/>
         </w:rPr>
       </w:pPr>
-      <w:bookmarkStart w:id="38" w:name="_Toc239097025"/>
+      <w:bookmarkStart w:id="38" w:name="_Toc239113286"/>
       <w:r>
         <w:rPr>
           <w:bCs/>
@@ -14531,7 +14531,7 @@
           <w:bCs/>
         </w:rPr>
       </w:pPr>
-      <w:bookmarkStart w:id="39" w:name="_Toc239097026"/>
+      <w:bookmarkStart w:id="39" w:name="_Toc239113287"/>
       <w:r>
         <w:rPr>
           <w:bCs/>
@@ -14558,7 +14558,7 @@
       <w:pPr>
         <w:pStyle w:val="Ttulo2"/>
       </w:pPr>
-      <w:bookmarkStart w:id="40" w:name="_Toc239097027"/>
+      <w:bookmarkStart w:id="40" w:name="_Toc239113288"/>
       <w:r>
         <w:t>Aspectos éticos y de protección de datos</w:t>
       </w:r>
@@ -14578,7 +14578,7 @@
       <w:pPr>
         <w:pStyle w:val="Ttulo1"/>
       </w:pPr>
-      <w:bookmarkStart w:id="41" w:name="_Toc239097028"/>
+      <w:bookmarkStart w:id="41" w:name="_Toc239113289"/>
       <w:r>
         <w:lastRenderedPageBreak/>
         <w:t>Diseño e implementación de la aplicación web</w:t>
@@ -14615,7 +14615,7 @@
           <w:rFonts w:eastAsiaTheme="minorEastAsia"/>
         </w:rPr>
       </w:pPr>
-      <w:bookmarkStart w:id="42" w:name="_Toc239097029"/>
+      <w:bookmarkStart w:id="42" w:name="_Toc239113290"/>
       <w:r>
         <w:rPr>
           <w:rFonts w:eastAsiaTheme="minorEastAsia"/>
@@ -14651,7 +14651,7 @@
       <w:pPr>
         <w:pStyle w:val="Ttulo2"/>
       </w:pPr>
-      <w:bookmarkStart w:id="43" w:name="_Toc239097030"/>
+      <w:bookmarkStart w:id="43" w:name="_Toc239113291"/>
       <w:r>
         <w:t>Cambios respecto a la propuesta inicial</w:t>
       </w:r>
@@ -15240,7 +15240,7 @@
           <w:rFonts w:eastAsiaTheme="minorEastAsia"/>
         </w:rPr>
       </w:pPr>
-      <w:bookmarkStart w:id="44" w:name="_Toc239097031"/>
+      <w:bookmarkStart w:id="44" w:name="_Toc239113292"/>
       <w:r>
         <w:rPr>
           <w:rFonts w:eastAsiaTheme="minorEastAsia"/>
@@ -15261,6 +15261,11 @@
       </w:r>
     </w:p>
     <w:p>
+      <w:r>
+        <w:t>En cuanto a concurrencia, el backend usa ThreadingHTTPServer y crea un hilo por petición, sin un máximo cerrado en el código. En este equipo se repitieron pruebas de 8 y 16 análisis simultáneos sin fallos; con 16, el percentil 95 de latencia quedó entre 0,58 y 0,66 s, mientras que a 32 aparecieron errores. Por ello se recomiendan 4-8 solicitudes concurrentes para la configuración académica y se presenta 16 solo como máximo comprobado localmente, no como capacidad de producción. Entrenamiento y borrado de modelos se serializan mediante un bloqueo.</w:t>
+      </w:r>
+    </w:p>
+    <w:p>
       <w:pPr>
         <w:rPr>
           <w:rFonts w:asciiTheme="minorHAnsi" w:hAnsiTheme="minorHAnsi"/>
@@ -15287,7 +15292,7 @@
           <w:rFonts w:eastAsiaTheme="minorEastAsia"/>
         </w:rPr>
       </w:pPr>
-      <w:bookmarkStart w:id="45" w:name="_Toc239097032"/>
+      <w:bookmarkStart w:id="45" w:name="_Toc239113293"/>
       <w:r>
         <w:rPr>
           <w:rFonts w:eastAsiaTheme="minorEastAsia"/>
@@ -15329,21 +15334,24 @@
         <w:rPr>
           <w:rFonts w:asciiTheme="minorHAnsi" w:hAnsiTheme="minorHAnsi"/>
         </w:rPr>
-        <w:t>Una vez normalizado el correo, SignalBuilder ejecuta 31 reglas y produce un diccionario estable de señales. Además de cabeceras, autenticación, URLs, HTML y adjuntos, incorpora tres patrones bilingües para BEC sin enlace: cambio de datos bancarios, orden urgente de transferencia y suplantación de un directivo bajo aislamiento o confidencialidad. Si el modo lo requiere, el backend detecta el idioma y reutiliza el modelo neuronal central correspondiente.</w:t>
-      </w:r>
-    </w:p>
-    <w:p>
-      <w:pPr>
+        <w:t xml:space="preserve">Una vez normalizado el correo, SignalBuilder ejecuta 31 reglas y produce un diccionario estable de señales. Además de cabeceras, autenticación, URLs, HTML y adjuntos, incorpora tres </w:t>
+      </w:r>
+      <w:r>
         <w:rPr>
           <w:rFonts w:asciiTheme="minorHAnsi" w:hAnsiTheme="minorHAnsi"/>
         </w:rPr>
-      </w:pPr>
-      <w:r>
-        <w:t xml:space="preserve">RiskScorer asigna una ponderación a cada señal activa y calcula una puntuación final entre 0 y 100. Si la puntuación supera el umbral configurado, el mensaje se clasifica como phishing probable. ExplanationBuilder transforma las señales en explicaciones comprensibles. El backend central devuelve ese resultado por HTTP a Streamlit, la extensión o el monitor; los </w:t>
-      </w:r>
-      <w:r>
         <w:lastRenderedPageBreak/>
-        <w:t>clientes solo lo presentan o, en el caso del monitor, pueden generar una alerta de Telegram y registrar el identificador para evitar duplicados.</w:t>
+        <w:t>patrones bilingües para BEC sin enlace: cambio de datos bancarios, orden urgente de transferencia y suplantación de un directivo bajo aislamiento o confidencialidad. Si el modo lo requiere, el backend detecta el idioma y reutiliza el modelo neuronal central correspondiente.</w:t>
+      </w:r>
+    </w:p>
+    <w:p>
+      <w:pPr>
+        <w:rPr>
+          <w:rFonts w:asciiTheme="minorHAnsi" w:hAnsiTheme="minorHAnsi"/>
+        </w:rPr>
+      </w:pPr>
+      <w:r>
+        <w:t>RiskScorer asigna una ponderación a cada señal activa y calcula una puntuación final entre 0 y 100. Si la puntuación supera el umbral configurado, el mensaje se clasifica como phishing probable. ExplanationBuilder transforma las señales en explicaciones comprensibles. El backend central devuelve ese resultado por HTTP a Streamlit, la extensión o el monitor; los clientes solo lo presentan o, en el caso del monitor, pueden generar una alerta de Telegram y registrar el identificador para evitar duplicados.</w:t>
       </w:r>
     </w:p>
     <w:p>
@@ -15353,7 +15361,7 @@
           <w:rFonts w:eastAsiaTheme="minorEastAsia"/>
         </w:rPr>
       </w:pPr>
-      <w:bookmarkStart w:id="46" w:name="_Toc239097033"/>
+      <w:bookmarkStart w:id="46" w:name="_Toc239113294"/>
       <w:r>
         <w:rPr>
           <w:rFonts w:eastAsiaTheme="minorEastAsia"/>
@@ -15431,7 +15439,7 @@
           <w:rFonts w:eastAsiaTheme="minorEastAsia"/>
         </w:rPr>
       </w:pPr>
-      <w:bookmarkStart w:id="47" w:name="_Toc239097034"/>
+      <w:bookmarkStart w:id="47" w:name="_Toc239113295"/>
       <w:r>
         <w:rPr>
           <w:rFonts w:eastAsiaTheme="minorEastAsia"/>
@@ -15470,6 +15478,7 @@
         </w:rPr>
       </w:pPr>
       <w:r>
+        <w:lastRenderedPageBreak/>
         <w:t>Los modelos entrenados se almacenan mediante joblib en runtime/server/models, diferenciando el artefacto español del inglés. Solo el backend accede a esas rutas. Durante el análisis, el servidor detecta el idioma con langdetect y reutiliza un detector cacheado por idioma. Si el modelo esperado no existe, está corrupto o tiene metadatos incompatibles, se entrena un modelo sintético del mismo idioma; nunca se reutiliza silenciosamente el modelo de la lengua opuesta.</w:t>
       </w:r>
     </w:p>
@@ -15480,12 +15489,11 @@
           <w:rFonts w:eastAsiaTheme="minorEastAsia"/>
         </w:rPr>
       </w:pPr>
-      <w:bookmarkStart w:id="48" w:name="_Toc239097035"/>
+      <w:bookmarkStart w:id="48" w:name="_Toc239113296"/>
       <w:r>
         <w:rPr>
           <w:rFonts w:eastAsiaTheme="minorEastAsia"/>
         </w:rPr>
-        <w:lastRenderedPageBreak/>
         <w:t>Interfaz de usuario</w:t>
       </w:r>
       <w:bookmarkEnd w:id="48"/>
@@ -15527,7 +15535,7 @@
       <w:pPr>
         <w:pStyle w:val="Ttulo2"/>
       </w:pPr>
-      <w:bookmarkStart w:id="49" w:name="_Toc239097036"/>
+      <w:bookmarkStart w:id="49" w:name="_Toc239113297"/>
       <w:r>
         <w:t>Diseño modular</w:t>
       </w:r>
@@ -15570,7 +15578,7 @@
       <w:pPr>
         <w:pStyle w:val="Ttulo2"/>
       </w:pPr>
-      <w:bookmarkStart w:id="50" w:name="_Toc239097037"/>
+      <w:bookmarkStart w:id="50" w:name="_Toc239113298"/>
       <w:r>
         <w:rPr>
           <w:rFonts w:eastAsiaTheme="minorEastAsia"/>
@@ -15586,7 +15594,11 @@
         </w:rPr>
       </w:pPr>
       <w:r>
-        <w:t>El prototipo presenta varias limitaciones. Las listas negras son locales y no se consultan servicios externos de reputación en tiempo real. Tampoco se realiza análisis dinámico de las páginas enlazadas, ni se validan certificados digitales ni se comprueba la reputación histórica de los dominios. Además, Streamlit se utiliza como interfaz académica en un entorno controlado: la versión actual no incorpora gestión multiusuario, control de acceso ni aislamiento de datos para un despliegue público.</w:t>
+        <w:t xml:space="preserve">El prototipo presenta varias limitaciones. Las listas negras son locales y no se consultan servicios externos de reputación en tiempo real. Tampoco se realiza análisis dinámico de las páginas enlazadas, ni se validan certificados digitales ni se comprueba la reputación histórica de los dominios. Además, Streamlit se utiliza como interfaz académica en un </w:t>
+      </w:r>
+      <w:r>
+        <w:lastRenderedPageBreak/>
+        <w:t>entorno controlado: la versión actual no incorpora gestión multiusuario, control de acceso ni aislamiento de datos para un despliegue público.</w:t>
       </w:r>
     </w:p>
     <w:p>
@@ -15596,11 +15608,7 @@
         </w:rPr>
       </w:pPr>
       <w:r>
-        <w:t xml:space="preserve">El modelo neuronal depende de la calidad y representatividad de los datasets utilizados para el entrenamiento. Aunque la aplicación permite entrenar con CSV externos, su rendimiento real debe evaluarse con conjuntos amplios, recientes y equilibrados. Por último, el prototipo </w:t>
-      </w:r>
-      <w:r>
-        <w:lastRenderedPageBreak/>
-        <w:t>no incorpora transformers ni LLMs, aunque el estado del arte los identifica como una línea prometedora junto con la detección semántica de principios de ingeniería social.</w:t>
+        <w:t>El modelo neuronal depende de la calidad y representatividad de los datasets utilizados para el entrenamiento. Aunque la aplicación permite entrenar con CSV externos, su rendimiento real debe evaluarse con conjuntos amplios, recientes y equilibrados. Por último, el prototipo no incorpora transformers ni LLMs, aunque el estado del arte los identifica como una línea prometedora junto con la detección semántica de principios de ingeniería social.</w:t>
       </w:r>
     </w:p>
     <w:p>
@@ -15614,7 +15622,7 @@
       <w:pPr>
         <w:pStyle w:val="Ttulo1"/>
       </w:pPr>
-      <w:bookmarkStart w:id="51" w:name="_Toc239097038"/>
+      <w:bookmarkStart w:id="51" w:name="_Toc239113299"/>
       <w:r>
         <w:lastRenderedPageBreak/>
         <w:t>Pruebas, resultados y discusión</w:t>
@@ -15625,7 +15633,7 @@
       <w:pPr>
         <w:pStyle w:val="Ttulo2"/>
       </w:pPr>
-      <w:bookmarkStart w:id="52" w:name="_Toc239097039"/>
+      <w:bookmarkStart w:id="52" w:name="_Toc239113300"/>
       <w:r>
         <w:t>Pruebas unitarias y de integración</w:t>
       </w:r>
@@ -15645,7 +15653,7 @@
       <w:pPr>
         <w:pStyle w:val="Ttulo2"/>
       </w:pPr>
-      <w:bookmarkStart w:id="53" w:name="_Toc239097040"/>
+      <w:bookmarkStart w:id="53" w:name="_Toc239113301"/>
       <w:r>
         <w:t>Rendimiento y eficiencia de arranque</w:t>
       </w:r>
@@ -15670,7 +15678,7 @@
       <w:pPr>
         <w:pStyle w:val="Ttulo2"/>
       </w:pPr>
-      <w:bookmarkStart w:id="54" w:name="_Toc239097041"/>
+      <w:bookmarkStart w:id="54" w:name="_Toc239113302"/>
       <w:r>
         <w:t>Diseño experimental y datasets</w:t>
       </w:r>
@@ -17160,7 +17168,7 @@
       <w:pPr>
         <w:pStyle w:val="Ttulo2"/>
       </w:pPr>
-      <w:bookmarkStart w:id="55" w:name="_Toc239097042"/>
+      <w:bookmarkStart w:id="55" w:name="_Toc239113303"/>
       <w:r>
         <w:t>Resultados comparados</w:t>
       </w:r>
@@ -19661,7 +19669,7 @@
       <w:pPr>
         <w:pStyle w:val="Ttulo2"/>
       </w:pPr>
-      <w:bookmarkStart w:id="56" w:name="_Toc239097043"/>
+      <w:bookmarkStart w:id="56" w:name="_Toc239113304"/>
       <w:r>
         <w:t>Comportamiento del sistema heurístico</w:t>
       </w:r>
@@ -19684,7 +19692,7 @@
       <w:pPr>
         <w:pStyle w:val="Ttulo2"/>
       </w:pPr>
-      <w:bookmarkStart w:id="57" w:name="_Toc239097044"/>
+      <w:bookmarkStart w:id="57" w:name="_Toc239113305"/>
       <w:r>
         <w:t>Prueba funcional de la aplicación web</w:t>
       </w:r>
@@ -19704,7 +19712,7 @@
       <w:pPr>
         <w:pStyle w:val="Ttulo3"/>
       </w:pPr>
-      <w:bookmarkStart w:id="58" w:name="_Toc239097045"/>
+      <w:bookmarkStart w:id="58" w:name="_Toc239113306"/>
       <w:r>
         <w:t>Evidencia visual del prototipo</w:t>
       </w:r>
@@ -19727,7 +19735,7 @@
         </w:rPr>
         <w:lastRenderedPageBreak/>
         <w:drawing>
-          <wp:inline distT="0" distB="0" distL="0" distR="0" wp14:anchorId="04904560" wp14:editId="2DC23896">
+          <wp:inline distT="0" distB="0" distL="0" distR="0" wp14:anchorId="24424463" wp14:editId="1D465DD0">
             <wp:extent cx="5715000" cy="3571875"/>
             <wp:effectExtent l="0" t="0" r="0" b="0"/>
             <wp:docPr id="2138688317" name="Picture 2138688317" descr="Pantalla inicial de Streamlit con el backend central conectado."/>
@@ -19784,7 +19792,7 @@
           <w:noProof/>
         </w:rPr>
         <w:drawing>
-          <wp:inline distT="0" distB="0" distL="0" distR="0" wp14:anchorId="0F019BA0" wp14:editId="4BBC0764">
+          <wp:inline distT="0" distB="0" distL="0" distR="0" wp14:anchorId="2F89B1DB" wp14:editId="5078E85D">
             <wp:extent cx="5715000" cy="1489982"/>
             <wp:effectExtent l="0" t="0" r="0" b="0"/>
             <wp:docPr id="2138688318" name="Picture 2138688318" descr="Tarjeta de resultado combinado para un escenario BEC sintético."/>
@@ -19834,7 +19842,7 @@
       <w:pPr>
         <w:pStyle w:val="Ttulo2"/>
       </w:pPr>
-      <w:bookmarkStart w:id="59" w:name="_Toc239097046"/>
+      <w:bookmarkStart w:id="59" w:name="_Toc239113307"/>
       <w:r>
         <w:t>Discusión</w:t>
       </w:r>
@@ -19855,7 +19863,7 @@
         <w:pStyle w:val="Ttulo1"/>
         <w:pageBreakBefore w:val="0"/>
       </w:pPr>
-      <w:bookmarkStart w:id="60" w:name="_Toc239097047"/>
+      <w:bookmarkStart w:id="60" w:name="_Toc239113308"/>
       <w:r>
         <w:t>Conclusiones generales</w:t>
       </w:r>
@@ -19962,7 +19970,7 @@
       <w:pPr>
         <w:pStyle w:val="Ttulo2"/>
       </w:pPr>
-      <w:bookmarkStart w:id="61" w:name="_Toc239097048"/>
+      <w:bookmarkStart w:id="61" w:name="_Toc239113309"/>
       <w:r>
         <w:t>Trabajo futuro</w:t>
       </w:r>
@@ -19982,7 +19990,7 @@
       <w:pPr>
         <w:pStyle w:val="Ttulo1"/>
       </w:pPr>
-      <w:bookmarkStart w:id="62" w:name="_Toc239097049"/>
+      <w:bookmarkStart w:id="62" w:name="_Toc239113310"/>
       <w:r>
         <w:lastRenderedPageBreak/>
         <w:t>Glosario</w:t>
@@ -20348,7 +20356,7 @@
       <w:pPr>
         <w:pStyle w:val="Ttulo1"/>
       </w:pPr>
-      <w:bookmarkStart w:id="63" w:name="_Toc239097050"/>
+      <w:bookmarkStart w:id="63" w:name="_Toc239113311"/>
       <w:r>
         <w:lastRenderedPageBreak/>
         <w:t>Referencias</w:t>
@@ -20698,7 +20706,7 @@
           <w:bCs/>
         </w:rPr>
       </w:pPr>
-      <w:bookmarkStart w:id="64" w:name="_Toc239097051"/>
+      <w:bookmarkStart w:id="64" w:name="_Toc239113312"/>
       <w:r>
         <w:rPr>
           <w:bCs/>
@@ -20719,7 +20727,7 @@
           <w:bCs/>
         </w:rPr>
       </w:pPr>
-      <w:bookmarkStart w:id="65" w:name="_Toc239097052"/>
+      <w:bookmarkStart w:id="65" w:name="_Toc239113313"/>
       <w:r>
         <w:rPr>
           <w:bCs/>
@@ -21159,7 +21167,7 @@
           <w:bCs/>
         </w:rPr>
       </w:pPr>
-      <w:bookmarkStart w:id="66" w:name="_Toc239097053"/>
+      <w:bookmarkStart w:id="66" w:name="_Toc239113314"/>
       <w:r>
         <w:rPr>
           <w:bCs/>
@@ -21180,7 +21188,7 @@
           <w:bCs/>
         </w:rPr>
       </w:pPr>
-      <w:bookmarkStart w:id="67" w:name="_Toc239097054"/>
+      <w:bookmarkStart w:id="67" w:name="_Toc239113315"/>
       <w:r>
         <w:rPr>
           <w:bCs/>
@@ -21276,7 +21284,7 @@
           <w:bCs/>
         </w:rPr>
       </w:pPr>
-      <w:bookmarkStart w:id="68" w:name="_Toc239097055"/>
+      <w:bookmarkStart w:id="68" w:name="_Toc239113316"/>
       <w:r>
         <w:rPr>
           <w:bCs/>
@@ -21733,7 +21741,7 @@
           <w:bCs/>
         </w:rPr>
       </w:pPr>
-      <w:bookmarkStart w:id="69" w:name="_Toc239097056"/>
+      <w:bookmarkStart w:id="69" w:name="_Toc239113317"/>
       <w:r>
         <w:rPr>
           <w:bCs/>
@@ -22022,7 +22030,7 @@
           <w:bCs/>
         </w:rPr>
       </w:pPr>
-      <w:bookmarkStart w:id="70" w:name="_Toc239097057"/>
+      <w:bookmarkStart w:id="70" w:name="_Toc239113318"/>
       <w:r>
         <w:rPr>
           <w:bCs/>
@@ -22169,7 +22177,7 @@
       <w:pPr>
         <w:pStyle w:val="Ttulo2"/>
       </w:pPr>
-      <w:bookmarkStart w:id="71" w:name="_Toc239097058"/>
+      <w:bookmarkStart w:id="71" w:name="_Toc239113319"/>
       <w:r>
         <w:t>C.1. Uso del prototipo</w:t>
       </w:r>
@@ -22208,7 +22216,7 @@
           <w:bCs/>
         </w:rPr>
       </w:pPr>
-      <w:bookmarkStart w:id="72" w:name="_Toc239097059"/>
+      <w:bookmarkStart w:id="72" w:name="_Toc239113320"/>
       <w:r>
         <w:rPr>
           <w:bCs/>
@@ -22311,7 +22319,7 @@
       <w:pPr>
         <w:pStyle w:val="Ttulo2"/>
       </w:pPr>
-      <w:bookmarkStart w:id="73" w:name="_Toc239097060"/>
+      <w:bookmarkStart w:id="73" w:name="_Toc239113321"/>
       <w:r>
         <w:t>Anexo E: Resumen de arquitectura y evidencia</w:t>
       </w:r>

</xml_diff>

<commit_message>
Añadir evidencia visual a la memoria
</commit_message>
<xml_diff>
--- a/TFG.docx
+++ b/TFG.docx
@@ -118,7 +118,7 @@
       <w:pPr>
         <w:pStyle w:val="Ttulo1"/>
       </w:pPr>
-      <w:bookmarkStart w:id="0" w:name="_Toc239113248"/>
+      <w:bookmarkStart w:id="0" w:name="_Toc239142801"/>
       <w:r>
         <w:lastRenderedPageBreak/>
         <w:t>Resumen</w:t>
@@ -140,7 +140,7 @@
       <w:pPr>
         <w:pStyle w:val="Ttulo1"/>
       </w:pPr>
-      <w:bookmarkStart w:id="1" w:name="_Toc239113249"/>
+      <w:bookmarkStart w:id="1" w:name="_Toc239142802"/>
       <w:r>
         <w:lastRenderedPageBreak/>
         <w:t>Abstract</w:t>
@@ -167,7 +167,7 @@
       <w:pPr>
         <w:pStyle w:val="Ttulo1"/>
       </w:pPr>
-      <w:bookmarkStart w:id="2" w:name="_Toc239113250"/>
+      <w:bookmarkStart w:id="2" w:name="_Toc239142803"/>
       <w:r>
         <w:lastRenderedPageBreak/>
         <w:t>Agradecimientos</w:t>
@@ -183,7 +183,7 @@
       <w:pPr>
         <w:pStyle w:val="Ttulo1"/>
       </w:pPr>
-      <w:bookmarkStart w:id="3" w:name="_Toc239113251"/>
+      <w:bookmarkStart w:id="3" w:name="_Toc239142804"/>
       <w:r>
         <w:lastRenderedPageBreak/>
         <w:t>Índice de figuras y tablas</w:t>
@@ -208,6 +208,7 @@
         <w:t>Figura 2.2: Vectores iniciales en brechas analizadas por el DBIR 2025 (n=9.891).</w:t>
       </w:r>
     </w:p>
+    <w:p/>
     <w:p>
       <w:r>
         <w:t>Figura 6.1: Pantalla inicial del cliente web con el backend central conectado.</w:t>
@@ -215,10 +216,29 @@
     </w:p>
     <w:p>
       <w:r>
-        <w:t>Figura 6.2: Resultado combinado del escenario BEC sintético reservado.</w:t>
-      </w:r>
-    </w:p>
-    <w:p/>
+        <w:t>Figura 6.2: Fuentes de entrada y configuración del modo combinado en el cliente web.</w:t>
+      </w:r>
+    </w:p>
+    <w:p>
+      <w:r>
+        <w:t>Figura 6.3: Resultado combinado del escenario BEC sintético reservado.</w:t>
+      </w:r>
+    </w:p>
+    <w:p>
+      <w:r>
+        <w:t>Figura 6.4: Resultado heurístico y desglose explicable de señales por categoría.</w:t>
+      </w:r>
+    </w:p>
+    <w:p>
+      <w:r>
+        <w:t>Figura 6.5: Administración y versiones activas de los modelos centrales ES y EN.</w:t>
+      </w:r>
+    </w:p>
+    <w:p>
+      <w:r>
+        <w:t>Figura 6.6: Ajustes de análisis e hiperparámetros almacenados en el servidor.</w:t>
+      </w:r>
+    </w:p>
     <w:p>
       <w:r>
         <w:rPr>
@@ -279,19 +299,24 @@
     </w:p>
     <w:p>
       <w:r>
-        <w:t>Tabla 6.2: Métricas sobre los 16 EML reservados.</w:t>
-      </w:r>
-    </w:p>
-    <w:p>
-      <w:r>
-        <w:t>Tabla 6.3: Matrices de confusión sobre los 16 EML reservados.</w:t>
+        <w:t>Tabla 6.2: Métricas sobre los holdouts de texto.</w:t>
+      </w:r>
+    </w:p>
+    <w:p>
+      <w:r>
+        <w:t>Tabla 6.3: Métricas sobre los 16 EML reservados.</w:t>
+      </w:r>
+    </w:p>
+    <w:p>
+      <w:r>
+        <w:t>Tabla 6.4: Matrices de confusión sobre los 16 EML reservados.</w:t>
       </w:r>
     </w:p>
     <w:p>
       <w:pPr>
         <w:pStyle w:val="Ttulo1"/>
       </w:pPr>
-      <w:bookmarkStart w:id="4" w:name="_Toc239113252"/>
+      <w:bookmarkStart w:id="4" w:name="_Toc239142805"/>
       <w:r>
         <w:lastRenderedPageBreak/>
         <w:t>Abreviaturas</w:t>
@@ -560,7 +585,7 @@
           <w:r>
             <w:fldChar w:fldCharType="separate"/>
           </w:r>
-          <w:hyperlink w:anchor="_Toc239113248" w:history="1">
+          <w:hyperlink w:anchor="_Toc239142801" w:history="1">
             <w:r>
               <w:rPr>
                 <w:rStyle w:val="Hipervnculo"/>
@@ -587,7 +612,7 @@
                 <w:noProof/>
                 <w:webHidden/>
               </w:rPr>
-              <w:instrText xml:space="preserve"> PAGEREF _Toc239113248 \h </w:instrText>
+              <w:instrText xml:space="preserve"> PAGEREF _Toc239142801 \h </w:instrText>
             </w:r>
             <w:r>
               <w:rPr>
@@ -635,7 +660,7 @@
               <w14:ligatures w14:val="standardContextual"/>
             </w:rPr>
           </w:pPr>
-          <w:hyperlink w:anchor="_Toc239113249" w:history="1">
+          <w:hyperlink w:anchor="_Toc239142802" w:history="1">
             <w:r>
               <w:rPr>
                 <w:rStyle w:val="Hipervnculo"/>
@@ -662,7 +687,7 @@
                 <w:noProof/>
                 <w:webHidden/>
               </w:rPr>
-              <w:instrText xml:space="preserve"> PAGEREF _Toc239113249 \h </w:instrText>
+              <w:instrText xml:space="preserve"> PAGEREF _Toc239142802 \h </w:instrText>
             </w:r>
             <w:r>
               <w:rPr>
@@ -710,7 +735,7 @@
               <w14:ligatures w14:val="standardContextual"/>
             </w:rPr>
           </w:pPr>
-          <w:hyperlink w:anchor="_Toc239113250" w:history="1">
+          <w:hyperlink w:anchor="_Toc239142803" w:history="1">
             <w:r>
               <w:rPr>
                 <w:rStyle w:val="Hipervnculo"/>
@@ -737,7 +762,7 @@
                 <w:noProof/>
                 <w:webHidden/>
               </w:rPr>
-              <w:instrText xml:space="preserve"> PAGEREF _Toc239113250 \h </w:instrText>
+              <w:instrText xml:space="preserve"> PAGEREF _Toc239142803 \h </w:instrText>
             </w:r>
             <w:r>
               <w:rPr>
@@ -785,7 +810,7 @@
               <w14:ligatures w14:val="standardContextual"/>
             </w:rPr>
           </w:pPr>
-          <w:hyperlink w:anchor="_Toc239113251" w:history="1">
+          <w:hyperlink w:anchor="_Toc239142804" w:history="1">
             <w:r>
               <w:rPr>
                 <w:rStyle w:val="Hipervnculo"/>
@@ -812,7 +837,7 @@
                 <w:noProof/>
                 <w:webHidden/>
               </w:rPr>
-              <w:instrText xml:space="preserve"> PAGEREF _Toc239113251 \h </w:instrText>
+              <w:instrText xml:space="preserve"> PAGEREF _Toc239142804 \h </w:instrText>
             </w:r>
             <w:r>
               <w:rPr>
@@ -860,7 +885,7 @@
               <w14:ligatures w14:val="standardContextual"/>
             </w:rPr>
           </w:pPr>
-          <w:hyperlink w:anchor="_Toc239113252" w:history="1">
+          <w:hyperlink w:anchor="_Toc239142805" w:history="1">
             <w:r>
               <w:rPr>
                 <w:rStyle w:val="Hipervnculo"/>
@@ -887,7 +912,7 @@
                 <w:noProof/>
                 <w:webHidden/>
               </w:rPr>
-              <w:instrText xml:space="preserve"> PAGEREF _Toc239113252 \h </w:instrText>
+              <w:instrText xml:space="preserve"> PAGEREF _Toc239142805 \h </w:instrText>
             </w:r>
             <w:r>
               <w:rPr>
@@ -935,7 +960,7 @@
               <w14:ligatures w14:val="standardContextual"/>
             </w:rPr>
           </w:pPr>
-          <w:hyperlink w:anchor="_Toc239113253" w:history="1">
+          <w:hyperlink w:anchor="_Toc239142806" w:history="1">
             <w:r>
               <w:rPr>
                 <w:rStyle w:val="Hipervnculo"/>
@@ -962,7 +987,7 @@
                 <w:noProof/>
                 <w:webHidden/>
               </w:rPr>
-              <w:instrText xml:space="preserve"> PAGEREF _Toc239113253 \h </w:instrText>
+              <w:instrText xml:space="preserve"> PAGEREF _Toc239142806 \h </w:instrText>
             </w:r>
             <w:r>
               <w:rPr>
@@ -1010,7 +1035,7 @@
               <w14:ligatures w14:val="standardContextual"/>
             </w:rPr>
           </w:pPr>
-          <w:hyperlink w:anchor="_Toc239113254" w:history="1">
+          <w:hyperlink w:anchor="_Toc239142807" w:history="1">
             <w:r>
               <w:rPr>
                 <w:rStyle w:val="Hipervnculo"/>
@@ -1037,7 +1062,7 @@
                 <w:noProof/>
                 <w:webHidden/>
               </w:rPr>
-              <w:instrText xml:space="preserve"> PAGEREF _Toc239113254 \h </w:instrText>
+              <w:instrText xml:space="preserve"> PAGEREF _Toc239142807 \h </w:instrText>
             </w:r>
             <w:r>
               <w:rPr>
@@ -1085,7 +1110,7 @@
               <w14:ligatures w14:val="standardContextual"/>
             </w:rPr>
           </w:pPr>
-          <w:hyperlink w:anchor="_Toc239113255" w:history="1">
+          <w:hyperlink w:anchor="_Toc239142808" w:history="1">
             <w:r>
               <w:rPr>
                 <w:rStyle w:val="Hipervnculo"/>
@@ -1112,7 +1137,7 @@
                 <w:noProof/>
                 <w:webHidden/>
               </w:rPr>
-              <w:instrText xml:space="preserve"> PAGEREF _Toc239113255 \h </w:instrText>
+              <w:instrText xml:space="preserve"> PAGEREF _Toc239142808 \h </w:instrText>
             </w:r>
             <w:r>
               <w:rPr>
@@ -1160,7 +1185,7 @@
               <w14:ligatures w14:val="standardContextual"/>
             </w:rPr>
           </w:pPr>
-          <w:hyperlink w:anchor="_Toc239113256" w:history="1">
+          <w:hyperlink w:anchor="_Toc239142809" w:history="1">
             <w:r>
               <w:rPr>
                 <w:rStyle w:val="Hipervnculo"/>
@@ -1187,7 +1212,7 @@
                 <w:noProof/>
                 <w:webHidden/>
               </w:rPr>
-              <w:instrText xml:space="preserve"> PAGEREF _Toc239113256 \h </w:instrText>
+              <w:instrText xml:space="preserve"> PAGEREF _Toc239142809 \h </w:instrText>
             </w:r>
             <w:r>
               <w:rPr>
@@ -1235,7 +1260,7 @@
               <w14:ligatures w14:val="standardContextual"/>
             </w:rPr>
           </w:pPr>
-          <w:hyperlink w:anchor="_Toc239113257" w:history="1">
+          <w:hyperlink w:anchor="_Toc239142810" w:history="1">
             <w:r>
               <w:rPr>
                 <w:rStyle w:val="Hipervnculo"/>
@@ -1262,7 +1287,7 @@
                 <w:noProof/>
                 <w:webHidden/>
               </w:rPr>
-              <w:instrText xml:space="preserve"> PAGEREF _Toc239113257 \h </w:instrText>
+              <w:instrText xml:space="preserve"> PAGEREF _Toc239142810 \h </w:instrText>
             </w:r>
             <w:r>
               <w:rPr>
@@ -1310,7 +1335,7 @@
               <w14:ligatures w14:val="standardContextual"/>
             </w:rPr>
           </w:pPr>
-          <w:hyperlink w:anchor="_Toc239113258" w:history="1">
+          <w:hyperlink w:anchor="_Toc239142811" w:history="1">
             <w:r>
               <w:rPr>
                 <w:rStyle w:val="Hipervnculo"/>
@@ -1337,7 +1362,7 @@
                 <w:noProof/>
                 <w:webHidden/>
               </w:rPr>
-              <w:instrText xml:space="preserve"> PAGEREF _Toc239113258 \h </w:instrText>
+              <w:instrText xml:space="preserve"> PAGEREF _Toc239142811 \h </w:instrText>
             </w:r>
             <w:r>
               <w:rPr>
@@ -1385,7 +1410,7 @@
               <w14:ligatures w14:val="standardContextual"/>
             </w:rPr>
           </w:pPr>
-          <w:hyperlink w:anchor="_Toc239113259" w:history="1">
+          <w:hyperlink w:anchor="_Toc239142812" w:history="1">
             <w:r>
               <w:rPr>
                 <w:rStyle w:val="Hipervnculo"/>
@@ -1412,7 +1437,7 @@
                 <w:noProof/>
                 <w:webHidden/>
               </w:rPr>
-              <w:instrText xml:space="preserve"> PAGEREF _Toc239113259 \h </w:instrText>
+              <w:instrText xml:space="preserve"> PAGEREF _Toc239142812 \h </w:instrText>
             </w:r>
             <w:r>
               <w:rPr>
@@ -1460,7 +1485,7 @@
               <w14:ligatures w14:val="standardContextual"/>
             </w:rPr>
           </w:pPr>
-          <w:hyperlink w:anchor="_Toc239113260" w:history="1">
+          <w:hyperlink w:anchor="_Toc239142813" w:history="1">
             <w:r>
               <w:rPr>
                 <w:rStyle w:val="Hipervnculo"/>
@@ -1487,7 +1512,7 @@
                 <w:noProof/>
                 <w:webHidden/>
               </w:rPr>
-              <w:instrText xml:space="preserve"> PAGEREF _Toc239113260 \h </w:instrText>
+              <w:instrText xml:space="preserve"> PAGEREF _Toc239142813 \h </w:instrText>
             </w:r>
             <w:r>
               <w:rPr>
@@ -1535,7 +1560,7 @@
               <w14:ligatures w14:val="standardContextual"/>
             </w:rPr>
           </w:pPr>
-          <w:hyperlink w:anchor="_Toc239113261" w:history="1">
+          <w:hyperlink w:anchor="_Toc239142814" w:history="1">
             <w:r>
               <w:rPr>
                 <w:rStyle w:val="Hipervnculo"/>
@@ -1562,7 +1587,7 @@
                 <w:noProof/>
                 <w:webHidden/>
               </w:rPr>
-              <w:instrText xml:space="preserve"> PAGEREF _Toc239113261 \h </w:instrText>
+              <w:instrText xml:space="preserve"> PAGEREF _Toc239142814 \h </w:instrText>
             </w:r>
             <w:r>
               <w:rPr>
@@ -1610,7 +1635,7 @@
               <w14:ligatures w14:val="standardContextual"/>
             </w:rPr>
           </w:pPr>
-          <w:hyperlink w:anchor="_Toc239113262" w:history="1">
+          <w:hyperlink w:anchor="_Toc239142815" w:history="1">
             <w:r>
               <w:rPr>
                 <w:rStyle w:val="Hipervnculo"/>
@@ -1637,7 +1662,7 @@
                 <w:noProof/>
                 <w:webHidden/>
               </w:rPr>
-              <w:instrText xml:space="preserve"> PAGEREF _Toc239113262 \h </w:instrText>
+              <w:instrText xml:space="preserve"> PAGEREF _Toc239142815 \h </w:instrText>
             </w:r>
             <w:r>
               <w:rPr>
@@ -1685,7 +1710,7 @@
               <w14:ligatures w14:val="standardContextual"/>
             </w:rPr>
           </w:pPr>
-          <w:hyperlink w:anchor="_Toc239113263" w:history="1">
+          <w:hyperlink w:anchor="_Toc239142816" w:history="1">
             <w:r>
               <w:rPr>
                 <w:rStyle w:val="Hipervnculo"/>
@@ -1712,7 +1737,7 @@
                 <w:noProof/>
                 <w:webHidden/>
               </w:rPr>
-              <w:instrText xml:space="preserve"> PAGEREF _Toc239113263 \h </w:instrText>
+              <w:instrText xml:space="preserve"> PAGEREF _Toc239142816 \h </w:instrText>
             </w:r>
             <w:r>
               <w:rPr>
@@ -1760,7 +1785,7 @@
               <w14:ligatures w14:val="standardContextual"/>
             </w:rPr>
           </w:pPr>
-          <w:hyperlink w:anchor="_Toc239113264" w:history="1">
+          <w:hyperlink w:anchor="_Toc239142817" w:history="1">
             <w:r>
               <w:rPr>
                 <w:rStyle w:val="Hipervnculo"/>
@@ -1787,7 +1812,7 @@
                 <w:noProof/>
                 <w:webHidden/>
               </w:rPr>
-              <w:instrText xml:space="preserve"> PAGEREF _Toc239113264 \h </w:instrText>
+              <w:instrText xml:space="preserve"> PAGEREF _Toc239142817 \h </w:instrText>
             </w:r>
             <w:r>
               <w:rPr>
@@ -1835,7 +1860,7 @@
               <w14:ligatures w14:val="standardContextual"/>
             </w:rPr>
           </w:pPr>
-          <w:hyperlink w:anchor="_Toc239113265" w:history="1">
+          <w:hyperlink w:anchor="_Toc239142818" w:history="1">
             <w:r>
               <w:rPr>
                 <w:rStyle w:val="Hipervnculo"/>
@@ -1862,7 +1887,7 @@
                 <w:noProof/>
                 <w:webHidden/>
               </w:rPr>
-              <w:instrText xml:space="preserve"> PAGEREF _Toc239113265 \h </w:instrText>
+              <w:instrText xml:space="preserve"> PAGEREF _Toc239142818 \h </w:instrText>
             </w:r>
             <w:r>
               <w:rPr>
@@ -1910,7 +1935,7 @@
               <w14:ligatures w14:val="standardContextual"/>
             </w:rPr>
           </w:pPr>
-          <w:hyperlink w:anchor="_Toc239113266" w:history="1">
+          <w:hyperlink w:anchor="_Toc239142819" w:history="1">
             <w:r>
               <w:rPr>
                 <w:rStyle w:val="Hipervnculo"/>
@@ -1937,7 +1962,7 @@
                 <w:noProof/>
                 <w:webHidden/>
               </w:rPr>
-              <w:instrText xml:space="preserve"> PAGEREF _Toc239113266 \h </w:instrText>
+              <w:instrText xml:space="preserve"> PAGEREF _Toc239142819 \h </w:instrText>
             </w:r>
             <w:r>
               <w:rPr>
@@ -1985,7 +2010,7 @@
               <w14:ligatures w14:val="standardContextual"/>
             </w:rPr>
           </w:pPr>
-          <w:hyperlink w:anchor="_Toc239113267" w:history="1">
+          <w:hyperlink w:anchor="_Toc239142820" w:history="1">
             <w:r>
               <w:rPr>
                 <w:rStyle w:val="Hipervnculo"/>
@@ -2012,7 +2037,7 @@
                 <w:noProof/>
                 <w:webHidden/>
               </w:rPr>
-              <w:instrText xml:space="preserve"> PAGEREF _Toc239113267 \h </w:instrText>
+              <w:instrText xml:space="preserve"> PAGEREF _Toc239142820 \h </w:instrText>
             </w:r>
             <w:r>
               <w:rPr>
@@ -2060,7 +2085,7 @@
               <w14:ligatures w14:val="standardContextual"/>
             </w:rPr>
           </w:pPr>
-          <w:hyperlink w:anchor="_Toc239113268" w:history="1">
+          <w:hyperlink w:anchor="_Toc239142821" w:history="1">
             <w:r>
               <w:rPr>
                 <w:rStyle w:val="Hipervnculo"/>
@@ -2087,7 +2112,7 @@
                 <w:noProof/>
                 <w:webHidden/>
               </w:rPr>
-              <w:instrText xml:space="preserve"> PAGEREF _Toc239113268 \h </w:instrText>
+              <w:instrText xml:space="preserve"> PAGEREF _Toc239142821 \h </w:instrText>
             </w:r>
             <w:r>
               <w:rPr>
@@ -2135,7 +2160,7 @@
               <w14:ligatures w14:val="standardContextual"/>
             </w:rPr>
           </w:pPr>
-          <w:hyperlink w:anchor="_Toc239113269" w:history="1">
+          <w:hyperlink w:anchor="_Toc239142822" w:history="1">
             <w:r>
               <w:rPr>
                 <w:rStyle w:val="Hipervnculo"/>
@@ -2162,7 +2187,7 @@
                 <w:noProof/>
                 <w:webHidden/>
               </w:rPr>
-              <w:instrText xml:space="preserve"> PAGEREF _Toc239113269 \h </w:instrText>
+              <w:instrText xml:space="preserve"> PAGEREF _Toc239142822 \h </w:instrText>
             </w:r>
             <w:r>
               <w:rPr>
@@ -2210,7 +2235,7 @@
               <w14:ligatures w14:val="standardContextual"/>
             </w:rPr>
           </w:pPr>
-          <w:hyperlink w:anchor="_Toc239113270" w:history="1">
+          <w:hyperlink w:anchor="_Toc239142823" w:history="1">
             <w:r>
               <w:rPr>
                 <w:rStyle w:val="Hipervnculo"/>
@@ -2237,7 +2262,7 @@
                 <w:noProof/>
                 <w:webHidden/>
               </w:rPr>
-              <w:instrText xml:space="preserve"> PAGEREF _Toc239113270 \h </w:instrText>
+              <w:instrText xml:space="preserve"> PAGEREF _Toc239142823 \h </w:instrText>
             </w:r>
             <w:r>
               <w:rPr>
@@ -2285,7 +2310,7 @@
               <w14:ligatures w14:val="standardContextual"/>
             </w:rPr>
           </w:pPr>
-          <w:hyperlink w:anchor="_Toc239113271" w:history="1">
+          <w:hyperlink w:anchor="_Toc239142824" w:history="1">
             <w:r>
               <w:rPr>
                 <w:rStyle w:val="Hipervnculo"/>
@@ -2312,7 +2337,7 @@
                 <w:noProof/>
                 <w:webHidden/>
               </w:rPr>
-              <w:instrText xml:space="preserve"> PAGEREF _Toc239113271 \h </w:instrText>
+              <w:instrText xml:space="preserve"> PAGEREF _Toc239142824 \h </w:instrText>
             </w:r>
             <w:r>
               <w:rPr>
@@ -2360,7 +2385,7 @@
               <w14:ligatures w14:val="standardContextual"/>
             </w:rPr>
           </w:pPr>
-          <w:hyperlink w:anchor="_Toc239113272" w:history="1">
+          <w:hyperlink w:anchor="_Toc239142825" w:history="1">
             <w:r>
               <w:rPr>
                 <w:rStyle w:val="Hipervnculo"/>
@@ -2387,7 +2412,7 @@
                 <w:noProof/>
                 <w:webHidden/>
               </w:rPr>
-              <w:instrText xml:space="preserve"> PAGEREF _Toc239113272 \h </w:instrText>
+              <w:instrText xml:space="preserve"> PAGEREF _Toc239142825 \h </w:instrText>
             </w:r>
             <w:r>
               <w:rPr>
@@ -2435,7 +2460,7 @@
               <w14:ligatures w14:val="standardContextual"/>
             </w:rPr>
           </w:pPr>
-          <w:hyperlink w:anchor="_Toc239113273" w:history="1">
+          <w:hyperlink w:anchor="_Toc239142826" w:history="1">
             <w:r>
               <w:rPr>
                 <w:rStyle w:val="Hipervnculo"/>
@@ -2462,7 +2487,7 @@
                 <w:noProof/>
                 <w:webHidden/>
               </w:rPr>
-              <w:instrText xml:space="preserve"> PAGEREF _Toc239113273 \h </w:instrText>
+              <w:instrText xml:space="preserve"> PAGEREF _Toc239142826 \h </w:instrText>
             </w:r>
             <w:r>
               <w:rPr>
@@ -2510,7 +2535,7 @@
               <w14:ligatures w14:val="standardContextual"/>
             </w:rPr>
           </w:pPr>
-          <w:hyperlink w:anchor="_Toc239113274" w:history="1">
+          <w:hyperlink w:anchor="_Toc239142827" w:history="1">
             <w:r>
               <w:rPr>
                 <w:rStyle w:val="Hipervnculo"/>
@@ -2537,7 +2562,7 @@
                 <w:noProof/>
                 <w:webHidden/>
               </w:rPr>
-              <w:instrText xml:space="preserve"> PAGEREF _Toc239113274 \h </w:instrText>
+              <w:instrText xml:space="preserve"> PAGEREF _Toc239142827 \h </w:instrText>
             </w:r>
             <w:r>
               <w:rPr>
@@ -2585,7 +2610,7 @@
               <w14:ligatures w14:val="standardContextual"/>
             </w:rPr>
           </w:pPr>
-          <w:hyperlink w:anchor="_Toc239113275" w:history="1">
+          <w:hyperlink w:anchor="_Toc239142828" w:history="1">
             <w:r>
               <w:rPr>
                 <w:rStyle w:val="Hipervnculo"/>
@@ -2612,7 +2637,7 @@
                 <w:noProof/>
                 <w:webHidden/>
               </w:rPr>
-              <w:instrText xml:space="preserve"> PAGEREF _Toc239113275 \h </w:instrText>
+              <w:instrText xml:space="preserve"> PAGEREF _Toc239142828 \h </w:instrText>
             </w:r>
             <w:r>
               <w:rPr>
@@ -2660,7 +2685,7 @@
               <w14:ligatures w14:val="standardContextual"/>
             </w:rPr>
           </w:pPr>
-          <w:hyperlink w:anchor="_Toc239113276" w:history="1">
+          <w:hyperlink w:anchor="_Toc239142829" w:history="1">
             <w:r>
               <w:rPr>
                 <w:rStyle w:val="Hipervnculo"/>
@@ -2687,7 +2712,7 @@
                 <w:noProof/>
                 <w:webHidden/>
               </w:rPr>
-              <w:instrText xml:space="preserve"> PAGEREF _Toc239113276 \h </w:instrText>
+              <w:instrText xml:space="preserve"> PAGEREF _Toc239142829 \h </w:instrText>
             </w:r>
             <w:r>
               <w:rPr>
@@ -2735,7 +2760,7 @@
               <w14:ligatures w14:val="standardContextual"/>
             </w:rPr>
           </w:pPr>
-          <w:hyperlink w:anchor="_Toc239113277" w:history="1">
+          <w:hyperlink w:anchor="_Toc239142830" w:history="1">
             <w:r>
               <w:rPr>
                 <w:rStyle w:val="Hipervnculo"/>
@@ -2762,7 +2787,7 @@
                 <w:noProof/>
                 <w:webHidden/>
               </w:rPr>
-              <w:instrText xml:space="preserve"> PAGEREF _Toc239113277 \h </w:instrText>
+              <w:instrText xml:space="preserve"> PAGEREF _Toc239142830 \h </w:instrText>
             </w:r>
             <w:r>
               <w:rPr>
@@ -2810,7 +2835,7 @@
               <w14:ligatures w14:val="standardContextual"/>
             </w:rPr>
           </w:pPr>
-          <w:hyperlink w:anchor="_Toc239113278" w:history="1">
+          <w:hyperlink w:anchor="_Toc239142831" w:history="1">
             <w:r>
               <w:rPr>
                 <w:rStyle w:val="Hipervnculo"/>
@@ -2837,7 +2862,7 @@
                 <w:noProof/>
                 <w:webHidden/>
               </w:rPr>
-              <w:instrText xml:space="preserve"> PAGEREF _Toc239113278 \h </w:instrText>
+              <w:instrText xml:space="preserve"> PAGEREF _Toc239142831 \h </w:instrText>
             </w:r>
             <w:r>
               <w:rPr>
@@ -2885,7 +2910,7 @@
               <w14:ligatures w14:val="standardContextual"/>
             </w:rPr>
           </w:pPr>
-          <w:hyperlink w:anchor="_Toc239113279" w:history="1">
+          <w:hyperlink w:anchor="_Toc239142832" w:history="1">
             <w:r>
               <w:rPr>
                 <w:rStyle w:val="Hipervnculo"/>
@@ -2912,7 +2937,7 @@
                 <w:noProof/>
                 <w:webHidden/>
               </w:rPr>
-              <w:instrText xml:space="preserve"> PAGEREF _Toc239113279 \h </w:instrText>
+              <w:instrText xml:space="preserve"> PAGEREF _Toc239142832 \h </w:instrText>
             </w:r>
             <w:r>
               <w:rPr>
@@ -2960,7 +2985,7 @@
               <w14:ligatures w14:val="standardContextual"/>
             </w:rPr>
           </w:pPr>
-          <w:hyperlink w:anchor="_Toc239113280" w:history="1">
+          <w:hyperlink w:anchor="_Toc239142833" w:history="1">
             <w:r>
               <w:rPr>
                 <w:rStyle w:val="Hipervnculo"/>
@@ -2987,7 +3012,7 @@
                 <w:noProof/>
                 <w:webHidden/>
               </w:rPr>
-              <w:instrText xml:space="preserve"> PAGEREF _Toc239113280 \h </w:instrText>
+              <w:instrText xml:space="preserve"> PAGEREF _Toc239142833 \h </w:instrText>
             </w:r>
             <w:r>
               <w:rPr>
@@ -3035,7 +3060,7 @@
               <w14:ligatures w14:val="standardContextual"/>
             </w:rPr>
           </w:pPr>
-          <w:hyperlink w:anchor="_Toc239113281" w:history="1">
+          <w:hyperlink w:anchor="_Toc239142834" w:history="1">
             <w:r>
               <w:rPr>
                 <w:rStyle w:val="Hipervnculo"/>
@@ -3062,7 +3087,7 @@
                 <w:noProof/>
                 <w:webHidden/>
               </w:rPr>
-              <w:instrText xml:space="preserve"> PAGEREF _Toc239113281 \h </w:instrText>
+              <w:instrText xml:space="preserve"> PAGEREF _Toc239142834 \h </w:instrText>
             </w:r>
             <w:r>
               <w:rPr>
@@ -3110,7 +3135,7 @@
               <w14:ligatures w14:val="standardContextual"/>
             </w:rPr>
           </w:pPr>
-          <w:hyperlink w:anchor="_Toc239113282" w:history="1">
+          <w:hyperlink w:anchor="_Toc239142835" w:history="1">
             <w:r>
               <w:rPr>
                 <w:rStyle w:val="Hipervnculo"/>
@@ -3137,7 +3162,7 @@
                 <w:noProof/>
                 <w:webHidden/>
               </w:rPr>
-              <w:instrText xml:space="preserve"> PAGEREF _Toc239113282 \h </w:instrText>
+              <w:instrText xml:space="preserve"> PAGEREF _Toc239142835 \h </w:instrText>
             </w:r>
             <w:r>
               <w:rPr>
@@ -3185,7 +3210,7 @@
               <w14:ligatures w14:val="standardContextual"/>
             </w:rPr>
           </w:pPr>
-          <w:hyperlink w:anchor="_Toc239113283" w:history="1">
+          <w:hyperlink w:anchor="_Toc239142836" w:history="1">
             <w:r>
               <w:rPr>
                 <w:rStyle w:val="Hipervnculo"/>
@@ -3213,7 +3238,7 @@
                 <w:noProof/>
                 <w:webHidden/>
               </w:rPr>
-              <w:instrText xml:space="preserve"> PAGEREF _Toc239113283 \h </w:instrText>
+              <w:instrText xml:space="preserve"> PAGEREF _Toc239142836 \h </w:instrText>
             </w:r>
             <w:r>
               <w:rPr>
@@ -3261,7 +3286,7 @@
               <w14:ligatures w14:val="standardContextual"/>
             </w:rPr>
           </w:pPr>
-          <w:hyperlink w:anchor="_Toc239113284" w:history="1">
+          <w:hyperlink w:anchor="_Toc239142837" w:history="1">
             <w:r>
               <w:rPr>
                 <w:rStyle w:val="Hipervnculo"/>
@@ -3289,7 +3314,7 @@
                 <w:noProof/>
                 <w:webHidden/>
               </w:rPr>
-              <w:instrText xml:space="preserve"> PAGEREF _Toc239113284 \h </w:instrText>
+              <w:instrText xml:space="preserve"> PAGEREF _Toc239142837 \h </w:instrText>
             </w:r>
             <w:r>
               <w:rPr>
@@ -3337,7 +3362,7 @@
               <w14:ligatures w14:val="standardContextual"/>
             </w:rPr>
           </w:pPr>
-          <w:hyperlink w:anchor="_Toc239113285" w:history="1">
+          <w:hyperlink w:anchor="_Toc239142838" w:history="1">
             <w:r>
               <w:rPr>
                 <w:rStyle w:val="Hipervnculo"/>
@@ -3365,7 +3390,7 @@
                 <w:noProof/>
                 <w:webHidden/>
               </w:rPr>
-              <w:instrText xml:space="preserve"> PAGEREF _Toc239113285 \h </w:instrText>
+              <w:instrText xml:space="preserve"> PAGEREF _Toc239142838 \h </w:instrText>
             </w:r>
             <w:r>
               <w:rPr>
@@ -3413,7 +3438,7 @@
               <w14:ligatures w14:val="standardContextual"/>
             </w:rPr>
           </w:pPr>
-          <w:hyperlink w:anchor="_Toc239113286" w:history="1">
+          <w:hyperlink w:anchor="_Toc239142839" w:history="1">
             <w:r>
               <w:rPr>
                 <w:rStyle w:val="Hipervnculo"/>
@@ -3441,7 +3466,7 @@
                 <w:noProof/>
                 <w:webHidden/>
               </w:rPr>
-              <w:instrText xml:space="preserve"> PAGEREF _Toc239113286 \h </w:instrText>
+              <w:instrText xml:space="preserve"> PAGEREF _Toc239142839 \h </w:instrText>
             </w:r>
             <w:r>
               <w:rPr>
@@ -3489,7 +3514,7 @@
               <w14:ligatures w14:val="standardContextual"/>
             </w:rPr>
           </w:pPr>
-          <w:hyperlink w:anchor="_Toc239113287" w:history="1">
+          <w:hyperlink w:anchor="_Toc239142840" w:history="1">
             <w:r>
               <w:rPr>
                 <w:rStyle w:val="Hipervnculo"/>
@@ -3517,7 +3542,7 @@
                 <w:noProof/>
                 <w:webHidden/>
               </w:rPr>
-              <w:instrText xml:space="preserve"> PAGEREF _Toc239113287 \h </w:instrText>
+              <w:instrText xml:space="preserve"> PAGEREF _Toc239142840 \h </w:instrText>
             </w:r>
             <w:r>
               <w:rPr>
@@ -3565,7 +3590,7 @@
               <w14:ligatures w14:val="standardContextual"/>
             </w:rPr>
           </w:pPr>
-          <w:hyperlink w:anchor="_Toc239113288" w:history="1">
+          <w:hyperlink w:anchor="_Toc239142841" w:history="1">
             <w:r>
               <w:rPr>
                 <w:rStyle w:val="Hipervnculo"/>
@@ -3592,7 +3617,7 @@
                 <w:noProof/>
                 <w:webHidden/>
               </w:rPr>
-              <w:instrText xml:space="preserve"> PAGEREF _Toc239113288 \h </w:instrText>
+              <w:instrText xml:space="preserve"> PAGEREF _Toc239142841 \h </w:instrText>
             </w:r>
             <w:r>
               <w:rPr>
@@ -3640,7 +3665,7 @@
               <w14:ligatures w14:val="standardContextual"/>
             </w:rPr>
           </w:pPr>
-          <w:hyperlink w:anchor="_Toc239113289" w:history="1">
+          <w:hyperlink w:anchor="_Toc239142842" w:history="1">
             <w:r>
               <w:rPr>
                 <w:rStyle w:val="Hipervnculo"/>
@@ -3667,7 +3692,7 @@
                 <w:noProof/>
                 <w:webHidden/>
               </w:rPr>
-              <w:instrText xml:space="preserve"> PAGEREF _Toc239113289 \h </w:instrText>
+              <w:instrText xml:space="preserve"> PAGEREF _Toc239142842 \h </w:instrText>
             </w:r>
             <w:r>
               <w:rPr>
@@ -3715,7 +3740,7 @@
               <w14:ligatures w14:val="standardContextual"/>
             </w:rPr>
           </w:pPr>
-          <w:hyperlink w:anchor="_Toc239113290" w:history="1">
+          <w:hyperlink w:anchor="_Toc239142843" w:history="1">
             <w:r>
               <w:rPr>
                 <w:rStyle w:val="Hipervnculo"/>
@@ -3742,7 +3767,7 @@
                 <w:noProof/>
                 <w:webHidden/>
               </w:rPr>
-              <w:instrText xml:space="preserve"> PAGEREF _Toc239113290 \h </w:instrText>
+              <w:instrText xml:space="preserve"> PAGEREF _Toc239142843 \h </w:instrText>
             </w:r>
             <w:r>
               <w:rPr>
@@ -3790,7 +3815,7 @@
               <w14:ligatures w14:val="standardContextual"/>
             </w:rPr>
           </w:pPr>
-          <w:hyperlink w:anchor="_Toc239113291" w:history="1">
+          <w:hyperlink w:anchor="_Toc239142844" w:history="1">
             <w:r>
               <w:rPr>
                 <w:rStyle w:val="Hipervnculo"/>
@@ -3817,7 +3842,7 @@
                 <w:noProof/>
                 <w:webHidden/>
               </w:rPr>
-              <w:instrText xml:space="preserve"> PAGEREF _Toc239113291 \h </w:instrText>
+              <w:instrText xml:space="preserve"> PAGEREF _Toc239142844 \h </w:instrText>
             </w:r>
             <w:r>
               <w:rPr>
@@ -3865,7 +3890,7 @@
               <w14:ligatures w14:val="standardContextual"/>
             </w:rPr>
           </w:pPr>
-          <w:hyperlink w:anchor="_Toc239113292" w:history="1">
+          <w:hyperlink w:anchor="_Toc239142845" w:history="1">
             <w:r>
               <w:rPr>
                 <w:rStyle w:val="Hipervnculo"/>
@@ -3892,7 +3917,7 @@
                 <w:noProof/>
                 <w:webHidden/>
               </w:rPr>
-              <w:instrText xml:space="preserve"> PAGEREF _Toc239113292 \h </w:instrText>
+              <w:instrText xml:space="preserve"> PAGEREF _Toc239142845 \h </w:instrText>
             </w:r>
             <w:r>
               <w:rPr>
@@ -3940,7 +3965,7 @@
               <w14:ligatures w14:val="standardContextual"/>
             </w:rPr>
           </w:pPr>
-          <w:hyperlink w:anchor="_Toc239113293" w:history="1">
+          <w:hyperlink w:anchor="_Toc239142846" w:history="1">
             <w:r>
               <w:rPr>
                 <w:rStyle w:val="Hipervnculo"/>
@@ -3967,7 +3992,7 @@
                 <w:noProof/>
                 <w:webHidden/>
               </w:rPr>
-              <w:instrText xml:space="preserve"> PAGEREF _Toc239113293 \h </w:instrText>
+              <w:instrText xml:space="preserve"> PAGEREF _Toc239142846 \h </w:instrText>
             </w:r>
             <w:r>
               <w:rPr>
@@ -4015,7 +4040,7 @@
               <w14:ligatures w14:val="standardContextual"/>
             </w:rPr>
           </w:pPr>
-          <w:hyperlink w:anchor="_Toc239113294" w:history="1">
+          <w:hyperlink w:anchor="_Toc239142847" w:history="1">
             <w:r>
               <w:rPr>
                 <w:rStyle w:val="Hipervnculo"/>
@@ -4042,7 +4067,7 @@
                 <w:noProof/>
                 <w:webHidden/>
               </w:rPr>
-              <w:instrText xml:space="preserve"> PAGEREF _Toc239113294 \h </w:instrText>
+              <w:instrText xml:space="preserve"> PAGEREF _Toc239142847 \h </w:instrText>
             </w:r>
             <w:r>
               <w:rPr>
@@ -4090,7 +4115,7 @@
               <w14:ligatures w14:val="standardContextual"/>
             </w:rPr>
           </w:pPr>
-          <w:hyperlink w:anchor="_Toc239113295" w:history="1">
+          <w:hyperlink w:anchor="_Toc239142848" w:history="1">
             <w:r>
               <w:rPr>
                 <w:rStyle w:val="Hipervnculo"/>
@@ -4117,7 +4142,7 @@
                 <w:noProof/>
                 <w:webHidden/>
               </w:rPr>
-              <w:instrText xml:space="preserve"> PAGEREF _Toc239113295 \h </w:instrText>
+              <w:instrText xml:space="preserve"> PAGEREF _Toc239142848 \h </w:instrText>
             </w:r>
             <w:r>
               <w:rPr>
@@ -4165,7 +4190,7 @@
               <w14:ligatures w14:val="standardContextual"/>
             </w:rPr>
           </w:pPr>
-          <w:hyperlink w:anchor="_Toc239113296" w:history="1">
+          <w:hyperlink w:anchor="_Toc239142849" w:history="1">
             <w:r>
               <w:rPr>
                 <w:rStyle w:val="Hipervnculo"/>
@@ -4192,7 +4217,7 @@
                 <w:noProof/>
                 <w:webHidden/>
               </w:rPr>
-              <w:instrText xml:space="preserve"> PAGEREF _Toc239113296 \h </w:instrText>
+              <w:instrText xml:space="preserve"> PAGEREF _Toc239142849 \h </w:instrText>
             </w:r>
             <w:r>
               <w:rPr>
@@ -4240,7 +4265,7 @@
               <w14:ligatures w14:val="standardContextual"/>
             </w:rPr>
           </w:pPr>
-          <w:hyperlink w:anchor="_Toc239113297" w:history="1">
+          <w:hyperlink w:anchor="_Toc239142850" w:history="1">
             <w:r>
               <w:rPr>
                 <w:rStyle w:val="Hipervnculo"/>
@@ -4267,7 +4292,7 @@
                 <w:noProof/>
                 <w:webHidden/>
               </w:rPr>
-              <w:instrText xml:space="preserve"> PAGEREF _Toc239113297 \h </w:instrText>
+              <w:instrText xml:space="preserve"> PAGEREF _Toc239142850 \h </w:instrText>
             </w:r>
             <w:r>
               <w:rPr>
@@ -4315,7 +4340,7 @@
               <w14:ligatures w14:val="standardContextual"/>
             </w:rPr>
           </w:pPr>
-          <w:hyperlink w:anchor="_Toc239113298" w:history="1">
+          <w:hyperlink w:anchor="_Toc239142851" w:history="1">
             <w:r>
               <w:rPr>
                 <w:rStyle w:val="Hipervnculo"/>
@@ -4342,7 +4367,7 @@
                 <w:noProof/>
                 <w:webHidden/>
               </w:rPr>
-              <w:instrText xml:space="preserve"> PAGEREF _Toc239113298 \h </w:instrText>
+              <w:instrText xml:space="preserve"> PAGEREF _Toc239142851 \h </w:instrText>
             </w:r>
             <w:r>
               <w:rPr>
@@ -4390,7 +4415,7 @@
               <w14:ligatures w14:val="standardContextual"/>
             </w:rPr>
           </w:pPr>
-          <w:hyperlink w:anchor="_Toc239113299" w:history="1">
+          <w:hyperlink w:anchor="_Toc239142852" w:history="1">
             <w:r>
               <w:rPr>
                 <w:rStyle w:val="Hipervnculo"/>
@@ -4417,7 +4442,7 @@
                 <w:noProof/>
                 <w:webHidden/>
               </w:rPr>
-              <w:instrText xml:space="preserve"> PAGEREF _Toc239113299 \h </w:instrText>
+              <w:instrText xml:space="preserve"> PAGEREF _Toc239142852 \h </w:instrText>
             </w:r>
             <w:r>
               <w:rPr>
@@ -4465,7 +4490,7 @@
               <w14:ligatures w14:val="standardContextual"/>
             </w:rPr>
           </w:pPr>
-          <w:hyperlink w:anchor="_Toc239113300" w:history="1">
+          <w:hyperlink w:anchor="_Toc239142853" w:history="1">
             <w:r>
               <w:rPr>
                 <w:rStyle w:val="Hipervnculo"/>
@@ -4492,7 +4517,7 @@
                 <w:noProof/>
                 <w:webHidden/>
               </w:rPr>
-              <w:instrText xml:space="preserve"> PAGEREF _Toc239113300 \h </w:instrText>
+              <w:instrText xml:space="preserve"> PAGEREF _Toc239142853 \h </w:instrText>
             </w:r>
             <w:r>
               <w:rPr>
@@ -4540,7 +4565,7 @@
               <w14:ligatures w14:val="standardContextual"/>
             </w:rPr>
           </w:pPr>
-          <w:hyperlink w:anchor="_Toc239113301" w:history="1">
+          <w:hyperlink w:anchor="_Toc239142854" w:history="1">
             <w:r>
               <w:rPr>
                 <w:rStyle w:val="Hipervnculo"/>
@@ -4567,7 +4592,7 @@
                 <w:noProof/>
                 <w:webHidden/>
               </w:rPr>
-              <w:instrText xml:space="preserve"> PAGEREF _Toc239113301 \h </w:instrText>
+              <w:instrText xml:space="preserve"> PAGEREF _Toc239142854 \h </w:instrText>
             </w:r>
             <w:r>
               <w:rPr>
@@ -4615,7 +4640,7 @@
               <w14:ligatures w14:val="standardContextual"/>
             </w:rPr>
           </w:pPr>
-          <w:hyperlink w:anchor="_Toc239113302" w:history="1">
+          <w:hyperlink w:anchor="_Toc239142855" w:history="1">
             <w:r>
               <w:rPr>
                 <w:rStyle w:val="Hipervnculo"/>
@@ -4642,7 +4667,7 @@
                 <w:noProof/>
                 <w:webHidden/>
               </w:rPr>
-              <w:instrText xml:space="preserve"> PAGEREF _Toc239113302 \h </w:instrText>
+              <w:instrText xml:space="preserve"> PAGEREF _Toc239142855 \h </w:instrText>
             </w:r>
             <w:r>
               <w:rPr>
@@ -4690,7 +4715,7 @@
               <w14:ligatures w14:val="standardContextual"/>
             </w:rPr>
           </w:pPr>
-          <w:hyperlink w:anchor="_Toc239113303" w:history="1">
+          <w:hyperlink w:anchor="_Toc239142856" w:history="1">
             <w:r>
               <w:rPr>
                 <w:rStyle w:val="Hipervnculo"/>
@@ -4717,7 +4742,7 @@
                 <w:noProof/>
                 <w:webHidden/>
               </w:rPr>
-              <w:instrText xml:space="preserve"> PAGEREF _Toc239113303 \h </w:instrText>
+              <w:instrText xml:space="preserve"> PAGEREF _Toc239142856 \h </w:instrText>
             </w:r>
             <w:r>
               <w:rPr>
@@ -4765,7 +4790,7 @@
               <w14:ligatures w14:val="standardContextual"/>
             </w:rPr>
           </w:pPr>
-          <w:hyperlink w:anchor="_Toc239113304" w:history="1">
+          <w:hyperlink w:anchor="_Toc239142857" w:history="1">
             <w:r>
               <w:rPr>
                 <w:rStyle w:val="Hipervnculo"/>
@@ -4792,7 +4817,7 @@
                 <w:noProof/>
                 <w:webHidden/>
               </w:rPr>
-              <w:instrText xml:space="preserve"> PAGEREF _Toc239113304 \h </w:instrText>
+              <w:instrText xml:space="preserve"> PAGEREF _Toc239142857 \h </w:instrText>
             </w:r>
             <w:r>
               <w:rPr>
@@ -4840,7 +4865,7 @@
               <w14:ligatures w14:val="standardContextual"/>
             </w:rPr>
           </w:pPr>
-          <w:hyperlink w:anchor="_Toc239113305" w:history="1">
+          <w:hyperlink w:anchor="_Toc239142858" w:history="1">
             <w:r>
               <w:rPr>
                 <w:rStyle w:val="Hipervnculo"/>
@@ -4867,7 +4892,7 @@
                 <w:noProof/>
                 <w:webHidden/>
               </w:rPr>
-              <w:instrText xml:space="preserve"> PAGEREF _Toc239113305 \h </w:instrText>
+              <w:instrText xml:space="preserve"> PAGEREF _Toc239142858 \h </w:instrText>
             </w:r>
             <w:r>
               <w:rPr>
@@ -4915,7 +4940,7 @@
               <w14:ligatures w14:val="standardContextual"/>
             </w:rPr>
           </w:pPr>
-          <w:hyperlink w:anchor="_Toc239113306" w:history="1">
+          <w:hyperlink w:anchor="_Toc239142859" w:history="1">
             <w:r>
               <w:rPr>
                 <w:rStyle w:val="Hipervnculo"/>
@@ -4942,7 +4967,7 @@
                 <w:noProof/>
                 <w:webHidden/>
               </w:rPr>
-              <w:instrText xml:space="preserve"> PAGEREF _Toc239113306 \h </w:instrText>
+              <w:instrText xml:space="preserve"> PAGEREF _Toc239142859 \h </w:instrText>
             </w:r>
             <w:r>
               <w:rPr>
@@ -4962,7 +4987,7 @@
                 <w:noProof/>
                 <w:webHidden/>
               </w:rPr>
-              <w:t>36</w:t>
+              <w:t>37</w:t>
             </w:r>
             <w:r>
               <w:rPr>
@@ -4990,7 +5015,7 @@
               <w14:ligatures w14:val="standardContextual"/>
             </w:rPr>
           </w:pPr>
-          <w:hyperlink w:anchor="_Toc239113307" w:history="1">
+          <w:hyperlink w:anchor="_Toc239142860" w:history="1">
             <w:r>
               <w:rPr>
                 <w:rStyle w:val="Hipervnculo"/>
@@ -5017,7 +5042,7 @@
                 <w:noProof/>
                 <w:webHidden/>
               </w:rPr>
-              <w:instrText xml:space="preserve"> PAGEREF _Toc239113307 \h </w:instrText>
+              <w:instrText xml:space="preserve"> PAGEREF _Toc239142860 \h </w:instrText>
             </w:r>
             <w:r>
               <w:rPr>
@@ -5037,7 +5062,7 @@
                 <w:noProof/>
                 <w:webHidden/>
               </w:rPr>
-              <w:t>37</w:t>
+              <w:t>42</w:t>
             </w:r>
             <w:r>
               <w:rPr>
@@ -5065,7 +5090,7 @@
               <w14:ligatures w14:val="standardContextual"/>
             </w:rPr>
           </w:pPr>
-          <w:hyperlink w:anchor="_Toc239113308" w:history="1">
+          <w:hyperlink w:anchor="_Toc239142861" w:history="1">
             <w:r>
               <w:rPr>
                 <w:rStyle w:val="Hipervnculo"/>
@@ -5092,7 +5117,7 @@
                 <w:noProof/>
                 <w:webHidden/>
               </w:rPr>
-              <w:instrText xml:space="preserve"> PAGEREF _Toc239113308 \h </w:instrText>
+              <w:instrText xml:space="preserve"> PAGEREF _Toc239142861 \h </w:instrText>
             </w:r>
             <w:r>
               <w:rPr>
@@ -5112,7 +5137,7 @@
                 <w:noProof/>
                 <w:webHidden/>
               </w:rPr>
-              <w:t>37</w:t>
+              <w:t>42</w:t>
             </w:r>
             <w:r>
               <w:rPr>
@@ -5140,7 +5165,7 @@
               <w14:ligatures w14:val="standardContextual"/>
             </w:rPr>
           </w:pPr>
-          <w:hyperlink w:anchor="_Toc239113309" w:history="1">
+          <w:hyperlink w:anchor="_Toc239142862" w:history="1">
             <w:r>
               <w:rPr>
                 <w:rStyle w:val="Hipervnculo"/>
@@ -5167,7 +5192,7 @@
                 <w:noProof/>
                 <w:webHidden/>
               </w:rPr>
-              <w:instrText xml:space="preserve"> PAGEREF _Toc239113309 \h </w:instrText>
+              <w:instrText xml:space="preserve"> PAGEREF _Toc239142862 \h </w:instrText>
             </w:r>
             <w:r>
               <w:rPr>
@@ -5187,7 +5212,7 @@
                 <w:noProof/>
                 <w:webHidden/>
               </w:rPr>
-              <w:t>38</w:t>
+              <w:t>43</w:t>
             </w:r>
             <w:r>
               <w:rPr>
@@ -5215,7 +5240,7 @@
               <w14:ligatures w14:val="standardContextual"/>
             </w:rPr>
           </w:pPr>
-          <w:hyperlink w:anchor="_Toc239113310" w:history="1">
+          <w:hyperlink w:anchor="_Toc239142863" w:history="1">
             <w:r>
               <w:rPr>
                 <w:rStyle w:val="Hipervnculo"/>
@@ -5242,7 +5267,7 @@
                 <w:noProof/>
                 <w:webHidden/>
               </w:rPr>
-              <w:instrText xml:space="preserve"> PAGEREF _Toc239113310 \h </w:instrText>
+              <w:instrText xml:space="preserve"> PAGEREF _Toc239142863 \h </w:instrText>
             </w:r>
             <w:r>
               <w:rPr>
@@ -5262,7 +5287,7 @@
                 <w:noProof/>
                 <w:webHidden/>
               </w:rPr>
-              <w:t>39</w:t>
+              <w:t>44</w:t>
             </w:r>
             <w:r>
               <w:rPr>
@@ -5290,7 +5315,7 @@
               <w14:ligatures w14:val="standardContextual"/>
             </w:rPr>
           </w:pPr>
-          <w:hyperlink w:anchor="_Toc239113311" w:history="1">
+          <w:hyperlink w:anchor="_Toc239142864" w:history="1">
             <w:r>
               <w:rPr>
                 <w:rStyle w:val="Hipervnculo"/>
@@ -5317,7 +5342,7 @@
                 <w:noProof/>
                 <w:webHidden/>
               </w:rPr>
-              <w:instrText xml:space="preserve"> PAGEREF _Toc239113311 \h </w:instrText>
+              <w:instrText xml:space="preserve"> PAGEREF _Toc239142864 \h </w:instrText>
             </w:r>
             <w:r>
               <w:rPr>
@@ -5337,7 +5362,7 @@
                 <w:noProof/>
                 <w:webHidden/>
               </w:rPr>
-              <w:t>40</w:t>
+              <w:t>45</w:t>
             </w:r>
             <w:r>
               <w:rPr>
@@ -5365,7 +5390,7 @@
               <w14:ligatures w14:val="standardContextual"/>
             </w:rPr>
           </w:pPr>
-          <w:hyperlink w:anchor="_Toc239113312" w:history="1">
+          <w:hyperlink w:anchor="_Toc239142865" w:history="1">
             <w:r>
               <w:rPr>
                 <w:rStyle w:val="Hipervnculo"/>
@@ -5393,7 +5418,7 @@
                 <w:noProof/>
                 <w:webHidden/>
               </w:rPr>
-              <w:instrText xml:space="preserve"> PAGEREF _Toc239113312 \h </w:instrText>
+              <w:instrText xml:space="preserve"> PAGEREF _Toc239142865 \h </w:instrText>
             </w:r>
             <w:r>
               <w:rPr>
@@ -5413,7 +5438,7 @@
                 <w:noProof/>
                 <w:webHidden/>
               </w:rPr>
-              <w:t>41</w:t>
+              <w:t>46</w:t>
             </w:r>
             <w:r>
               <w:rPr>
@@ -5441,7 +5466,7 @@
               <w14:ligatures w14:val="standardContextual"/>
             </w:rPr>
           </w:pPr>
-          <w:hyperlink w:anchor="_Toc239113313" w:history="1">
+          <w:hyperlink w:anchor="_Toc239142866" w:history="1">
             <w:r>
               <w:rPr>
                 <w:rStyle w:val="Hipervnculo"/>
@@ -5469,7 +5494,7 @@
                 <w:noProof/>
                 <w:webHidden/>
               </w:rPr>
-              <w:instrText xml:space="preserve"> PAGEREF _Toc239113313 \h </w:instrText>
+              <w:instrText xml:space="preserve"> PAGEREF _Toc239142866 \h </w:instrText>
             </w:r>
             <w:r>
               <w:rPr>
@@ -5489,7 +5514,7 @@
                 <w:noProof/>
                 <w:webHidden/>
               </w:rPr>
-              <w:t>41</w:t>
+              <w:t>46</w:t>
             </w:r>
             <w:r>
               <w:rPr>
@@ -5517,7 +5542,7 @@
               <w14:ligatures w14:val="standardContextual"/>
             </w:rPr>
           </w:pPr>
-          <w:hyperlink w:anchor="_Toc239113314" w:history="1">
+          <w:hyperlink w:anchor="_Toc239142867" w:history="1">
             <w:r>
               <w:rPr>
                 <w:rStyle w:val="Hipervnculo"/>
@@ -5545,7 +5570,7 @@
                 <w:noProof/>
                 <w:webHidden/>
               </w:rPr>
-              <w:instrText xml:space="preserve"> PAGEREF _Toc239113314 \h </w:instrText>
+              <w:instrText xml:space="preserve"> PAGEREF _Toc239142867 \h </w:instrText>
             </w:r>
             <w:r>
               <w:rPr>
@@ -5565,7 +5590,7 @@
                 <w:noProof/>
                 <w:webHidden/>
               </w:rPr>
-              <w:t>42</w:t>
+              <w:t>47</w:t>
             </w:r>
             <w:r>
               <w:rPr>
@@ -5593,7 +5618,7 @@
               <w14:ligatures w14:val="standardContextual"/>
             </w:rPr>
           </w:pPr>
-          <w:hyperlink w:anchor="_Toc239113315" w:history="1">
+          <w:hyperlink w:anchor="_Toc239142868" w:history="1">
             <w:r>
               <w:rPr>
                 <w:rStyle w:val="Hipervnculo"/>
@@ -5621,7 +5646,7 @@
                 <w:noProof/>
                 <w:webHidden/>
               </w:rPr>
-              <w:instrText xml:space="preserve"> PAGEREF _Toc239113315 \h </w:instrText>
+              <w:instrText xml:space="preserve"> PAGEREF _Toc239142868 \h </w:instrText>
             </w:r>
             <w:r>
               <w:rPr>
@@ -5641,7 +5666,7 @@
                 <w:noProof/>
                 <w:webHidden/>
               </w:rPr>
-              <w:t>42</w:t>
+              <w:t>47</w:t>
             </w:r>
             <w:r>
               <w:rPr>
@@ -5669,7 +5694,7 @@
               <w14:ligatures w14:val="standardContextual"/>
             </w:rPr>
           </w:pPr>
-          <w:hyperlink w:anchor="_Toc239113316" w:history="1">
+          <w:hyperlink w:anchor="_Toc239142869" w:history="1">
             <w:r>
               <w:rPr>
                 <w:rStyle w:val="Hipervnculo"/>
@@ -5697,7 +5722,7 @@
                 <w:noProof/>
                 <w:webHidden/>
               </w:rPr>
-              <w:instrText xml:space="preserve"> PAGEREF _Toc239113316 \h </w:instrText>
+              <w:instrText xml:space="preserve"> PAGEREF _Toc239142869 \h </w:instrText>
             </w:r>
             <w:r>
               <w:rPr>
@@ -5717,7 +5742,7 @@
                 <w:noProof/>
                 <w:webHidden/>
               </w:rPr>
-              <w:t>42</w:t>
+              <w:t>47</w:t>
             </w:r>
             <w:r>
               <w:rPr>
@@ -5745,7 +5770,7 @@
               <w14:ligatures w14:val="standardContextual"/>
             </w:rPr>
           </w:pPr>
-          <w:hyperlink w:anchor="_Toc239113317" w:history="1">
+          <w:hyperlink w:anchor="_Toc239142870" w:history="1">
             <w:r>
               <w:rPr>
                 <w:rStyle w:val="Hipervnculo"/>
@@ -5773,7 +5798,7 @@
                 <w:noProof/>
                 <w:webHidden/>
               </w:rPr>
-              <w:instrText xml:space="preserve"> PAGEREF _Toc239113317 \h </w:instrText>
+              <w:instrText xml:space="preserve"> PAGEREF _Toc239142870 \h </w:instrText>
             </w:r>
             <w:r>
               <w:rPr>
@@ -5793,7 +5818,7 @@
                 <w:noProof/>
                 <w:webHidden/>
               </w:rPr>
-              <w:t>43</w:t>
+              <w:t>48</w:t>
             </w:r>
             <w:r>
               <w:rPr>
@@ -5821,7 +5846,7 @@
               <w14:ligatures w14:val="standardContextual"/>
             </w:rPr>
           </w:pPr>
-          <w:hyperlink w:anchor="_Toc239113318" w:history="1">
+          <w:hyperlink w:anchor="_Toc239142871" w:history="1">
             <w:r>
               <w:rPr>
                 <w:rStyle w:val="Hipervnculo"/>
@@ -5849,7 +5874,7 @@
                 <w:noProof/>
                 <w:webHidden/>
               </w:rPr>
-              <w:instrText xml:space="preserve"> PAGEREF _Toc239113318 \h </w:instrText>
+              <w:instrText xml:space="preserve"> PAGEREF _Toc239142871 \h </w:instrText>
             </w:r>
             <w:r>
               <w:rPr>
@@ -5869,7 +5894,7 @@
                 <w:noProof/>
                 <w:webHidden/>
               </w:rPr>
-              <w:t>44</w:t>
+              <w:t>49</w:t>
             </w:r>
             <w:r>
               <w:rPr>
@@ -5897,7 +5922,7 @@
               <w14:ligatures w14:val="standardContextual"/>
             </w:rPr>
           </w:pPr>
-          <w:hyperlink w:anchor="_Toc239113319" w:history="1">
+          <w:hyperlink w:anchor="_Toc239142872" w:history="1">
             <w:r>
               <w:rPr>
                 <w:rStyle w:val="Hipervnculo"/>
@@ -5924,7 +5949,7 @@
                 <w:noProof/>
                 <w:webHidden/>
               </w:rPr>
-              <w:instrText xml:space="preserve"> PAGEREF _Toc239113319 \h </w:instrText>
+              <w:instrText xml:space="preserve"> PAGEREF _Toc239142872 \h </w:instrText>
             </w:r>
             <w:r>
               <w:rPr>
@@ -5944,7 +5969,7 @@
                 <w:noProof/>
                 <w:webHidden/>
               </w:rPr>
-              <w:t>44</w:t>
+              <w:t>49</w:t>
             </w:r>
             <w:r>
               <w:rPr>
@@ -5972,7 +5997,7 @@
               <w14:ligatures w14:val="standardContextual"/>
             </w:rPr>
           </w:pPr>
-          <w:hyperlink w:anchor="_Toc239113320" w:history="1">
+          <w:hyperlink w:anchor="_Toc239142873" w:history="1">
             <w:r>
               <w:rPr>
                 <w:rStyle w:val="Hipervnculo"/>
@@ -6000,7 +6025,7 @@
                 <w:noProof/>
                 <w:webHidden/>
               </w:rPr>
-              <w:instrText xml:space="preserve"> PAGEREF _Toc239113320 \h </w:instrText>
+              <w:instrText xml:space="preserve"> PAGEREF _Toc239142873 \h </w:instrText>
             </w:r>
             <w:r>
               <w:rPr>
@@ -6020,7 +6045,7 @@
                 <w:noProof/>
                 <w:webHidden/>
               </w:rPr>
-              <w:t>45</w:t>
+              <w:t>50</w:t>
             </w:r>
             <w:r>
               <w:rPr>
@@ -6048,7 +6073,7 @@
               <w14:ligatures w14:val="standardContextual"/>
             </w:rPr>
           </w:pPr>
-          <w:hyperlink w:anchor="_Toc239113321" w:history="1">
+          <w:hyperlink w:anchor="_Toc239142874" w:history="1">
             <w:r>
               <w:rPr>
                 <w:rStyle w:val="Hipervnculo"/>
@@ -6075,7 +6100,7 @@
                 <w:noProof/>
                 <w:webHidden/>
               </w:rPr>
-              <w:instrText xml:space="preserve"> PAGEREF _Toc239113321 \h </w:instrText>
+              <w:instrText xml:space="preserve"> PAGEREF _Toc239142874 \h </w:instrText>
             </w:r>
             <w:r>
               <w:rPr>
@@ -6095,7 +6120,7 @@
                 <w:noProof/>
                 <w:webHidden/>
               </w:rPr>
-              <w:t>45</w:t>
+              <w:t>50</w:t>
             </w:r>
             <w:r>
               <w:rPr>
@@ -6121,7 +6146,7 @@
       <w:pPr>
         <w:pStyle w:val="Ttulo1"/>
       </w:pPr>
-      <w:bookmarkStart w:id="5" w:name="_Toc239113253"/>
+      <w:bookmarkStart w:id="5" w:name="_Toc239142806"/>
       <w:r>
         <w:lastRenderedPageBreak/>
         <w:t>Introducción</w:t>
@@ -6229,7 +6254,7 @@
       <w:pPr>
         <w:pStyle w:val="Ttulo1"/>
       </w:pPr>
-      <w:bookmarkStart w:id="6" w:name="_Toc239113254"/>
+      <w:bookmarkStart w:id="6" w:name="_Toc239142807"/>
       <w:r>
         <w:lastRenderedPageBreak/>
         <w:t>Marco teórico del phishing</w:t>
@@ -6240,7 +6265,7 @@
       <w:pPr>
         <w:pStyle w:val="Ttulo2"/>
       </w:pPr>
-      <w:bookmarkStart w:id="7" w:name="_Toc239113255"/>
+      <w:bookmarkStart w:id="7" w:name="_Toc239142808"/>
       <w:r>
         <w:t>Concepto y contexto actual</w:t>
       </w:r>
@@ -6282,7 +6307,7 @@
       <w:pPr>
         <w:pStyle w:val="Ttulo2"/>
       </w:pPr>
-      <w:bookmarkStart w:id="8" w:name="_Toc239113256"/>
+      <w:bookmarkStart w:id="8" w:name="_Toc239142809"/>
       <w:r>
         <w:t>Fases de un ataque de phishing</w:t>
       </w:r>
@@ -6515,7 +6540,7 @@
       <w:pPr>
         <w:pStyle w:val="Ttulo3"/>
       </w:pPr>
-      <w:bookmarkStart w:id="9" w:name="_Toc239113257"/>
+      <w:bookmarkStart w:id="9" w:name="_Toc239142810"/>
       <w:r>
         <w:t>Preparación y Recopilación de Información (Reconocimiento)</w:t>
       </w:r>
@@ -6581,7 +6606,7 @@
       <w:pPr>
         <w:pStyle w:val="Ttulo3"/>
       </w:pPr>
-      <w:bookmarkStart w:id="10" w:name="_Toc239113258"/>
+      <w:bookmarkStart w:id="10" w:name="_Toc239142811"/>
       <w:r>
         <w:t>Creación y Lanzamiento del Cebo (Setup y Ataque)</w:t>
       </w:r>
@@ -6665,7 +6690,7 @@
           <w:noProof/>
         </w:rPr>
         <w:drawing>
-          <wp:inline distT="0" distB="0" distL="0" distR="0" wp14:anchorId="5F2B1234" wp14:editId="15618109">
+          <wp:inline distT="0" distB="0" distL="0" distR="0" wp14:anchorId="5F2B1234" wp14:editId="52A8BEEC">
             <wp:extent cx="5398135" cy="3598545"/>
             <wp:effectExtent l="0" t="0" r="0" b="1905"/>
             <wp:docPr id="2138688316" name="Imagen 4" descr="Figura o captura del sistema de detección, imagen 2." title="Figura del TFG 2"/>
@@ -6718,7 +6743,7 @@
       <w:pPr>
         <w:pStyle w:val="Ttulo3"/>
       </w:pPr>
-      <w:bookmarkStart w:id="11" w:name="_Toc239113259"/>
+      <w:bookmarkStart w:id="11" w:name="_Toc239142812"/>
       <w:r>
         <w:t>Interacción y Explotación (Colección Inicial)</w:t>
       </w:r>
@@ -6783,7 +6808,7 @@
       <w:pPr>
         <w:pStyle w:val="Ttulo3"/>
       </w:pPr>
-      <w:bookmarkStart w:id="12" w:name="_Toc239113260"/>
+      <w:bookmarkStart w:id="12" w:name="_Toc239142813"/>
       <w:r>
         <w:t>Adquisición y Monetización de los Datos</w:t>
       </w:r>
@@ -7431,7 +7456,7 @@
       <w:pPr>
         <w:pStyle w:val="Ttulo3"/>
       </w:pPr>
-      <w:bookmarkStart w:id="13" w:name="_Toc239113261"/>
+      <w:bookmarkStart w:id="13" w:name="_Toc239142814"/>
       <w:r>
         <w:t>Comparación crítica de modelos de fases</w:t>
       </w:r>
@@ -8072,7 +8097,7 @@
         <w:pStyle w:val="Ttulo3"/>
         <w:spacing w:line="278" w:lineRule="auto"/>
       </w:pPr>
-      <w:bookmarkStart w:id="14" w:name="_Toc239113262"/>
+      <w:bookmarkStart w:id="14" w:name="_Toc239142815"/>
       <w:r>
         <w:lastRenderedPageBreak/>
         <w:t>Puntos de intervención y controles</w:t>
@@ -8678,7 +8703,7 @@
       <w:pPr>
         <w:pStyle w:val="Ttulo2"/>
       </w:pPr>
-      <w:bookmarkStart w:id="15" w:name="_Toc239113263"/>
+      <w:bookmarkStart w:id="15" w:name="_Toc239142816"/>
       <w:r>
         <w:t>Tipos, clasificación y evolución de los ataques de phishing</w:t>
       </w:r>
@@ -8688,7 +8713,7 @@
       <w:pPr>
         <w:pStyle w:val="Ttulo3"/>
       </w:pPr>
-      <w:bookmarkStart w:id="16" w:name="_Toc239113264"/>
+      <w:bookmarkStart w:id="16" w:name="_Toc239142817"/>
       <w:r>
         <w:t>Introducción a la clasificación</w:t>
       </w:r>
@@ -8706,7 +8731,7 @@
       <w:pPr>
         <w:pStyle w:val="Ttulo3"/>
       </w:pPr>
-      <w:bookmarkStart w:id="17" w:name="_Toc239113265"/>
+      <w:bookmarkStart w:id="17" w:name="_Toc239142818"/>
       <w:r>
         <w:t>Clasificación según el vector de entrega</w:t>
       </w:r>
@@ -8780,7 +8805,7 @@
       <w:pPr>
         <w:pStyle w:val="Ttulo3"/>
       </w:pPr>
-      <w:bookmarkStart w:id="18" w:name="_Toc239113266"/>
+      <w:bookmarkStart w:id="18" w:name="_Toc239142819"/>
       <w:r>
         <w:t>Clasificación según el grado de personalización y objetivo</w:t>
       </w:r>
@@ -8858,7 +8883,7 @@
       <w:pPr>
         <w:pStyle w:val="Ttulo3"/>
       </w:pPr>
-      <w:bookmarkStart w:id="19" w:name="_Toc239113267"/>
+      <w:bookmarkStart w:id="19" w:name="_Toc239142820"/>
       <w:r>
         <w:t>Clasificación según la técnica de explotación</w:t>
       </w:r>
@@ -8928,7 +8953,7 @@
       <w:pPr>
         <w:pStyle w:val="Ttulo3"/>
       </w:pPr>
-      <w:bookmarkStart w:id="20" w:name="_Toc239113268"/>
+      <w:bookmarkStart w:id="20" w:name="_Toc239142821"/>
       <w:r>
         <w:t>Evolución histórica resumida</w:t>
       </w:r>
@@ -9026,7 +9051,7 @@
       <w:pPr>
         <w:pStyle w:val="Ttulo3"/>
       </w:pPr>
-      <w:bookmarkStart w:id="21" w:name="_Toc239113269"/>
+      <w:bookmarkStart w:id="21" w:name="_Toc239142822"/>
       <w:r>
         <w:t>Impacto actual (2025)</w:t>
       </w:r>
@@ -9052,7 +9077,7 @@
       <w:pPr>
         <w:pStyle w:val="Ttulo2"/>
       </w:pPr>
-      <w:bookmarkStart w:id="22" w:name="_Toc239113270"/>
+      <w:bookmarkStart w:id="22" w:name="_Toc239142823"/>
       <w:r>
         <w:t>La ingeniería social como fundamento psicológico y sociotécnico del phishing</w:t>
       </w:r>
@@ -9070,7 +9095,7 @@
       <w:pPr>
         <w:pStyle w:val="Ttulo3"/>
       </w:pPr>
-      <w:bookmarkStart w:id="23" w:name="_Toc239113271"/>
+      <w:bookmarkStart w:id="23" w:name="_Toc239142824"/>
       <w:r>
         <w:lastRenderedPageBreak/>
         <w:t>Principios psicológicos fundamentales explotados</w:t>
@@ -9723,7 +9748,7 @@
       <w:pPr>
         <w:pStyle w:val="Ttulo3"/>
       </w:pPr>
-      <w:bookmarkStart w:id="24" w:name="_Toc239113272"/>
+      <w:bookmarkStart w:id="24" w:name="_Toc239142825"/>
       <w:r>
         <w:t>Sesgos cognitivos específicos explotados</w:t>
       </w:r>
@@ -9797,7 +9822,7 @@
       <w:pPr>
         <w:pStyle w:val="Ttulo3"/>
       </w:pPr>
-      <w:bookmarkStart w:id="25" w:name="_Toc239113273"/>
+      <w:bookmarkStart w:id="25" w:name="_Toc239142826"/>
       <w:r>
         <w:t>El impacto de la inteligencia artificial generativa en la ingeniería social (2023-2025)</w:t>
       </w:r>
@@ -9858,7 +9883,7 @@
       <w:pPr>
         <w:pStyle w:val="Ttulo3"/>
       </w:pPr>
-      <w:bookmarkStart w:id="26" w:name="_Toc239113274"/>
+      <w:bookmarkStart w:id="26" w:name="_Toc239142827"/>
       <w:r>
         <w:t>Consecuencias organizativas y humanas</w:t>
       </w:r>
@@ -9884,7 +9909,7 @@
       <w:pPr>
         <w:pStyle w:val="Ttulo3"/>
       </w:pPr>
-      <w:bookmarkStart w:id="27" w:name="_Toc239113275"/>
+      <w:bookmarkStart w:id="27" w:name="_Toc239142828"/>
       <w:r>
         <w:t>Implicaciones para la detección</w:t>
       </w:r>
@@ -9963,7 +9988,7 @@
       <w:pPr>
         <w:pStyle w:val="Ttulo1"/>
       </w:pPr>
-      <w:bookmarkStart w:id="28" w:name="_Toc239113276"/>
+      <w:bookmarkStart w:id="28" w:name="_Toc239142829"/>
       <w:r>
         <w:lastRenderedPageBreak/>
         <w:t>Estado del arte en técnicas de detección y prevención de phishing basadas en Machine Learning y Deep Learning (2018-2025)</w:t>
@@ -10004,7 +10029,7 @@
       <w:pPr>
         <w:pStyle w:val="Ttulo2"/>
       </w:pPr>
-      <w:bookmarkStart w:id="29" w:name="_Toc239113277"/>
+      <w:bookmarkStart w:id="29" w:name="_Toc239142830"/>
       <w:r>
         <w:t>Evolución de los enfoques de detección</w:t>
       </w:r>
@@ -10076,7 +10101,7 @@
       <w:pPr>
         <w:pStyle w:val="Ttulo2"/>
       </w:pPr>
-      <w:bookmarkStart w:id="30" w:name="_Toc239113278"/>
+      <w:bookmarkStart w:id="30" w:name="_Toc239142831"/>
       <w:r>
         <w:t>Técnicas clásicas de Machine Learning (representativas 2019-2022)</w:t>
       </w:r>
@@ -10992,7 +11017,7 @@
       <w:pPr>
         <w:pStyle w:val="Ttulo2"/>
       </w:pPr>
-      <w:bookmarkStart w:id="31" w:name="_Toc239113279"/>
+      <w:bookmarkStart w:id="31" w:name="_Toc239142832"/>
       <w:r>
         <w:t>Técnicas de Deep Learning y Transformers (2023-2025)</w:t>
       </w:r>
@@ -12586,7 +12611,7 @@
       <w:pPr>
         <w:pStyle w:val="Ttulo2"/>
       </w:pPr>
-      <w:bookmarkStart w:id="32" w:name="_Toc239113280"/>
+      <w:bookmarkStart w:id="32" w:name="_Toc239142833"/>
       <w:r>
         <w:t>Enfoques híbridos y basados en comportamiento (UEBA)</w:t>
       </w:r>
@@ -12673,7 +12698,7 @@
       <w:pPr>
         <w:pStyle w:val="Ttulo2"/>
       </w:pPr>
-      <w:bookmarkStart w:id="33" w:name="_Toc239113281"/>
+      <w:bookmarkStart w:id="33" w:name="_Toc239142834"/>
       <w:r>
         <w:t>Limitaciones actuales de los enfoques</w:t>
       </w:r>
@@ -12773,7 +12798,7 @@
       <w:pPr>
         <w:pStyle w:val="Ttulo2"/>
       </w:pPr>
-      <w:bookmarkStart w:id="34" w:name="_Toc239113282"/>
+      <w:bookmarkStart w:id="34" w:name="_Toc239142835"/>
       <w:r>
         <w:t>Conclusiones del estado del arte y hueco de investigación</w:t>
       </w:r>
@@ -12862,7 +12887,7 @@
           <w:bCs/>
         </w:rPr>
       </w:pPr>
-      <w:bookmarkStart w:id="35" w:name="_Toc239113283"/>
+      <w:bookmarkStart w:id="35" w:name="_Toc239142836"/>
       <w:r>
         <w:rPr>
           <w:bCs/>
@@ -12883,7 +12908,7 @@
           <w:bCs/>
         </w:rPr>
       </w:pPr>
-      <w:bookmarkStart w:id="36" w:name="_Toc239113284"/>
+      <w:bookmarkStart w:id="36" w:name="_Toc239142837"/>
       <w:r>
         <w:rPr>
           <w:bCs/>
@@ -12925,7 +12950,7 @@
           <w:bCs/>
         </w:rPr>
       </w:pPr>
-      <w:bookmarkStart w:id="37" w:name="_Toc239113285"/>
+      <w:bookmarkStart w:id="37" w:name="_Toc239142838"/>
       <w:r>
         <w:rPr>
           <w:bCs/>
@@ -13824,7 +13849,7 @@
           <w:bCs/>
         </w:rPr>
       </w:pPr>
-      <w:bookmarkStart w:id="38" w:name="_Toc239113286"/>
+      <w:bookmarkStart w:id="38" w:name="_Toc239142839"/>
       <w:r>
         <w:rPr>
           <w:bCs/>
@@ -14531,7 +14556,7 @@
           <w:bCs/>
         </w:rPr>
       </w:pPr>
-      <w:bookmarkStart w:id="39" w:name="_Toc239113287"/>
+      <w:bookmarkStart w:id="39" w:name="_Toc239142840"/>
       <w:r>
         <w:rPr>
           <w:bCs/>
@@ -14558,7 +14583,7 @@
       <w:pPr>
         <w:pStyle w:val="Ttulo2"/>
       </w:pPr>
-      <w:bookmarkStart w:id="40" w:name="_Toc239113288"/>
+      <w:bookmarkStart w:id="40" w:name="_Toc239142841"/>
       <w:r>
         <w:t>Aspectos éticos y de protección de datos</w:t>
       </w:r>
@@ -14578,7 +14603,7 @@
       <w:pPr>
         <w:pStyle w:val="Ttulo1"/>
       </w:pPr>
-      <w:bookmarkStart w:id="41" w:name="_Toc239113289"/>
+      <w:bookmarkStart w:id="41" w:name="_Toc239142842"/>
       <w:r>
         <w:lastRenderedPageBreak/>
         <w:t>Diseño e implementación de la aplicación web</w:t>
@@ -14615,7 +14640,7 @@
           <w:rFonts w:eastAsiaTheme="minorEastAsia"/>
         </w:rPr>
       </w:pPr>
-      <w:bookmarkStart w:id="42" w:name="_Toc239113290"/>
+      <w:bookmarkStart w:id="42" w:name="_Toc239142843"/>
       <w:r>
         <w:rPr>
           <w:rFonts w:eastAsiaTheme="minorEastAsia"/>
@@ -14651,7 +14676,7 @@
       <w:pPr>
         <w:pStyle w:val="Ttulo2"/>
       </w:pPr>
-      <w:bookmarkStart w:id="43" w:name="_Toc239113291"/>
+      <w:bookmarkStart w:id="43" w:name="_Toc239142844"/>
       <w:r>
         <w:t>Cambios respecto a la propuesta inicial</w:t>
       </w:r>
@@ -15240,7 +15265,7 @@
           <w:rFonts w:eastAsiaTheme="minorEastAsia"/>
         </w:rPr>
       </w:pPr>
-      <w:bookmarkStart w:id="44" w:name="_Toc239113292"/>
+      <w:bookmarkStart w:id="44" w:name="_Toc239142845"/>
       <w:r>
         <w:rPr>
           <w:rFonts w:eastAsiaTheme="minorEastAsia"/>
@@ -15292,7 +15317,7 @@
           <w:rFonts w:eastAsiaTheme="minorEastAsia"/>
         </w:rPr>
       </w:pPr>
-      <w:bookmarkStart w:id="45" w:name="_Toc239113293"/>
+      <w:bookmarkStart w:id="45" w:name="_Toc239142846"/>
       <w:r>
         <w:rPr>
           <w:rFonts w:eastAsiaTheme="minorEastAsia"/>
@@ -15361,7 +15386,7 @@
           <w:rFonts w:eastAsiaTheme="minorEastAsia"/>
         </w:rPr>
       </w:pPr>
-      <w:bookmarkStart w:id="46" w:name="_Toc239113294"/>
+      <w:bookmarkStart w:id="46" w:name="_Toc239142847"/>
       <w:r>
         <w:rPr>
           <w:rFonts w:eastAsiaTheme="minorEastAsia"/>
@@ -15439,7 +15464,7 @@
           <w:rFonts w:eastAsiaTheme="minorEastAsia"/>
         </w:rPr>
       </w:pPr>
-      <w:bookmarkStart w:id="47" w:name="_Toc239113295"/>
+      <w:bookmarkStart w:id="47" w:name="_Toc239142848"/>
       <w:r>
         <w:rPr>
           <w:rFonts w:eastAsiaTheme="minorEastAsia"/>
@@ -15489,7 +15514,7 @@
           <w:rFonts w:eastAsiaTheme="minorEastAsia"/>
         </w:rPr>
       </w:pPr>
-      <w:bookmarkStart w:id="48" w:name="_Toc239113296"/>
+      <w:bookmarkStart w:id="48" w:name="_Toc239142849"/>
       <w:r>
         <w:rPr>
           <w:rFonts w:eastAsiaTheme="minorEastAsia"/>
@@ -15535,7 +15560,7 @@
       <w:pPr>
         <w:pStyle w:val="Ttulo2"/>
       </w:pPr>
-      <w:bookmarkStart w:id="49" w:name="_Toc239113297"/>
+      <w:bookmarkStart w:id="49" w:name="_Toc239142850"/>
       <w:r>
         <w:t>Diseño modular</w:t>
       </w:r>
@@ -15578,7 +15603,7 @@
       <w:pPr>
         <w:pStyle w:val="Ttulo2"/>
       </w:pPr>
-      <w:bookmarkStart w:id="50" w:name="_Toc239113298"/>
+      <w:bookmarkStart w:id="50" w:name="_Toc239142851"/>
       <w:r>
         <w:rPr>
           <w:rFonts w:eastAsiaTheme="minorEastAsia"/>
@@ -15622,7 +15647,7 @@
       <w:pPr>
         <w:pStyle w:val="Ttulo1"/>
       </w:pPr>
-      <w:bookmarkStart w:id="51" w:name="_Toc239113299"/>
+      <w:bookmarkStart w:id="51" w:name="_Toc239142852"/>
       <w:r>
         <w:lastRenderedPageBreak/>
         <w:t>Pruebas, resultados y discusión</w:t>
@@ -15633,7 +15658,7 @@
       <w:pPr>
         <w:pStyle w:val="Ttulo2"/>
       </w:pPr>
-      <w:bookmarkStart w:id="52" w:name="_Toc239113300"/>
+      <w:bookmarkStart w:id="52" w:name="_Toc239142853"/>
       <w:r>
         <w:t>Pruebas unitarias y de integración</w:t>
       </w:r>
@@ -15653,7 +15678,7 @@
       <w:pPr>
         <w:pStyle w:val="Ttulo2"/>
       </w:pPr>
-      <w:bookmarkStart w:id="53" w:name="_Toc239113301"/>
+      <w:bookmarkStart w:id="53" w:name="_Toc239142854"/>
       <w:r>
         <w:t>Rendimiento y eficiencia de arranque</w:t>
       </w:r>
@@ -15678,7 +15703,7 @@
       <w:pPr>
         <w:pStyle w:val="Ttulo2"/>
       </w:pPr>
-      <w:bookmarkStart w:id="54" w:name="_Toc239113302"/>
+      <w:bookmarkStart w:id="54" w:name="_Toc239142855"/>
       <w:r>
         <w:t>Diseño experimental y datasets</w:t>
       </w:r>
@@ -15686,10 +15711,7 @@
     </w:p>
     <w:p>
       <w:r>
-        <w:t>El protocolo reproducible fija las fuentes, licencias y SHA-256 sin versionar los mensajes. En español se combinan el split de entrenamiento de softecapps/spam_ham_spanish (Hugging Face, DOI 10.57967/hf/2264) y SMS Spam Mexico (Kaggle). Tras retirar 147 copias, dos filas contradictorias y una coincidencia con la prueba quedan 1.148 textos. Las 209 filas del split oficial se reservan para probar. En inglés se utiliza únicamente phishing_email.csv (Kaggle), porque ya agrega CEAS, Enron, Ling, Nazario, Nigeria</w:t>
-      </w:r>
-      <w:r>
-        <w:t>n Fraud y SpamAssassin: añadir también esos seis CSV duplicaba el corpus. Tras retirar 408 copias quedan 82.077 textos, divididos de forma estratificada 80/20 con semilla 42. Los joblib guardan el pipeline y estos metadatos, nunca el texto bruto.</w:t>
+        <w:t>El protocolo reproducible fija las fuentes, licencias y SHA-256 sin versionar los mensajes. En español se combinan el split de entrenamiento de softecapps/spam_ham_spanish (Hugging Face, DOI 10.57967/hf/2264) y SMS Spam Mexico (Kaggle). Tras retirar 147 copias, dos filas contradictorias y una coincidencia con la prueba quedan 1.148 textos. Las 209 filas del split oficial se reservan para probar. En inglés se utiliza únicamente phishing_email.csv (Kaggle), porque ya agrega CEAS, Enron, Ling, Nazario, Nigerian Fraud y SpamAssassin: añadir también esos seis CSV duplicaba el corpus. Tras retirar 408 copias quedan 82.077 textos, divididos de forma estratificada 80/20 con semilla 42. Los joblib guardan el pipeline y estos metadatos, nunca el texto bruto.</w:t>
       </w:r>
     </w:p>
     <w:p>
@@ -17153,10 +17175,7 @@
     </w:tbl>
     <w:p>
       <w:r>
-        <w:t>La separación se realiza antes del ajuste. Español conserva el test oficial y elimina del entrenamiento cualquier coincidencia exacta; inglés deduplica primero y después divide 80/20 de forma estratificada y determinista. Otros 40 casos calibran la fusión mediante cinco particiones y 16 EML distintos comprueban los tres modos con MIME y cabeceras. Zenodo y DIFrauD añaden diagnósticos externos; DIFrauD no se considera independiente por posible solapamiento de fuentes históricas con el agregado inglés (Boumbe</w:t>
-      </w:r>
-      <w:r>
-        <w:t>r et al., 2024).</w:t>
+        <w:t>La separación se realiza antes del ajuste. Español conserva el test oficial y elimina del entrenamiento cualquier coincidencia exacta; inglés deduplica primero y después divide 80/20 de forma estratificada y determinista. Otros 40 casos calibran la fusión mediante cinco particiones y 16 EML distintos comprueban los tres modos con MIME y cabeceras. Zenodo y DIFrauD añaden diagnósticos externos; DIFrauD no se considera independiente por posible solapamiento de fuentes históricas con el agregado inglés (Boumber et al., 2024).</w:t>
       </w:r>
     </w:p>
     <w:p>
@@ -17168,7 +17187,7 @@
       <w:pPr>
         <w:pStyle w:val="Ttulo2"/>
       </w:pPr>
-      <w:bookmarkStart w:id="55" w:name="_Toc239113303"/>
+      <w:bookmarkStart w:id="55" w:name="_Toc239142856"/>
       <w:r>
         <w:t>Resultados comparados</w:t>
       </w:r>
@@ -19659,17 +19678,14 @@
     </w:tbl>
     <w:p>
       <w:r>
-        <w:t xml:space="preserve">El heurístico obtiene el mejor resultado en este conjunto pequeño porque los EML contienen las cabeceras, enlaces y escenarios para los que se diseñaron las reglas. El combinado conserva los ocho verdaderos positivos y reduce el riesgo de depender solo del texto, a costa de dos falsos positivos. El neuronal genera dos falsas alarmas y omite un phishing. En los diagnósticos externos, el combinado alcanza 70,0 % de accuracy y 95,7 % de recall sobre los 100 textos únicos de Zenodo, y 89,0 % de accuracy y 93,4 </w:t>
-      </w:r>
-      <w:r>
-        <w:t>% de recall sobre DIFrauD. La diferencia frente al 98,4 % del holdout inglés revela cambio de distribución y refuerza que no existe un ganador universal ni una métrica extrapolable a producción.</w:t>
+        <w:t>El heurístico obtiene el mejor resultado en este conjunto pequeño porque los EML contienen las cabeceras, enlaces y escenarios para los que se diseñaron las reglas. El combinado conserva los ocho verdaderos positivos y reduce el riesgo de depender solo del texto, a costa de dos falsos positivos. El neuronal genera dos falsas alarmas y omite un phishing. En los diagnósticos externos, el combinado alcanza 70,0 % de accuracy y 95,7 % de recall sobre los 100 textos únicos de Zenodo, y 89,0 % de accuracy y 93,4 % de recall sobre DIFrauD. La diferencia frente al 98,4 % del holdout inglés revela cambio de distribución y refuerza que no existe un ganador universal ni una métrica extrapolable a producción.</w:t>
       </w:r>
     </w:p>
     <w:p>
       <w:pPr>
         <w:pStyle w:val="Ttulo2"/>
       </w:pPr>
-      <w:bookmarkStart w:id="56" w:name="_Toc239113304"/>
+      <w:bookmarkStart w:id="56" w:name="_Toc239142857"/>
       <w:r>
         <w:t>Comportamiento del sistema heurístico</w:t>
       </w:r>
@@ -19692,7 +19708,7 @@
       <w:pPr>
         <w:pStyle w:val="Ttulo2"/>
       </w:pPr>
-      <w:bookmarkStart w:id="57" w:name="_Toc239113305"/>
+      <w:bookmarkStart w:id="57" w:name="_Toc239142858"/>
       <w:r>
         <w:t>Prueba funcional de la aplicación web</w:t>
       </w:r>
@@ -19711,16 +19727,21 @@
     <w:p>
       <w:pPr>
         <w:pStyle w:val="Ttulo3"/>
-      </w:pPr>
-      <w:bookmarkStart w:id="58" w:name="_Toc239113306"/>
-      <w:r>
+        <w:pageBreakBefore/>
+      </w:pPr>
+      <w:bookmarkStart w:id="58" w:name="_Toc239142859"/>
+      <w:r>
+        <w:lastRenderedPageBreak/>
         <w:t>Evidencia visual del prototipo</w:t>
       </w:r>
       <w:bookmarkEnd w:id="58"/>
     </w:p>
     <w:p>
-      <w:r>
-        <w:t>Las siguientes capturas se generaron con backend y Streamlit en procesos separados y un navegador Chromium real. La primera confirma la conexión del cliente; la segunda muestra la salida del modo combinado para el EML BEC sintético reservado, sin credenciales ni datos personales.</w:t>
+      <w:pPr>
+        <w:keepNext/>
+      </w:pPr>
+      <w:r>
+        <w:t>Las siguientes capturas se generaron de forma reproducible con el backend y Streamlit en procesos separados y un navegador Chromium real. El recorrido muestra las entradas admitidas, los modos combinado y heurístico, las explicaciones, las versiones activas ES/EN y los ajustes compartidos del servidor. Se utilizó exclusivamente el EML BEC sintético reservado, sin credenciales, cuentas ni correos personales.</w:t>
       </w:r>
     </w:p>
     <w:p>
@@ -19733,12 +19754,11 @@
         <w:rPr>
           <w:noProof/>
         </w:rPr>
-        <w:lastRenderedPageBreak/>
         <w:drawing>
-          <wp:inline distT="0" distB="0" distL="0" distR="0" wp14:anchorId="24424463" wp14:editId="1D465DD0">
-            <wp:extent cx="5715000" cy="3571875"/>
+          <wp:inline distT="0" distB="0" distL="0" distR="0" wp14:anchorId="5C55F7F4" wp14:editId="69162E18">
+            <wp:extent cx="5715000" cy="4167188"/>
             <wp:effectExtent l="0" t="0" r="0" b="0"/>
-            <wp:docPr id="2138688317" name="Picture 2138688317" descr="Pantalla inicial de Streamlit con el backend central conectado."/>
+            <wp:docPr id="2138688317" name="Picture 2138688317" descr="Pantalla inicial de Streamlit con el backend central conectado y los dos modelos disponibles."/>
             <wp:cNvGraphicFramePr>
               <a:graphicFrameLocks xmlns:a="http://schemas.openxmlformats.org/drawingml/2006/main" noChangeAspect="1"/>
             </wp:cNvGraphicFramePr>
@@ -19758,7 +19778,7 @@
                   <pic:spPr>
                     <a:xfrm>
                       <a:off x="0" y="0"/>
-                      <a:ext cx="5715000" cy="3571875"/>
+                      <a:ext cx="5715000" cy="4167188"/>
                     </a:xfrm>
                     <a:prstGeom prst="rect">
                       <a:avLst/>
@@ -19788,14 +19808,18 @@
         <w:jc w:val="center"/>
       </w:pPr>
       <w:r>
+        <w:br w:type="page"/>
+      </w:r>
+      <w:r>
         <w:rPr>
           <w:noProof/>
         </w:rPr>
+        <w:lastRenderedPageBreak/>
         <w:drawing>
-          <wp:inline distT="0" distB="0" distL="0" distR="0" wp14:anchorId="2F89B1DB" wp14:editId="5078E85D">
-            <wp:extent cx="5715000" cy="1489982"/>
+          <wp:inline distT="0" distB="0" distL="0" distR="0" wp14:anchorId="12F3427C" wp14:editId="194A5AE1">
+            <wp:extent cx="5715000" cy="4167188"/>
             <wp:effectExtent l="0" t="0" r="0" b="0"/>
-            <wp:docPr id="2138688318" name="Picture 2138688318" descr="Tarjeta de resultado combinado para un escenario BEC sintético."/>
+            <wp:docPr id="2138688318" name="Picture 2138688318" descr="Formulario de detección con entrada por texto, EML o Gmail y selección del modo combinado."/>
             <wp:cNvGraphicFramePr>
               <a:graphicFrameLocks xmlns:a="http://schemas.openxmlformats.org/drawingml/2006/main" noChangeAspect="1"/>
             </wp:cNvGraphicFramePr>
@@ -19815,7 +19839,7 @@
                   <pic:spPr>
                     <a:xfrm>
                       <a:off x="0" y="0"/>
-                      <a:ext cx="5715000" cy="1489982"/>
+                      <a:ext cx="5715000" cy="4167188"/>
                     </a:xfrm>
                     <a:prstGeom prst="rect">
                       <a:avLst/>
@@ -19835,14 +19859,258 @@
         <w:keepLines/>
       </w:pPr>
       <w:r>
-        <w:t>Figura 6.2: Resultado combinado del escenario BEC sintético reservado. Fuente: elaboración propia.</w:t>
+        <w:t>Figura 6.2: Fuentes de entrada y configuración del modo combinado en el cliente web. Fuente: elaboración propia.</w:t>
+      </w:r>
+    </w:p>
+    <w:p>
+      <w:pPr>
+        <w:keepNext/>
+        <w:keepLines/>
+        <w:jc w:val="center"/>
+      </w:pPr>
+      <w:r>
+        <w:br w:type="page"/>
+      </w:r>
+      <w:r>
+        <w:rPr>
+          <w:noProof/>
+        </w:rPr>
+        <w:lastRenderedPageBreak/>
+        <w:drawing>
+          <wp:inline distT="0" distB="0" distL="0" distR="0" wp14:anchorId="548D1652" wp14:editId="439E248D">
+            <wp:extent cx="5715000" cy="4167188"/>
+            <wp:effectExtent l="0" t="0" r="0" b="0"/>
+            <wp:docPr id="2138688319" name="Picture 2138688319" descr="Resultado combinado para un escenario BEC sintético con riesgo alto, ponderación y datos procesados."/>
+            <wp:cNvGraphicFramePr>
+              <a:graphicFrameLocks xmlns:a="http://schemas.openxmlformats.org/drawingml/2006/main" noChangeAspect="1"/>
+            </wp:cNvGraphicFramePr>
+            <a:graphic xmlns:a="http://schemas.openxmlformats.org/drawingml/2006/main">
+              <a:graphicData uri="http://schemas.openxmlformats.org/drawingml/2006/picture">
+                <pic:pic xmlns:pic="http://schemas.openxmlformats.org/drawingml/2006/picture">
+                  <pic:nvPicPr>
+                    <pic:cNvPr id="0" name="image.png"/>
+                    <pic:cNvPicPr/>
+                  </pic:nvPicPr>
+                  <pic:blipFill>
+                    <a:blip r:embed="rId12"/>
+                    <a:stretch>
+                      <a:fillRect/>
+                    </a:stretch>
+                  </pic:blipFill>
+                  <pic:spPr>
+                    <a:xfrm>
+                      <a:off x="0" y="0"/>
+                      <a:ext cx="5715000" cy="4167188"/>
+                    </a:xfrm>
+                    <a:prstGeom prst="rect">
+                      <a:avLst/>
+                    </a:prstGeom>
+                  </pic:spPr>
+                </pic:pic>
+              </a:graphicData>
+            </a:graphic>
+          </wp:inline>
+        </w:drawing>
+      </w:r>
+    </w:p>
+    <w:p>
+      <w:pPr>
+        <w:pStyle w:val="PieTFG"/>
+        <w:keepNext w:val="0"/>
+        <w:keepLines/>
+      </w:pPr>
+      <w:r>
+        <w:t>Figura 6.3: Resultado combinado del escenario BEC sintético reservado. Fuente: elaboración propia.</w:t>
+      </w:r>
+    </w:p>
+    <w:p>
+      <w:pPr>
+        <w:keepNext/>
+        <w:keepLines/>
+        <w:jc w:val="center"/>
+      </w:pPr>
+      <w:r>
+        <w:br w:type="page"/>
+      </w:r>
+      <w:r>
+        <w:rPr>
+          <w:noProof/>
+        </w:rPr>
+        <w:lastRenderedPageBreak/>
+        <w:drawing>
+          <wp:inline distT="0" distB="0" distL="0" distR="0" wp14:anchorId="24ED0A1E" wp14:editId="34A9F305">
+            <wp:extent cx="5715000" cy="4167188"/>
+            <wp:effectExtent l="0" t="0" r="0" b="0"/>
+            <wp:docPr id="2138688320" name="Picture 2138688320" descr="Resultado heurístico del correo BEC y agrupación de las señales que explican el veredicto."/>
+            <wp:cNvGraphicFramePr>
+              <a:graphicFrameLocks xmlns:a="http://schemas.openxmlformats.org/drawingml/2006/main" noChangeAspect="1"/>
+            </wp:cNvGraphicFramePr>
+            <a:graphic xmlns:a="http://schemas.openxmlformats.org/drawingml/2006/main">
+              <a:graphicData uri="http://schemas.openxmlformats.org/drawingml/2006/picture">
+                <pic:pic xmlns:pic="http://schemas.openxmlformats.org/drawingml/2006/picture">
+                  <pic:nvPicPr>
+                    <pic:cNvPr id="0" name="image.png"/>
+                    <pic:cNvPicPr/>
+                  </pic:nvPicPr>
+                  <pic:blipFill>
+                    <a:blip r:embed="rId13"/>
+                    <a:stretch>
+                      <a:fillRect/>
+                    </a:stretch>
+                  </pic:blipFill>
+                  <pic:spPr>
+                    <a:xfrm>
+                      <a:off x="0" y="0"/>
+                      <a:ext cx="5715000" cy="4167188"/>
+                    </a:xfrm>
+                    <a:prstGeom prst="rect">
+                      <a:avLst/>
+                    </a:prstGeom>
+                  </pic:spPr>
+                </pic:pic>
+              </a:graphicData>
+            </a:graphic>
+          </wp:inline>
+        </w:drawing>
+      </w:r>
+    </w:p>
+    <w:p>
+      <w:pPr>
+        <w:pStyle w:val="PieTFG"/>
+        <w:keepNext w:val="0"/>
+        <w:keepLines/>
+      </w:pPr>
+      <w:r>
+        <w:t>Figura 6.4: Resultado heurístico y desglose explicable de señales por categoría. Fuente: elaboración propia.</w:t>
+      </w:r>
+    </w:p>
+    <w:p>
+      <w:pPr>
+        <w:keepNext/>
+        <w:keepLines/>
+        <w:jc w:val="center"/>
+      </w:pPr>
+      <w:r>
+        <w:br w:type="page"/>
+      </w:r>
+      <w:r>
+        <w:rPr>
+          <w:noProof/>
+        </w:rPr>
+        <w:lastRenderedPageBreak/>
+        <w:drawing>
+          <wp:inline distT="0" distB="0" distL="0" distR="0" wp14:anchorId="76DCE3A6" wp14:editId="13165988">
+            <wp:extent cx="5715000" cy="4167188"/>
+            <wp:effectExtent l="0" t="0" r="0" b="0"/>
+            <wp:docPr id="2138688321" name="Picture 2138688321" descr="Pantalla de administración con los modelos español e inglés activos en el servidor central."/>
+            <wp:cNvGraphicFramePr>
+              <a:graphicFrameLocks xmlns:a="http://schemas.openxmlformats.org/drawingml/2006/main" noChangeAspect="1"/>
+            </wp:cNvGraphicFramePr>
+            <a:graphic xmlns:a="http://schemas.openxmlformats.org/drawingml/2006/main">
+              <a:graphicData uri="http://schemas.openxmlformats.org/drawingml/2006/picture">
+                <pic:pic xmlns:pic="http://schemas.openxmlformats.org/drawingml/2006/picture">
+                  <pic:nvPicPr>
+                    <pic:cNvPr id="0" name="image.png"/>
+                    <pic:cNvPicPr/>
+                  </pic:nvPicPr>
+                  <pic:blipFill>
+                    <a:blip r:embed="rId14"/>
+                    <a:stretch>
+                      <a:fillRect/>
+                    </a:stretch>
+                  </pic:blipFill>
+                  <pic:spPr>
+                    <a:xfrm>
+                      <a:off x="0" y="0"/>
+                      <a:ext cx="5715000" cy="4167188"/>
+                    </a:xfrm>
+                    <a:prstGeom prst="rect">
+                      <a:avLst/>
+                    </a:prstGeom>
+                  </pic:spPr>
+                </pic:pic>
+              </a:graphicData>
+            </a:graphic>
+          </wp:inline>
+        </w:drawing>
+      </w:r>
+    </w:p>
+    <w:p>
+      <w:pPr>
+        <w:pStyle w:val="PieTFG"/>
+        <w:keepNext w:val="0"/>
+        <w:keepLines/>
+      </w:pPr>
+      <w:r>
+        <w:t>Figura 6.5: Administración y versiones activas de los modelos centrales ES y EN. Fuente: elaboración propia.</w:t>
+      </w:r>
+    </w:p>
+    <w:p>
+      <w:pPr>
+        <w:keepNext/>
+        <w:keepLines/>
+        <w:jc w:val="center"/>
+      </w:pPr>
+      <w:r>
+        <w:br w:type="page"/>
+      </w:r>
+      <w:r>
+        <w:rPr>
+          <w:noProof/>
+        </w:rPr>
+        <w:lastRenderedPageBreak/>
+        <w:drawing>
+          <wp:inline distT="0" distB="0" distL="0" distR="0" wp14:anchorId="5B75848E" wp14:editId="466B26BC">
+            <wp:extent cx="5715000" cy="4167188"/>
+            <wp:effectExtent l="0" t="0" r="0" b="0"/>
+            <wp:docPr id="2138688322" name="Picture 2138688322" descr="Configuración central del modo, umbral, ponderación e hiperparámetros compartidos por los clientes."/>
+            <wp:cNvGraphicFramePr>
+              <a:graphicFrameLocks xmlns:a="http://schemas.openxmlformats.org/drawingml/2006/main" noChangeAspect="1"/>
+            </wp:cNvGraphicFramePr>
+            <a:graphic xmlns:a="http://schemas.openxmlformats.org/drawingml/2006/main">
+              <a:graphicData uri="http://schemas.openxmlformats.org/drawingml/2006/picture">
+                <pic:pic xmlns:pic="http://schemas.openxmlformats.org/drawingml/2006/picture">
+                  <pic:nvPicPr>
+                    <pic:cNvPr id="0" name="image.png"/>
+                    <pic:cNvPicPr/>
+                  </pic:nvPicPr>
+                  <pic:blipFill>
+                    <a:blip r:embed="rId15"/>
+                    <a:stretch>
+                      <a:fillRect/>
+                    </a:stretch>
+                  </pic:blipFill>
+                  <pic:spPr>
+                    <a:xfrm>
+                      <a:off x="0" y="0"/>
+                      <a:ext cx="5715000" cy="4167188"/>
+                    </a:xfrm>
+                    <a:prstGeom prst="rect">
+                      <a:avLst/>
+                    </a:prstGeom>
+                  </pic:spPr>
+                </pic:pic>
+              </a:graphicData>
+            </a:graphic>
+          </wp:inline>
+        </w:drawing>
+      </w:r>
+    </w:p>
+    <w:p>
+      <w:pPr>
+        <w:pStyle w:val="PieTFG"/>
+        <w:keepNext w:val="0"/>
+        <w:keepLines/>
+      </w:pPr>
+      <w:r>
+        <w:t>Figura 6.6: Ajustes de análisis e hiperparámetros almacenados en el servidor. Fuente: elaboración propia.</w:t>
       </w:r>
     </w:p>
     <w:p>
       <w:pPr>
         <w:pStyle w:val="Ttulo2"/>
       </w:pPr>
-      <w:bookmarkStart w:id="59" w:name="_Toc239113307"/>
+      <w:bookmarkStart w:id="59" w:name="_Toc239142860"/>
       <w:r>
         <w:t>Discusión</w:t>
       </w:r>
@@ -19863,7 +20131,7 @@
         <w:pStyle w:val="Ttulo1"/>
         <w:pageBreakBefore w:val="0"/>
       </w:pPr>
-      <w:bookmarkStart w:id="60" w:name="_Toc239113308"/>
+      <w:bookmarkStart w:id="60" w:name="_Toc239142861"/>
       <w:r>
         <w:t>Conclusiones generales</w:t>
       </w:r>
@@ -19876,11 +20144,7 @@
         </w:rPr>
       </w:pPr>
       <w:r>
-        <w:t xml:space="preserve">Estas conclusiones generales valoran el trabajo completo y se diferencian de las conclusiones del estado del arte. El Trabajo Fin de Grado ha alcanzado los objetivos planteados: se ha estudiado el phishing desde su base psicológica y su evolución reciente, se ha revisado la investigación en machine learning y deep learning y se ha desarrollado un sistema cliente-servidor funcional que combina análisis heurístico explicable con un </w:t>
-      </w:r>
-      <w:r>
-        <w:lastRenderedPageBreak/>
-        <w:t>clasificador TF-IDF + MLP. Streamlit, la extensión de Gmail y el monitor envían las entradas al backend central, que procesa el correo y mantiene los modelos compartidos.</w:t>
+        <w:t>Estas conclusiones generales valoran el trabajo completo y se diferencian de las conclusiones del estado del arte. El Trabajo Fin de Grado ha alcanzado los objetivos planteados: se ha estudiado el phishing desde su base psicológica y su evolución reciente, se ha revisado la investigación en machine learning y deep learning y se ha desarrollado un sistema cliente-servidor funcional que combina análisis heurístico explicable con un clasificador TF-IDF + MLP. Streamlit, la extensión de Gmail y el monitor envían las entradas al backend central, que procesa el correo y mantiene los modelos compartidos.</w:t>
       </w:r>
     </w:p>
     <w:p>
@@ -19903,7 +20167,11 @@
         </w:rPr>
       </w:pPr>
       <w:r>
-        <w:t>El primer objetivo, analizar el fenómeno del phishing, sus fases, tipologías y evolución histórica, se aborda en el marco teórico mediante modelos de fases, vectores de ataque, modalidades según personalización y técnicas emergentes contrastadas con fuentes académicas e informes de industria.</w:t>
+        <w:t xml:space="preserve">El primer objetivo, analizar el fenómeno del phishing, sus fases, tipologías y evolución histórica, se aborda en el marco teórico mediante modelos de fases, vectores de ataque, </w:t>
+      </w:r>
+      <w:r>
+        <w:lastRenderedPageBreak/>
+        <w:t>modalidades según personalización y técnicas emergentes contrastadas con fuentes académicas e informes de industria.</w:t>
       </w:r>
     </w:p>
     <w:p>
@@ -19970,7 +20238,7 @@
       <w:pPr>
         <w:pStyle w:val="Ttulo2"/>
       </w:pPr>
-      <w:bookmarkStart w:id="61" w:name="_Toc239113309"/>
+      <w:bookmarkStart w:id="61" w:name="_Toc239142862"/>
       <w:r>
         <w:t>Trabajo futuro</w:t>
       </w:r>
@@ -19990,7 +20258,7 @@
       <w:pPr>
         <w:pStyle w:val="Ttulo1"/>
       </w:pPr>
-      <w:bookmarkStart w:id="62" w:name="_Toc239113310"/>
+      <w:bookmarkStart w:id="62" w:name="_Toc239142863"/>
       <w:r>
         <w:lastRenderedPageBreak/>
         <w:t>Glosario</w:t>
@@ -20356,7 +20624,7 @@
       <w:pPr>
         <w:pStyle w:val="Ttulo1"/>
       </w:pPr>
-      <w:bookmarkStart w:id="63" w:name="_Toc239113311"/>
+      <w:bookmarkStart w:id="63" w:name="_Toc239142864"/>
       <w:r>
         <w:lastRenderedPageBreak/>
         <w:t>Referencias</w:t>
@@ -20706,7 +20974,7 @@
           <w:bCs/>
         </w:rPr>
       </w:pPr>
-      <w:bookmarkStart w:id="64" w:name="_Toc239113312"/>
+      <w:bookmarkStart w:id="64" w:name="_Toc239142865"/>
       <w:r>
         <w:rPr>
           <w:bCs/>
@@ -20727,7 +20995,7 @@
           <w:bCs/>
         </w:rPr>
       </w:pPr>
-      <w:bookmarkStart w:id="65" w:name="_Toc239113313"/>
+      <w:bookmarkStart w:id="65" w:name="_Toc239142866"/>
       <w:r>
         <w:rPr>
           <w:bCs/>
@@ -21167,7 +21435,7 @@
           <w:bCs/>
         </w:rPr>
       </w:pPr>
-      <w:bookmarkStart w:id="66" w:name="_Toc239113314"/>
+      <w:bookmarkStart w:id="66" w:name="_Toc239142867"/>
       <w:r>
         <w:rPr>
           <w:bCs/>
@@ -21188,7 +21456,7 @@
           <w:bCs/>
         </w:rPr>
       </w:pPr>
-      <w:bookmarkStart w:id="67" w:name="_Toc239113315"/>
+      <w:bookmarkStart w:id="67" w:name="_Toc239142868"/>
       <w:r>
         <w:rPr>
           <w:bCs/>
@@ -21284,7 +21552,7 @@
           <w:bCs/>
         </w:rPr>
       </w:pPr>
-      <w:bookmarkStart w:id="68" w:name="_Toc239113316"/>
+      <w:bookmarkStart w:id="68" w:name="_Toc239142869"/>
       <w:r>
         <w:rPr>
           <w:bCs/>
@@ -21741,7 +22009,7 @@
           <w:bCs/>
         </w:rPr>
       </w:pPr>
-      <w:bookmarkStart w:id="69" w:name="_Toc239113317"/>
+      <w:bookmarkStart w:id="69" w:name="_Toc239142870"/>
       <w:r>
         <w:rPr>
           <w:bCs/>
@@ -22030,7 +22298,7 @@
           <w:bCs/>
         </w:rPr>
       </w:pPr>
-      <w:bookmarkStart w:id="70" w:name="_Toc239113318"/>
+      <w:bookmarkStart w:id="70" w:name="_Toc239142871"/>
       <w:r>
         <w:rPr>
           <w:bCs/>
@@ -22177,7 +22445,7 @@
       <w:pPr>
         <w:pStyle w:val="Ttulo2"/>
       </w:pPr>
-      <w:bookmarkStart w:id="71" w:name="_Toc239113319"/>
+      <w:bookmarkStart w:id="71" w:name="_Toc239142872"/>
       <w:r>
         <w:t>C.1. Uso del prototipo</w:t>
       </w:r>
@@ -22216,7 +22484,7 @@
           <w:bCs/>
         </w:rPr>
       </w:pPr>
-      <w:bookmarkStart w:id="72" w:name="_Toc239113320"/>
+      <w:bookmarkStart w:id="72" w:name="_Toc239142873"/>
       <w:r>
         <w:rPr>
           <w:bCs/>
@@ -22319,7 +22587,7 @@
       <w:pPr>
         <w:pStyle w:val="Ttulo2"/>
       </w:pPr>
-      <w:bookmarkStart w:id="73" w:name="_Toc239113321"/>
+      <w:bookmarkStart w:id="73" w:name="_Toc239142874"/>
       <w:r>
         <w:t>Anexo E: Resumen de arquitectura y evidencia</w:t>
       </w:r>
@@ -22341,12 +22609,12 @@
       </w:r>
     </w:p>
     <w:sectPr>
-      <w:headerReference w:type="even" r:id="rId12"/>
-      <w:headerReference w:type="default" r:id="rId13"/>
-      <w:footerReference w:type="even" r:id="rId14"/>
-      <w:footerReference w:type="default" r:id="rId15"/>
-      <w:headerReference w:type="first" r:id="rId16"/>
-      <w:footerReference w:type="first" r:id="rId17"/>
+      <w:headerReference w:type="even" r:id="rId16"/>
+      <w:headerReference w:type="default" r:id="rId17"/>
+      <w:footerReference w:type="even" r:id="rId18"/>
+      <w:footerReference w:type="default" r:id="rId19"/>
+      <w:headerReference w:type="first" r:id="rId20"/>
+      <w:footerReference w:type="first" r:id="rId21"/>
       <w:pgSz w:w="11906" w:h="16838"/>
       <w:pgMar w:top="1417" w:right="1701" w:bottom="1417" w:left="1701" w:header="708" w:footer="708" w:gutter="0"/>
       <w:cols w:space="708"/>

</xml_diff>

<commit_message>
Añadir visuales técnicos a la memoria
</commit_message>
<xml_diff>
--- a/TFG.docx
+++ b/TFG.docx
@@ -118,7 +118,7 @@
       <w:pPr>
         <w:pStyle w:val="Ttulo1"/>
       </w:pPr>
-      <w:bookmarkStart w:id="0" w:name="_Toc239142801"/>
+      <w:bookmarkStart w:id="0" w:name="_Toc239144472"/>
       <w:r>
         <w:lastRenderedPageBreak/>
         <w:t>Resumen</w:t>
@@ -140,7 +140,7 @@
       <w:pPr>
         <w:pStyle w:val="Ttulo1"/>
       </w:pPr>
-      <w:bookmarkStart w:id="1" w:name="_Toc239142802"/>
+      <w:bookmarkStart w:id="1" w:name="_Toc239144473"/>
       <w:r>
         <w:lastRenderedPageBreak/>
         <w:t>Abstract</w:t>
@@ -167,7 +167,7 @@
       <w:pPr>
         <w:pStyle w:val="Ttulo1"/>
       </w:pPr>
-      <w:bookmarkStart w:id="2" w:name="_Toc239142803"/>
+      <w:bookmarkStart w:id="2" w:name="_Toc239144474"/>
       <w:r>
         <w:lastRenderedPageBreak/>
         <w:t>Agradecimientos</w:t>
@@ -183,7 +183,7 @@
       <w:pPr>
         <w:pStyle w:val="Ttulo1"/>
       </w:pPr>
-      <w:bookmarkStart w:id="3" w:name="_Toc239142804"/>
+      <w:bookmarkStart w:id="3" w:name="_Toc239144475"/>
       <w:r>
         <w:lastRenderedPageBreak/>
         <w:t>Índice de figuras y tablas</w:t>
@@ -211,6 +211,17 @@
     <w:p/>
     <w:p>
       <w:r>
+        <w:t>Figura 5.1: Arquitectura general cliente-servidor del prototipo.</w:t>
+      </w:r>
+    </w:p>
+    <w:p>
+      <w:r>
+        <w:t>Figura 5.2: Flujo de análisis desde la entrada hasta la respuesta del backend.</w:t>
+      </w:r>
+    </w:p>
+    <w:p/>
+    <w:p>
+      <w:r>
         <w:t>Figura 6.1: Pantalla inicial del cliente web con el backend central conectado.</w:t>
       </w:r>
     </w:p>
@@ -294,6 +305,11 @@
     </w:p>
     <w:p>
       <w:r>
+        <w:t>Tabla 5.2: Capas y responsabilidades del diseño modular.</w:t>
+      </w:r>
+    </w:p>
+    <w:p>
+      <w:r>
         <w:t>Tabla 6.1: Conjuntos empleados y separación experimental.</w:t>
       </w:r>
     </w:p>
@@ -316,7 +332,7 @@
       <w:pPr>
         <w:pStyle w:val="Ttulo1"/>
       </w:pPr>
-      <w:bookmarkStart w:id="4" w:name="_Toc239142805"/>
+      <w:bookmarkStart w:id="4" w:name="_Toc239144476"/>
       <w:r>
         <w:lastRenderedPageBreak/>
         <w:t>Abreviaturas</w:t>
@@ -585,7 +601,7 @@
           <w:r>
             <w:fldChar w:fldCharType="separate"/>
           </w:r>
-          <w:hyperlink w:anchor="_Toc239142801" w:history="1">
+          <w:hyperlink w:anchor="_Toc239144472" w:history="1">
             <w:r>
               <w:rPr>
                 <w:rStyle w:val="Hipervnculo"/>
@@ -612,7 +628,7 @@
                 <w:noProof/>
                 <w:webHidden/>
               </w:rPr>
-              <w:instrText xml:space="preserve"> PAGEREF _Toc239142801 \h </w:instrText>
+              <w:instrText xml:space="preserve"> PAGEREF _Toc239144472 \h </w:instrText>
             </w:r>
             <w:r>
               <w:rPr>
@@ -660,7 +676,7 @@
               <w14:ligatures w14:val="standardContextual"/>
             </w:rPr>
           </w:pPr>
-          <w:hyperlink w:anchor="_Toc239142802" w:history="1">
+          <w:hyperlink w:anchor="_Toc239144473" w:history="1">
             <w:r>
               <w:rPr>
                 <w:rStyle w:val="Hipervnculo"/>
@@ -687,7 +703,7 @@
                 <w:noProof/>
                 <w:webHidden/>
               </w:rPr>
-              <w:instrText xml:space="preserve"> PAGEREF _Toc239142802 \h </w:instrText>
+              <w:instrText xml:space="preserve"> PAGEREF _Toc239144473 \h </w:instrText>
             </w:r>
             <w:r>
               <w:rPr>
@@ -735,7 +751,7 @@
               <w14:ligatures w14:val="standardContextual"/>
             </w:rPr>
           </w:pPr>
-          <w:hyperlink w:anchor="_Toc239142803" w:history="1">
+          <w:hyperlink w:anchor="_Toc239144474" w:history="1">
             <w:r>
               <w:rPr>
                 <w:rStyle w:val="Hipervnculo"/>
@@ -762,7 +778,7 @@
                 <w:noProof/>
                 <w:webHidden/>
               </w:rPr>
-              <w:instrText xml:space="preserve"> PAGEREF _Toc239142803 \h </w:instrText>
+              <w:instrText xml:space="preserve"> PAGEREF _Toc239144474 \h </w:instrText>
             </w:r>
             <w:r>
               <w:rPr>
@@ -810,7 +826,7 @@
               <w14:ligatures w14:val="standardContextual"/>
             </w:rPr>
           </w:pPr>
-          <w:hyperlink w:anchor="_Toc239142804" w:history="1">
+          <w:hyperlink w:anchor="_Toc239144475" w:history="1">
             <w:r>
               <w:rPr>
                 <w:rStyle w:val="Hipervnculo"/>
@@ -837,7 +853,7 @@
                 <w:noProof/>
                 <w:webHidden/>
               </w:rPr>
-              <w:instrText xml:space="preserve"> PAGEREF _Toc239142804 \h </w:instrText>
+              <w:instrText xml:space="preserve"> PAGEREF _Toc239144475 \h </w:instrText>
             </w:r>
             <w:r>
               <w:rPr>
@@ -885,7 +901,7 @@
               <w14:ligatures w14:val="standardContextual"/>
             </w:rPr>
           </w:pPr>
-          <w:hyperlink w:anchor="_Toc239142805" w:history="1">
+          <w:hyperlink w:anchor="_Toc239144476" w:history="1">
             <w:r>
               <w:rPr>
                 <w:rStyle w:val="Hipervnculo"/>
@@ -912,7 +928,7 @@
                 <w:noProof/>
                 <w:webHidden/>
               </w:rPr>
-              <w:instrText xml:space="preserve"> PAGEREF _Toc239142805 \h </w:instrText>
+              <w:instrText xml:space="preserve"> PAGEREF _Toc239144476 \h </w:instrText>
             </w:r>
             <w:r>
               <w:rPr>
@@ -960,7 +976,7 @@
               <w14:ligatures w14:val="standardContextual"/>
             </w:rPr>
           </w:pPr>
-          <w:hyperlink w:anchor="_Toc239142806" w:history="1">
+          <w:hyperlink w:anchor="_Toc239144477" w:history="1">
             <w:r>
               <w:rPr>
                 <w:rStyle w:val="Hipervnculo"/>
@@ -987,7 +1003,7 @@
                 <w:noProof/>
                 <w:webHidden/>
               </w:rPr>
-              <w:instrText xml:space="preserve"> PAGEREF _Toc239142806 \h </w:instrText>
+              <w:instrText xml:space="preserve"> PAGEREF _Toc239144477 \h </w:instrText>
             </w:r>
             <w:r>
               <w:rPr>
@@ -1035,7 +1051,7 @@
               <w14:ligatures w14:val="standardContextual"/>
             </w:rPr>
           </w:pPr>
-          <w:hyperlink w:anchor="_Toc239142807" w:history="1">
+          <w:hyperlink w:anchor="_Toc239144478" w:history="1">
             <w:r>
               <w:rPr>
                 <w:rStyle w:val="Hipervnculo"/>
@@ -1062,7 +1078,7 @@
                 <w:noProof/>
                 <w:webHidden/>
               </w:rPr>
-              <w:instrText xml:space="preserve"> PAGEREF _Toc239142807 \h </w:instrText>
+              <w:instrText xml:space="preserve"> PAGEREF _Toc239144478 \h </w:instrText>
             </w:r>
             <w:r>
               <w:rPr>
@@ -1110,7 +1126,7 @@
               <w14:ligatures w14:val="standardContextual"/>
             </w:rPr>
           </w:pPr>
-          <w:hyperlink w:anchor="_Toc239142808" w:history="1">
+          <w:hyperlink w:anchor="_Toc239144479" w:history="1">
             <w:r>
               <w:rPr>
                 <w:rStyle w:val="Hipervnculo"/>
@@ -1137,7 +1153,7 @@
                 <w:noProof/>
                 <w:webHidden/>
               </w:rPr>
-              <w:instrText xml:space="preserve"> PAGEREF _Toc239142808 \h </w:instrText>
+              <w:instrText xml:space="preserve"> PAGEREF _Toc239144479 \h </w:instrText>
             </w:r>
             <w:r>
               <w:rPr>
@@ -1185,7 +1201,7 @@
               <w14:ligatures w14:val="standardContextual"/>
             </w:rPr>
           </w:pPr>
-          <w:hyperlink w:anchor="_Toc239142809" w:history="1">
+          <w:hyperlink w:anchor="_Toc239144480" w:history="1">
             <w:r>
               <w:rPr>
                 <w:rStyle w:val="Hipervnculo"/>
@@ -1212,7 +1228,7 @@
                 <w:noProof/>
                 <w:webHidden/>
               </w:rPr>
-              <w:instrText xml:space="preserve"> PAGEREF _Toc239142809 \h </w:instrText>
+              <w:instrText xml:space="preserve"> PAGEREF _Toc239144480 \h </w:instrText>
             </w:r>
             <w:r>
               <w:rPr>
@@ -1260,7 +1276,7 @@
               <w14:ligatures w14:val="standardContextual"/>
             </w:rPr>
           </w:pPr>
-          <w:hyperlink w:anchor="_Toc239142810" w:history="1">
+          <w:hyperlink w:anchor="_Toc239144481" w:history="1">
             <w:r>
               <w:rPr>
                 <w:rStyle w:val="Hipervnculo"/>
@@ -1287,7 +1303,7 @@
                 <w:noProof/>
                 <w:webHidden/>
               </w:rPr>
-              <w:instrText xml:space="preserve"> PAGEREF _Toc239142810 \h </w:instrText>
+              <w:instrText xml:space="preserve"> PAGEREF _Toc239144481 \h </w:instrText>
             </w:r>
             <w:r>
               <w:rPr>
@@ -1335,7 +1351,7 @@
               <w14:ligatures w14:val="standardContextual"/>
             </w:rPr>
           </w:pPr>
-          <w:hyperlink w:anchor="_Toc239142811" w:history="1">
+          <w:hyperlink w:anchor="_Toc239144482" w:history="1">
             <w:r>
               <w:rPr>
                 <w:rStyle w:val="Hipervnculo"/>
@@ -1362,7 +1378,7 @@
                 <w:noProof/>
                 <w:webHidden/>
               </w:rPr>
-              <w:instrText xml:space="preserve"> PAGEREF _Toc239142811 \h </w:instrText>
+              <w:instrText xml:space="preserve"> PAGEREF _Toc239144482 \h </w:instrText>
             </w:r>
             <w:r>
               <w:rPr>
@@ -1410,7 +1426,7 @@
               <w14:ligatures w14:val="standardContextual"/>
             </w:rPr>
           </w:pPr>
-          <w:hyperlink w:anchor="_Toc239142812" w:history="1">
+          <w:hyperlink w:anchor="_Toc239144483" w:history="1">
             <w:r>
               <w:rPr>
                 <w:rStyle w:val="Hipervnculo"/>
@@ -1437,7 +1453,7 @@
                 <w:noProof/>
                 <w:webHidden/>
               </w:rPr>
-              <w:instrText xml:space="preserve"> PAGEREF _Toc239142812 \h </w:instrText>
+              <w:instrText xml:space="preserve"> PAGEREF _Toc239144483 \h </w:instrText>
             </w:r>
             <w:r>
               <w:rPr>
@@ -1485,7 +1501,7 @@
               <w14:ligatures w14:val="standardContextual"/>
             </w:rPr>
           </w:pPr>
-          <w:hyperlink w:anchor="_Toc239142813" w:history="1">
+          <w:hyperlink w:anchor="_Toc239144484" w:history="1">
             <w:r>
               <w:rPr>
                 <w:rStyle w:val="Hipervnculo"/>
@@ -1512,7 +1528,7 @@
                 <w:noProof/>
                 <w:webHidden/>
               </w:rPr>
-              <w:instrText xml:space="preserve"> PAGEREF _Toc239142813 \h </w:instrText>
+              <w:instrText xml:space="preserve"> PAGEREF _Toc239144484 \h </w:instrText>
             </w:r>
             <w:r>
               <w:rPr>
@@ -1560,7 +1576,7 @@
               <w14:ligatures w14:val="standardContextual"/>
             </w:rPr>
           </w:pPr>
-          <w:hyperlink w:anchor="_Toc239142814" w:history="1">
+          <w:hyperlink w:anchor="_Toc239144485" w:history="1">
             <w:r>
               <w:rPr>
                 <w:rStyle w:val="Hipervnculo"/>
@@ -1587,7 +1603,7 @@
                 <w:noProof/>
                 <w:webHidden/>
               </w:rPr>
-              <w:instrText xml:space="preserve"> PAGEREF _Toc239142814 \h </w:instrText>
+              <w:instrText xml:space="preserve"> PAGEREF _Toc239144485 \h </w:instrText>
             </w:r>
             <w:r>
               <w:rPr>
@@ -1635,7 +1651,7 @@
               <w14:ligatures w14:val="standardContextual"/>
             </w:rPr>
           </w:pPr>
-          <w:hyperlink w:anchor="_Toc239142815" w:history="1">
+          <w:hyperlink w:anchor="_Toc239144486" w:history="1">
             <w:r>
               <w:rPr>
                 <w:rStyle w:val="Hipervnculo"/>
@@ -1662,7 +1678,7 @@
                 <w:noProof/>
                 <w:webHidden/>
               </w:rPr>
-              <w:instrText xml:space="preserve"> PAGEREF _Toc239142815 \h </w:instrText>
+              <w:instrText xml:space="preserve"> PAGEREF _Toc239144486 \h </w:instrText>
             </w:r>
             <w:r>
               <w:rPr>
@@ -1710,7 +1726,7 @@
               <w14:ligatures w14:val="standardContextual"/>
             </w:rPr>
           </w:pPr>
-          <w:hyperlink w:anchor="_Toc239142816" w:history="1">
+          <w:hyperlink w:anchor="_Toc239144487" w:history="1">
             <w:r>
               <w:rPr>
                 <w:rStyle w:val="Hipervnculo"/>
@@ -1737,7 +1753,7 @@
                 <w:noProof/>
                 <w:webHidden/>
               </w:rPr>
-              <w:instrText xml:space="preserve"> PAGEREF _Toc239142816 \h </w:instrText>
+              <w:instrText xml:space="preserve"> PAGEREF _Toc239144487 \h </w:instrText>
             </w:r>
             <w:r>
               <w:rPr>
@@ -1785,7 +1801,7 @@
               <w14:ligatures w14:val="standardContextual"/>
             </w:rPr>
           </w:pPr>
-          <w:hyperlink w:anchor="_Toc239142817" w:history="1">
+          <w:hyperlink w:anchor="_Toc239144488" w:history="1">
             <w:r>
               <w:rPr>
                 <w:rStyle w:val="Hipervnculo"/>
@@ -1812,7 +1828,7 @@
                 <w:noProof/>
                 <w:webHidden/>
               </w:rPr>
-              <w:instrText xml:space="preserve"> PAGEREF _Toc239142817 \h </w:instrText>
+              <w:instrText xml:space="preserve"> PAGEREF _Toc239144488 \h </w:instrText>
             </w:r>
             <w:r>
               <w:rPr>
@@ -1860,7 +1876,7 @@
               <w14:ligatures w14:val="standardContextual"/>
             </w:rPr>
           </w:pPr>
-          <w:hyperlink w:anchor="_Toc239142818" w:history="1">
+          <w:hyperlink w:anchor="_Toc239144489" w:history="1">
             <w:r>
               <w:rPr>
                 <w:rStyle w:val="Hipervnculo"/>
@@ -1887,7 +1903,7 @@
                 <w:noProof/>
                 <w:webHidden/>
               </w:rPr>
-              <w:instrText xml:space="preserve"> PAGEREF _Toc239142818 \h </w:instrText>
+              <w:instrText xml:space="preserve"> PAGEREF _Toc239144489 \h </w:instrText>
             </w:r>
             <w:r>
               <w:rPr>
@@ -1935,7 +1951,7 @@
               <w14:ligatures w14:val="standardContextual"/>
             </w:rPr>
           </w:pPr>
-          <w:hyperlink w:anchor="_Toc239142819" w:history="1">
+          <w:hyperlink w:anchor="_Toc239144490" w:history="1">
             <w:r>
               <w:rPr>
                 <w:rStyle w:val="Hipervnculo"/>
@@ -1962,7 +1978,7 @@
                 <w:noProof/>
                 <w:webHidden/>
               </w:rPr>
-              <w:instrText xml:space="preserve"> PAGEREF _Toc239142819 \h </w:instrText>
+              <w:instrText xml:space="preserve"> PAGEREF _Toc239144490 \h </w:instrText>
             </w:r>
             <w:r>
               <w:rPr>
@@ -2010,7 +2026,7 @@
               <w14:ligatures w14:val="standardContextual"/>
             </w:rPr>
           </w:pPr>
-          <w:hyperlink w:anchor="_Toc239142820" w:history="1">
+          <w:hyperlink w:anchor="_Toc239144491" w:history="1">
             <w:r>
               <w:rPr>
                 <w:rStyle w:val="Hipervnculo"/>
@@ -2037,7 +2053,7 @@
                 <w:noProof/>
                 <w:webHidden/>
               </w:rPr>
-              <w:instrText xml:space="preserve"> PAGEREF _Toc239142820 \h </w:instrText>
+              <w:instrText xml:space="preserve"> PAGEREF _Toc239144491 \h </w:instrText>
             </w:r>
             <w:r>
               <w:rPr>
@@ -2085,7 +2101,7 @@
               <w14:ligatures w14:val="standardContextual"/>
             </w:rPr>
           </w:pPr>
-          <w:hyperlink w:anchor="_Toc239142821" w:history="1">
+          <w:hyperlink w:anchor="_Toc239144492" w:history="1">
             <w:r>
               <w:rPr>
                 <w:rStyle w:val="Hipervnculo"/>
@@ -2112,7 +2128,7 @@
                 <w:noProof/>
                 <w:webHidden/>
               </w:rPr>
-              <w:instrText xml:space="preserve"> PAGEREF _Toc239142821 \h </w:instrText>
+              <w:instrText xml:space="preserve"> PAGEREF _Toc239144492 \h </w:instrText>
             </w:r>
             <w:r>
               <w:rPr>
@@ -2160,7 +2176,7 @@
               <w14:ligatures w14:val="standardContextual"/>
             </w:rPr>
           </w:pPr>
-          <w:hyperlink w:anchor="_Toc239142822" w:history="1">
+          <w:hyperlink w:anchor="_Toc239144493" w:history="1">
             <w:r>
               <w:rPr>
                 <w:rStyle w:val="Hipervnculo"/>
@@ -2187,7 +2203,7 @@
                 <w:noProof/>
                 <w:webHidden/>
               </w:rPr>
-              <w:instrText xml:space="preserve"> PAGEREF _Toc239142822 \h </w:instrText>
+              <w:instrText xml:space="preserve"> PAGEREF _Toc239144493 \h </w:instrText>
             </w:r>
             <w:r>
               <w:rPr>
@@ -2235,7 +2251,7 @@
               <w14:ligatures w14:val="standardContextual"/>
             </w:rPr>
           </w:pPr>
-          <w:hyperlink w:anchor="_Toc239142823" w:history="1">
+          <w:hyperlink w:anchor="_Toc239144494" w:history="1">
             <w:r>
               <w:rPr>
                 <w:rStyle w:val="Hipervnculo"/>
@@ -2262,7 +2278,7 @@
                 <w:noProof/>
                 <w:webHidden/>
               </w:rPr>
-              <w:instrText xml:space="preserve"> PAGEREF _Toc239142823 \h </w:instrText>
+              <w:instrText xml:space="preserve"> PAGEREF _Toc239144494 \h </w:instrText>
             </w:r>
             <w:r>
               <w:rPr>
@@ -2310,7 +2326,7 @@
               <w14:ligatures w14:val="standardContextual"/>
             </w:rPr>
           </w:pPr>
-          <w:hyperlink w:anchor="_Toc239142824" w:history="1">
+          <w:hyperlink w:anchor="_Toc239144495" w:history="1">
             <w:r>
               <w:rPr>
                 <w:rStyle w:val="Hipervnculo"/>
@@ -2337,7 +2353,7 @@
                 <w:noProof/>
                 <w:webHidden/>
               </w:rPr>
-              <w:instrText xml:space="preserve"> PAGEREF _Toc239142824 \h </w:instrText>
+              <w:instrText xml:space="preserve"> PAGEREF _Toc239144495 \h </w:instrText>
             </w:r>
             <w:r>
               <w:rPr>
@@ -2385,7 +2401,7 @@
               <w14:ligatures w14:val="standardContextual"/>
             </w:rPr>
           </w:pPr>
-          <w:hyperlink w:anchor="_Toc239142825" w:history="1">
+          <w:hyperlink w:anchor="_Toc239144496" w:history="1">
             <w:r>
               <w:rPr>
                 <w:rStyle w:val="Hipervnculo"/>
@@ -2412,7 +2428,7 @@
                 <w:noProof/>
                 <w:webHidden/>
               </w:rPr>
-              <w:instrText xml:space="preserve"> PAGEREF _Toc239142825 \h </w:instrText>
+              <w:instrText xml:space="preserve"> PAGEREF _Toc239144496 \h </w:instrText>
             </w:r>
             <w:r>
               <w:rPr>
@@ -2460,7 +2476,7 @@
               <w14:ligatures w14:val="standardContextual"/>
             </w:rPr>
           </w:pPr>
-          <w:hyperlink w:anchor="_Toc239142826" w:history="1">
+          <w:hyperlink w:anchor="_Toc239144497" w:history="1">
             <w:r>
               <w:rPr>
                 <w:rStyle w:val="Hipervnculo"/>
@@ -2487,7 +2503,7 @@
                 <w:noProof/>
                 <w:webHidden/>
               </w:rPr>
-              <w:instrText xml:space="preserve"> PAGEREF _Toc239142826 \h </w:instrText>
+              <w:instrText xml:space="preserve"> PAGEREF _Toc239144497 \h </w:instrText>
             </w:r>
             <w:r>
               <w:rPr>
@@ -2535,7 +2551,7 @@
               <w14:ligatures w14:val="standardContextual"/>
             </w:rPr>
           </w:pPr>
-          <w:hyperlink w:anchor="_Toc239142827" w:history="1">
+          <w:hyperlink w:anchor="_Toc239144498" w:history="1">
             <w:r>
               <w:rPr>
                 <w:rStyle w:val="Hipervnculo"/>
@@ -2562,7 +2578,7 @@
                 <w:noProof/>
                 <w:webHidden/>
               </w:rPr>
-              <w:instrText xml:space="preserve"> PAGEREF _Toc239142827 \h </w:instrText>
+              <w:instrText xml:space="preserve"> PAGEREF _Toc239144498 \h </w:instrText>
             </w:r>
             <w:r>
               <w:rPr>
@@ -2610,7 +2626,7 @@
               <w14:ligatures w14:val="standardContextual"/>
             </w:rPr>
           </w:pPr>
-          <w:hyperlink w:anchor="_Toc239142828" w:history="1">
+          <w:hyperlink w:anchor="_Toc239144499" w:history="1">
             <w:r>
               <w:rPr>
                 <w:rStyle w:val="Hipervnculo"/>
@@ -2637,7 +2653,7 @@
                 <w:noProof/>
                 <w:webHidden/>
               </w:rPr>
-              <w:instrText xml:space="preserve"> PAGEREF _Toc239142828 \h </w:instrText>
+              <w:instrText xml:space="preserve"> PAGEREF _Toc239144499 \h </w:instrText>
             </w:r>
             <w:r>
               <w:rPr>
@@ -2685,7 +2701,7 @@
               <w14:ligatures w14:val="standardContextual"/>
             </w:rPr>
           </w:pPr>
-          <w:hyperlink w:anchor="_Toc239142829" w:history="1">
+          <w:hyperlink w:anchor="_Toc239144500" w:history="1">
             <w:r>
               <w:rPr>
                 <w:rStyle w:val="Hipervnculo"/>
@@ -2712,7 +2728,7 @@
                 <w:noProof/>
                 <w:webHidden/>
               </w:rPr>
-              <w:instrText xml:space="preserve"> PAGEREF _Toc239142829 \h </w:instrText>
+              <w:instrText xml:space="preserve"> PAGEREF _Toc239144500 \h </w:instrText>
             </w:r>
             <w:r>
               <w:rPr>
@@ -2760,7 +2776,7 @@
               <w14:ligatures w14:val="standardContextual"/>
             </w:rPr>
           </w:pPr>
-          <w:hyperlink w:anchor="_Toc239142830" w:history="1">
+          <w:hyperlink w:anchor="_Toc239144501" w:history="1">
             <w:r>
               <w:rPr>
                 <w:rStyle w:val="Hipervnculo"/>
@@ -2787,7 +2803,7 @@
                 <w:noProof/>
                 <w:webHidden/>
               </w:rPr>
-              <w:instrText xml:space="preserve"> PAGEREF _Toc239142830 \h </w:instrText>
+              <w:instrText xml:space="preserve"> PAGEREF _Toc239144501 \h </w:instrText>
             </w:r>
             <w:r>
               <w:rPr>
@@ -2835,7 +2851,7 @@
               <w14:ligatures w14:val="standardContextual"/>
             </w:rPr>
           </w:pPr>
-          <w:hyperlink w:anchor="_Toc239142831" w:history="1">
+          <w:hyperlink w:anchor="_Toc239144502" w:history="1">
             <w:r>
               <w:rPr>
                 <w:rStyle w:val="Hipervnculo"/>
@@ -2862,7 +2878,7 @@
                 <w:noProof/>
                 <w:webHidden/>
               </w:rPr>
-              <w:instrText xml:space="preserve"> PAGEREF _Toc239142831 \h </w:instrText>
+              <w:instrText xml:space="preserve"> PAGEREF _Toc239144502 \h </w:instrText>
             </w:r>
             <w:r>
               <w:rPr>
@@ -2910,7 +2926,7 @@
               <w14:ligatures w14:val="standardContextual"/>
             </w:rPr>
           </w:pPr>
-          <w:hyperlink w:anchor="_Toc239142832" w:history="1">
+          <w:hyperlink w:anchor="_Toc239144503" w:history="1">
             <w:r>
               <w:rPr>
                 <w:rStyle w:val="Hipervnculo"/>
@@ -2937,7 +2953,7 @@
                 <w:noProof/>
                 <w:webHidden/>
               </w:rPr>
-              <w:instrText xml:space="preserve"> PAGEREF _Toc239142832 \h </w:instrText>
+              <w:instrText xml:space="preserve"> PAGEREF _Toc239144503 \h </w:instrText>
             </w:r>
             <w:r>
               <w:rPr>
@@ -2985,7 +3001,7 @@
               <w14:ligatures w14:val="standardContextual"/>
             </w:rPr>
           </w:pPr>
-          <w:hyperlink w:anchor="_Toc239142833" w:history="1">
+          <w:hyperlink w:anchor="_Toc239144504" w:history="1">
             <w:r>
               <w:rPr>
                 <w:rStyle w:val="Hipervnculo"/>
@@ -3012,7 +3028,7 @@
                 <w:noProof/>
                 <w:webHidden/>
               </w:rPr>
-              <w:instrText xml:space="preserve"> PAGEREF _Toc239142833 \h </w:instrText>
+              <w:instrText xml:space="preserve"> PAGEREF _Toc239144504 \h </w:instrText>
             </w:r>
             <w:r>
               <w:rPr>
@@ -3060,7 +3076,7 @@
               <w14:ligatures w14:val="standardContextual"/>
             </w:rPr>
           </w:pPr>
-          <w:hyperlink w:anchor="_Toc239142834" w:history="1">
+          <w:hyperlink w:anchor="_Toc239144505" w:history="1">
             <w:r>
               <w:rPr>
                 <w:rStyle w:val="Hipervnculo"/>
@@ -3087,7 +3103,7 @@
                 <w:noProof/>
                 <w:webHidden/>
               </w:rPr>
-              <w:instrText xml:space="preserve"> PAGEREF _Toc239142834 \h </w:instrText>
+              <w:instrText xml:space="preserve"> PAGEREF _Toc239144505 \h </w:instrText>
             </w:r>
             <w:r>
               <w:rPr>
@@ -3135,7 +3151,7 @@
               <w14:ligatures w14:val="standardContextual"/>
             </w:rPr>
           </w:pPr>
-          <w:hyperlink w:anchor="_Toc239142835" w:history="1">
+          <w:hyperlink w:anchor="_Toc239144506" w:history="1">
             <w:r>
               <w:rPr>
                 <w:rStyle w:val="Hipervnculo"/>
@@ -3162,7 +3178,7 @@
                 <w:noProof/>
                 <w:webHidden/>
               </w:rPr>
-              <w:instrText xml:space="preserve"> PAGEREF _Toc239142835 \h </w:instrText>
+              <w:instrText xml:space="preserve"> PAGEREF _Toc239144506 \h </w:instrText>
             </w:r>
             <w:r>
               <w:rPr>
@@ -3210,7 +3226,7 @@
               <w14:ligatures w14:val="standardContextual"/>
             </w:rPr>
           </w:pPr>
-          <w:hyperlink w:anchor="_Toc239142836" w:history="1">
+          <w:hyperlink w:anchor="_Toc239144507" w:history="1">
             <w:r>
               <w:rPr>
                 <w:rStyle w:val="Hipervnculo"/>
@@ -3238,7 +3254,7 @@
                 <w:noProof/>
                 <w:webHidden/>
               </w:rPr>
-              <w:instrText xml:space="preserve"> PAGEREF _Toc239142836 \h </w:instrText>
+              <w:instrText xml:space="preserve"> PAGEREF _Toc239144507 \h </w:instrText>
             </w:r>
             <w:r>
               <w:rPr>
@@ -3286,7 +3302,7 @@
               <w14:ligatures w14:val="standardContextual"/>
             </w:rPr>
           </w:pPr>
-          <w:hyperlink w:anchor="_Toc239142837" w:history="1">
+          <w:hyperlink w:anchor="_Toc239144508" w:history="1">
             <w:r>
               <w:rPr>
                 <w:rStyle w:val="Hipervnculo"/>
@@ -3314,7 +3330,7 @@
                 <w:noProof/>
                 <w:webHidden/>
               </w:rPr>
-              <w:instrText xml:space="preserve"> PAGEREF _Toc239142837 \h </w:instrText>
+              <w:instrText xml:space="preserve"> PAGEREF _Toc239144508 \h </w:instrText>
             </w:r>
             <w:r>
               <w:rPr>
@@ -3362,7 +3378,7 @@
               <w14:ligatures w14:val="standardContextual"/>
             </w:rPr>
           </w:pPr>
-          <w:hyperlink w:anchor="_Toc239142838" w:history="1">
+          <w:hyperlink w:anchor="_Toc239144509" w:history="1">
             <w:r>
               <w:rPr>
                 <w:rStyle w:val="Hipervnculo"/>
@@ -3390,7 +3406,7 @@
                 <w:noProof/>
                 <w:webHidden/>
               </w:rPr>
-              <w:instrText xml:space="preserve"> PAGEREF _Toc239142838 \h </w:instrText>
+              <w:instrText xml:space="preserve"> PAGEREF _Toc239144509 \h </w:instrText>
             </w:r>
             <w:r>
               <w:rPr>
@@ -3438,7 +3454,7 @@
               <w14:ligatures w14:val="standardContextual"/>
             </w:rPr>
           </w:pPr>
-          <w:hyperlink w:anchor="_Toc239142839" w:history="1">
+          <w:hyperlink w:anchor="_Toc239144510" w:history="1">
             <w:r>
               <w:rPr>
                 <w:rStyle w:val="Hipervnculo"/>
@@ -3466,7 +3482,7 @@
                 <w:noProof/>
                 <w:webHidden/>
               </w:rPr>
-              <w:instrText xml:space="preserve"> PAGEREF _Toc239142839 \h </w:instrText>
+              <w:instrText xml:space="preserve"> PAGEREF _Toc239144510 \h </w:instrText>
             </w:r>
             <w:r>
               <w:rPr>
@@ -3514,7 +3530,7 @@
               <w14:ligatures w14:val="standardContextual"/>
             </w:rPr>
           </w:pPr>
-          <w:hyperlink w:anchor="_Toc239142840" w:history="1">
+          <w:hyperlink w:anchor="_Toc239144511" w:history="1">
             <w:r>
               <w:rPr>
                 <w:rStyle w:val="Hipervnculo"/>
@@ -3542,7 +3558,7 @@
                 <w:noProof/>
                 <w:webHidden/>
               </w:rPr>
-              <w:instrText xml:space="preserve"> PAGEREF _Toc239142840 \h </w:instrText>
+              <w:instrText xml:space="preserve"> PAGEREF _Toc239144511 \h </w:instrText>
             </w:r>
             <w:r>
               <w:rPr>
@@ -3590,7 +3606,7 @@
               <w14:ligatures w14:val="standardContextual"/>
             </w:rPr>
           </w:pPr>
-          <w:hyperlink w:anchor="_Toc239142841" w:history="1">
+          <w:hyperlink w:anchor="_Toc239144512" w:history="1">
             <w:r>
               <w:rPr>
                 <w:rStyle w:val="Hipervnculo"/>
@@ -3617,7 +3633,7 @@
                 <w:noProof/>
                 <w:webHidden/>
               </w:rPr>
-              <w:instrText xml:space="preserve"> PAGEREF _Toc239142841 \h </w:instrText>
+              <w:instrText xml:space="preserve"> PAGEREF _Toc239144512 \h </w:instrText>
             </w:r>
             <w:r>
               <w:rPr>
@@ -3665,7 +3681,7 @@
               <w14:ligatures w14:val="standardContextual"/>
             </w:rPr>
           </w:pPr>
-          <w:hyperlink w:anchor="_Toc239142842" w:history="1">
+          <w:hyperlink w:anchor="_Toc239144513" w:history="1">
             <w:r>
               <w:rPr>
                 <w:rStyle w:val="Hipervnculo"/>
@@ -3692,7 +3708,7 @@
                 <w:noProof/>
                 <w:webHidden/>
               </w:rPr>
-              <w:instrText xml:space="preserve"> PAGEREF _Toc239142842 \h </w:instrText>
+              <w:instrText xml:space="preserve"> PAGEREF _Toc239144513 \h </w:instrText>
             </w:r>
             <w:r>
               <w:rPr>
@@ -3740,7 +3756,7 @@
               <w14:ligatures w14:val="standardContextual"/>
             </w:rPr>
           </w:pPr>
-          <w:hyperlink w:anchor="_Toc239142843" w:history="1">
+          <w:hyperlink w:anchor="_Toc239144514" w:history="1">
             <w:r>
               <w:rPr>
                 <w:rStyle w:val="Hipervnculo"/>
@@ -3767,7 +3783,7 @@
                 <w:noProof/>
                 <w:webHidden/>
               </w:rPr>
-              <w:instrText xml:space="preserve"> PAGEREF _Toc239142843 \h </w:instrText>
+              <w:instrText xml:space="preserve"> PAGEREF _Toc239144514 \h </w:instrText>
             </w:r>
             <w:r>
               <w:rPr>
@@ -3815,7 +3831,7 @@
               <w14:ligatures w14:val="standardContextual"/>
             </w:rPr>
           </w:pPr>
-          <w:hyperlink w:anchor="_Toc239142844" w:history="1">
+          <w:hyperlink w:anchor="_Toc239144515" w:history="1">
             <w:r>
               <w:rPr>
                 <w:rStyle w:val="Hipervnculo"/>
@@ -3842,7 +3858,7 @@
                 <w:noProof/>
                 <w:webHidden/>
               </w:rPr>
-              <w:instrText xml:space="preserve"> PAGEREF _Toc239142844 \h </w:instrText>
+              <w:instrText xml:space="preserve"> PAGEREF _Toc239144515 \h </w:instrText>
             </w:r>
             <w:r>
               <w:rPr>
@@ -3890,7 +3906,7 @@
               <w14:ligatures w14:val="standardContextual"/>
             </w:rPr>
           </w:pPr>
-          <w:hyperlink w:anchor="_Toc239142845" w:history="1">
+          <w:hyperlink w:anchor="_Toc239144516" w:history="1">
             <w:r>
               <w:rPr>
                 <w:rStyle w:val="Hipervnculo"/>
@@ -3917,7 +3933,7 @@
                 <w:noProof/>
                 <w:webHidden/>
               </w:rPr>
-              <w:instrText xml:space="preserve"> PAGEREF _Toc239142845 \h </w:instrText>
+              <w:instrText xml:space="preserve"> PAGEREF _Toc239144516 \h </w:instrText>
             </w:r>
             <w:r>
               <w:rPr>
@@ -3965,7 +3981,7 @@
               <w14:ligatures w14:val="standardContextual"/>
             </w:rPr>
           </w:pPr>
-          <w:hyperlink w:anchor="_Toc239142846" w:history="1">
+          <w:hyperlink w:anchor="_Toc239144517" w:history="1">
             <w:r>
               <w:rPr>
                 <w:rStyle w:val="Hipervnculo"/>
@@ -3992,7 +4008,7 @@
                 <w:noProof/>
                 <w:webHidden/>
               </w:rPr>
-              <w:instrText xml:space="preserve"> PAGEREF _Toc239142846 \h </w:instrText>
+              <w:instrText xml:space="preserve"> PAGEREF _Toc239144517 \h </w:instrText>
             </w:r>
             <w:r>
               <w:rPr>
@@ -4012,7 +4028,7 @@
                 <w:noProof/>
                 <w:webHidden/>
               </w:rPr>
-              <w:t>30</w:t>
+              <w:t>31</w:t>
             </w:r>
             <w:r>
               <w:rPr>
@@ -4040,7 +4056,7 @@
               <w14:ligatures w14:val="standardContextual"/>
             </w:rPr>
           </w:pPr>
-          <w:hyperlink w:anchor="_Toc239142847" w:history="1">
+          <w:hyperlink w:anchor="_Toc239144518" w:history="1">
             <w:r>
               <w:rPr>
                 <w:rStyle w:val="Hipervnculo"/>
@@ -4067,7 +4083,7 @@
                 <w:noProof/>
                 <w:webHidden/>
               </w:rPr>
-              <w:instrText xml:space="preserve"> PAGEREF _Toc239142847 \h </w:instrText>
+              <w:instrText xml:space="preserve"> PAGEREF _Toc239144518 \h </w:instrText>
             </w:r>
             <w:r>
               <w:rPr>
@@ -4087,7 +4103,7 @@
                 <w:noProof/>
                 <w:webHidden/>
               </w:rPr>
-              <w:t>31</w:t>
+              <w:t>32</w:t>
             </w:r>
             <w:r>
               <w:rPr>
@@ -4115,7 +4131,7 @@
               <w14:ligatures w14:val="standardContextual"/>
             </w:rPr>
           </w:pPr>
-          <w:hyperlink w:anchor="_Toc239142848" w:history="1">
+          <w:hyperlink w:anchor="_Toc239144519" w:history="1">
             <w:r>
               <w:rPr>
                 <w:rStyle w:val="Hipervnculo"/>
@@ -4142,7 +4158,7 @@
                 <w:noProof/>
                 <w:webHidden/>
               </w:rPr>
-              <w:instrText xml:space="preserve"> PAGEREF _Toc239142848 \h </w:instrText>
+              <w:instrText xml:space="preserve"> PAGEREF _Toc239144519 \h </w:instrText>
             </w:r>
             <w:r>
               <w:rPr>
@@ -4162,7 +4178,7 @@
                 <w:noProof/>
                 <w:webHidden/>
               </w:rPr>
-              <w:t>31</w:t>
+              <w:t>32</w:t>
             </w:r>
             <w:r>
               <w:rPr>
@@ -4190,7 +4206,7 @@
               <w14:ligatures w14:val="standardContextual"/>
             </w:rPr>
           </w:pPr>
-          <w:hyperlink w:anchor="_Toc239142849" w:history="1">
+          <w:hyperlink w:anchor="_Toc239144520" w:history="1">
             <w:r>
               <w:rPr>
                 <w:rStyle w:val="Hipervnculo"/>
@@ -4217,7 +4233,7 @@
                 <w:noProof/>
                 <w:webHidden/>
               </w:rPr>
-              <w:instrText xml:space="preserve"> PAGEREF _Toc239142849 \h </w:instrText>
+              <w:instrText xml:space="preserve"> PAGEREF _Toc239144520 \h </w:instrText>
             </w:r>
             <w:r>
               <w:rPr>
@@ -4237,7 +4253,7 @@
                 <w:noProof/>
                 <w:webHidden/>
               </w:rPr>
-              <w:t>32</w:t>
+              <w:t>33</w:t>
             </w:r>
             <w:r>
               <w:rPr>
@@ -4265,7 +4281,7 @@
               <w14:ligatures w14:val="standardContextual"/>
             </w:rPr>
           </w:pPr>
-          <w:hyperlink w:anchor="_Toc239142850" w:history="1">
+          <w:hyperlink w:anchor="_Toc239144521" w:history="1">
             <w:r>
               <w:rPr>
                 <w:rStyle w:val="Hipervnculo"/>
@@ -4292,7 +4308,7 @@
                 <w:noProof/>
                 <w:webHidden/>
               </w:rPr>
-              <w:instrText xml:space="preserve"> PAGEREF _Toc239142850 \h </w:instrText>
+              <w:instrText xml:space="preserve"> PAGEREF _Toc239144521 \h </w:instrText>
             </w:r>
             <w:r>
               <w:rPr>
@@ -4312,7 +4328,7 @@
                 <w:noProof/>
                 <w:webHidden/>
               </w:rPr>
-              <w:t>32</w:t>
+              <w:t>33</w:t>
             </w:r>
             <w:r>
               <w:rPr>
@@ -4340,7 +4356,7 @@
               <w14:ligatures w14:val="standardContextual"/>
             </w:rPr>
           </w:pPr>
-          <w:hyperlink w:anchor="_Toc239142851" w:history="1">
+          <w:hyperlink w:anchor="_Toc239144522" w:history="1">
             <w:r>
               <w:rPr>
                 <w:rStyle w:val="Hipervnculo"/>
@@ -4367,7 +4383,7 @@
                 <w:noProof/>
                 <w:webHidden/>
               </w:rPr>
-              <w:instrText xml:space="preserve"> PAGEREF _Toc239142851 \h </w:instrText>
+              <w:instrText xml:space="preserve"> PAGEREF _Toc239144522 \h </w:instrText>
             </w:r>
             <w:r>
               <w:rPr>
@@ -4387,7 +4403,7 @@
                 <w:noProof/>
                 <w:webHidden/>
               </w:rPr>
-              <w:t>32</w:t>
+              <w:t>34</w:t>
             </w:r>
             <w:r>
               <w:rPr>
@@ -4415,7 +4431,7 @@
               <w14:ligatures w14:val="standardContextual"/>
             </w:rPr>
           </w:pPr>
-          <w:hyperlink w:anchor="_Toc239142852" w:history="1">
+          <w:hyperlink w:anchor="_Toc239144523" w:history="1">
             <w:r>
               <w:rPr>
                 <w:rStyle w:val="Hipervnculo"/>
@@ -4442,7 +4458,7 @@
                 <w:noProof/>
                 <w:webHidden/>
               </w:rPr>
-              <w:instrText xml:space="preserve"> PAGEREF _Toc239142852 \h </w:instrText>
+              <w:instrText xml:space="preserve"> PAGEREF _Toc239144523 \h </w:instrText>
             </w:r>
             <w:r>
               <w:rPr>
@@ -4462,7 +4478,7 @@
                 <w:noProof/>
                 <w:webHidden/>
               </w:rPr>
-              <w:t>34</w:t>
+              <w:t>35</w:t>
             </w:r>
             <w:r>
               <w:rPr>
@@ -4490,7 +4506,7 @@
               <w14:ligatures w14:val="standardContextual"/>
             </w:rPr>
           </w:pPr>
-          <w:hyperlink w:anchor="_Toc239142853" w:history="1">
+          <w:hyperlink w:anchor="_Toc239144524" w:history="1">
             <w:r>
               <w:rPr>
                 <w:rStyle w:val="Hipervnculo"/>
@@ -4517,7 +4533,7 @@
                 <w:noProof/>
                 <w:webHidden/>
               </w:rPr>
-              <w:instrText xml:space="preserve"> PAGEREF _Toc239142853 \h </w:instrText>
+              <w:instrText xml:space="preserve"> PAGEREF _Toc239144524 \h </w:instrText>
             </w:r>
             <w:r>
               <w:rPr>
@@ -4537,7 +4553,7 @@
                 <w:noProof/>
                 <w:webHidden/>
               </w:rPr>
-              <w:t>34</w:t>
+              <w:t>35</w:t>
             </w:r>
             <w:r>
               <w:rPr>
@@ -4565,7 +4581,7 @@
               <w14:ligatures w14:val="standardContextual"/>
             </w:rPr>
           </w:pPr>
-          <w:hyperlink w:anchor="_Toc239142854" w:history="1">
+          <w:hyperlink w:anchor="_Toc239144525" w:history="1">
             <w:r>
               <w:rPr>
                 <w:rStyle w:val="Hipervnculo"/>
@@ -4592,7 +4608,7 @@
                 <w:noProof/>
                 <w:webHidden/>
               </w:rPr>
-              <w:instrText xml:space="preserve"> PAGEREF _Toc239142854 \h </w:instrText>
+              <w:instrText xml:space="preserve"> PAGEREF _Toc239144525 \h </w:instrText>
             </w:r>
             <w:r>
               <w:rPr>
@@ -4612,7 +4628,7 @@
                 <w:noProof/>
                 <w:webHidden/>
               </w:rPr>
-              <w:t>34</w:t>
+              <w:t>35</w:t>
             </w:r>
             <w:r>
               <w:rPr>
@@ -4640,7 +4656,7 @@
               <w14:ligatures w14:val="standardContextual"/>
             </w:rPr>
           </w:pPr>
-          <w:hyperlink w:anchor="_Toc239142855" w:history="1">
+          <w:hyperlink w:anchor="_Toc239144526" w:history="1">
             <w:r>
               <w:rPr>
                 <w:rStyle w:val="Hipervnculo"/>
@@ -4667,7 +4683,7 @@
                 <w:noProof/>
                 <w:webHidden/>
               </w:rPr>
-              <w:instrText xml:space="preserve"> PAGEREF _Toc239142855 \h </w:instrText>
+              <w:instrText xml:space="preserve"> PAGEREF _Toc239144526 \h </w:instrText>
             </w:r>
             <w:r>
               <w:rPr>
@@ -4687,7 +4703,7 @@
                 <w:noProof/>
                 <w:webHidden/>
               </w:rPr>
-              <w:t>34</w:t>
+              <w:t>35</w:t>
             </w:r>
             <w:r>
               <w:rPr>
@@ -4715,7 +4731,7 @@
               <w14:ligatures w14:val="standardContextual"/>
             </w:rPr>
           </w:pPr>
-          <w:hyperlink w:anchor="_Toc239142856" w:history="1">
+          <w:hyperlink w:anchor="_Toc239144527" w:history="1">
             <w:r>
               <w:rPr>
                 <w:rStyle w:val="Hipervnculo"/>
@@ -4742,7 +4758,7 @@
                 <w:noProof/>
                 <w:webHidden/>
               </w:rPr>
-              <w:instrText xml:space="preserve"> PAGEREF _Toc239142856 \h </w:instrText>
+              <w:instrText xml:space="preserve"> PAGEREF _Toc239144527 \h </w:instrText>
             </w:r>
             <w:r>
               <w:rPr>
@@ -4762,7 +4778,7 @@
                 <w:noProof/>
                 <w:webHidden/>
               </w:rPr>
-              <w:t>35</w:t>
+              <w:t>36</w:t>
             </w:r>
             <w:r>
               <w:rPr>
@@ -4790,7 +4806,7 @@
               <w14:ligatures w14:val="standardContextual"/>
             </w:rPr>
           </w:pPr>
-          <w:hyperlink w:anchor="_Toc239142857" w:history="1">
+          <w:hyperlink w:anchor="_Toc239144528" w:history="1">
             <w:r>
               <w:rPr>
                 <w:rStyle w:val="Hipervnculo"/>
@@ -4817,7 +4833,7 @@
                 <w:noProof/>
                 <w:webHidden/>
               </w:rPr>
-              <w:instrText xml:space="preserve"> PAGEREF _Toc239142857 \h </w:instrText>
+              <w:instrText xml:space="preserve"> PAGEREF _Toc239144528 \h </w:instrText>
             </w:r>
             <w:r>
               <w:rPr>
@@ -4837,7 +4853,7 @@
                 <w:noProof/>
                 <w:webHidden/>
               </w:rPr>
-              <w:t>36</w:t>
+              <w:t>37</w:t>
             </w:r>
             <w:r>
               <w:rPr>
@@ -4865,7 +4881,7 @@
               <w14:ligatures w14:val="standardContextual"/>
             </w:rPr>
           </w:pPr>
-          <w:hyperlink w:anchor="_Toc239142858" w:history="1">
+          <w:hyperlink w:anchor="_Toc239144529" w:history="1">
             <w:r>
               <w:rPr>
                 <w:rStyle w:val="Hipervnculo"/>
@@ -4892,7 +4908,7 @@
                 <w:noProof/>
                 <w:webHidden/>
               </w:rPr>
-              <w:instrText xml:space="preserve"> PAGEREF _Toc239142858 \h </w:instrText>
+              <w:instrText xml:space="preserve"> PAGEREF _Toc239144529 \h </w:instrText>
             </w:r>
             <w:r>
               <w:rPr>
@@ -4912,7 +4928,7 @@
                 <w:noProof/>
                 <w:webHidden/>
               </w:rPr>
-              <w:t>36</w:t>
+              <w:t>37</w:t>
             </w:r>
             <w:r>
               <w:rPr>
@@ -4940,7 +4956,7 @@
               <w14:ligatures w14:val="standardContextual"/>
             </w:rPr>
           </w:pPr>
-          <w:hyperlink w:anchor="_Toc239142859" w:history="1">
+          <w:hyperlink w:anchor="_Toc239144530" w:history="1">
             <w:r>
               <w:rPr>
                 <w:rStyle w:val="Hipervnculo"/>
@@ -4967,7 +4983,7 @@
                 <w:noProof/>
                 <w:webHidden/>
               </w:rPr>
-              <w:instrText xml:space="preserve"> PAGEREF _Toc239142859 \h </w:instrText>
+              <w:instrText xml:space="preserve"> PAGEREF _Toc239144530 \h </w:instrText>
             </w:r>
             <w:r>
               <w:rPr>
@@ -4987,7 +5003,7 @@
                 <w:noProof/>
                 <w:webHidden/>
               </w:rPr>
-              <w:t>37</w:t>
+              <w:t>38</w:t>
             </w:r>
             <w:r>
               <w:rPr>
@@ -5015,7 +5031,7 @@
               <w14:ligatures w14:val="standardContextual"/>
             </w:rPr>
           </w:pPr>
-          <w:hyperlink w:anchor="_Toc239142860" w:history="1">
+          <w:hyperlink w:anchor="_Toc239144531" w:history="1">
             <w:r>
               <w:rPr>
                 <w:rStyle w:val="Hipervnculo"/>
@@ -5042,7 +5058,7 @@
                 <w:noProof/>
                 <w:webHidden/>
               </w:rPr>
-              <w:instrText xml:space="preserve"> PAGEREF _Toc239142860 \h </w:instrText>
+              <w:instrText xml:space="preserve"> PAGEREF _Toc239144531 \h </w:instrText>
             </w:r>
             <w:r>
               <w:rPr>
@@ -5062,7 +5078,7 @@
                 <w:noProof/>
                 <w:webHidden/>
               </w:rPr>
-              <w:t>42</w:t>
+              <w:t>43</w:t>
             </w:r>
             <w:r>
               <w:rPr>
@@ -5090,7 +5106,7 @@
               <w14:ligatures w14:val="standardContextual"/>
             </w:rPr>
           </w:pPr>
-          <w:hyperlink w:anchor="_Toc239142861" w:history="1">
+          <w:hyperlink w:anchor="_Toc239144532" w:history="1">
             <w:r>
               <w:rPr>
                 <w:rStyle w:val="Hipervnculo"/>
@@ -5117,7 +5133,7 @@
                 <w:noProof/>
                 <w:webHidden/>
               </w:rPr>
-              <w:instrText xml:space="preserve"> PAGEREF _Toc239142861 \h </w:instrText>
+              <w:instrText xml:space="preserve"> PAGEREF _Toc239144532 \h </w:instrText>
             </w:r>
             <w:r>
               <w:rPr>
@@ -5137,7 +5153,7 @@
                 <w:noProof/>
                 <w:webHidden/>
               </w:rPr>
-              <w:t>42</w:t>
+              <w:t>43</w:t>
             </w:r>
             <w:r>
               <w:rPr>
@@ -5165,7 +5181,7 @@
               <w14:ligatures w14:val="standardContextual"/>
             </w:rPr>
           </w:pPr>
-          <w:hyperlink w:anchor="_Toc239142862" w:history="1">
+          <w:hyperlink w:anchor="_Toc239144533" w:history="1">
             <w:r>
               <w:rPr>
                 <w:rStyle w:val="Hipervnculo"/>
@@ -5192,7 +5208,7 @@
                 <w:noProof/>
                 <w:webHidden/>
               </w:rPr>
-              <w:instrText xml:space="preserve"> PAGEREF _Toc239142862 \h </w:instrText>
+              <w:instrText xml:space="preserve"> PAGEREF _Toc239144533 \h </w:instrText>
             </w:r>
             <w:r>
               <w:rPr>
@@ -5212,7 +5228,7 @@
                 <w:noProof/>
                 <w:webHidden/>
               </w:rPr>
-              <w:t>43</w:t>
+              <w:t>44</w:t>
             </w:r>
             <w:r>
               <w:rPr>
@@ -5240,7 +5256,7 @@
               <w14:ligatures w14:val="standardContextual"/>
             </w:rPr>
           </w:pPr>
-          <w:hyperlink w:anchor="_Toc239142863" w:history="1">
+          <w:hyperlink w:anchor="_Toc239144534" w:history="1">
             <w:r>
               <w:rPr>
                 <w:rStyle w:val="Hipervnculo"/>
@@ -5267,7 +5283,7 @@
                 <w:noProof/>
                 <w:webHidden/>
               </w:rPr>
-              <w:instrText xml:space="preserve"> PAGEREF _Toc239142863 \h </w:instrText>
+              <w:instrText xml:space="preserve"> PAGEREF _Toc239144534 \h </w:instrText>
             </w:r>
             <w:r>
               <w:rPr>
@@ -5287,7 +5303,7 @@
                 <w:noProof/>
                 <w:webHidden/>
               </w:rPr>
-              <w:t>44</w:t>
+              <w:t>45</w:t>
             </w:r>
             <w:r>
               <w:rPr>
@@ -5315,7 +5331,7 @@
               <w14:ligatures w14:val="standardContextual"/>
             </w:rPr>
           </w:pPr>
-          <w:hyperlink w:anchor="_Toc239142864" w:history="1">
+          <w:hyperlink w:anchor="_Toc239144535" w:history="1">
             <w:r>
               <w:rPr>
                 <w:rStyle w:val="Hipervnculo"/>
@@ -5342,7 +5358,7 @@
                 <w:noProof/>
                 <w:webHidden/>
               </w:rPr>
-              <w:instrText xml:space="preserve"> PAGEREF _Toc239142864 \h </w:instrText>
+              <w:instrText xml:space="preserve"> PAGEREF _Toc239144535 \h </w:instrText>
             </w:r>
             <w:r>
               <w:rPr>
@@ -5362,7 +5378,7 @@
                 <w:noProof/>
                 <w:webHidden/>
               </w:rPr>
-              <w:t>45</w:t>
+              <w:t>46</w:t>
             </w:r>
             <w:r>
               <w:rPr>
@@ -5390,7 +5406,7 @@
               <w14:ligatures w14:val="standardContextual"/>
             </w:rPr>
           </w:pPr>
-          <w:hyperlink w:anchor="_Toc239142865" w:history="1">
+          <w:hyperlink w:anchor="_Toc239144536" w:history="1">
             <w:r>
               <w:rPr>
                 <w:rStyle w:val="Hipervnculo"/>
@@ -5418,7 +5434,7 @@
                 <w:noProof/>
                 <w:webHidden/>
               </w:rPr>
-              <w:instrText xml:space="preserve"> PAGEREF _Toc239142865 \h </w:instrText>
+              <w:instrText xml:space="preserve"> PAGEREF _Toc239144536 \h </w:instrText>
             </w:r>
             <w:r>
               <w:rPr>
@@ -5438,7 +5454,7 @@
                 <w:noProof/>
                 <w:webHidden/>
               </w:rPr>
-              <w:t>46</w:t>
+              <w:t>47</w:t>
             </w:r>
             <w:r>
               <w:rPr>
@@ -5466,7 +5482,7 @@
               <w14:ligatures w14:val="standardContextual"/>
             </w:rPr>
           </w:pPr>
-          <w:hyperlink w:anchor="_Toc239142866" w:history="1">
+          <w:hyperlink w:anchor="_Toc239144537" w:history="1">
             <w:r>
               <w:rPr>
                 <w:rStyle w:val="Hipervnculo"/>
@@ -5494,7 +5510,7 @@
                 <w:noProof/>
                 <w:webHidden/>
               </w:rPr>
-              <w:instrText xml:space="preserve"> PAGEREF _Toc239142866 \h </w:instrText>
+              <w:instrText xml:space="preserve"> PAGEREF _Toc239144537 \h </w:instrText>
             </w:r>
             <w:r>
               <w:rPr>
@@ -5514,7 +5530,7 @@
                 <w:noProof/>
                 <w:webHidden/>
               </w:rPr>
-              <w:t>46</w:t>
+              <w:t>47</w:t>
             </w:r>
             <w:r>
               <w:rPr>
@@ -5542,7 +5558,7 @@
               <w14:ligatures w14:val="standardContextual"/>
             </w:rPr>
           </w:pPr>
-          <w:hyperlink w:anchor="_Toc239142867" w:history="1">
+          <w:hyperlink w:anchor="_Toc239144538" w:history="1">
             <w:r>
               <w:rPr>
                 <w:rStyle w:val="Hipervnculo"/>
@@ -5570,7 +5586,7 @@
                 <w:noProof/>
                 <w:webHidden/>
               </w:rPr>
-              <w:instrText xml:space="preserve"> PAGEREF _Toc239142867 \h </w:instrText>
+              <w:instrText xml:space="preserve"> PAGEREF _Toc239144538 \h </w:instrText>
             </w:r>
             <w:r>
               <w:rPr>
@@ -5590,7 +5606,7 @@
                 <w:noProof/>
                 <w:webHidden/>
               </w:rPr>
-              <w:t>47</w:t>
+              <w:t>48</w:t>
             </w:r>
             <w:r>
               <w:rPr>
@@ -5618,7 +5634,7 @@
               <w14:ligatures w14:val="standardContextual"/>
             </w:rPr>
           </w:pPr>
-          <w:hyperlink w:anchor="_Toc239142868" w:history="1">
+          <w:hyperlink w:anchor="_Toc239144539" w:history="1">
             <w:r>
               <w:rPr>
                 <w:rStyle w:val="Hipervnculo"/>
@@ -5646,7 +5662,7 @@
                 <w:noProof/>
                 <w:webHidden/>
               </w:rPr>
-              <w:instrText xml:space="preserve"> PAGEREF _Toc239142868 \h </w:instrText>
+              <w:instrText xml:space="preserve"> PAGEREF _Toc239144539 \h </w:instrText>
             </w:r>
             <w:r>
               <w:rPr>
@@ -5666,7 +5682,7 @@
                 <w:noProof/>
                 <w:webHidden/>
               </w:rPr>
-              <w:t>47</w:t>
+              <w:t>48</w:t>
             </w:r>
             <w:r>
               <w:rPr>
@@ -5694,7 +5710,7 @@
               <w14:ligatures w14:val="standardContextual"/>
             </w:rPr>
           </w:pPr>
-          <w:hyperlink w:anchor="_Toc239142869" w:history="1">
+          <w:hyperlink w:anchor="_Toc239144540" w:history="1">
             <w:r>
               <w:rPr>
                 <w:rStyle w:val="Hipervnculo"/>
@@ -5722,7 +5738,7 @@
                 <w:noProof/>
                 <w:webHidden/>
               </w:rPr>
-              <w:instrText xml:space="preserve"> PAGEREF _Toc239142869 \h </w:instrText>
+              <w:instrText xml:space="preserve"> PAGEREF _Toc239144540 \h </w:instrText>
             </w:r>
             <w:r>
               <w:rPr>
@@ -5742,7 +5758,7 @@
                 <w:noProof/>
                 <w:webHidden/>
               </w:rPr>
-              <w:t>47</w:t>
+              <w:t>48</w:t>
             </w:r>
             <w:r>
               <w:rPr>
@@ -5770,7 +5786,7 @@
               <w14:ligatures w14:val="standardContextual"/>
             </w:rPr>
           </w:pPr>
-          <w:hyperlink w:anchor="_Toc239142870" w:history="1">
+          <w:hyperlink w:anchor="_Toc239144541" w:history="1">
             <w:r>
               <w:rPr>
                 <w:rStyle w:val="Hipervnculo"/>
@@ -5798,7 +5814,7 @@
                 <w:noProof/>
                 <w:webHidden/>
               </w:rPr>
-              <w:instrText xml:space="preserve"> PAGEREF _Toc239142870 \h </w:instrText>
+              <w:instrText xml:space="preserve"> PAGEREF _Toc239144541 \h </w:instrText>
             </w:r>
             <w:r>
               <w:rPr>
@@ -5818,7 +5834,7 @@
                 <w:noProof/>
                 <w:webHidden/>
               </w:rPr>
-              <w:t>48</w:t>
+              <w:t>49</w:t>
             </w:r>
             <w:r>
               <w:rPr>
@@ -5846,7 +5862,7 @@
               <w14:ligatures w14:val="standardContextual"/>
             </w:rPr>
           </w:pPr>
-          <w:hyperlink w:anchor="_Toc239142871" w:history="1">
+          <w:hyperlink w:anchor="_Toc239144542" w:history="1">
             <w:r>
               <w:rPr>
                 <w:rStyle w:val="Hipervnculo"/>
@@ -5874,7 +5890,7 @@
                 <w:noProof/>
                 <w:webHidden/>
               </w:rPr>
-              <w:instrText xml:space="preserve"> PAGEREF _Toc239142871 \h </w:instrText>
+              <w:instrText xml:space="preserve"> PAGEREF _Toc239144542 \h </w:instrText>
             </w:r>
             <w:r>
               <w:rPr>
@@ -5894,7 +5910,7 @@
                 <w:noProof/>
                 <w:webHidden/>
               </w:rPr>
-              <w:t>49</w:t>
+              <w:t>50</w:t>
             </w:r>
             <w:r>
               <w:rPr>
@@ -5922,7 +5938,7 @@
               <w14:ligatures w14:val="standardContextual"/>
             </w:rPr>
           </w:pPr>
-          <w:hyperlink w:anchor="_Toc239142872" w:history="1">
+          <w:hyperlink w:anchor="_Toc239144543" w:history="1">
             <w:r>
               <w:rPr>
                 <w:rStyle w:val="Hipervnculo"/>
@@ -5949,7 +5965,7 @@
                 <w:noProof/>
                 <w:webHidden/>
               </w:rPr>
-              <w:instrText xml:space="preserve"> PAGEREF _Toc239142872 \h </w:instrText>
+              <w:instrText xml:space="preserve"> PAGEREF _Toc239144543 \h </w:instrText>
             </w:r>
             <w:r>
               <w:rPr>
@@ -5969,7 +5985,7 @@
                 <w:noProof/>
                 <w:webHidden/>
               </w:rPr>
-              <w:t>49</w:t>
+              <w:t>50</w:t>
             </w:r>
             <w:r>
               <w:rPr>
@@ -5997,7 +6013,7 @@
               <w14:ligatures w14:val="standardContextual"/>
             </w:rPr>
           </w:pPr>
-          <w:hyperlink w:anchor="_Toc239142873" w:history="1">
+          <w:hyperlink w:anchor="_Toc239144544" w:history="1">
             <w:r>
               <w:rPr>
                 <w:rStyle w:val="Hipervnculo"/>
@@ -6025,7 +6041,7 @@
                 <w:noProof/>
                 <w:webHidden/>
               </w:rPr>
-              <w:instrText xml:space="preserve"> PAGEREF _Toc239142873 \h </w:instrText>
+              <w:instrText xml:space="preserve"> PAGEREF _Toc239144544 \h </w:instrText>
             </w:r>
             <w:r>
               <w:rPr>
@@ -6045,7 +6061,7 @@
                 <w:noProof/>
                 <w:webHidden/>
               </w:rPr>
-              <w:t>50</w:t>
+              <w:t>51</w:t>
             </w:r>
             <w:r>
               <w:rPr>
@@ -6073,7 +6089,7 @@
               <w14:ligatures w14:val="standardContextual"/>
             </w:rPr>
           </w:pPr>
-          <w:hyperlink w:anchor="_Toc239142874" w:history="1">
+          <w:hyperlink w:anchor="_Toc239144545" w:history="1">
             <w:r>
               <w:rPr>
                 <w:rStyle w:val="Hipervnculo"/>
@@ -6100,7 +6116,7 @@
                 <w:noProof/>
                 <w:webHidden/>
               </w:rPr>
-              <w:instrText xml:space="preserve"> PAGEREF _Toc239142874 \h </w:instrText>
+              <w:instrText xml:space="preserve"> PAGEREF _Toc239144545 \h </w:instrText>
             </w:r>
             <w:r>
               <w:rPr>
@@ -6120,7 +6136,7 @@
                 <w:noProof/>
                 <w:webHidden/>
               </w:rPr>
-              <w:t>50</w:t>
+              <w:t>51</w:t>
             </w:r>
             <w:r>
               <w:rPr>
@@ -6146,7 +6162,7 @@
       <w:pPr>
         <w:pStyle w:val="Ttulo1"/>
       </w:pPr>
-      <w:bookmarkStart w:id="5" w:name="_Toc239142806"/>
+      <w:bookmarkStart w:id="5" w:name="_Toc239144477"/>
       <w:r>
         <w:lastRenderedPageBreak/>
         <w:t>Introducción</w:t>
@@ -6254,7 +6270,7 @@
       <w:pPr>
         <w:pStyle w:val="Ttulo1"/>
       </w:pPr>
-      <w:bookmarkStart w:id="6" w:name="_Toc239142807"/>
+      <w:bookmarkStart w:id="6" w:name="_Toc239144478"/>
       <w:r>
         <w:lastRenderedPageBreak/>
         <w:t>Marco teórico del phishing</w:t>
@@ -6265,7 +6281,7 @@
       <w:pPr>
         <w:pStyle w:val="Ttulo2"/>
       </w:pPr>
-      <w:bookmarkStart w:id="7" w:name="_Toc239142808"/>
+      <w:bookmarkStart w:id="7" w:name="_Toc239144479"/>
       <w:r>
         <w:t>Concepto y contexto actual</w:t>
       </w:r>
@@ -6307,7 +6323,7 @@
       <w:pPr>
         <w:pStyle w:val="Ttulo2"/>
       </w:pPr>
-      <w:bookmarkStart w:id="8" w:name="_Toc239142809"/>
+      <w:bookmarkStart w:id="8" w:name="_Toc239144480"/>
       <w:r>
         <w:t>Fases de un ataque de phishing</w:t>
       </w:r>
@@ -6540,7 +6556,7 @@
       <w:pPr>
         <w:pStyle w:val="Ttulo3"/>
       </w:pPr>
-      <w:bookmarkStart w:id="9" w:name="_Toc239142810"/>
+      <w:bookmarkStart w:id="9" w:name="_Toc239144481"/>
       <w:r>
         <w:t>Preparación y Recopilación de Información (Reconocimiento)</w:t>
       </w:r>
@@ -6606,7 +6622,7 @@
       <w:pPr>
         <w:pStyle w:val="Ttulo3"/>
       </w:pPr>
-      <w:bookmarkStart w:id="10" w:name="_Toc239142811"/>
+      <w:bookmarkStart w:id="10" w:name="_Toc239144482"/>
       <w:r>
         <w:t>Creación y Lanzamiento del Cebo (Setup y Ataque)</w:t>
       </w:r>
@@ -6690,7 +6706,7 @@
           <w:noProof/>
         </w:rPr>
         <w:drawing>
-          <wp:inline distT="0" distB="0" distL="0" distR="0" wp14:anchorId="5F2B1234" wp14:editId="52A8BEEC">
+          <wp:inline distT="0" distB="0" distL="0" distR="0" wp14:anchorId="5F2B1234" wp14:editId="62CCFE6B">
             <wp:extent cx="5398135" cy="3598545"/>
             <wp:effectExtent l="0" t="0" r="0" b="1905"/>
             <wp:docPr id="2138688316" name="Imagen 4" descr="Figura o captura del sistema de detección, imagen 2." title="Figura del TFG 2"/>
@@ -6743,7 +6759,7 @@
       <w:pPr>
         <w:pStyle w:val="Ttulo3"/>
       </w:pPr>
-      <w:bookmarkStart w:id="11" w:name="_Toc239142812"/>
+      <w:bookmarkStart w:id="11" w:name="_Toc239144483"/>
       <w:r>
         <w:t>Interacción y Explotación (Colección Inicial)</w:t>
       </w:r>
@@ -6808,7 +6824,7 @@
       <w:pPr>
         <w:pStyle w:val="Ttulo3"/>
       </w:pPr>
-      <w:bookmarkStart w:id="12" w:name="_Toc239142813"/>
+      <w:bookmarkStart w:id="12" w:name="_Toc239144484"/>
       <w:r>
         <w:t>Adquisición y Monetización de los Datos</w:t>
       </w:r>
@@ -7456,7 +7472,7 @@
       <w:pPr>
         <w:pStyle w:val="Ttulo3"/>
       </w:pPr>
-      <w:bookmarkStart w:id="13" w:name="_Toc239142814"/>
+      <w:bookmarkStart w:id="13" w:name="_Toc239144485"/>
       <w:r>
         <w:t>Comparación crítica de modelos de fases</w:t>
       </w:r>
@@ -8097,7 +8113,7 @@
         <w:pStyle w:val="Ttulo3"/>
         <w:spacing w:line="278" w:lineRule="auto"/>
       </w:pPr>
-      <w:bookmarkStart w:id="14" w:name="_Toc239142815"/>
+      <w:bookmarkStart w:id="14" w:name="_Toc239144486"/>
       <w:r>
         <w:lastRenderedPageBreak/>
         <w:t>Puntos de intervención y controles</w:t>
@@ -8703,7 +8719,7 @@
       <w:pPr>
         <w:pStyle w:val="Ttulo2"/>
       </w:pPr>
-      <w:bookmarkStart w:id="15" w:name="_Toc239142816"/>
+      <w:bookmarkStart w:id="15" w:name="_Toc239144487"/>
       <w:r>
         <w:t>Tipos, clasificación y evolución de los ataques de phishing</w:t>
       </w:r>
@@ -8713,7 +8729,7 @@
       <w:pPr>
         <w:pStyle w:val="Ttulo3"/>
       </w:pPr>
-      <w:bookmarkStart w:id="16" w:name="_Toc239142817"/>
+      <w:bookmarkStart w:id="16" w:name="_Toc239144488"/>
       <w:r>
         <w:t>Introducción a la clasificación</w:t>
       </w:r>
@@ -8731,7 +8747,7 @@
       <w:pPr>
         <w:pStyle w:val="Ttulo3"/>
       </w:pPr>
-      <w:bookmarkStart w:id="17" w:name="_Toc239142818"/>
+      <w:bookmarkStart w:id="17" w:name="_Toc239144489"/>
       <w:r>
         <w:t>Clasificación según el vector de entrega</w:t>
       </w:r>
@@ -8805,7 +8821,7 @@
       <w:pPr>
         <w:pStyle w:val="Ttulo3"/>
       </w:pPr>
-      <w:bookmarkStart w:id="18" w:name="_Toc239142819"/>
+      <w:bookmarkStart w:id="18" w:name="_Toc239144490"/>
       <w:r>
         <w:t>Clasificación según el grado de personalización y objetivo</w:t>
       </w:r>
@@ -8883,7 +8899,7 @@
       <w:pPr>
         <w:pStyle w:val="Ttulo3"/>
       </w:pPr>
-      <w:bookmarkStart w:id="19" w:name="_Toc239142820"/>
+      <w:bookmarkStart w:id="19" w:name="_Toc239144491"/>
       <w:r>
         <w:t>Clasificación según la técnica de explotación</w:t>
       </w:r>
@@ -8953,7 +8969,7 @@
       <w:pPr>
         <w:pStyle w:val="Ttulo3"/>
       </w:pPr>
-      <w:bookmarkStart w:id="20" w:name="_Toc239142821"/>
+      <w:bookmarkStart w:id="20" w:name="_Toc239144492"/>
       <w:r>
         <w:t>Evolución histórica resumida</w:t>
       </w:r>
@@ -9051,7 +9067,7 @@
       <w:pPr>
         <w:pStyle w:val="Ttulo3"/>
       </w:pPr>
-      <w:bookmarkStart w:id="21" w:name="_Toc239142822"/>
+      <w:bookmarkStart w:id="21" w:name="_Toc239144493"/>
       <w:r>
         <w:t>Impacto actual (2025)</w:t>
       </w:r>
@@ -9077,7 +9093,7 @@
       <w:pPr>
         <w:pStyle w:val="Ttulo2"/>
       </w:pPr>
-      <w:bookmarkStart w:id="22" w:name="_Toc239142823"/>
+      <w:bookmarkStart w:id="22" w:name="_Toc239144494"/>
       <w:r>
         <w:t>La ingeniería social como fundamento psicológico y sociotécnico del phishing</w:t>
       </w:r>
@@ -9095,7 +9111,7 @@
       <w:pPr>
         <w:pStyle w:val="Ttulo3"/>
       </w:pPr>
-      <w:bookmarkStart w:id="23" w:name="_Toc239142824"/>
+      <w:bookmarkStart w:id="23" w:name="_Toc239144495"/>
       <w:r>
         <w:lastRenderedPageBreak/>
         <w:t>Principios psicológicos fundamentales explotados</w:t>
@@ -9748,7 +9764,7 @@
       <w:pPr>
         <w:pStyle w:val="Ttulo3"/>
       </w:pPr>
-      <w:bookmarkStart w:id="24" w:name="_Toc239142825"/>
+      <w:bookmarkStart w:id="24" w:name="_Toc239144496"/>
       <w:r>
         <w:t>Sesgos cognitivos específicos explotados</w:t>
       </w:r>
@@ -9822,7 +9838,7 @@
       <w:pPr>
         <w:pStyle w:val="Ttulo3"/>
       </w:pPr>
-      <w:bookmarkStart w:id="25" w:name="_Toc239142826"/>
+      <w:bookmarkStart w:id="25" w:name="_Toc239144497"/>
       <w:r>
         <w:t>El impacto de la inteligencia artificial generativa en la ingeniería social (2023-2025)</w:t>
       </w:r>
@@ -9883,7 +9899,7 @@
       <w:pPr>
         <w:pStyle w:val="Ttulo3"/>
       </w:pPr>
-      <w:bookmarkStart w:id="26" w:name="_Toc239142827"/>
+      <w:bookmarkStart w:id="26" w:name="_Toc239144498"/>
       <w:r>
         <w:t>Consecuencias organizativas y humanas</w:t>
       </w:r>
@@ -9909,7 +9925,7 @@
       <w:pPr>
         <w:pStyle w:val="Ttulo3"/>
       </w:pPr>
-      <w:bookmarkStart w:id="27" w:name="_Toc239142828"/>
+      <w:bookmarkStart w:id="27" w:name="_Toc239144499"/>
       <w:r>
         <w:t>Implicaciones para la detección</w:t>
       </w:r>
@@ -9988,7 +10004,7 @@
       <w:pPr>
         <w:pStyle w:val="Ttulo1"/>
       </w:pPr>
-      <w:bookmarkStart w:id="28" w:name="_Toc239142829"/>
+      <w:bookmarkStart w:id="28" w:name="_Toc239144500"/>
       <w:r>
         <w:lastRenderedPageBreak/>
         <w:t>Estado del arte en técnicas de detección y prevención de phishing basadas en Machine Learning y Deep Learning (2018-2025)</w:t>
@@ -10029,7 +10045,7 @@
       <w:pPr>
         <w:pStyle w:val="Ttulo2"/>
       </w:pPr>
-      <w:bookmarkStart w:id="29" w:name="_Toc239142830"/>
+      <w:bookmarkStart w:id="29" w:name="_Toc239144501"/>
       <w:r>
         <w:t>Evolución de los enfoques de detección</w:t>
       </w:r>
@@ -10101,7 +10117,7 @@
       <w:pPr>
         <w:pStyle w:val="Ttulo2"/>
       </w:pPr>
-      <w:bookmarkStart w:id="30" w:name="_Toc239142831"/>
+      <w:bookmarkStart w:id="30" w:name="_Toc239144502"/>
       <w:r>
         <w:t>Técnicas clásicas de Machine Learning (representativas 2019-2022)</w:t>
       </w:r>
@@ -11017,7 +11033,7 @@
       <w:pPr>
         <w:pStyle w:val="Ttulo2"/>
       </w:pPr>
-      <w:bookmarkStart w:id="31" w:name="_Toc239142832"/>
+      <w:bookmarkStart w:id="31" w:name="_Toc239144503"/>
       <w:r>
         <w:t>Técnicas de Deep Learning y Transformers (2023-2025)</w:t>
       </w:r>
@@ -12611,7 +12627,7 @@
       <w:pPr>
         <w:pStyle w:val="Ttulo2"/>
       </w:pPr>
-      <w:bookmarkStart w:id="32" w:name="_Toc239142833"/>
+      <w:bookmarkStart w:id="32" w:name="_Toc239144504"/>
       <w:r>
         <w:t>Enfoques híbridos y basados en comportamiento (UEBA)</w:t>
       </w:r>
@@ -12698,7 +12714,7 @@
       <w:pPr>
         <w:pStyle w:val="Ttulo2"/>
       </w:pPr>
-      <w:bookmarkStart w:id="33" w:name="_Toc239142834"/>
+      <w:bookmarkStart w:id="33" w:name="_Toc239144505"/>
       <w:r>
         <w:t>Limitaciones actuales de los enfoques</w:t>
       </w:r>
@@ -12798,7 +12814,7 @@
       <w:pPr>
         <w:pStyle w:val="Ttulo2"/>
       </w:pPr>
-      <w:bookmarkStart w:id="34" w:name="_Toc239142835"/>
+      <w:bookmarkStart w:id="34" w:name="_Toc239144506"/>
       <w:r>
         <w:t>Conclusiones del estado del arte y hueco de investigación</w:t>
       </w:r>
@@ -12887,7 +12903,7 @@
           <w:bCs/>
         </w:rPr>
       </w:pPr>
-      <w:bookmarkStart w:id="35" w:name="_Toc239142836"/>
+      <w:bookmarkStart w:id="35" w:name="_Toc239144507"/>
       <w:r>
         <w:rPr>
           <w:bCs/>
@@ -12908,7 +12924,7 @@
           <w:bCs/>
         </w:rPr>
       </w:pPr>
-      <w:bookmarkStart w:id="36" w:name="_Toc239142837"/>
+      <w:bookmarkStart w:id="36" w:name="_Toc239144508"/>
       <w:r>
         <w:rPr>
           <w:bCs/>
@@ -12950,7 +12966,7 @@
           <w:bCs/>
         </w:rPr>
       </w:pPr>
-      <w:bookmarkStart w:id="37" w:name="_Toc239142838"/>
+      <w:bookmarkStart w:id="37" w:name="_Toc239144509"/>
       <w:r>
         <w:rPr>
           <w:bCs/>
@@ -13849,7 +13865,7 @@
           <w:bCs/>
         </w:rPr>
       </w:pPr>
-      <w:bookmarkStart w:id="38" w:name="_Toc239142839"/>
+      <w:bookmarkStart w:id="38" w:name="_Toc239144510"/>
       <w:r>
         <w:rPr>
           <w:bCs/>
@@ -14556,7 +14572,7 @@
           <w:bCs/>
         </w:rPr>
       </w:pPr>
-      <w:bookmarkStart w:id="39" w:name="_Toc239142840"/>
+      <w:bookmarkStart w:id="39" w:name="_Toc239144511"/>
       <w:r>
         <w:rPr>
           <w:bCs/>
@@ -14583,7 +14599,7 @@
       <w:pPr>
         <w:pStyle w:val="Ttulo2"/>
       </w:pPr>
-      <w:bookmarkStart w:id="40" w:name="_Toc239142841"/>
+      <w:bookmarkStart w:id="40" w:name="_Toc239144512"/>
       <w:r>
         <w:t>Aspectos éticos y de protección de datos</w:t>
       </w:r>
@@ -14603,7 +14619,7 @@
       <w:pPr>
         <w:pStyle w:val="Ttulo1"/>
       </w:pPr>
-      <w:bookmarkStart w:id="41" w:name="_Toc239142842"/>
+      <w:bookmarkStart w:id="41" w:name="_Toc239144513"/>
       <w:r>
         <w:lastRenderedPageBreak/>
         <w:t>Diseño e implementación de la aplicación web</w:t>
@@ -14640,7 +14656,7 @@
           <w:rFonts w:eastAsiaTheme="minorEastAsia"/>
         </w:rPr>
       </w:pPr>
-      <w:bookmarkStart w:id="42" w:name="_Toc239142843"/>
+      <w:bookmarkStart w:id="42" w:name="_Toc239144514"/>
       <w:r>
         <w:rPr>
           <w:rFonts w:eastAsiaTheme="minorEastAsia"/>
@@ -14676,7 +14692,7 @@
       <w:pPr>
         <w:pStyle w:val="Ttulo2"/>
       </w:pPr>
-      <w:bookmarkStart w:id="43" w:name="_Toc239142844"/>
+      <w:bookmarkStart w:id="43" w:name="_Toc239144515"/>
       <w:r>
         <w:t>Cambios respecto a la propuesta inicial</w:t>
       </w:r>
@@ -15265,7 +15281,7 @@
           <w:rFonts w:eastAsiaTheme="minorEastAsia"/>
         </w:rPr>
       </w:pPr>
-      <w:bookmarkStart w:id="44" w:name="_Toc239142845"/>
+      <w:bookmarkStart w:id="44" w:name="_Toc239144516"/>
       <w:r>
         <w:rPr>
           <w:rFonts w:eastAsiaTheme="minorEastAsia"/>
@@ -15286,6 +15302,64 @@
       </w:r>
     </w:p>
     <w:p>
+      <w:pPr>
+        <w:keepNext/>
+        <w:spacing w:before="120" w:after="60"/>
+        <w:jc w:val="center"/>
+      </w:pPr>
+      <w:r>
+        <w:rPr>
+          <w:noProof/>
+        </w:rPr>
+        <w:drawing>
+          <wp:inline distT="0" distB="0" distL="0" distR="0" wp14:anchorId="4F7C4D0B" wp14:editId="6EA46C3F">
+            <wp:extent cx="5349240" cy="3008948"/>
+            <wp:effectExtent l="0" t="0" r="0" b="0"/>
+            <wp:docPr id="2138688323" name="Arquitectura cliente-servidor" descr="Diagrama que relaciona navegador, Streamlit, extensión y monitor con el backend central y separa runtime/client de runtime/server." title="Arquitectura cliente-servidor"/>
+            <wp:cNvGraphicFramePr>
+              <a:graphicFrameLocks xmlns:a="http://schemas.openxmlformats.org/drawingml/2006/main" noChangeAspect="1"/>
+            </wp:cNvGraphicFramePr>
+            <a:graphic xmlns:a="http://schemas.openxmlformats.org/drawingml/2006/main">
+              <a:graphicData uri="http://schemas.openxmlformats.org/drawingml/2006/picture">
+                <pic:pic xmlns:pic="http://schemas.openxmlformats.org/drawingml/2006/picture">
+                  <pic:nvPicPr>
+                    <pic:cNvPr id="0" name="figura_5_1_arquitectura_general.png"/>
+                    <pic:cNvPicPr/>
+                  </pic:nvPicPr>
+                  <pic:blipFill>
+                    <a:blip r:embed="rId10"/>
+                    <a:stretch>
+                      <a:fillRect/>
+                    </a:stretch>
+                  </pic:blipFill>
+                  <pic:spPr>
+                    <a:xfrm>
+                      <a:off x="0" y="0"/>
+                      <a:ext cx="5349240" cy="3008948"/>
+                    </a:xfrm>
+                    <a:prstGeom prst="rect">
+                      <a:avLst/>
+                    </a:prstGeom>
+                  </pic:spPr>
+                </pic:pic>
+              </a:graphicData>
+            </a:graphic>
+          </wp:inline>
+        </w:drawing>
+      </w:r>
+    </w:p>
+    <w:p>
+      <w:pPr>
+        <w:pStyle w:val="PieTFG"/>
+        <w:keepLines/>
+        <w:spacing w:after="160"/>
+        <w:jc w:val="center"/>
+      </w:pPr>
+      <w:r>
+        <w:t>Figura 5.1: Arquitectura general cliente-servidor del prototipo. Fuente: elaboración propia.</w:t>
+      </w:r>
+    </w:p>
+    <w:p>
       <w:r>
         <w:t>En cuanto a concurrencia, el backend usa ThreadingHTTPServer y crea un hilo por petición, sin un máximo cerrado en el código. En este equipo se repitieron pruebas de 8 y 16 análisis simultáneos sin fallos; con 16, el percentil 95 de latencia quedó entre 0,58 y 0,66 s, mientras que a 32 aparecieron errores. Por ello se recomiendan 4-8 solicitudes concurrentes para la configuración académica y se presenta 16 solo como máximo comprobado localmente, no como capacidad de producción. Entrenamiento y borrado de modelos se serializan mediante un bloqueo.</w:t>
       </w:r>
@@ -15307,7 +15381,11 @@
         </w:rPr>
       </w:pPr>
       <w:r>
-        <w:t>Las reglas heurísticas se han dividido en módulos especializados: header_signals.py para cabeceras y autenticación, content_signals.py para contenido textual y adjuntos, html_signals.py para estructuras HTML sospechosas y url_utils.py para extracción y análisis de URLs y dominios. La detección del idioma está centralizada en idioma.py, de modo que la aplicación y la monitorización seleccionan el modelo neuronal con el mismo criterio. Esta división mejora la mantenibilidad y facilita añadir nuevas reglas sin modificar el núcleo del analizador.</w:t>
+        <w:t xml:space="preserve">Las reglas heurísticas se han dividido en módulos especializados: header_signals.py para cabeceras y autenticación, content_signals.py para contenido textual y adjuntos, </w:t>
+      </w:r>
+      <w:r>
+        <w:lastRenderedPageBreak/>
+        <w:t>html_signals.py para estructuras HTML sospechosas y url_utils.py para extracción y análisis de URLs y dominios. La detección del idioma está centralizada en idioma.py, de modo que la aplicación y la monitorización seleccionan el modelo neuronal con el mismo criterio. Esta división mejora la mantenibilidad y facilita añadir nuevas reglas sin modificar el núcleo del analizador.</w:t>
       </w:r>
     </w:p>
     <w:p>
@@ -15317,7 +15395,7 @@
           <w:rFonts w:eastAsiaTheme="minorEastAsia"/>
         </w:rPr>
       </w:pPr>
-      <w:bookmarkStart w:id="45" w:name="_Toc239142846"/>
+      <w:bookmarkStart w:id="45" w:name="_Toc239144517"/>
       <w:r>
         <w:rPr>
           <w:rFonts w:eastAsiaTheme="minorEastAsia"/>
@@ -15359,14 +15437,190 @@
         <w:rPr>
           <w:rFonts w:asciiTheme="minorHAnsi" w:hAnsiTheme="minorHAnsi"/>
         </w:rPr>
-        <w:t xml:space="preserve">Una vez normalizado el correo, SignalBuilder ejecuta 31 reglas y produce un diccionario estable de señales. Además de cabeceras, autenticación, URLs, HTML y adjuntos, incorpora tres </w:t>
+        <w:t>Una vez normalizado el correo, SignalBuilder ejecuta 31 reglas y produce un diccionario estable de señales. Además de cabeceras, autenticación, URLs, HTML y adjuntos, incorpora tres patrones bilingües para BEC sin enlace: cambio de datos bancarios, orden urgente de transferencia y suplantación de un directivo bajo aislamiento o confidencialidad. Si el modo lo requiere, el backend detecta el idioma y reutiliza el modelo neuronal central correspondiente.</w:t>
+      </w:r>
+    </w:p>
+    <w:p>
+      <w:pPr>
+        <w:rPr>
+          <w:rFonts w:asciiTheme="minorHAnsi" w:hAnsiTheme="minorHAnsi"/>
+        </w:rPr>
+      </w:pPr>
+      <w:r>
+        <w:t>RiskScorer asigna una ponderación a cada señal activa y calcula una puntuación final entre 0 y 100. Si la puntuación supera el umbral configurado, el mensaje se clasifica como phishing probable. ExplanationBuilder transforma las señales en explicaciones comprensibles. El backend central devuelve ese resultado por HTTP a Streamlit, la extensión o el monitor; los clientes solo lo presentan o, en el caso del monitor, pueden generar una alerta de Telegram y registrar el identificador para evitar duplicados.</w:t>
+      </w:r>
+    </w:p>
+    <w:p>
+      <w:pPr>
+        <w:keepNext/>
+        <w:spacing w:before="120" w:after="60"/>
+        <w:jc w:val="center"/>
+      </w:pPr>
+      <w:r>
+        <w:rPr>
+          <w:noProof/>
+        </w:rPr>
+        <w:lastRenderedPageBreak/>
+        <w:drawing>
+          <wp:inline distT="0" distB="0" distL="0" distR="0" wp14:anchorId="34D99124" wp14:editId="19A1ED6B">
+            <wp:extent cx="5349240" cy="2888590"/>
+            <wp:effectExtent l="0" t="0" r="0" b="0"/>
+            <wp:docPr id="2138688324" name="Flujo completo de análisis" descr="Diagrama desde texto, EML, Gmail o JSON hasta normalización, ramas heurística y neuronal, decisión y respuesta JSON." title="Flujo completo de análisis"/>
+            <wp:cNvGraphicFramePr>
+              <a:graphicFrameLocks xmlns:a="http://schemas.openxmlformats.org/drawingml/2006/main" noChangeAspect="1"/>
+            </wp:cNvGraphicFramePr>
+            <a:graphic xmlns:a="http://schemas.openxmlformats.org/drawingml/2006/main">
+              <a:graphicData uri="http://schemas.openxmlformats.org/drawingml/2006/picture">
+                <pic:pic xmlns:pic="http://schemas.openxmlformats.org/drawingml/2006/picture">
+                  <pic:nvPicPr>
+                    <pic:cNvPr id="0" name="figura_5_2_flujo_analisis.png"/>
+                    <pic:cNvPicPr/>
+                  </pic:nvPicPr>
+                  <pic:blipFill>
+                    <a:blip r:embed="rId11"/>
+                    <a:stretch>
+                      <a:fillRect/>
+                    </a:stretch>
+                  </pic:blipFill>
+                  <pic:spPr>
+                    <a:xfrm>
+                      <a:off x="0" y="0"/>
+                      <a:ext cx="5349240" cy="2888590"/>
+                    </a:xfrm>
+                    <a:prstGeom prst="rect">
+                      <a:avLst/>
+                    </a:prstGeom>
+                  </pic:spPr>
+                </pic:pic>
+              </a:graphicData>
+            </a:graphic>
+          </wp:inline>
+        </w:drawing>
+      </w:r>
+    </w:p>
+    <w:p>
+      <w:pPr>
+        <w:pStyle w:val="PieTFG"/>
+        <w:keepLines/>
+        <w:spacing w:after="160"/>
+        <w:jc w:val="center"/>
+      </w:pPr>
+      <w:r>
+        <w:t>Figura 5.2: Flujo de análisis desde la entrada hasta la respuesta del backend. Fuente: elaboración propia.</w:t>
+      </w:r>
+    </w:p>
+    <w:p>
+      <w:pPr>
+        <w:pStyle w:val="Ttulo2"/>
+        <w:rPr>
+          <w:rFonts w:eastAsiaTheme="minorEastAsia"/>
+        </w:rPr>
+      </w:pPr>
+      <w:bookmarkStart w:id="46" w:name="_Toc239144518"/>
+      <w:r>
+        <w:rPr>
+          <w:rFonts w:eastAsiaTheme="minorEastAsia"/>
+        </w:rPr>
+        <w:t>Sistema heurístico</w:t>
+      </w:r>
+      <w:bookmarkEnd w:id="46"/>
+    </w:p>
+    <w:p>
+      <w:pPr>
+        <w:rPr>
+          <w:rFonts w:asciiTheme="minorHAnsi" w:hAnsiTheme="minorHAnsi"/>
+        </w:rPr>
+      </w:pPr>
+      <w:r>
+        <w:rPr>
+          <w:rFonts w:asciiTheme="minorHAnsi" w:hAnsiTheme="minorHAnsi"/>
+        </w:rPr>
+        <w:t>El sistema heurístico constituye la parte más explicable del prototipo. Está formado por un conjunto de reglas diseñadas a partir de patrones habituales en correos de phishing. Estas reglas se agrupan en varias categorías.</w:t>
+      </w:r>
+    </w:p>
+    <w:p>
+      <w:pPr>
+        <w:rPr>
+          <w:rFonts w:asciiTheme="minorHAnsi" w:hAnsiTheme="minorHAnsi"/>
+        </w:rPr>
+      </w:pPr>
+      <w:r>
+        <w:t>En primer lugar, se analizan las cabeceras del correo. El sistema interpreta los resultados que los servidores de correo ya han escrito en Received-SPF, Authentication-Results y ARC-Authentication-Results, y detecta estados fail, softfail o errores de SPF, DKIM y DMARC. También revisa incoherencias entre From, Reply-To y Return-Path y si una cabecera DKIM-Signature presente está mal formada. No realiza consultas DNS, no recupera claves públicas y no verifica criptográficamente SPF, DKIM o DMARC; por tanto, es una interpretación pasiva de cabeceras, no una validación completa de autenticación.</w:t>
+      </w:r>
+    </w:p>
+    <w:p>
+      <w:pPr>
+        <w:rPr>
+          <w:rFonts w:asciiTheme="minorHAnsi" w:hAnsiTheme="minorHAnsi"/>
+        </w:rPr>
+      </w:pPr>
+      <w:r>
+        <w:rPr>
+          <w:rFonts w:asciiTheme="minorHAnsi" w:hAnsiTheme="minorHAnsi"/>
+        </w:rPr>
+        <w:t>En segundo lugar, se analizan los enlaces. El sistema extrae URLs del texto y del HTML, comprueba la presencia de dominios en listas negras locales, detecta acortadores conocidos, identifica dominios con punycode o caracteres Unicode, y revisa parámetros de redirección sospechosos.</w:t>
+      </w:r>
+    </w:p>
+    <w:p>
+      <w:pPr>
+        <w:rPr>
+          <w:rFonts w:asciiTheme="minorHAnsi" w:hAnsiTheme="minorHAnsi"/>
+        </w:rPr>
+      </w:pPr>
+      <w:r>
+        <w:rPr>
+          <w:rFonts w:asciiTheme="minorHAnsi" w:hAnsiTheme="minorHAnsi"/>
+        </w:rPr>
+        <w:t>En tercer lugar, se estudia el contenido HTML. Se detectan formularios con acciones vacías, relativas o dirigidas a dominios sospechosos, así como elementos como iframe, base href, enlaces javascript: o redirecciones mediante meta refresh.</w:t>
+      </w:r>
+    </w:p>
+    <w:p>
+      <w:pPr>
+        <w:rPr>
+          <w:rFonts w:asciiTheme="minorHAnsi" w:hAnsiTheme="minorHAnsi"/>
+        </w:rPr>
+      </w:pPr>
+      <w:r>
+        <w:rPr>
+          <w:rFonts w:asciiTheme="minorHAnsi" w:hAnsiTheme="minorHAnsi"/>
+        </w:rPr>
+        <w:t>Por último, se analizan rasgos de ingeniería social presentes en el texto, como saludos genéricos, lenguaje urgente, asuntos sospechosos, solicitudes de credenciales o referencias a documentos adjuntos.</w:t>
+      </w:r>
+    </w:p>
+    <w:p>
+      <w:pPr>
+        <w:pStyle w:val="Ttulo2"/>
+        <w:rPr>
+          <w:rFonts w:eastAsiaTheme="minorEastAsia"/>
+        </w:rPr>
+      </w:pPr>
+      <w:bookmarkStart w:id="47" w:name="_Toc239144519"/>
+      <w:r>
+        <w:rPr>
+          <w:rFonts w:eastAsiaTheme="minorEastAsia"/>
+        </w:rPr>
+        <w:t>Clasificador neuronal</w:t>
+      </w:r>
+      <w:bookmarkEnd w:id="47"/>
+    </w:p>
+    <w:p>
+      <w:pPr>
+        <w:rPr>
+          <w:rFonts w:asciiTheme="minorHAnsi" w:hAnsiTheme="minorHAnsi"/>
+        </w:rPr>
+      </w:pPr>
+      <w:r>
+        <w:rPr>
+          <w:rFonts w:asciiTheme="minorHAnsi" w:hAnsiTheme="minorHAnsi"/>
+        </w:rPr>
+        <w:t xml:space="preserve">Además del sistema heurístico, se ha implementado un clasificador neuronal basado en scikit-learn. El modelo utiliza un pipeline formado por un vectorizador TF-IDF y un MLPClassifier. Los hiperparámetros están centralizados en HiperparametrosModelo y sus valores predeterminados se persisten en runtime/server/.env.local. La interfaz los consulta y modifica </w:t>
       </w:r>
       <w:r>
         <w:rPr>
           <w:rFonts w:asciiTheme="minorHAnsi" w:hAnsiTheme="minorHAnsi"/>
         </w:rPr>
         <w:lastRenderedPageBreak/>
-        <w:t>patrones bilingües para BEC sin enlace: cambio de datos bancarios, orden urgente de transferencia y suplantación de un directivo bajo aislamiento o confidencialidad. Si el modo lo requiere, el backend detecta el idioma y reutiliza el modelo neuronal central correspondiente.</w:t>
+        <w:t>mediante la API administrativa; un cliente puede enviar una excepción explícita al comparar o entrenar, pero no escribe el sistema de archivos del servidor.</w:t>
       </w:r>
     </w:p>
     <w:p>
@@ -15376,7 +15630,17 @@
         </w:rPr>
       </w:pPr>
       <w:r>
-        <w:t>RiskScorer asigna una ponderación a cada señal activa y calcula una puntuación final entre 0 y 100. Si la puntuación supera el umbral configurado, el mensaje se clasifica como phishing probable. ExplanationBuilder transforma las señales en explicaciones comprensibles. El backend central devuelve ese resultado por HTTP a Streamlit, la extensión o el monitor; los clientes solo lo presentan o, en el caso del monitor, pueden generar una alerta de Telegram y registrar el identificador para evitar duplicados.</w:t>
+        <w:t>El sistema permite una versión activa en español y otra en inglés. La vista de entrenamiento serializa los CSV y, solo cuando se solicita una excepción, los hiperparámetros; de lo contrario, el backend usa sus valores centrales persistidos. El servidor valida datos, entrena desde cero, guarda el artefacto de forma atómica en runtime/server/models e invalida la caché. Evaluación y comparación también se ejecutan en el servidor; los clientes reciben únicamente métricas y metadatos.</w:t>
+      </w:r>
+    </w:p>
+    <w:p>
+      <w:pPr>
+        <w:rPr>
+          <w:rFonts w:asciiTheme="minorHAnsi" w:hAnsiTheme="minorHAnsi"/>
+        </w:rPr>
+      </w:pPr>
+      <w:r>
+        <w:t>Los modelos entrenados se almacenan mediante joblib en runtime/server/models, diferenciando el artefacto español del inglés. Solo el backend accede a esas rutas. Durante el análisis, el servidor detecta el idioma con langdetect y reutiliza un detector cacheado por idioma. Si el modelo esperado no existe, está corrupto o tiene metadatos incompatibles, se entrena un modelo sintético del mismo idioma; nunca se reutiliza silenciosamente el modelo de la lengua opuesta.</w:t>
       </w:r>
     </w:p>
     <w:p>
@@ -15386,135 +15650,7 @@
           <w:rFonts w:eastAsiaTheme="minorEastAsia"/>
         </w:rPr>
       </w:pPr>
-      <w:bookmarkStart w:id="46" w:name="_Toc239142847"/>
-      <w:r>
-        <w:rPr>
-          <w:rFonts w:eastAsiaTheme="minorEastAsia"/>
-        </w:rPr>
-        <w:t>Sistema heurístico</w:t>
-      </w:r>
-      <w:bookmarkEnd w:id="46"/>
-    </w:p>
-    <w:p>
-      <w:pPr>
-        <w:rPr>
-          <w:rFonts w:asciiTheme="minorHAnsi" w:hAnsiTheme="minorHAnsi"/>
-        </w:rPr>
-      </w:pPr>
-      <w:r>
-        <w:rPr>
-          <w:rFonts w:asciiTheme="minorHAnsi" w:hAnsiTheme="minorHAnsi"/>
-        </w:rPr>
-        <w:t>El sistema heurístico constituye la parte más explicable del prototipo. Está formado por un conjunto de reglas diseñadas a partir de patrones habituales en correos de phishing. Estas reglas se agrupan en varias categorías.</w:t>
-      </w:r>
-    </w:p>
-    <w:p>
-      <w:pPr>
-        <w:rPr>
-          <w:rFonts w:asciiTheme="minorHAnsi" w:hAnsiTheme="minorHAnsi"/>
-        </w:rPr>
-      </w:pPr>
-      <w:r>
-        <w:t>En primer lugar, se analizan las cabeceras del correo. El sistema interpreta los resultados que los servidores de correo ya han escrito en Received-SPF, Authentication-Results y ARC-Authentication-Results, y detecta estados fail, softfail o errores de SPF, DKIM y DMARC. También revisa incoherencias entre From, Reply-To y Return-Path y si una cabecera DKIM-Signature presente está mal formada. No realiza consultas DNS, no recupera claves públicas y no verifica criptográficamente SPF, DKIM o DMARC; por tanto, es una interpretación pasiva de cabeceras, no una validación completa de autenticación.</w:t>
-      </w:r>
-    </w:p>
-    <w:p>
-      <w:pPr>
-        <w:rPr>
-          <w:rFonts w:asciiTheme="minorHAnsi" w:hAnsiTheme="minorHAnsi"/>
-        </w:rPr>
-      </w:pPr>
-      <w:r>
-        <w:rPr>
-          <w:rFonts w:asciiTheme="minorHAnsi" w:hAnsiTheme="minorHAnsi"/>
-        </w:rPr>
-        <w:t>En segundo lugar, se analizan los enlaces. El sistema extrae URLs del texto y del HTML, comprueba la presencia de dominios en listas negras locales, detecta acortadores conocidos, identifica dominios con punycode o caracteres Unicode, y revisa parámetros de redirección sospechosos.</w:t>
-      </w:r>
-    </w:p>
-    <w:p>
-      <w:pPr>
-        <w:rPr>
-          <w:rFonts w:asciiTheme="minorHAnsi" w:hAnsiTheme="minorHAnsi"/>
-        </w:rPr>
-      </w:pPr>
-      <w:r>
-        <w:rPr>
-          <w:rFonts w:asciiTheme="minorHAnsi" w:hAnsiTheme="minorHAnsi"/>
-        </w:rPr>
-        <w:t>En tercer lugar, se estudia el contenido HTML. Se detectan formularios con acciones vacías, relativas o dirigidas a dominios sospechosos, así como elementos como iframe, base href, enlaces javascript: o redirecciones mediante meta refresh.</w:t>
-      </w:r>
-    </w:p>
-    <w:p>
-      <w:pPr>
-        <w:rPr>
-          <w:rFonts w:asciiTheme="minorHAnsi" w:hAnsiTheme="minorHAnsi"/>
-        </w:rPr>
-      </w:pPr>
-      <w:r>
-        <w:rPr>
-          <w:rFonts w:asciiTheme="minorHAnsi" w:hAnsiTheme="minorHAnsi"/>
-        </w:rPr>
-        <w:t>Por último, se analizan rasgos de ingeniería social presentes en el texto, como saludos genéricos, lenguaje urgente, asuntos sospechosos, solicitudes de credenciales o referencias a documentos adjuntos.</w:t>
-      </w:r>
-    </w:p>
-    <w:p>
-      <w:pPr>
-        <w:pStyle w:val="Ttulo2"/>
-        <w:rPr>
-          <w:rFonts w:eastAsiaTheme="minorEastAsia"/>
-        </w:rPr>
-      </w:pPr>
-      <w:bookmarkStart w:id="47" w:name="_Toc239142848"/>
-      <w:r>
-        <w:rPr>
-          <w:rFonts w:eastAsiaTheme="minorEastAsia"/>
-        </w:rPr>
-        <w:t>Clasificador neuronal</w:t>
-      </w:r>
-      <w:bookmarkEnd w:id="47"/>
-    </w:p>
-    <w:p>
-      <w:pPr>
-        <w:rPr>
-          <w:rFonts w:asciiTheme="minorHAnsi" w:hAnsiTheme="minorHAnsi"/>
-        </w:rPr>
-      </w:pPr>
-      <w:r>
-        <w:rPr>
-          <w:rFonts w:asciiTheme="minorHAnsi" w:hAnsiTheme="minorHAnsi"/>
-        </w:rPr>
-        <w:t>Además del sistema heurístico, se ha implementado un clasificador neuronal basado en scikit-learn. El modelo utiliza un pipeline formado por un vectorizador TF-IDF y un MLPClassifier. Los hiperparámetros están centralizados en HiperparametrosModelo y sus valores predeterminados se persisten en runtime/server/.env.local. La interfaz los consulta y modifica mediante la API administrativa; un cliente puede enviar una excepción explícita al comparar o entrenar, pero no escribe el sistema de archivos del servidor.</w:t>
-      </w:r>
-    </w:p>
-    <w:p>
-      <w:pPr>
-        <w:rPr>
-          <w:rFonts w:asciiTheme="minorHAnsi" w:hAnsiTheme="minorHAnsi"/>
-        </w:rPr>
-      </w:pPr>
-      <w:r>
-        <w:t>El sistema permite una versión activa en español y otra en inglés. La vista de entrenamiento serializa los CSV y, solo cuando se solicita una excepción, los hiperparámetros; de lo contrario, el backend usa sus valores centrales persistidos. El servidor valida datos, entrena desde cero, guarda el artefacto de forma atómica en runtime/server/models e invalida la caché. Evaluación y comparación también se ejecutan en el servidor; los clientes reciben únicamente métricas y metadatos.</w:t>
-      </w:r>
-    </w:p>
-    <w:p>
-      <w:pPr>
-        <w:rPr>
-          <w:rFonts w:asciiTheme="minorHAnsi" w:hAnsiTheme="minorHAnsi"/>
-        </w:rPr>
-      </w:pPr>
-      <w:r>
-        <w:lastRenderedPageBreak/>
-        <w:t>Los modelos entrenados se almacenan mediante joblib en runtime/server/models, diferenciando el artefacto español del inglés. Solo el backend accede a esas rutas. Durante el análisis, el servidor detecta el idioma con langdetect y reutiliza un detector cacheado por idioma. Si el modelo esperado no existe, está corrupto o tiene metadatos incompatibles, se entrena un modelo sintético del mismo idioma; nunca se reutiliza silenciosamente el modelo de la lengua opuesta.</w:t>
-      </w:r>
-    </w:p>
-    <w:p>
-      <w:pPr>
-        <w:pStyle w:val="Ttulo2"/>
-        <w:rPr>
-          <w:rFonts w:eastAsiaTheme="minorEastAsia"/>
-        </w:rPr>
-      </w:pPr>
-      <w:bookmarkStart w:id="48" w:name="_Toc239142849"/>
+      <w:bookmarkStart w:id="48" w:name="_Toc239144520"/>
       <w:r>
         <w:rPr>
           <w:rFonts w:eastAsiaTheme="minorEastAsia"/>
@@ -15560,7 +15696,7 @@
       <w:pPr>
         <w:pStyle w:val="Ttulo2"/>
       </w:pPr>
-      <w:bookmarkStart w:id="49" w:name="_Toc239142850"/>
+      <w:bookmarkStart w:id="49" w:name="_Toc239144521"/>
       <w:r>
         <w:t>Diseño modular</w:t>
       </w:r>
@@ -15591,6 +15727,641 @@
     </w:p>
     <w:p>
       <w:pPr>
+        <w:pStyle w:val="PieTFG"/>
+        <w:spacing w:before="120" w:after="60"/>
+        <w:jc w:val="center"/>
+      </w:pPr>
+      <w:r>
+        <w:lastRenderedPageBreak/>
+        <w:t>Tabla 5.2: Capas y responsabilidades del diseño modular.</w:t>
+      </w:r>
+    </w:p>
+    <w:tbl>
+      <w:tblPr>
+        <w:tblStyle w:val="Tablaconcuadrcula"/>
+        <w:tblW w:w="8424" w:type="dxa"/>
+        <w:jc w:val="center"/>
+        <w:tblLayout w:type="fixed"/>
+        <w:tblLook w:val="04A0" w:firstRow="1" w:lastRow="0" w:firstColumn="1" w:lastColumn="0" w:noHBand="0" w:noVBand="1"/>
+      </w:tblPr>
+      <w:tblGrid>
+        <w:gridCol w:w="1656"/>
+        <w:gridCol w:w="3096"/>
+        <w:gridCol w:w="3672"/>
+      </w:tblGrid>
+      <w:tr>
+        <w:trPr>
+          <w:cantSplit/>
+          <w:tblHeader/>
+          <w:jc w:val="center"/>
+        </w:trPr>
+        <w:tc>
+          <w:tcPr>
+            <w:tcW w:w="1656" w:type="dxa"/>
+            <w:shd w:val="clear" w:color="auto" w:fill="12386B"/>
+            <w:tcMar>
+              <w:top w:w="90" w:type="dxa"/>
+              <w:left w:w="110" w:type="dxa"/>
+              <w:bottom w:w="90" w:type="dxa"/>
+              <w:right w:w="110" w:type="dxa"/>
+            </w:tcMar>
+            <w:vAlign w:val="center"/>
+          </w:tcPr>
+          <w:p>
+            <w:pPr>
+              <w:spacing w:after="0" w:line="240" w:lineRule="auto"/>
+              <w:jc w:val="center"/>
+            </w:pPr>
+            <w:r>
+              <w:rPr>
+                <w:rFonts w:ascii="Calibri" w:hAnsi="Calibri"/>
+                <w:b/>
+                <w:color w:val="FFFFFF"/>
+                <w:sz w:val="16"/>
+              </w:rPr>
+              <w:t>Capa</w:t>
+            </w:r>
+          </w:p>
+        </w:tc>
+        <w:tc>
+          <w:tcPr>
+            <w:tcW w:w="3096" w:type="dxa"/>
+            <w:shd w:val="clear" w:color="auto" w:fill="12386B"/>
+            <w:tcMar>
+              <w:top w:w="90" w:type="dxa"/>
+              <w:left w:w="110" w:type="dxa"/>
+              <w:bottom w:w="90" w:type="dxa"/>
+              <w:right w:w="110" w:type="dxa"/>
+            </w:tcMar>
+            <w:vAlign w:val="center"/>
+          </w:tcPr>
+          <w:p>
+            <w:pPr>
+              <w:spacing w:after="0" w:line="240" w:lineRule="auto"/>
+              <w:jc w:val="center"/>
+            </w:pPr>
+            <w:r>
+              <w:rPr>
+                <w:rFonts w:ascii="Calibri" w:hAnsi="Calibri"/>
+                <w:b/>
+                <w:color w:val="FFFFFF"/>
+                <w:sz w:val="16"/>
+              </w:rPr>
+              <w:t>Módulos principales</w:t>
+            </w:r>
+          </w:p>
+        </w:tc>
+        <w:tc>
+          <w:tcPr>
+            <w:tcW w:w="3672" w:type="dxa"/>
+            <w:shd w:val="clear" w:color="auto" w:fill="12386B"/>
+            <w:tcMar>
+              <w:top w:w="90" w:type="dxa"/>
+              <w:left w:w="110" w:type="dxa"/>
+              <w:bottom w:w="90" w:type="dxa"/>
+              <w:right w:w="110" w:type="dxa"/>
+            </w:tcMar>
+            <w:vAlign w:val="center"/>
+          </w:tcPr>
+          <w:p>
+            <w:pPr>
+              <w:spacing w:after="0" w:line="240" w:lineRule="auto"/>
+              <w:jc w:val="center"/>
+            </w:pPr>
+            <w:r>
+              <w:rPr>
+                <w:rFonts w:ascii="Calibri" w:hAnsi="Calibri"/>
+                <w:b/>
+                <w:color w:val="FFFFFF"/>
+                <w:sz w:val="16"/>
+              </w:rPr>
+              <w:t>Responsabilidad</w:t>
+            </w:r>
+          </w:p>
+        </w:tc>
+      </w:tr>
+      <w:tr>
+        <w:trPr>
+          <w:cantSplit/>
+          <w:jc w:val="center"/>
+        </w:trPr>
+        <w:tc>
+          <w:tcPr>
+            <w:tcW w:w="1656" w:type="dxa"/>
+            <w:tcMar>
+              <w:top w:w="90" w:type="dxa"/>
+              <w:left w:w="110" w:type="dxa"/>
+              <w:bottom w:w="90" w:type="dxa"/>
+              <w:right w:w="110" w:type="dxa"/>
+            </w:tcMar>
+            <w:vAlign w:val="center"/>
+          </w:tcPr>
+          <w:p>
+            <w:pPr>
+              <w:spacing w:after="0" w:line="240" w:lineRule="auto"/>
+              <w:jc w:val="center"/>
+            </w:pPr>
+            <w:r>
+              <w:rPr>
+                <w:rFonts w:ascii="Calibri" w:hAnsi="Calibri"/>
+                <w:b/>
+                <w:color w:val="263238"/>
+                <w:sz w:val="16"/>
+              </w:rPr>
+              <w:t>Presentación y clientes</w:t>
+            </w:r>
+          </w:p>
+        </w:tc>
+        <w:tc>
+          <w:tcPr>
+            <w:tcW w:w="3096" w:type="dxa"/>
+            <w:tcMar>
+              <w:top w:w="90" w:type="dxa"/>
+              <w:left w:w="110" w:type="dxa"/>
+              <w:bottom w:w="90" w:type="dxa"/>
+              <w:right w:w="110" w:type="dxa"/>
+            </w:tcMar>
+            <w:vAlign w:val="center"/>
+          </w:tcPr>
+          <w:p>
+            <w:pPr>
+              <w:spacing w:after="0" w:line="240" w:lineRule="auto"/>
+              <w:jc w:val="left"/>
+            </w:pPr>
+            <w:r>
+              <w:rPr>
+                <w:rFonts w:ascii="Calibri" w:hAnsi="Calibri"/>
+                <w:color w:val="263238"/>
+                <w:sz w:val="16"/>
+              </w:rPr>
+              <w:t>app.py, detect_app.py, config_app.py, train_app.py, monitor_app.py y extension_gmail/</w:t>
+            </w:r>
+          </w:p>
+        </w:tc>
+        <w:tc>
+          <w:tcPr>
+            <w:tcW w:w="3672" w:type="dxa"/>
+            <w:tcMar>
+              <w:top w:w="90" w:type="dxa"/>
+              <w:left w:w="110" w:type="dxa"/>
+              <w:bottom w:w="90" w:type="dxa"/>
+              <w:right w:w="110" w:type="dxa"/>
+            </w:tcMar>
+            <w:vAlign w:val="center"/>
+          </w:tcPr>
+          <w:p>
+            <w:pPr>
+              <w:spacing w:after="0" w:line="240" w:lineRule="auto"/>
+              <w:jc w:val="left"/>
+            </w:pPr>
+            <w:r>
+              <w:rPr>
+                <w:rFonts w:ascii="Calibri" w:hAnsi="Calibri"/>
+                <w:color w:val="263238"/>
+                <w:sz w:val="16"/>
+              </w:rPr>
+              <w:t>Recoger entradas, mantener el estado visual y presentar la respuesta del backend.</w:t>
+            </w:r>
+          </w:p>
+        </w:tc>
+      </w:tr>
+      <w:tr>
+        <w:trPr>
+          <w:cantSplit/>
+          <w:jc w:val="center"/>
+        </w:trPr>
+        <w:tc>
+          <w:tcPr>
+            <w:tcW w:w="1656" w:type="dxa"/>
+            <w:shd w:val="clear" w:color="auto" w:fill="F2F6F9"/>
+            <w:tcMar>
+              <w:top w:w="90" w:type="dxa"/>
+              <w:left w:w="110" w:type="dxa"/>
+              <w:bottom w:w="90" w:type="dxa"/>
+              <w:right w:w="110" w:type="dxa"/>
+            </w:tcMar>
+            <w:vAlign w:val="center"/>
+          </w:tcPr>
+          <w:p>
+            <w:pPr>
+              <w:spacing w:after="0" w:line="240" w:lineRule="auto"/>
+              <w:jc w:val="center"/>
+            </w:pPr>
+            <w:r>
+              <w:rPr>
+                <w:rFonts w:ascii="Calibri" w:hAnsi="Calibri"/>
+                <w:b/>
+                <w:color w:val="263238"/>
+                <w:sz w:val="16"/>
+              </w:rPr>
+              <w:t>Transporte</w:t>
+            </w:r>
+          </w:p>
+        </w:tc>
+        <w:tc>
+          <w:tcPr>
+            <w:tcW w:w="3096" w:type="dxa"/>
+            <w:shd w:val="clear" w:color="auto" w:fill="F2F6F9"/>
+            <w:tcMar>
+              <w:top w:w="90" w:type="dxa"/>
+              <w:left w:w="110" w:type="dxa"/>
+              <w:bottom w:w="90" w:type="dxa"/>
+              <w:right w:w="110" w:type="dxa"/>
+            </w:tcMar>
+            <w:vAlign w:val="center"/>
+          </w:tcPr>
+          <w:p>
+            <w:pPr>
+              <w:spacing w:after="0" w:line="240" w:lineRule="auto"/>
+              <w:jc w:val="left"/>
+            </w:pPr>
+            <w:r>
+              <w:rPr>
+                <w:rFonts w:ascii="Calibri" w:hAnsi="Calibri"/>
+                <w:color w:val="263238"/>
+                <w:sz w:val="16"/>
+              </w:rPr>
+              <w:t>backend_client.py y http_api.py</w:t>
+            </w:r>
+          </w:p>
+        </w:tc>
+        <w:tc>
+          <w:tcPr>
+            <w:tcW w:w="3672" w:type="dxa"/>
+            <w:shd w:val="clear" w:color="auto" w:fill="F2F6F9"/>
+            <w:tcMar>
+              <w:top w:w="90" w:type="dxa"/>
+              <w:left w:w="110" w:type="dxa"/>
+              <w:bottom w:w="90" w:type="dxa"/>
+              <w:right w:w="110" w:type="dxa"/>
+            </w:tcMar>
+            <w:vAlign w:val="center"/>
+          </w:tcPr>
+          <w:p>
+            <w:pPr>
+              <w:spacing w:after="0" w:line="240" w:lineRule="auto"/>
+              <w:jc w:val="left"/>
+            </w:pPr>
+            <w:r>
+              <w:rPr>
+                <w:rFonts w:ascii="Calibri" w:hAnsi="Calibri"/>
+                <w:color w:val="263238"/>
+                <w:sz w:val="16"/>
+              </w:rPr>
+              <w:t>Serializar JSON, aplicar límites, gestionar CORS/autorización y devolver códigos HTTP.</w:t>
+            </w:r>
+          </w:p>
+        </w:tc>
+      </w:tr>
+      <w:tr>
+        <w:trPr>
+          <w:cantSplit/>
+          <w:jc w:val="center"/>
+        </w:trPr>
+        <w:tc>
+          <w:tcPr>
+            <w:tcW w:w="1656" w:type="dxa"/>
+            <w:tcMar>
+              <w:top w:w="90" w:type="dxa"/>
+              <w:left w:w="110" w:type="dxa"/>
+              <w:bottom w:w="90" w:type="dxa"/>
+              <w:right w:w="110" w:type="dxa"/>
+            </w:tcMar>
+            <w:vAlign w:val="center"/>
+          </w:tcPr>
+          <w:p>
+            <w:pPr>
+              <w:spacing w:after="0" w:line="240" w:lineRule="auto"/>
+              <w:jc w:val="center"/>
+            </w:pPr>
+            <w:r>
+              <w:rPr>
+                <w:rFonts w:ascii="Calibri" w:hAnsi="Calibri"/>
+                <w:b/>
+                <w:color w:val="263238"/>
+                <w:sz w:val="16"/>
+              </w:rPr>
+              <w:t>Aplicación</w:t>
+            </w:r>
+          </w:p>
+        </w:tc>
+        <w:tc>
+          <w:tcPr>
+            <w:tcW w:w="3096" w:type="dxa"/>
+            <w:tcMar>
+              <w:top w:w="90" w:type="dxa"/>
+              <w:left w:w="110" w:type="dxa"/>
+              <w:bottom w:w="90" w:type="dxa"/>
+              <w:right w:w="110" w:type="dxa"/>
+            </w:tcMar>
+            <w:vAlign w:val="center"/>
+          </w:tcPr>
+          <w:p>
+            <w:pPr>
+              <w:spacing w:after="0" w:line="240" w:lineRule="auto"/>
+              <w:jc w:val="left"/>
+            </w:pPr>
+            <w:r>
+              <w:rPr>
+                <w:rFonts w:ascii="Calibri" w:hAnsi="Calibri"/>
+                <w:color w:val="263238"/>
+                <w:sz w:val="16"/>
+              </w:rPr>
+              <w:t>backend_service.py y analysis_service.py</w:t>
+            </w:r>
+          </w:p>
+        </w:tc>
+        <w:tc>
+          <w:tcPr>
+            <w:tcW w:w="3672" w:type="dxa"/>
+            <w:tcMar>
+              <w:top w:w="90" w:type="dxa"/>
+              <w:left w:w="110" w:type="dxa"/>
+              <w:bottom w:w="90" w:type="dxa"/>
+              <w:right w:w="110" w:type="dxa"/>
+            </w:tcMar>
+            <w:vAlign w:val="center"/>
+          </w:tcPr>
+          <w:p>
+            <w:pPr>
+              <w:spacing w:after="0" w:line="240" w:lineRule="auto"/>
+              <w:jc w:val="left"/>
+            </w:pPr>
+            <w:r>
+              <w:rPr>
+                <w:rFonts w:ascii="Calibri" w:hAnsi="Calibri"/>
+                <w:color w:val="263238"/>
+                <w:sz w:val="16"/>
+              </w:rPr>
+              <w:t>Coordinar análisis, modos, caché, ajustes, entrenamiento, evaluación y versiones.</w:t>
+            </w:r>
+          </w:p>
+        </w:tc>
+      </w:tr>
+      <w:tr>
+        <w:trPr>
+          <w:cantSplit/>
+          <w:jc w:val="center"/>
+        </w:trPr>
+        <w:tc>
+          <w:tcPr>
+            <w:tcW w:w="1656" w:type="dxa"/>
+            <w:shd w:val="clear" w:color="auto" w:fill="F2F6F9"/>
+            <w:tcMar>
+              <w:top w:w="90" w:type="dxa"/>
+              <w:left w:w="110" w:type="dxa"/>
+              <w:bottom w:w="90" w:type="dxa"/>
+              <w:right w:w="110" w:type="dxa"/>
+            </w:tcMar>
+            <w:vAlign w:val="center"/>
+          </w:tcPr>
+          <w:p>
+            <w:pPr>
+              <w:spacing w:after="0" w:line="240" w:lineRule="auto"/>
+              <w:jc w:val="center"/>
+            </w:pPr>
+            <w:r>
+              <w:rPr>
+                <w:rFonts w:ascii="Calibri" w:hAnsi="Calibri"/>
+                <w:b/>
+                <w:color w:val="263238"/>
+                <w:sz w:val="16"/>
+              </w:rPr>
+              <w:t>Dominio de análisis</w:t>
+            </w:r>
+          </w:p>
+        </w:tc>
+        <w:tc>
+          <w:tcPr>
+            <w:tcW w:w="3096" w:type="dxa"/>
+            <w:shd w:val="clear" w:color="auto" w:fill="F2F6F9"/>
+            <w:tcMar>
+              <w:top w:w="90" w:type="dxa"/>
+              <w:left w:w="110" w:type="dxa"/>
+              <w:bottom w:w="90" w:type="dxa"/>
+              <w:right w:w="110" w:type="dxa"/>
+            </w:tcMar>
+            <w:vAlign w:val="center"/>
+          </w:tcPr>
+          <w:p>
+            <w:pPr>
+              <w:spacing w:after="0" w:line="240" w:lineRule="auto"/>
+              <w:jc w:val="left"/>
+            </w:pPr>
+            <w:r>
+              <w:rPr>
+                <w:rFonts w:ascii="Calibri" w:hAnsi="Calibri"/>
+                <w:color w:val="263238"/>
+                <w:sz w:val="16"/>
+              </w:rPr>
+              <w:t>analizador_email.py, correo.py, signal_builder.py, scorer.py y explanations.py</w:t>
+            </w:r>
+          </w:p>
+        </w:tc>
+        <w:tc>
+          <w:tcPr>
+            <w:tcW w:w="3672" w:type="dxa"/>
+            <w:shd w:val="clear" w:color="auto" w:fill="F2F6F9"/>
+            <w:tcMar>
+              <w:top w:w="90" w:type="dxa"/>
+              <w:left w:w="110" w:type="dxa"/>
+              <w:bottom w:w="90" w:type="dxa"/>
+              <w:right w:w="110" w:type="dxa"/>
+            </w:tcMar>
+            <w:vAlign w:val="center"/>
+          </w:tcPr>
+          <w:p>
+            <w:pPr>
+              <w:spacing w:after="0" w:line="240" w:lineRule="auto"/>
+              <w:jc w:val="left"/>
+            </w:pPr>
+            <w:r>
+              <w:rPr>
+                <w:rFonts w:ascii="Calibri" w:hAnsi="Calibri"/>
+                <w:color w:val="263238"/>
+                <w:sz w:val="16"/>
+              </w:rPr>
+              <w:t>Normalizar el correo, construir señales, calcular el riesgo y generar explicaciones.</w:t>
+            </w:r>
+          </w:p>
+        </w:tc>
+      </w:tr>
+      <w:tr>
+        <w:trPr>
+          <w:cantSplit/>
+          <w:jc w:val="center"/>
+        </w:trPr>
+        <w:tc>
+          <w:tcPr>
+            <w:tcW w:w="1656" w:type="dxa"/>
+            <w:tcMar>
+              <w:top w:w="90" w:type="dxa"/>
+              <w:left w:w="110" w:type="dxa"/>
+              <w:bottom w:w="90" w:type="dxa"/>
+              <w:right w:w="110" w:type="dxa"/>
+            </w:tcMar>
+            <w:vAlign w:val="center"/>
+          </w:tcPr>
+          <w:p>
+            <w:pPr>
+              <w:spacing w:after="0" w:line="240" w:lineRule="auto"/>
+              <w:jc w:val="center"/>
+            </w:pPr>
+            <w:r>
+              <w:rPr>
+                <w:rFonts w:ascii="Calibri" w:hAnsi="Calibri"/>
+                <w:b/>
+                <w:color w:val="263238"/>
+                <w:sz w:val="16"/>
+              </w:rPr>
+              <w:t>Aprendizaje y datos</w:t>
+            </w:r>
+          </w:p>
+        </w:tc>
+        <w:tc>
+          <w:tcPr>
+            <w:tcW w:w="3096" w:type="dxa"/>
+            <w:tcMar>
+              <w:top w:w="90" w:type="dxa"/>
+              <w:left w:w="110" w:type="dxa"/>
+              <w:bottom w:w="90" w:type="dxa"/>
+              <w:right w:w="110" w:type="dxa"/>
+            </w:tcMar>
+            <w:vAlign w:val="center"/>
+          </w:tcPr>
+          <w:p>
+            <w:pPr>
+              <w:spacing w:after="0" w:line="240" w:lineRule="auto"/>
+              <w:jc w:val="left"/>
+            </w:pPr>
+            <w:r>
+              <w:rPr>
+                <w:rFonts w:ascii="Calibri" w:hAnsi="Calibri"/>
+                <w:color w:val="263238"/>
+                <w:sz w:val="16"/>
+              </w:rPr>
+              <w:t>modelo_neural.py, model_config.py, dataset.py, training_protocol.py y metrics.py</w:t>
+            </w:r>
+          </w:p>
+        </w:tc>
+        <w:tc>
+          <w:tcPr>
+            <w:tcW w:w="3672" w:type="dxa"/>
+            <w:tcMar>
+              <w:top w:w="90" w:type="dxa"/>
+              <w:left w:w="110" w:type="dxa"/>
+              <w:bottom w:w="90" w:type="dxa"/>
+              <w:right w:w="110" w:type="dxa"/>
+            </w:tcMar>
+            <w:vAlign w:val="center"/>
+          </w:tcPr>
+          <w:p>
+            <w:pPr>
+              <w:spacing w:after="0" w:line="240" w:lineRule="auto"/>
+              <w:jc w:val="left"/>
+            </w:pPr>
+            <w:r>
+              <w:rPr>
+                <w:rFonts w:ascii="Calibri" w:hAnsi="Calibri"/>
+                <w:color w:val="263238"/>
+                <w:sz w:val="16"/>
+              </w:rPr>
+              <w:t>Vectorizar, entrenar, inferir, limpiar datasets y calcular métricas reproducibles.</w:t>
+            </w:r>
+          </w:p>
+        </w:tc>
+      </w:tr>
+      <w:tr>
+        <w:trPr>
+          <w:cantSplit/>
+          <w:jc w:val="center"/>
+        </w:trPr>
+        <w:tc>
+          <w:tcPr>
+            <w:tcW w:w="1656" w:type="dxa"/>
+            <w:shd w:val="clear" w:color="auto" w:fill="F2F6F9"/>
+            <w:tcMar>
+              <w:top w:w="90" w:type="dxa"/>
+              <w:left w:w="110" w:type="dxa"/>
+              <w:bottom w:w="90" w:type="dxa"/>
+              <w:right w:w="110" w:type="dxa"/>
+            </w:tcMar>
+            <w:vAlign w:val="center"/>
+          </w:tcPr>
+          <w:p>
+            <w:pPr>
+              <w:spacing w:after="0" w:line="240" w:lineRule="auto"/>
+              <w:jc w:val="center"/>
+            </w:pPr>
+            <w:r>
+              <w:rPr>
+                <w:rFonts w:ascii="Calibri" w:hAnsi="Calibri"/>
+                <w:b/>
+                <w:color w:val="263238"/>
+                <w:sz w:val="16"/>
+              </w:rPr>
+              <w:t>Infraestructura e integraciones</w:t>
+            </w:r>
+          </w:p>
+        </w:tc>
+        <w:tc>
+          <w:tcPr>
+            <w:tcW w:w="3096" w:type="dxa"/>
+            <w:shd w:val="clear" w:color="auto" w:fill="F2F6F9"/>
+            <w:tcMar>
+              <w:top w:w="90" w:type="dxa"/>
+              <w:left w:w="110" w:type="dxa"/>
+              <w:bottom w:w="90" w:type="dxa"/>
+              <w:right w:w="110" w:type="dxa"/>
+            </w:tcMar>
+            <w:vAlign w:val="center"/>
+          </w:tcPr>
+          <w:p>
+            <w:pPr>
+              <w:spacing w:after="0" w:line="240" w:lineRule="auto"/>
+              <w:jc w:val="left"/>
+            </w:pPr>
+            <w:r>
+              <w:rPr>
+                <w:rFonts w:ascii="Calibri" w:hAnsi="Calibri"/>
+                <w:color w:val="263238"/>
+                <w:sz w:val="16"/>
+              </w:rPr>
+              <w:t>runtime_paths.py, env_loader.py, file_utils.py, gmail_client.py y telegram_notifier.py</w:t>
+            </w:r>
+          </w:p>
+        </w:tc>
+        <w:tc>
+          <w:tcPr>
+            <w:tcW w:w="3672" w:type="dxa"/>
+            <w:shd w:val="clear" w:color="auto" w:fill="F2F6F9"/>
+            <w:tcMar>
+              <w:top w:w="90" w:type="dxa"/>
+              <w:left w:w="110" w:type="dxa"/>
+              <w:bottom w:w="90" w:type="dxa"/>
+              <w:right w:w="110" w:type="dxa"/>
+            </w:tcMar>
+            <w:vAlign w:val="center"/>
+          </w:tcPr>
+          <w:p>
+            <w:pPr>
+              <w:spacing w:after="0" w:line="240" w:lineRule="auto"/>
+              <w:jc w:val="left"/>
+            </w:pPr>
+            <w:r>
+              <w:rPr>
+                <w:rFonts w:ascii="Calibri" w:hAnsi="Calibri"/>
+                <w:color w:val="263238"/>
+                <w:sz w:val="16"/>
+              </w:rPr>
+              <w:t>Separar persistencia, escribir de forma atómica e integrar Gmail y Telegram.</w:t>
+            </w:r>
+          </w:p>
+        </w:tc>
+      </w:tr>
+    </w:tbl>
+    <w:p>
+      <w:pPr>
         <w:rPr>
           <w:rFonts w:asciiTheme="minorHAnsi" w:hAnsiTheme="minorHAnsi"/>
         </w:rPr>
@@ -15603,7 +16374,7 @@
       <w:pPr>
         <w:pStyle w:val="Ttulo2"/>
       </w:pPr>
-      <w:bookmarkStart w:id="50" w:name="_Toc239142851"/>
+      <w:bookmarkStart w:id="50" w:name="_Toc239144522"/>
       <w:r>
         <w:rPr>
           <w:rFonts w:eastAsiaTheme="minorEastAsia"/>
@@ -15619,11 +16390,7 @@
         </w:rPr>
       </w:pPr>
       <w:r>
-        <w:t xml:space="preserve">El prototipo presenta varias limitaciones. Las listas negras son locales y no se consultan servicios externos de reputación en tiempo real. Tampoco se realiza análisis dinámico de las páginas enlazadas, ni se validan certificados digitales ni se comprueba la reputación histórica de los dominios. Además, Streamlit se utiliza como interfaz académica en un </w:t>
-      </w:r>
-      <w:r>
-        <w:lastRenderedPageBreak/>
-        <w:t>entorno controlado: la versión actual no incorpora gestión multiusuario, control de acceso ni aislamiento de datos para un despliegue público.</w:t>
+        <w:t>El prototipo presenta varias limitaciones. Las listas negras son locales y no se consultan servicios externos de reputación en tiempo real. Tampoco se realiza análisis dinámico de las páginas enlazadas, ni se validan certificados digitales ni se comprueba la reputación histórica de los dominios. Además, Streamlit se utiliza como interfaz académica en un entorno controlado: la versión actual no incorpora gestión multiusuario, control de acceso ni aislamiento de datos para un despliegue público.</w:t>
       </w:r>
     </w:p>
     <w:p>
@@ -15647,7 +16414,7 @@
       <w:pPr>
         <w:pStyle w:val="Ttulo1"/>
       </w:pPr>
-      <w:bookmarkStart w:id="51" w:name="_Toc239142852"/>
+      <w:bookmarkStart w:id="51" w:name="_Toc239144523"/>
       <w:r>
         <w:lastRenderedPageBreak/>
         <w:t>Pruebas, resultados y discusión</w:t>
@@ -15658,7 +16425,7 @@
       <w:pPr>
         <w:pStyle w:val="Ttulo2"/>
       </w:pPr>
-      <w:bookmarkStart w:id="52" w:name="_Toc239142853"/>
+      <w:bookmarkStart w:id="52" w:name="_Toc239144524"/>
       <w:r>
         <w:t>Pruebas unitarias y de integración</w:t>
       </w:r>
@@ -15678,7 +16445,7 @@
       <w:pPr>
         <w:pStyle w:val="Ttulo2"/>
       </w:pPr>
-      <w:bookmarkStart w:id="53" w:name="_Toc239142854"/>
+      <w:bookmarkStart w:id="53" w:name="_Toc239144525"/>
       <w:r>
         <w:t>Rendimiento y eficiencia de arranque</w:t>
       </w:r>
@@ -15703,7 +16470,7 @@
       <w:pPr>
         <w:pStyle w:val="Ttulo2"/>
       </w:pPr>
-      <w:bookmarkStart w:id="54" w:name="_Toc239142855"/>
+      <w:bookmarkStart w:id="54" w:name="_Toc239144526"/>
       <w:r>
         <w:t>Diseño experimental y datasets</w:t>
       </w:r>
@@ -17187,7 +17954,7 @@
       <w:pPr>
         <w:pStyle w:val="Ttulo2"/>
       </w:pPr>
-      <w:bookmarkStart w:id="55" w:name="_Toc239142856"/>
+      <w:bookmarkStart w:id="55" w:name="_Toc239144527"/>
       <w:r>
         <w:t>Resultados comparados</w:t>
       </w:r>
@@ -19685,7 +20452,7 @@
       <w:pPr>
         <w:pStyle w:val="Ttulo2"/>
       </w:pPr>
-      <w:bookmarkStart w:id="56" w:name="_Toc239142857"/>
+      <w:bookmarkStart w:id="56" w:name="_Toc239144528"/>
       <w:r>
         <w:t>Comportamiento del sistema heurístico</w:t>
       </w:r>
@@ -19708,7 +20475,7 @@
       <w:pPr>
         <w:pStyle w:val="Ttulo2"/>
       </w:pPr>
-      <w:bookmarkStart w:id="57" w:name="_Toc239142858"/>
+      <w:bookmarkStart w:id="57" w:name="_Toc239144529"/>
       <w:r>
         <w:t>Prueba funcional de la aplicación web</w:t>
       </w:r>
@@ -19729,7 +20496,7 @@
         <w:pStyle w:val="Ttulo3"/>
         <w:pageBreakBefore/>
       </w:pPr>
-      <w:bookmarkStart w:id="58" w:name="_Toc239142859"/>
+      <w:bookmarkStart w:id="58" w:name="_Toc239144530"/>
       <w:r>
         <w:lastRenderedPageBreak/>
         <w:t>Evidencia visual del prototipo</w:t>
@@ -19759,128 +20526,6 @@
             <wp:extent cx="5715000" cy="4167188"/>
             <wp:effectExtent l="0" t="0" r="0" b="0"/>
             <wp:docPr id="2138688317" name="Picture 2138688317" descr="Pantalla inicial de Streamlit con el backend central conectado y los dos modelos disponibles."/>
-            <wp:cNvGraphicFramePr>
-              <a:graphicFrameLocks xmlns:a="http://schemas.openxmlformats.org/drawingml/2006/main" noChangeAspect="1"/>
-            </wp:cNvGraphicFramePr>
-            <a:graphic xmlns:a="http://schemas.openxmlformats.org/drawingml/2006/main">
-              <a:graphicData uri="http://schemas.openxmlformats.org/drawingml/2006/picture">
-                <pic:pic xmlns:pic="http://schemas.openxmlformats.org/drawingml/2006/picture">
-                  <pic:nvPicPr>
-                    <pic:cNvPr id="0" name="image.png"/>
-                    <pic:cNvPicPr/>
-                  </pic:nvPicPr>
-                  <pic:blipFill>
-                    <a:blip r:embed="rId10"/>
-                    <a:stretch>
-                      <a:fillRect/>
-                    </a:stretch>
-                  </pic:blipFill>
-                  <pic:spPr>
-                    <a:xfrm>
-                      <a:off x="0" y="0"/>
-                      <a:ext cx="5715000" cy="4167188"/>
-                    </a:xfrm>
-                    <a:prstGeom prst="rect">
-                      <a:avLst/>
-                    </a:prstGeom>
-                  </pic:spPr>
-                </pic:pic>
-              </a:graphicData>
-            </a:graphic>
-          </wp:inline>
-        </w:drawing>
-      </w:r>
-    </w:p>
-    <w:p>
-      <w:pPr>
-        <w:pStyle w:val="PieTFG"/>
-        <w:keepNext w:val="0"/>
-        <w:keepLines/>
-      </w:pPr>
-      <w:r>
-        <w:t>Figura 6.1: Pantalla inicial del cliente web con el backend central conectado. Fuente: elaboración propia.</w:t>
-      </w:r>
-    </w:p>
-    <w:p>
-      <w:pPr>
-        <w:keepNext/>
-        <w:keepLines/>
-        <w:jc w:val="center"/>
-      </w:pPr>
-      <w:r>
-        <w:br w:type="page"/>
-      </w:r>
-      <w:r>
-        <w:rPr>
-          <w:noProof/>
-        </w:rPr>
-        <w:lastRenderedPageBreak/>
-        <w:drawing>
-          <wp:inline distT="0" distB="0" distL="0" distR="0" wp14:anchorId="12F3427C" wp14:editId="194A5AE1">
-            <wp:extent cx="5715000" cy="4167188"/>
-            <wp:effectExtent l="0" t="0" r="0" b="0"/>
-            <wp:docPr id="2138688318" name="Picture 2138688318" descr="Formulario de detección con entrada por texto, EML o Gmail y selección del modo combinado."/>
-            <wp:cNvGraphicFramePr>
-              <a:graphicFrameLocks xmlns:a="http://schemas.openxmlformats.org/drawingml/2006/main" noChangeAspect="1"/>
-            </wp:cNvGraphicFramePr>
-            <a:graphic xmlns:a="http://schemas.openxmlformats.org/drawingml/2006/main">
-              <a:graphicData uri="http://schemas.openxmlformats.org/drawingml/2006/picture">
-                <pic:pic xmlns:pic="http://schemas.openxmlformats.org/drawingml/2006/picture">
-                  <pic:nvPicPr>
-                    <pic:cNvPr id="0" name="image.png"/>
-                    <pic:cNvPicPr/>
-                  </pic:nvPicPr>
-                  <pic:blipFill>
-                    <a:blip r:embed="rId11"/>
-                    <a:stretch>
-                      <a:fillRect/>
-                    </a:stretch>
-                  </pic:blipFill>
-                  <pic:spPr>
-                    <a:xfrm>
-                      <a:off x="0" y="0"/>
-                      <a:ext cx="5715000" cy="4167188"/>
-                    </a:xfrm>
-                    <a:prstGeom prst="rect">
-                      <a:avLst/>
-                    </a:prstGeom>
-                  </pic:spPr>
-                </pic:pic>
-              </a:graphicData>
-            </a:graphic>
-          </wp:inline>
-        </w:drawing>
-      </w:r>
-    </w:p>
-    <w:p>
-      <w:pPr>
-        <w:pStyle w:val="PieTFG"/>
-        <w:keepNext w:val="0"/>
-        <w:keepLines/>
-      </w:pPr>
-      <w:r>
-        <w:t>Figura 6.2: Fuentes de entrada y configuración del modo combinado en el cliente web. Fuente: elaboración propia.</w:t>
-      </w:r>
-    </w:p>
-    <w:p>
-      <w:pPr>
-        <w:keepNext/>
-        <w:keepLines/>
-        <w:jc w:val="center"/>
-      </w:pPr>
-      <w:r>
-        <w:br w:type="page"/>
-      </w:r>
-      <w:r>
-        <w:rPr>
-          <w:noProof/>
-        </w:rPr>
-        <w:lastRenderedPageBreak/>
-        <w:drawing>
-          <wp:inline distT="0" distB="0" distL="0" distR="0" wp14:anchorId="548D1652" wp14:editId="439E248D">
-            <wp:extent cx="5715000" cy="4167188"/>
-            <wp:effectExtent l="0" t="0" r="0" b="0"/>
-            <wp:docPr id="2138688319" name="Picture 2138688319" descr="Resultado combinado para un escenario BEC sintético con riesgo alto, ponderación y datos procesados."/>
             <wp:cNvGraphicFramePr>
               <a:graphicFrameLocks xmlns:a="http://schemas.openxmlformats.org/drawingml/2006/main" noChangeAspect="1"/>
             </wp:cNvGraphicFramePr>
@@ -19920,7 +20565,7 @@
         <w:keepLines/>
       </w:pPr>
       <w:r>
-        <w:t>Figura 6.3: Resultado combinado del escenario BEC sintético reservado. Fuente: elaboración propia.</w:t>
+        <w:t>Figura 6.1: Pantalla inicial del cliente web con el backend central conectado. Fuente: elaboración propia.</w:t>
       </w:r>
     </w:p>
     <w:p>
@@ -19938,10 +20583,10 @@
         </w:rPr>
         <w:lastRenderedPageBreak/>
         <w:drawing>
-          <wp:inline distT="0" distB="0" distL="0" distR="0" wp14:anchorId="24ED0A1E" wp14:editId="34A9F305">
+          <wp:inline distT="0" distB="0" distL="0" distR="0" wp14:anchorId="12F3427C" wp14:editId="194A5AE1">
             <wp:extent cx="5715000" cy="4167188"/>
             <wp:effectExtent l="0" t="0" r="0" b="0"/>
-            <wp:docPr id="2138688320" name="Picture 2138688320" descr="Resultado heurístico del correo BEC y agrupación de las señales que explican el veredicto."/>
+            <wp:docPr id="2138688318" name="Picture 2138688318" descr="Formulario de detección con entrada por texto, EML o Gmail y selección del modo combinado."/>
             <wp:cNvGraphicFramePr>
               <a:graphicFrameLocks xmlns:a="http://schemas.openxmlformats.org/drawingml/2006/main" noChangeAspect="1"/>
             </wp:cNvGraphicFramePr>
@@ -19981,7 +20626,7 @@
         <w:keepLines/>
       </w:pPr>
       <w:r>
-        <w:t>Figura 6.4: Resultado heurístico y desglose explicable de señales por categoría. Fuente: elaboración propia.</w:t>
+        <w:t>Figura 6.2: Fuentes de entrada y configuración del modo combinado en el cliente web. Fuente: elaboración propia.</w:t>
       </w:r>
     </w:p>
     <w:p>
@@ -19999,10 +20644,10 @@
         </w:rPr>
         <w:lastRenderedPageBreak/>
         <w:drawing>
-          <wp:inline distT="0" distB="0" distL="0" distR="0" wp14:anchorId="76DCE3A6" wp14:editId="13165988">
+          <wp:inline distT="0" distB="0" distL="0" distR="0" wp14:anchorId="548D1652" wp14:editId="439E248D">
             <wp:extent cx="5715000" cy="4167188"/>
             <wp:effectExtent l="0" t="0" r="0" b="0"/>
-            <wp:docPr id="2138688321" name="Picture 2138688321" descr="Pantalla de administración con los modelos español e inglés activos en el servidor central."/>
+            <wp:docPr id="2138688319" name="Picture 2138688319" descr="Resultado combinado para un escenario BEC sintético con riesgo alto, ponderación y datos procesados."/>
             <wp:cNvGraphicFramePr>
               <a:graphicFrameLocks xmlns:a="http://schemas.openxmlformats.org/drawingml/2006/main" noChangeAspect="1"/>
             </wp:cNvGraphicFramePr>
@@ -20042,7 +20687,7 @@
         <w:keepLines/>
       </w:pPr>
       <w:r>
-        <w:t>Figura 6.5: Administración y versiones activas de los modelos centrales ES y EN. Fuente: elaboración propia.</w:t>
+        <w:t>Figura 6.3: Resultado combinado del escenario BEC sintético reservado. Fuente: elaboración propia.</w:t>
       </w:r>
     </w:p>
     <w:p>
@@ -20060,10 +20705,10 @@
         </w:rPr>
         <w:lastRenderedPageBreak/>
         <w:drawing>
-          <wp:inline distT="0" distB="0" distL="0" distR="0" wp14:anchorId="5B75848E" wp14:editId="466B26BC">
+          <wp:inline distT="0" distB="0" distL="0" distR="0" wp14:anchorId="24ED0A1E" wp14:editId="34A9F305">
             <wp:extent cx="5715000" cy="4167188"/>
             <wp:effectExtent l="0" t="0" r="0" b="0"/>
-            <wp:docPr id="2138688322" name="Picture 2138688322" descr="Configuración central del modo, umbral, ponderación e hiperparámetros compartidos por los clientes."/>
+            <wp:docPr id="2138688320" name="Picture 2138688320" descr="Resultado heurístico del correo BEC y agrupación de las señales que explican el veredicto."/>
             <wp:cNvGraphicFramePr>
               <a:graphicFrameLocks xmlns:a="http://schemas.openxmlformats.org/drawingml/2006/main" noChangeAspect="1"/>
             </wp:cNvGraphicFramePr>
@@ -20103,6 +20748,128 @@
         <w:keepLines/>
       </w:pPr>
       <w:r>
+        <w:t>Figura 6.4: Resultado heurístico y desglose explicable de señales por categoría. Fuente: elaboración propia.</w:t>
+      </w:r>
+    </w:p>
+    <w:p>
+      <w:pPr>
+        <w:keepNext/>
+        <w:keepLines/>
+        <w:jc w:val="center"/>
+      </w:pPr>
+      <w:r>
+        <w:br w:type="page"/>
+      </w:r>
+      <w:r>
+        <w:rPr>
+          <w:noProof/>
+        </w:rPr>
+        <w:lastRenderedPageBreak/>
+        <w:drawing>
+          <wp:inline distT="0" distB="0" distL="0" distR="0" wp14:anchorId="76DCE3A6" wp14:editId="13165988">
+            <wp:extent cx="5715000" cy="4167188"/>
+            <wp:effectExtent l="0" t="0" r="0" b="0"/>
+            <wp:docPr id="2138688321" name="Picture 2138688321" descr="Pantalla de administración con los modelos español e inglés activos en el servidor central."/>
+            <wp:cNvGraphicFramePr>
+              <a:graphicFrameLocks xmlns:a="http://schemas.openxmlformats.org/drawingml/2006/main" noChangeAspect="1"/>
+            </wp:cNvGraphicFramePr>
+            <a:graphic xmlns:a="http://schemas.openxmlformats.org/drawingml/2006/main">
+              <a:graphicData uri="http://schemas.openxmlformats.org/drawingml/2006/picture">
+                <pic:pic xmlns:pic="http://schemas.openxmlformats.org/drawingml/2006/picture">
+                  <pic:nvPicPr>
+                    <pic:cNvPr id="0" name="image.png"/>
+                    <pic:cNvPicPr/>
+                  </pic:nvPicPr>
+                  <pic:blipFill>
+                    <a:blip r:embed="rId16"/>
+                    <a:stretch>
+                      <a:fillRect/>
+                    </a:stretch>
+                  </pic:blipFill>
+                  <pic:spPr>
+                    <a:xfrm>
+                      <a:off x="0" y="0"/>
+                      <a:ext cx="5715000" cy="4167188"/>
+                    </a:xfrm>
+                    <a:prstGeom prst="rect">
+                      <a:avLst/>
+                    </a:prstGeom>
+                  </pic:spPr>
+                </pic:pic>
+              </a:graphicData>
+            </a:graphic>
+          </wp:inline>
+        </w:drawing>
+      </w:r>
+    </w:p>
+    <w:p>
+      <w:pPr>
+        <w:pStyle w:val="PieTFG"/>
+        <w:keepNext w:val="0"/>
+        <w:keepLines/>
+      </w:pPr>
+      <w:r>
+        <w:t>Figura 6.5: Administración y versiones activas de los modelos centrales ES y EN. Fuente: elaboración propia.</w:t>
+      </w:r>
+    </w:p>
+    <w:p>
+      <w:pPr>
+        <w:keepNext/>
+        <w:keepLines/>
+        <w:jc w:val="center"/>
+      </w:pPr>
+      <w:r>
+        <w:br w:type="page"/>
+      </w:r>
+      <w:r>
+        <w:rPr>
+          <w:noProof/>
+        </w:rPr>
+        <w:lastRenderedPageBreak/>
+        <w:drawing>
+          <wp:inline distT="0" distB="0" distL="0" distR="0" wp14:anchorId="5B75848E" wp14:editId="466B26BC">
+            <wp:extent cx="5715000" cy="4167188"/>
+            <wp:effectExtent l="0" t="0" r="0" b="0"/>
+            <wp:docPr id="2138688322" name="Picture 2138688322" descr="Configuración central del modo, umbral, ponderación e hiperparámetros compartidos por los clientes."/>
+            <wp:cNvGraphicFramePr>
+              <a:graphicFrameLocks xmlns:a="http://schemas.openxmlformats.org/drawingml/2006/main" noChangeAspect="1"/>
+            </wp:cNvGraphicFramePr>
+            <a:graphic xmlns:a="http://schemas.openxmlformats.org/drawingml/2006/main">
+              <a:graphicData uri="http://schemas.openxmlformats.org/drawingml/2006/picture">
+                <pic:pic xmlns:pic="http://schemas.openxmlformats.org/drawingml/2006/picture">
+                  <pic:nvPicPr>
+                    <pic:cNvPr id="0" name="image.png"/>
+                    <pic:cNvPicPr/>
+                  </pic:nvPicPr>
+                  <pic:blipFill>
+                    <a:blip r:embed="rId17"/>
+                    <a:stretch>
+                      <a:fillRect/>
+                    </a:stretch>
+                  </pic:blipFill>
+                  <pic:spPr>
+                    <a:xfrm>
+                      <a:off x="0" y="0"/>
+                      <a:ext cx="5715000" cy="4167188"/>
+                    </a:xfrm>
+                    <a:prstGeom prst="rect">
+                      <a:avLst/>
+                    </a:prstGeom>
+                  </pic:spPr>
+                </pic:pic>
+              </a:graphicData>
+            </a:graphic>
+          </wp:inline>
+        </w:drawing>
+      </w:r>
+    </w:p>
+    <w:p>
+      <w:pPr>
+        <w:pStyle w:val="PieTFG"/>
+        <w:keepNext w:val="0"/>
+        <w:keepLines/>
+      </w:pPr>
+      <w:r>
         <w:t>Figura 6.6: Ajustes de análisis e hiperparámetros almacenados en el servidor. Fuente: elaboración propia.</w:t>
       </w:r>
     </w:p>
@@ -20110,7 +20877,7 @@
       <w:pPr>
         <w:pStyle w:val="Ttulo2"/>
       </w:pPr>
-      <w:bookmarkStart w:id="59" w:name="_Toc239142860"/>
+      <w:bookmarkStart w:id="59" w:name="_Toc239144531"/>
       <w:r>
         <w:t>Discusión</w:t>
       </w:r>
@@ -20131,7 +20898,7 @@
         <w:pStyle w:val="Ttulo1"/>
         <w:pageBreakBefore w:val="0"/>
       </w:pPr>
-      <w:bookmarkStart w:id="60" w:name="_Toc239142861"/>
+      <w:bookmarkStart w:id="60" w:name="_Toc239144532"/>
       <w:r>
         <w:t>Conclusiones generales</w:t>
       </w:r>
@@ -20238,7 +21005,7 @@
       <w:pPr>
         <w:pStyle w:val="Ttulo2"/>
       </w:pPr>
-      <w:bookmarkStart w:id="61" w:name="_Toc239142862"/>
+      <w:bookmarkStart w:id="61" w:name="_Toc239144533"/>
       <w:r>
         <w:t>Trabajo futuro</w:t>
       </w:r>
@@ -20258,7 +21025,7 @@
       <w:pPr>
         <w:pStyle w:val="Ttulo1"/>
       </w:pPr>
-      <w:bookmarkStart w:id="62" w:name="_Toc239142863"/>
+      <w:bookmarkStart w:id="62" w:name="_Toc239144534"/>
       <w:r>
         <w:lastRenderedPageBreak/>
         <w:t>Glosario</w:t>
@@ -20624,7 +21391,7 @@
       <w:pPr>
         <w:pStyle w:val="Ttulo1"/>
       </w:pPr>
-      <w:bookmarkStart w:id="63" w:name="_Toc239142864"/>
+      <w:bookmarkStart w:id="63" w:name="_Toc239144535"/>
       <w:r>
         <w:lastRenderedPageBreak/>
         <w:t>Referencias</w:t>
@@ -20974,7 +21741,7 @@
           <w:bCs/>
         </w:rPr>
       </w:pPr>
-      <w:bookmarkStart w:id="64" w:name="_Toc239142865"/>
+      <w:bookmarkStart w:id="64" w:name="_Toc239144536"/>
       <w:r>
         <w:rPr>
           <w:bCs/>
@@ -20995,7 +21762,7 @@
           <w:bCs/>
         </w:rPr>
       </w:pPr>
-      <w:bookmarkStart w:id="65" w:name="_Toc239142866"/>
+      <w:bookmarkStart w:id="65" w:name="_Toc239144537"/>
       <w:r>
         <w:rPr>
           <w:bCs/>
@@ -21435,7 +22202,7 @@
           <w:bCs/>
         </w:rPr>
       </w:pPr>
-      <w:bookmarkStart w:id="66" w:name="_Toc239142867"/>
+      <w:bookmarkStart w:id="66" w:name="_Toc239144538"/>
       <w:r>
         <w:rPr>
           <w:bCs/>
@@ -21456,7 +22223,7 @@
           <w:bCs/>
         </w:rPr>
       </w:pPr>
-      <w:bookmarkStart w:id="67" w:name="_Toc239142868"/>
+      <w:bookmarkStart w:id="67" w:name="_Toc239144539"/>
       <w:r>
         <w:rPr>
           <w:bCs/>
@@ -21552,7 +22319,7 @@
           <w:bCs/>
         </w:rPr>
       </w:pPr>
-      <w:bookmarkStart w:id="68" w:name="_Toc239142869"/>
+      <w:bookmarkStart w:id="68" w:name="_Toc239144540"/>
       <w:r>
         <w:rPr>
           <w:bCs/>
@@ -22009,7 +22776,7 @@
           <w:bCs/>
         </w:rPr>
       </w:pPr>
-      <w:bookmarkStart w:id="69" w:name="_Toc239142870"/>
+      <w:bookmarkStart w:id="69" w:name="_Toc239144541"/>
       <w:r>
         <w:rPr>
           <w:bCs/>
@@ -22298,7 +23065,7 @@
           <w:bCs/>
         </w:rPr>
       </w:pPr>
-      <w:bookmarkStart w:id="70" w:name="_Toc239142871"/>
+      <w:bookmarkStart w:id="70" w:name="_Toc239144542"/>
       <w:r>
         <w:rPr>
           <w:bCs/>
@@ -22445,7 +23212,7 @@
       <w:pPr>
         <w:pStyle w:val="Ttulo2"/>
       </w:pPr>
-      <w:bookmarkStart w:id="71" w:name="_Toc239142872"/>
+      <w:bookmarkStart w:id="71" w:name="_Toc239144543"/>
       <w:r>
         <w:t>C.1. Uso del prototipo</w:t>
       </w:r>
@@ -22484,7 +23251,7 @@
           <w:bCs/>
         </w:rPr>
       </w:pPr>
-      <w:bookmarkStart w:id="72" w:name="_Toc239142873"/>
+      <w:bookmarkStart w:id="72" w:name="_Toc239144544"/>
       <w:r>
         <w:rPr>
           <w:bCs/>
@@ -22587,7 +23354,7 @@
       <w:pPr>
         <w:pStyle w:val="Ttulo2"/>
       </w:pPr>
-      <w:bookmarkStart w:id="73" w:name="_Toc239142874"/>
+      <w:bookmarkStart w:id="73" w:name="_Toc239144545"/>
       <w:r>
         <w:t>Anexo E: Resumen de arquitectura y evidencia</w:t>
       </w:r>
@@ -22609,12 +23376,12 @@
       </w:r>
     </w:p>
     <w:sectPr>
-      <w:headerReference w:type="even" r:id="rId16"/>
-      <w:headerReference w:type="default" r:id="rId17"/>
-      <w:footerReference w:type="even" r:id="rId18"/>
-      <w:footerReference w:type="default" r:id="rId19"/>
-      <w:headerReference w:type="first" r:id="rId20"/>
-      <w:footerReference w:type="first" r:id="rId21"/>
+      <w:headerReference w:type="even" r:id="rId18"/>
+      <w:headerReference w:type="default" r:id="rId19"/>
+      <w:footerReference w:type="even" r:id="rId20"/>
+      <w:footerReference w:type="default" r:id="rId21"/>
+      <w:headerReference w:type="first" r:id="rId22"/>
+      <w:footerReference w:type="first" r:id="rId23"/>
       <w:pgSz w:w="11906" w:h="16838"/>
       <w:pgMar w:top="1417" w:right="1701" w:bottom="1417" w:left="1701" w:header="708" w:footer="708" w:gutter="0"/>
       <w:cols w:space="708"/>

</xml_diff>